<commit_message>
Added to Progress Report Doc.
</commit_message>
<xml_diff>
--- a/Documentation/COMP3000 - Progress Report.docx
+++ b/Documentation/COMP3000 - Progress Report.docx
@@ -1,6 +1,6 @@
 
 <file path=word/document.xml><?xml version="1.0" encoding="utf-8"?>
-<w:document xmlns:wpc="http://schemas.microsoft.com/office/word/2010/wordprocessingCanvas" xmlns:cx="http://schemas.microsoft.com/office/drawing/2014/chartex" xmlns:cx1="http://schemas.microsoft.com/office/drawing/2015/9/8/chartex" xmlns:cx2="http://schemas.microsoft.com/office/drawing/2015/10/21/chartex" xmlns:cx3="http://schemas.microsoft.com/office/drawing/2016/5/9/chartex" xmlns:cx4="http://schemas.microsoft.com/office/drawing/2016/5/10/chartex" xmlns:cx5="http://schemas.microsoft.com/office/drawing/2016/5/11/chartex" xmlns:cx6="http://schemas.microsoft.com/office/drawing/2016/5/12/chartex" xmlns:cx7="http://schemas.microsoft.com/office/drawing/2016/5/13/chartex" xmlns:cx8="http://schemas.microsoft.com/office/drawing/2016/5/14/chartex" xmlns:mc="http://schemas.openxmlformats.org/markup-compatibility/2006" xmlns:aink="http://schemas.microsoft.com/office/drawing/2016/ink" xmlns:am3d="http://schemas.microsoft.com/office/drawing/2017/model3d" xmlns:o="urn:schemas-microsoft-com:office:office" xmlns:oel="http://schemas.microsoft.com/office/2019/extlst" xmlns:r="http://schemas.openxmlformats.org/officeDocument/2006/relationships" xmlns:m="http://schemas.openxmlformats.org/officeDocument/2006/math" xmlns:v="urn:schemas-microsoft-com:vml" xmlns:wp14="http://schemas.microsoft.com/office/word/2010/wordprocessingDrawing" xmlns:wp="http://schemas.openxmlformats.org/drawingml/2006/wordprocessingDrawing" xmlns:w10="urn:schemas-microsoft-com:office:word" xmlns:w="http://schemas.openxmlformats.org/wordprocessingml/2006/main" xmlns:w14="http://schemas.microsoft.com/office/word/2010/wordml" xmlns:w15="http://schemas.microsoft.com/office/word/2012/wordml" xmlns:w16cex="http://schemas.microsoft.com/office/word/2018/wordml/cex" xmlns:w16cid="http://schemas.microsoft.com/office/word/2016/wordml/cid" xmlns:w16="http://schemas.microsoft.com/office/word/2018/wordml" xmlns:w16du="http://schemas.microsoft.com/office/word/2023/wordml/word16du" xmlns:w16sdtdh="http://schemas.microsoft.com/office/word/2020/wordml/sdtdatahash" xmlns:w16sdtfl="http://schemas.microsoft.com/office/word/2024/wordml/sdtformatlock" xmlns:w16se="http://schemas.microsoft.com/office/word/2015/wordml/symex" xmlns:wpg="http://schemas.microsoft.com/office/word/2010/wordprocessingGroup" xmlns:wpi="http://schemas.microsoft.com/office/word/2010/wordprocessingInk" xmlns:wne="http://schemas.microsoft.com/office/word/2006/wordml" xmlns:wps="http://schemas.microsoft.com/office/word/2010/wordprocessingShape" xmlns:a="http://schemas.openxmlformats.org/drawingml/2006/main" xmlns:pic="http://schemas.openxmlformats.org/drawingml/2006/picture" xmlns:a14="http://schemas.microsoft.com/office/drawing/2010/main" mc:Ignorable="w14 w15 w16se w16cid w16 w16cex w16sdtdh w16sdtfl w16du wp14">
+<w:document xmlns:wpc="http://schemas.microsoft.com/office/word/2010/wordprocessingCanvas" xmlns:cx="http://schemas.microsoft.com/office/drawing/2014/chartex" xmlns:cx1="http://schemas.microsoft.com/office/drawing/2015/9/8/chartex" xmlns:cx2="http://schemas.microsoft.com/office/drawing/2015/10/21/chartex" xmlns:cx3="http://schemas.microsoft.com/office/drawing/2016/5/9/chartex" xmlns:cx4="http://schemas.microsoft.com/office/drawing/2016/5/10/chartex" xmlns:cx5="http://schemas.microsoft.com/office/drawing/2016/5/11/chartex" xmlns:cx6="http://schemas.microsoft.com/office/drawing/2016/5/12/chartex" xmlns:cx7="http://schemas.microsoft.com/office/drawing/2016/5/13/chartex" xmlns:cx8="http://schemas.microsoft.com/office/drawing/2016/5/14/chartex" xmlns:mc="http://schemas.openxmlformats.org/markup-compatibility/2006" xmlns:aink="http://schemas.microsoft.com/office/drawing/2016/ink" xmlns:am3d="http://schemas.microsoft.com/office/drawing/2017/model3d" xmlns:o="urn:schemas-microsoft-com:office:office" xmlns:oel="http://schemas.microsoft.com/office/2019/extlst" xmlns:r="http://schemas.openxmlformats.org/officeDocument/2006/relationships" xmlns:m="http://schemas.openxmlformats.org/officeDocument/2006/math" xmlns:v="urn:schemas-microsoft-com:vml" xmlns:wp14="http://schemas.microsoft.com/office/word/2010/wordprocessingDrawing" xmlns:wp="http://schemas.openxmlformats.org/drawingml/2006/wordprocessingDrawing" xmlns:w10="urn:schemas-microsoft-com:office:word" xmlns:w="http://schemas.openxmlformats.org/wordprocessingml/2006/main" xmlns:w14="http://schemas.microsoft.com/office/word/2010/wordml" xmlns:w15="http://schemas.microsoft.com/office/word/2012/wordml" xmlns:w16cex="http://schemas.microsoft.com/office/word/2018/wordml/cex" xmlns:w16cid="http://schemas.microsoft.com/office/word/2016/wordml/cid" xmlns:w16="http://schemas.microsoft.com/office/word/2018/wordml" xmlns:w16du="http://schemas.microsoft.com/office/word/2023/wordml/word16du" xmlns:w16sdtdh="http://schemas.microsoft.com/office/word/2020/wordml/sdtdatahash" xmlns:w16sdtfl="http://schemas.microsoft.com/office/word/2024/wordml/sdtformatlock" xmlns:w16se="http://schemas.microsoft.com/office/word/2015/wordml/symex" xmlns:wpg="http://schemas.microsoft.com/office/word/2010/wordprocessingGroup" xmlns:wpi="http://schemas.microsoft.com/office/word/2010/wordprocessingInk" xmlns:wne="http://schemas.microsoft.com/office/word/2006/wordml" xmlns:wps="http://schemas.microsoft.com/office/word/2010/wordprocessingShape" mc:Ignorable="w14 w15 w16se w16cid w16 w16cex w16sdtdh w16sdtfl w16du wp14">
   <w:body>
     <w:p>
       <w:pPr>
@@ -80,31 +80,33 @@
     </w:p>
     <w:p>
       <w:pPr>
-        <w:pStyle w:val="Normal"/>
-        <w:rPr>
-          <w:lang w:val="en-US"/>
-        </w:rPr>
-      </w:pPr>
-      <w:r>
+        <w:rPr>
+          <w:lang w:val="en-US"/>
+        </w:rPr>
+      </w:pPr>
+      <w:r>
+        <w:rPr>
+          <w:noProof/>
+        </w:rPr>
         <w:drawing>
-          <wp:inline wp14:editId="5DA4ADEA" wp14:anchorId="42B12C16">
+          <wp:inline distT="0" distB="0" distL="0" distR="0" wp14:anchorId="42B12C16" wp14:editId="17C9121C">
             <wp:extent cx="5724525" cy="2752725"/>
             <wp:effectExtent l="0" t="0" r="0" b="0"/>
             <wp:docPr id="300026125" name="drawing"/>
             <wp:cNvGraphicFramePr>
-              <a:graphicFrameLocks noChangeAspect="1"/>
+              <a:graphicFrameLocks xmlns:a="http://schemas.openxmlformats.org/drawingml/2006/main" noChangeAspect="1"/>
             </wp:cNvGraphicFramePr>
-            <a:graphic>
-              <a:graphicData xmlns:a="http://schemas.openxmlformats.org/drawingml/2006/main" uri="http://schemas.openxmlformats.org/drawingml/2006/picture">
+            <a:graphic xmlns:a="http://schemas.openxmlformats.org/drawingml/2006/main">
+              <a:graphicData uri="http://schemas.openxmlformats.org/drawingml/2006/picture">
                 <pic:pic xmlns:pic="http://schemas.openxmlformats.org/drawingml/2006/picture">
                   <pic:nvPicPr>
                     <pic:cNvPr id="300026125" name=""/>
                     <pic:cNvPicPr/>
                   </pic:nvPicPr>
                   <pic:blipFill>
-                    <a:blip xmlns:r="http://schemas.openxmlformats.org/officeDocument/2006/relationships" r:embed="rId118196116">
+                    <a:blip r:embed="rId8" cstate="print">
                       <a:extLst>
-                        <a:ext xmlns:a="http://schemas.openxmlformats.org/drawingml/2006/main" uri="{28A0092B-C50C-407E-A947-70E740481C1C}">
+                        <a:ext uri="{28A0092B-C50C-407E-A947-70E740481C1C}">
                           <a14:useLocalDpi xmlns:a14="http://schemas.microsoft.com/office/drawing/2010/main" val="0"/>
                         </a:ext>
                       </a:extLst>
@@ -132,8 +134,796 @@
         <w:br/>
       </w:r>
     </w:p>
+    <w:p>
+      <w:pPr>
+        <w:rPr>
+          <w:lang w:val="en-US"/>
+        </w:rPr>
+      </w:pPr>
+      <w:r>
+        <w:rPr>
+          <w:lang w:val="en-US"/>
+        </w:rPr>
+        <w:t>Useful Code Used:</w:t>
+      </w:r>
+      <w:r>
+        <w:rPr>
+          <w:lang w:val="en-US"/>
+        </w:rPr>
+        <w:br/>
+      </w:r>
+    </w:p>
+    <w:p>
+      <w:pPr>
+        <w:pStyle w:val="ListParagraph"/>
+        <w:numPr>
+          <w:ilvl w:val="0"/>
+          <w:numId w:val="1"/>
+        </w:numPr>
+        <w:rPr>
+          <w:lang w:val="en-US"/>
+        </w:rPr>
+      </w:pPr>
+      <w:r>
+        <w:rPr>
+          <w:lang w:val="en-US"/>
+        </w:rPr>
+        <w:t xml:space="preserve">For setting up expo via terminal: </w:t>
+      </w:r>
+      <w:r>
+        <w:rPr>
+          <w:lang w:val="en-US"/>
+        </w:rPr>
+        <w:t>‘</w:t>
+      </w:r>
+      <w:r>
+        <w:rPr>
+          <w:lang w:val="en-US"/>
+        </w:rPr>
+        <w:t>npx create-expo-app mobile-app</w:t>
+      </w:r>
+      <w:r>
+        <w:rPr>
+          <w:lang w:val="en-US"/>
+        </w:rPr>
+        <w:t>’</w:t>
+      </w:r>
+    </w:p>
+    <w:p>
+      <w:pPr>
+        <w:pStyle w:val="ListParagraph"/>
+        <w:numPr>
+          <w:ilvl w:val="0"/>
+          <w:numId w:val="1"/>
+        </w:numPr>
+        <w:rPr>
+          <w:lang w:val="en-US"/>
+        </w:rPr>
+      </w:pPr>
+      <w:r>
+        <w:rPr>
+          <w:lang w:val="en-US"/>
+        </w:rPr>
+        <w:t xml:space="preserve">For running the expo app: ‘npx expo start’ in </w:t>
+      </w:r>
+      <w:r>
+        <w:rPr>
+          <w:lang w:val="en-US"/>
+        </w:rPr>
+        <w:t>mobile-app.</w:t>
+      </w:r>
+    </w:p>
+    <w:p>
+      <w:pPr>
+        <w:rPr>
+          <w:b/>
+          <w:bCs/>
+          <w:lang w:val="en-US"/>
+        </w:rPr>
+      </w:pPr>
+      <w:r>
+        <w:rPr>
+          <w:b/>
+          <w:bCs/>
+          <w:lang w:val="en-US"/>
+        </w:rPr>
+        <w:br/>
+      </w:r>
+    </w:p>
+    <w:p>
+      <w:pPr>
+        <w:rPr>
+          <w:b/>
+          <w:bCs/>
+          <w:lang w:val="en-US"/>
+        </w:rPr>
+      </w:pPr>
+      <w:r>
+        <w:rPr>
+          <w:b/>
+          <w:bCs/>
+          <w:lang w:val="en-US"/>
+        </w:rPr>
+        <w:br w:type="page"/>
+      </w:r>
+    </w:p>
+    <w:p>
+      <w:pPr>
+        <w:rPr>
+          <w:lang w:val="en-US"/>
+        </w:rPr>
+      </w:pPr>
+      <w:r>
+        <w:rPr>
+          <w:b/>
+          <w:bCs/>
+          <w:lang w:val="en-US"/>
+        </w:rPr>
+        <w:lastRenderedPageBreak/>
+        <w:t>firebase.js:</w:t>
+      </w:r>
+      <w:r>
+        <w:rPr>
+          <w:lang w:val="en-US"/>
+        </w:rPr>
+        <w:br/>
+        <w:t xml:space="preserve">- links the </w:t>
+      </w:r>
+      <w:r>
+        <w:rPr>
+          <w:lang w:val="en-US"/>
+        </w:rPr>
+        <w:t xml:space="preserve">android </w:t>
+      </w:r>
+      <w:r>
+        <w:rPr>
+          <w:lang w:val="en-US"/>
+        </w:rPr>
+        <w:t xml:space="preserve">app to the firebase </w:t>
+      </w:r>
+      <w:r>
+        <w:rPr>
+          <w:lang w:val="en-US"/>
+        </w:rPr>
+        <w:t xml:space="preserve">web </w:t>
+      </w:r>
+      <w:r>
+        <w:rPr>
+          <w:lang w:val="en-US"/>
+        </w:rPr>
+        <w:t>app</w:t>
+      </w:r>
+      <w:r>
+        <w:rPr>
+          <w:lang w:val="en-US"/>
+        </w:rPr>
+        <w:t xml:space="preserve"> for auth and storing.</w:t>
+      </w:r>
+      <w:r>
+        <w:rPr>
+          <w:lang w:val="en-US"/>
+        </w:rPr>
+        <w:br/>
+      </w:r>
+      <w:r>
+        <w:rPr>
+          <w:noProof/>
+          <w:lang w:val="en-US"/>
+        </w:rPr>
+        <w:drawing>
+          <wp:inline distT="0" distB="0" distL="0" distR="0" wp14:anchorId="4622DF5B" wp14:editId="0D036CE1">
+            <wp:extent cx="2171184" cy="2151219"/>
+            <wp:effectExtent l="0" t="0" r="635" b="1905"/>
+            <wp:docPr id="102780249" name="Picture 1" descr="A screenshot of a computer program&#10;&#10;AI-generated content may be incorrect."/>
+            <wp:cNvGraphicFramePr>
+              <a:graphicFrameLocks xmlns:a="http://schemas.openxmlformats.org/drawingml/2006/main" noChangeAspect="1"/>
+            </wp:cNvGraphicFramePr>
+            <a:graphic xmlns:a="http://schemas.openxmlformats.org/drawingml/2006/main">
+              <a:graphicData uri="http://schemas.openxmlformats.org/drawingml/2006/picture">
+                <pic:pic xmlns:pic="http://schemas.openxmlformats.org/drawingml/2006/picture">
+                  <pic:nvPicPr>
+                    <pic:cNvPr id="102780249" name="Picture 1" descr="A screenshot of a computer program&#10;&#10;AI-generated content may be incorrect."/>
+                    <pic:cNvPicPr/>
+                  </pic:nvPicPr>
+                  <pic:blipFill>
+                    <a:blip r:embed="rId9"/>
+                    <a:stretch>
+                      <a:fillRect/>
+                    </a:stretch>
+                  </pic:blipFill>
+                  <pic:spPr>
+                    <a:xfrm>
+                      <a:off x="0" y="0"/>
+                      <a:ext cx="2190788" cy="2170642"/>
+                    </a:xfrm>
+                    <a:prstGeom prst="rect">
+                      <a:avLst/>
+                    </a:prstGeom>
+                  </pic:spPr>
+                </pic:pic>
+              </a:graphicData>
+            </a:graphic>
+          </wp:inline>
+        </w:drawing>
+      </w:r>
+      <w:r>
+        <w:rPr>
+          <w:lang w:val="en-US"/>
+        </w:rPr>
+        <w:br/>
+      </w:r>
+    </w:p>
+    <w:p>
+      <w:pPr>
+        <w:rPr>
+          <w:b/>
+          <w:bCs/>
+          <w:lang w:val="en-US"/>
+        </w:rPr>
+      </w:pPr>
+      <w:r>
+        <w:rPr>
+          <w:b/>
+          <w:bCs/>
+          <w:lang w:val="en-US"/>
+        </w:rPr>
+        <w:t>firestoreTest.js:</w:t>
+      </w:r>
+      <w:r>
+        <w:rPr>
+          <w:b/>
+          <w:bCs/>
+          <w:lang w:val="en-US"/>
+        </w:rPr>
+        <w:br/>
+      </w:r>
+      <w:r>
+        <w:rPr>
+          <w:lang w:val="en-US"/>
+        </w:rPr>
+        <w:t xml:space="preserve">- used </w:t>
+      </w:r>
+      <w:r>
+        <w:rPr>
+          <w:lang w:val="en-US"/>
+        </w:rPr>
+        <w:t xml:space="preserve">to </w:t>
+      </w:r>
+      <w:r>
+        <w:rPr>
+          <w:lang w:val="en-US"/>
+        </w:rPr>
+        <w:t xml:space="preserve">add test data to the </w:t>
+      </w:r>
+      <w:r>
+        <w:rPr>
+          <w:lang w:val="en-US"/>
+        </w:rPr>
+        <w:t>Firestore database.</w:t>
+      </w:r>
+      <w:r>
+        <w:rPr>
+          <w:b/>
+          <w:bCs/>
+          <w:lang w:val="en-US"/>
+        </w:rPr>
+        <w:br/>
+      </w:r>
+      <w:r>
+        <w:rPr>
+          <w:b/>
+          <w:bCs/>
+          <w:noProof/>
+          <w:lang w:val="en-US"/>
+        </w:rPr>
+        <w:drawing>
+          <wp:inline distT="0" distB="0" distL="0" distR="0" wp14:anchorId="37D2155C" wp14:editId="4C1DA6AF">
+            <wp:extent cx="2537064" cy="1889727"/>
+            <wp:effectExtent l="0" t="0" r="0" b="0"/>
+            <wp:docPr id="1478083659" name="Picture 1" descr="A screen shot of a computer program&#10;&#10;AI-generated content may be incorrect."/>
+            <wp:cNvGraphicFramePr>
+              <a:graphicFrameLocks xmlns:a="http://schemas.openxmlformats.org/drawingml/2006/main" noChangeAspect="1"/>
+            </wp:cNvGraphicFramePr>
+            <a:graphic xmlns:a="http://schemas.openxmlformats.org/drawingml/2006/main">
+              <a:graphicData uri="http://schemas.openxmlformats.org/drawingml/2006/picture">
+                <pic:pic xmlns:pic="http://schemas.openxmlformats.org/drawingml/2006/picture">
+                  <pic:nvPicPr>
+                    <pic:cNvPr id="1478083659" name="Picture 1" descr="A screen shot of a computer program&#10;&#10;AI-generated content may be incorrect."/>
+                    <pic:cNvPicPr/>
+                  </pic:nvPicPr>
+                  <pic:blipFill>
+                    <a:blip r:embed="rId10"/>
+                    <a:stretch>
+                      <a:fillRect/>
+                    </a:stretch>
+                  </pic:blipFill>
+                  <pic:spPr>
+                    <a:xfrm>
+                      <a:off x="0" y="0"/>
+                      <a:ext cx="2552037" cy="1900880"/>
+                    </a:xfrm>
+                    <a:prstGeom prst="rect">
+                      <a:avLst/>
+                    </a:prstGeom>
+                  </pic:spPr>
+                </pic:pic>
+              </a:graphicData>
+            </a:graphic>
+          </wp:inline>
+        </w:drawing>
+      </w:r>
+      <w:r>
+        <w:rPr>
+          <w:lang w:val="en-US"/>
+        </w:rPr>
+        <w:br/>
+      </w:r>
+      <w:r>
+        <w:rPr>
+          <w:lang w:val="en-US"/>
+        </w:rPr>
+        <w:br/>
+      </w:r>
+      <w:r>
+        <w:rPr>
+          <w:b/>
+          <w:bCs/>
+          <w:noProof/>
+          <w:lang w:val="en-US"/>
+        </w:rPr>
+        <w:drawing>
+          <wp:inline distT="0" distB="0" distL="0" distR="0" wp14:anchorId="2F8E942E" wp14:editId="597F0398">
+            <wp:extent cx="3022801" cy="2235788"/>
+            <wp:effectExtent l="0" t="0" r="6350" b="0"/>
+            <wp:docPr id="1701736993" name="Picture 1" descr="A screenshot of a computer&#10;&#10;AI-generated content may be incorrect."/>
+            <wp:cNvGraphicFramePr>
+              <a:graphicFrameLocks xmlns:a="http://schemas.openxmlformats.org/drawingml/2006/main" noChangeAspect="1"/>
+            </wp:cNvGraphicFramePr>
+            <a:graphic xmlns:a="http://schemas.openxmlformats.org/drawingml/2006/main">
+              <a:graphicData uri="http://schemas.openxmlformats.org/drawingml/2006/picture">
+                <pic:pic xmlns:pic="http://schemas.openxmlformats.org/drawingml/2006/picture">
+                  <pic:nvPicPr>
+                    <pic:cNvPr id="1701736993" name="Picture 1" descr="A screenshot of a computer&#10;&#10;AI-generated content may be incorrect."/>
+                    <pic:cNvPicPr/>
+                  </pic:nvPicPr>
+                  <pic:blipFill>
+                    <a:blip r:embed="rId11"/>
+                    <a:stretch>
+                      <a:fillRect/>
+                    </a:stretch>
+                  </pic:blipFill>
+                  <pic:spPr>
+                    <a:xfrm>
+                      <a:off x="0" y="0"/>
+                      <a:ext cx="3030307" cy="2241339"/>
+                    </a:xfrm>
+                    <a:prstGeom prst="rect">
+                      <a:avLst/>
+                    </a:prstGeom>
+                  </pic:spPr>
+                </pic:pic>
+              </a:graphicData>
+            </a:graphic>
+          </wp:inline>
+        </w:drawing>
+      </w:r>
+    </w:p>
+    <w:p>
+      <w:pPr>
+        <w:rPr>
+          <w:b/>
+          <w:bCs/>
+          <w:lang w:val="en-US"/>
+        </w:rPr>
+      </w:pPr>
+      <w:r>
+        <w:rPr>
+          <w:b/>
+          <w:bCs/>
+          <w:lang w:val="en-US"/>
+        </w:rPr>
+        <w:br/>
+      </w:r>
+      <w:r>
+        <w:rPr>
+          <w:b/>
+          <w:bCs/>
+          <w:lang w:val="en-US"/>
+        </w:rPr>
+        <w:br/>
+      </w:r>
+      <w:r>
+        <w:rPr>
+          <w:b/>
+          <w:bCs/>
+          <w:lang w:val="en-US"/>
+        </w:rPr>
+        <w:br/>
+      </w:r>
+      <w:r>
+        <w:rPr>
+          <w:b/>
+          <w:bCs/>
+          <w:lang w:val="en-US"/>
+        </w:rPr>
+        <w:br/>
+      </w:r>
+      <w:r>
+        <w:rPr>
+          <w:b/>
+          <w:bCs/>
+          <w:lang w:val="en-US"/>
+        </w:rPr>
+        <w:br/>
+      </w:r>
+      <w:r>
+        <w:rPr>
+          <w:b/>
+          <w:bCs/>
+          <w:lang w:val="en-US"/>
+        </w:rPr>
+        <w:lastRenderedPageBreak/>
+        <w:t>firebaseTest.tsx:</w:t>
+      </w:r>
+      <w:r>
+        <w:rPr>
+          <w:lang w:val="en-US"/>
+        </w:rPr>
+        <w:br/>
+      </w:r>
+      <w:r>
+        <w:rPr>
+          <w:b/>
+          <w:bCs/>
+          <w:lang w:val="en-US"/>
+        </w:rPr>
+        <w:t xml:space="preserve">- </w:t>
+      </w:r>
+      <w:r>
+        <w:rPr>
+          <w:lang w:val="en-US"/>
+        </w:rPr>
+        <w:t>U</w:t>
+      </w:r>
+      <w:r>
+        <w:rPr>
+          <w:lang w:val="en-US"/>
+        </w:rPr>
+        <w:t xml:space="preserve">sed to verify that </w:t>
+      </w:r>
+      <w:r>
+        <w:rPr>
+          <w:lang w:val="en-US"/>
+        </w:rPr>
+        <w:t>the test data was attempted to be sent to the database.</w:t>
+      </w:r>
+    </w:p>
+    <w:p>
+      <w:pPr>
+        <w:rPr>
+          <w:b/>
+          <w:bCs/>
+          <w:lang w:val="en-US"/>
+        </w:rPr>
+      </w:pPr>
+      <w:r>
+        <w:rPr>
+          <w:b/>
+          <w:bCs/>
+          <w:noProof/>
+          <w:lang w:val="en-US"/>
+        </w:rPr>
+        <w:drawing>
+          <wp:inline distT="0" distB="0" distL="0" distR="0" wp14:anchorId="034EBD50" wp14:editId="6D9347AA">
+            <wp:extent cx="2886496" cy="1712518"/>
+            <wp:effectExtent l="0" t="0" r="0" b="2540"/>
+            <wp:docPr id="858932646" name="Picture 1" descr="A screen shot of a computer program&#10;&#10;AI-generated content may be incorrect."/>
+            <wp:cNvGraphicFramePr>
+              <a:graphicFrameLocks xmlns:a="http://schemas.openxmlformats.org/drawingml/2006/main" noChangeAspect="1"/>
+            </wp:cNvGraphicFramePr>
+            <a:graphic xmlns:a="http://schemas.openxmlformats.org/drawingml/2006/main">
+              <a:graphicData uri="http://schemas.openxmlformats.org/drawingml/2006/picture">
+                <pic:pic xmlns:pic="http://schemas.openxmlformats.org/drawingml/2006/picture">
+                  <pic:nvPicPr>
+                    <pic:cNvPr id="858932646" name="Picture 1" descr="A screen shot of a computer program&#10;&#10;AI-generated content may be incorrect."/>
+                    <pic:cNvPicPr/>
+                  </pic:nvPicPr>
+                  <pic:blipFill>
+                    <a:blip r:embed="rId12"/>
+                    <a:stretch>
+                      <a:fillRect/>
+                    </a:stretch>
+                  </pic:blipFill>
+                  <pic:spPr>
+                    <a:xfrm>
+                      <a:off x="0" y="0"/>
+                      <a:ext cx="2902169" cy="1721816"/>
+                    </a:xfrm>
+                    <a:prstGeom prst="rect">
+                      <a:avLst/>
+                    </a:prstGeom>
+                  </pic:spPr>
+                </pic:pic>
+              </a:graphicData>
+            </a:graphic>
+          </wp:inline>
+        </w:drawing>
+      </w:r>
+    </w:p>
+    <w:p>
+      <w:pPr>
+        <w:rPr>
+          <w:lang w:val="en-US"/>
+        </w:rPr>
+      </w:pPr>
+      <w:r>
+        <w:rPr>
+          <w:b/>
+          <w:bCs/>
+          <w:lang w:val="en-US"/>
+        </w:rPr>
+        <w:br/>
+      </w:r>
+      <w:r>
+        <w:rPr>
+          <w:b/>
+          <w:bCs/>
+          <w:lang w:val="en-US"/>
+        </w:rPr>
+        <w:t>Index.tsx</w:t>
+      </w:r>
+      <w:r>
+        <w:rPr>
+          <w:b/>
+          <w:bCs/>
+          <w:lang w:val="en-US"/>
+        </w:rPr>
+        <w:t>:</w:t>
+      </w:r>
+      <w:r>
+        <w:rPr>
+          <w:b/>
+          <w:bCs/>
+          <w:lang w:val="en-US"/>
+        </w:rPr>
+        <w:br/>
+      </w:r>
+      <w:r>
+        <w:rPr>
+          <w:lang w:val="en-US"/>
+        </w:rPr>
+        <w:t xml:space="preserve">- </w:t>
+      </w:r>
+      <w:r>
+        <w:rPr>
+          <w:lang w:val="en-US"/>
+        </w:rPr>
+        <w:t>M</w:t>
+      </w:r>
+      <w:r>
+        <w:rPr>
+          <w:lang w:val="en-US"/>
+        </w:rPr>
+        <w:t xml:space="preserve">odified </w:t>
+      </w:r>
+      <w:r>
+        <w:rPr>
+          <w:lang w:val="en-US"/>
+        </w:rPr>
+        <w:t xml:space="preserve">from stock expo </w:t>
+      </w:r>
+      <w:proofErr w:type="spellStart"/>
+      <w:r>
+        <w:rPr>
+          <w:lang w:val="en-US"/>
+        </w:rPr>
+        <w:t>ui</w:t>
+      </w:r>
+      <w:proofErr w:type="spellEnd"/>
+      <w:r>
+        <w:rPr>
+          <w:lang w:val="en-US"/>
+        </w:rPr>
+        <w:t xml:space="preserve"> </w:t>
+      </w:r>
+      <w:r>
+        <w:rPr>
+          <w:lang w:val="en-US"/>
+        </w:rPr>
+        <w:t>to include</w:t>
+      </w:r>
+      <w:r>
+        <w:rPr>
+          <w:lang w:val="en-US"/>
+        </w:rPr>
+        <w:t xml:space="preserve"> ‘Firebase Test’ button to </w:t>
+      </w:r>
+      <w:r>
+        <w:rPr>
+          <w:lang w:val="en-US"/>
+        </w:rPr>
+        <w:t xml:space="preserve">link to </w:t>
+      </w:r>
+      <w:r>
+        <w:rPr>
+          <w:lang w:val="en-US"/>
+        </w:rPr>
+        <w:t>firebaseTest.tsx</w:t>
+      </w:r>
+      <w:r>
+        <w:rPr>
+          <w:lang w:val="en-US"/>
+        </w:rPr>
+        <w:t xml:space="preserve">, </w:t>
+      </w:r>
+      <w:r>
+        <w:rPr>
+          <w:lang w:val="en-US"/>
+        </w:rPr>
+        <w:t xml:space="preserve">triggering the FirebaseTestScreen() function, which then triggers the </w:t>
+      </w:r>
+      <w:proofErr w:type="spellStart"/>
+      <w:r>
+        <w:rPr>
+          <w:lang w:val="en-US"/>
+        </w:rPr>
+        <w:t>addUser</w:t>
+      </w:r>
+      <w:proofErr w:type="spellEnd"/>
+      <w:r>
+        <w:rPr>
+          <w:lang w:val="en-US"/>
+        </w:rPr>
+        <w:t xml:space="preserve">() function to add </w:t>
+      </w:r>
+      <w:r>
+        <w:rPr>
+          <w:lang w:val="en-US"/>
+        </w:rPr>
+        <w:t xml:space="preserve">a </w:t>
+      </w:r>
+      <w:r>
+        <w:rPr>
+          <w:lang w:val="en-US"/>
+        </w:rPr>
+        <w:t xml:space="preserve">test </w:t>
+      </w:r>
+      <w:r>
+        <w:rPr>
+          <w:lang w:val="en-US"/>
+        </w:rPr>
+        <w:t>user to the db</w:t>
+      </w:r>
+      <w:r>
+        <w:rPr>
+          <w:lang w:val="en-US"/>
+        </w:rPr>
+        <w:t>.</w:t>
+      </w:r>
+    </w:p>
+    <w:p>
+      <w:pPr>
+        <w:rPr>
+          <w:b/>
+          <w:bCs/>
+          <w:lang w:val="en-US"/>
+        </w:rPr>
+      </w:pPr>
+      <w:r>
+        <w:rPr>
+          <w:b/>
+          <w:bCs/>
+          <w:noProof/>
+          <w:lang w:val="en-US"/>
+        </w:rPr>
+        <w:drawing>
+          <wp:inline distT="0" distB="0" distL="0" distR="0" wp14:anchorId="6503EFDF" wp14:editId="7A74FA02">
+            <wp:extent cx="3453070" cy="2739578"/>
+            <wp:effectExtent l="0" t="0" r="0" b="3810"/>
+            <wp:docPr id="2004694687" name="Picture 1" descr="A computer screen shot of a program&#10;&#10;AI-generated content may be incorrect."/>
+            <wp:cNvGraphicFramePr>
+              <a:graphicFrameLocks xmlns:a="http://schemas.openxmlformats.org/drawingml/2006/main" noChangeAspect="1"/>
+            </wp:cNvGraphicFramePr>
+            <a:graphic xmlns:a="http://schemas.openxmlformats.org/drawingml/2006/main">
+              <a:graphicData uri="http://schemas.openxmlformats.org/drawingml/2006/picture">
+                <pic:pic xmlns:pic="http://schemas.openxmlformats.org/drawingml/2006/picture">
+                  <pic:nvPicPr>
+                    <pic:cNvPr id="2004694687" name="Picture 1" descr="A computer screen shot of a program&#10;&#10;AI-generated content may be incorrect."/>
+                    <pic:cNvPicPr/>
+                  </pic:nvPicPr>
+                  <pic:blipFill>
+                    <a:blip r:embed="rId13"/>
+                    <a:stretch>
+                      <a:fillRect/>
+                    </a:stretch>
+                  </pic:blipFill>
+                  <pic:spPr>
+                    <a:xfrm>
+                      <a:off x="0" y="0"/>
+                      <a:ext cx="3459375" cy="2744580"/>
+                    </a:xfrm>
+                    <a:prstGeom prst="rect">
+                      <a:avLst/>
+                    </a:prstGeom>
+                  </pic:spPr>
+                </pic:pic>
+              </a:graphicData>
+            </a:graphic>
+          </wp:inline>
+        </w:drawing>
+      </w:r>
+      <w:r>
+        <w:rPr>
+          <w:b/>
+          <w:bCs/>
+          <w:noProof/>
+          <w:lang w:val="en-US"/>
+        </w:rPr>
+        <w:drawing>
+          <wp:inline distT="0" distB="0" distL="0" distR="0" wp14:anchorId="15D7538B" wp14:editId="126A6637">
+            <wp:extent cx="1871948" cy="4112157"/>
+            <wp:effectExtent l="0" t="0" r="0" b="3175"/>
+            <wp:docPr id="1452753192" name="Picture 1" descr="A screenshot of a phone&#10;&#10;AI-generated content may be incorrect."/>
+            <wp:cNvGraphicFramePr>
+              <a:graphicFrameLocks xmlns:a="http://schemas.openxmlformats.org/drawingml/2006/main" noChangeAspect="1"/>
+            </wp:cNvGraphicFramePr>
+            <a:graphic xmlns:a="http://schemas.openxmlformats.org/drawingml/2006/main">
+              <a:graphicData uri="http://schemas.openxmlformats.org/drawingml/2006/picture">
+                <pic:pic xmlns:pic="http://schemas.openxmlformats.org/drawingml/2006/picture">
+                  <pic:nvPicPr>
+                    <pic:cNvPr id="1452753192" name="Picture 1" descr="A screenshot of a phone&#10;&#10;AI-generated content may be incorrect."/>
+                    <pic:cNvPicPr/>
+                  </pic:nvPicPr>
+                  <pic:blipFill>
+                    <a:blip r:embed="rId14"/>
+                    <a:stretch>
+                      <a:fillRect/>
+                    </a:stretch>
+                  </pic:blipFill>
+                  <pic:spPr>
+                    <a:xfrm>
+                      <a:off x="0" y="0"/>
+                      <a:ext cx="1891854" cy="4155886"/>
+                    </a:xfrm>
+                    <a:prstGeom prst="rect">
+                      <a:avLst/>
+                    </a:prstGeom>
+                  </pic:spPr>
+                </pic:pic>
+              </a:graphicData>
+            </a:graphic>
+          </wp:inline>
+        </w:drawing>
+      </w:r>
+      <w:r>
+        <w:rPr>
+          <w:b/>
+          <w:bCs/>
+          <w:lang w:val="en-US"/>
+        </w:rPr>
+        <w:br/>
+      </w:r>
+      <w:r>
+        <w:rPr>
+          <w:lang w:val="en-US"/>
+        </w:rPr>
+        <w:t xml:space="preserve">// </w:t>
+      </w:r>
+      <w:r>
+        <w:rPr>
+          <w:lang w:val="en-US"/>
+        </w:rPr>
+        <w:t xml:space="preserve">Not the best looking, but </w:t>
+      </w:r>
+      <w:r>
+        <w:rPr>
+          <w:lang w:val="en-US"/>
+        </w:rPr>
+        <w:t>added In for temporary testing purposes (as I have very little experience with TypeScript and Firestore!</w:t>
+      </w:r>
+    </w:p>
     <w:sectPr>
-      <w:pgSz w:w="11906" w:h="16838" w:orient="portrait"/>
+      <w:pgSz w:w="11906" w:h="16838"/>
       <w:pgMar w:top="1440" w:right="1440" w:bottom="1440" w:left="1440" w:header="708" w:footer="708" w:gutter="0"/>
       <w:cols w:space="708"/>
       <w:docGrid w:linePitch="360"/>
@@ -142,12 +932,132 @@
 </w:document>
 </file>
 
+<file path=word/numbering.xml><?xml version="1.0" encoding="utf-8"?>
+<w:numbering xmlns:wpc="http://schemas.microsoft.com/office/word/2010/wordprocessingCanvas" xmlns:cx="http://schemas.microsoft.com/office/drawing/2014/chartex" xmlns:cx1="http://schemas.microsoft.com/office/drawing/2015/9/8/chartex" xmlns:cx2="http://schemas.microsoft.com/office/drawing/2015/10/21/chartex" xmlns:cx3="http://schemas.microsoft.com/office/drawing/2016/5/9/chartex" xmlns:cx4="http://schemas.microsoft.com/office/drawing/2016/5/10/chartex" xmlns:cx5="http://schemas.microsoft.com/office/drawing/2016/5/11/chartex" xmlns:cx6="http://schemas.microsoft.com/office/drawing/2016/5/12/chartex" xmlns:cx7="http://schemas.microsoft.com/office/drawing/2016/5/13/chartex" xmlns:cx8="http://schemas.microsoft.com/office/drawing/2016/5/14/chartex" xmlns:mc="http://schemas.openxmlformats.org/markup-compatibility/2006" xmlns:aink="http://schemas.microsoft.com/office/drawing/2016/ink" xmlns:am3d="http://schemas.microsoft.com/office/drawing/2017/model3d" xmlns:o="urn:schemas-microsoft-com:office:office" xmlns:oel="http://schemas.microsoft.com/office/2019/extlst" xmlns:r="http://schemas.openxmlformats.org/officeDocument/2006/relationships" xmlns:m="http://schemas.openxmlformats.org/officeDocument/2006/math" xmlns:v="urn:schemas-microsoft-com:vml" xmlns:wp14="http://schemas.microsoft.com/office/word/2010/wordprocessingDrawing" xmlns:wp="http://schemas.openxmlformats.org/drawingml/2006/wordprocessingDrawing" xmlns:w10="urn:schemas-microsoft-com:office:word" xmlns:w="http://schemas.openxmlformats.org/wordprocessingml/2006/main" xmlns:w14="http://schemas.microsoft.com/office/word/2010/wordml" xmlns:w15="http://schemas.microsoft.com/office/word/2012/wordml" xmlns:w16cex="http://schemas.microsoft.com/office/word/2018/wordml/cex" xmlns:w16cid="http://schemas.microsoft.com/office/word/2016/wordml/cid" xmlns:w16="http://schemas.microsoft.com/office/word/2018/wordml" xmlns:w16du="http://schemas.microsoft.com/office/word/2023/wordml/word16du" xmlns:w16sdtdh="http://schemas.microsoft.com/office/word/2020/wordml/sdtdatahash" xmlns:w16sdtfl="http://schemas.microsoft.com/office/word/2024/wordml/sdtformatlock" xmlns:w16se="http://schemas.microsoft.com/office/word/2015/wordml/symex" xmlns:wpg="http://schemas.microsoft.com/office/word/2010/wordprocessingGroup" xmlns:wpi="http://schemas.microsoft.com/office/word/2010/wordprocessingInk" xmlns:wne="http://schemas.microsoft.com/office/word/2006/wordml" xmlns:wps="http://schemas.microsoft.com/office/word/2010/wordprocessingShape" mc:Ignorable="w14 w15 w16se w16cid w16 w16cex w16sdtdh w16sdtfl w16du wp14">
+  <w:abstractNum w:abstractNumId="0" w15:restartNumberingAfterBreak="0">
+    <w:nsid w:val="6364308B"/>
+    <w:multiLevelType w:val="hybridMultilevel"/>
+    <w:tmpl w:val="0E8EB992"/>
+    <w:lvl w:ilvl="0" w:tplc="BBA05988">
+      <w:numFmt w:val="bullet"/>
+      <w:lvlText w:val="-"/>
+      <w:lvlJc w:val="left"/>
+      <w:pPr>
+        <w:ind w:left="720" w:hanging="360"/>
+      </w:pPr>
+      <w:rPr>
+        <w:rFonts w:ascii="Aptos" w:eastAsiaTheme="minorHAnsi" w:hAnsi="Aptos" w:cstheme="minorBidi" w:hint="default"/>
+      </w:rPr>
+    </w:lvl>
+    <w:lvl w:ilvl="1" w:tplc="08090003" w:tentative="1">
+      <w:start w:val="1"/>
+      <w:numFmt w:val="bullet"/>
+      <w:lvlText w:val="o"/>
+      <w:lvlJc w:val="left"/>
+      <w:pPr>
+        <w:ind w:left="1440" w:hanging="360"/>
+      </w:pPr>
+      <w:rPr>
+        <w:rFonts w:ascii="Courier New" w:hAnsi="Courier New" w:cs="Courier New" w:hint="default"/>
+      </w:rPr>
+    </w:lvl>
+    <w:lvl w:ilvl="2" w:tplc="08090005" w:tentative="1">
+      <w:start w:val="1"/>
+      <w:numFmt w:val="bullet"/>
+      <w:lvlText w:val=""/>
+      <w:lvlJc w:val="left"/>
+      <w:pPr>
+        <w:ind w:left="2160" w:hanging="360"/>
+      </w:pPr>
+      <w:rPr>
+        <w:rFonts w:ascii="Wingdings" w:hAnsi="Wingdings" w:hint="default"/>
+      </w:rPr>
+    </w:lvl>
+    <w:lvl w:ilvl="3" w:tplc="08090001" w:tentative="1">
+      <w:start w:val="1"/>
+      <w:numFmt w:val="bullet"/>
+      <w:lvlText w:val=""/>
+      <w:lvlJc w:val="left"/>
+      <w:pPr>
+        <w:ind w:left="2880" w:hanging="360"/>
+      </w:pPr>
+      <w:rPr>
+        <w:rFonts w:ascii="Symbol" w:hAnsi="Symbol" w:hint="default"/>
+      </w:rPr>
+    </w:lvl>
+    <w:lvl w:ilvl="4" w:tplc="08090003" w:tentative="1">
+      <w:start w:val="1"/>
+      <w:numFmt w:val="bullet"/>
+      <w:lvlText w:val="o"/>
+      <w:lvlJc w:val="left"/>
+      <w:pPr>
+        <w:ind w:left="3600" w:hanging="360"/>
+      </w:pPr>
+      <w:rPr>
+        <w:rFonts w:ascii="Courier New" w:hAnsi="Courier New" w:cs="Courier New" w:hint="default"/>
+      </w:rPr>
+    </w:lvl>
+    <w:lvl w:ilvl="5" w:tplc="08090005" w:tentative="1">
+      <w:start w:val="1"/>
+      <w:numFmt w:val="bullet"/>
+      <w:lvlText w:val=""/>
+      <w:lvlJc w:val="left"/>
+      <w:pPr>
+        <w:ind w:left="4320" w:hanging="360"/>
+      </w:pPr>
+      <w:rPr>
+        <w:rFonts w:ascii="Wingdings" w:hAnsi="Wingdings" w:hint="default"/>
+      </w:rPr>
+    </w:lvl>
+    <w:lvl w:ilvl="6" w:tplc="08090001" w:tentative="1">
+      <w:start w:val="1"/>
+      <w:numFmt w:val="bullet"/>
+      <w:lvlText w:val=""/>
+      <w:lvlJc w:val="left"/>
+      <w:pPr>
+        <w:ind w:left="5040" w:hanging="360"/>
+      </w:pPr>
+      <w:rPr>
+        <w:rFonts w:ascii="Symbol" w:hAnsi="Symbol" w:hint="default"/>
+      </w:rPr>
+    </w:lvl>
+    <w:lvl w:ilvl="7" w:tplc="08090003" w:tentative="1">
+      <w:start w:val="1"/>
+      <w:numFmt w:val="bullet"/>
+      <w:lvlText w:val="o"/>
+      <w:lvlJc w:val="left"/>
+      <w:pPr>
+        <w:ind w:left="5760" w:hanging="360"/>
+      </w:pPr>
+      <w:rPr>
+        <w:rFonts w:ascii="Courier New" w:hAnsi="Courier New" w:cs="Courier New" w:hint="default"/>
+      </w:rPr>
+    </w:lvl>
+    <w:lvl w:ilvl="8" w:tplc="08090005" w:tentative="1">
+      <w:start w:val="1"/>
+      <w:numFmt w:val="bullet"/>
+      <w:lvlText w:val=""/>
+      <w:lvlJc w:val="left"/>
+      <w:pPr>
+        <w:ind w:left="6480" w:hanging="360"/>
+      </w:pPr>
+      <w:rPr>
+        <w:rFonts w:ascii="Wingdings" w:hAnsi="Wingdings" w:hint="default"/>
+      </w:rPr>
+    </w:lvl>
+  </w:abstractNum>
+  <w:num w:numId="1" w16cid:durableId="413480618">
+    <w:abstractNumId w:val="0"/>
+  </w:num>
+</w:numbering>
+</file>
+
 <file path=word/styles.xml><?xml version="1.0" encoding="utf-8"?>
 <w:styles xmlns:mc="http://schemas.openxmlformats.org/markup-compatibility/2006" xmlns:r="http://schemas.openxmlformats.org/officeDocument/2006/relationships" xmlns:w="http://schemas.openxmlformats.org/wordprocessingml/2006/main" xmlns:w14="http://schemas.microsoft.com/office/word/2010/wordml" xmlns:w15="http://schemas.microsoft.com/office/word/2012/wordml" xmlns:w16cex="http://schemas.microsoft.com/office/word/2018/wordml/cex" xmlns:w16cid="http://schemas.microsoft.com/office/word/2016/wordml/cid" xmlns:w16="http://schemas.microsoft.com/office/word/2018/wordml" xmlns:w16du="http://schemas.microsoft.com/office/word/2023/wordml/word16du" xmlns:w16sdtdh="http://schemas.microsoft.com/office/word/2020/wordml/sdtdatahash" xmlns:w16sdtfl="http://schemas.microsoft.com/office/word/2024/wordml/sdtformatlock" xmlns:w16se="http://schemas.microsoft.com/office/word/2015/wordml/symex" mc:Ignorable="w14 w15 w16se w16cid w16 w16cex w16sdtdh w16sdtfl w16du">
   <w:docDefaults>
     <w:rPrDefault>
       <w:rPr>
-        <w:rFonts w:asciiTheme="minorHAnsi" w:hAnsiTheme="minorHAnsi" w:eastAsiaTheme="minorHAnsi" w:cstheme="minorBidi"/>
+        <w:rFonts w:asciiTheme="minorHAnsi" w:eastAsiaTheme="minorHAnsi" w:hAnsiTheme="minorHAnsi" w:cstheme="minorBidi"/>
         <w:kern w:val="2"/>
         <w:sz w:val="22"/>
         <w:szCs w:val="22"/>
@@ -164,14 +1074,14 @@
   <w:latentStyles w:defLockedState="0" w:defUIPriority="99" w:defSemiHidden="0" w:defUnhideWhenUsed="0" w:defQFormat="0" w:count="376">
     <w:lsdException w:name="Normal" w:uiPriority="0" w:qFormat="1"/>
     <w:lsdException w:name="heading 1" w:uiPriority="9" w:qFormat="1"/>
-    <w:lsdException w:name="heading 2" w:uiPriority="9" w:semiHidden="1" w:unhideWhenUsed="1" w:qFormat="1"/>
-    <w:lsdException w:name="heading 3" w:uiPriority="9" w:semiHidden="1" w:unhideWhenUsed="1" w:qFormat="1"/>
-    <w:lsdException w:name="heading 4" w:uiPriority="9" w:semiHidden="1" w:unhideWhenUsed="1" w:qFormat="1"/>
-    <w:lsdException w:name="heading 5" w:uiPriority="9" w:semiHidden="1" w:unhideWhenUsed="1" w:qFormat="1"/>
-    <w:lsdException w:name="heading 6" w:uiPriority="9" w:semiHidden="1" w:unhideWhenUsed="1" w:qFormat="1"/>
-    <w:lsdException w:name="heading 7" w:uiPriority="9" w:semiHidden="1" w:unhideWhenUsed="1" w:qFormat="1"/>
-    <w:lsdException w:name="heading 8" w:uiPriority="9" w:semiHidden="1" w:unhideWhenUsed="1" w:qFormat="1"/>
-    <w:lsdException w:name="heading 9" w:uiPriority="9" w:semiHidden="1" w:unhideWhenUsed="1" w:qFormat="1"/>
+    <w:lsdException w:name="heading 2" w:semiHidden="1" w:uiPriority="9" w:unhideWhenUsed="1" w:qFormat="1"/>
+    <w:lsdException w:name="heading 3" w:semiHidden="1" w:uiPriority="9" w:unhideWhenUsed="1" w:qFormat="1"/>
+    <w:lsdException w:name="heading 4" w:semiHidden="1" w:uiPriority="9" w:unhideWhenUsed="1" w:qFormat="1"/>
+    <w:lsdException w:name="heading 5" w:semiHidden="1" w:uiPriority="9" w:unhideWhenUsed="1" w:qFormat="1"/>
+    <w:lsdException w:name="heading 6" w:semiHidden="1" w:uiPriority="9" w:unhideWhenUsed="1" w:qFormat="1"/>
+    <w:lsdException w:name="heading 7" w:semiHidden="1" w:uiPriority="9" w:unhideWhenUsed="1" w:qFormat="1"/>
+    <w:lsdException w:name="heading 8" w:semiHidden="1" w:uiPriority="9" w:unhideWhenUsed="1" w:qFormat="1"/>
+    <w:lsdException w:name="heading 9" w:semiHidden="1" w:uiPriority="9" w:unhideWhenUsed="1" w:qFormat="1"/>
     <w:lsdException w:name="index 1" w:semiHidden="1" w:unhideWhenUsed="1"/>
     <w:lsdException w:name="index 2" w:semiHidden="1" w:unhideWhenUsed="1"/>
     <w:lsdException w:name="index 3" w:semiHidden="1" w:unhideWhenUsed="1"/>
@@ -181,22 +1091,22 @@
     <w:lsdException w:name="index 7" w:semiHidden="1" w:unhideWhenUsed="1"/>
     <w:lsdException w:name="index 8" w:semiHidden="1" w:unhideWhenUsed="1"/>
     <w:lsdException w:name="index 9" w:semiHidden="1" w:unhideWhenUsed="1"/>
-    <w:lsdException w:name="toc 1" w:uiPriority="39" w:semiHidden="1" w:unhideWhenUsed="1"/>
-    <w:lsdException w:name="toc 2" w:uiPriority="39" w:semiHidden="1" w:unhideWhenUsed="1"/>
-    <w:lsdException w:name="toc 3" w:uiPriority="39" w:semiHidden="1" w:unhideWhenUsed="1"/>
-    <w:lsdException w:name="toc 4" w:uiPriority="39" w:semiHidden="1" w:unhideWhenUsed="1"/>
-    <w:lsdException w:name="toc 5" w:uiPriority="39" w:semiHidden="1" w:unhideWhenUsed="1"/>
-    <w:lsdException w:name="toc 6" w:uiPriority="39" w:semiHidden="1" w:unhideWhenUsed="1"/>
-    <w:lsdException w:name="toc 7" w:uiPriority="39" w:semiHidden="1" w:unhideWhenUsed="1"/>
-    <w:lsdException w:name="toc 8" w:uiPriority="39" w:semiHidden="1" w:unhideWhenUsed="1"/>
-    <w:lsdException w:name="toc 9" w:uiPriority="39" w:semiHidden="1" w:unhideWhenUsed="1"/>
+    <w:lsdException w:name="toc 1" w:semiHidden="1" w:uiPriority="39" w:unhideWhenUsed="1"/>
+    <w:lsdException w:name="toc 2" w:semiHidden="1" w:uiPriority="39" w:unhideWhenUsed="1"/>
+    <w:lsdException w:name="toc 3" w:semiHidden="1" w:uiPriority="39" w:unhideWhenUsed="1"/>
+    <w:lsdException w:name="toc 4" w:semiHidden="1" w:uiPriority="39" w:unhideWhenUsed="1"/>
+    <w:lsdException w:name="toc 5" w:semiHidden="1" w:uiPriority="39" w:unhideWhenUsed="1"/>
+    <w:lsdException w:name="toc 6" w:semiHidden="1" w:uiPriority="39" w:unhideWhenUsed="1"/>
+    <w:lsdException w:name="toc 7" w:semiHidden="1" w:uiPriority="39" w:unhideWhenUsed="1"/>
+    <w:lsdException w:name="toc 8" w:semiHidden="1" w:uiPriority="39" w:unhideWhenUsed="1"/>
+    <w:lsdException w:name="toc 9" w:semiHidden="1" w:uiPriority="39" w:unhideWhenUsed="1"/>
     <w:lsdException w:name="Normal Indent" w:semiHidden="1" w:unhideWhenUsed="1"/>
     <w:lsdException w:name="footnote text" w:semiHidden="1" w:unhideWhenUsed="1"/>
     <w:lsdException w:name="annotation text" w:semiHidden="1" w:unhideWhenUsed="1"/>
     <w:lsdException w:name="header" w:semiHidden="1" w:unhideWhenUsed="1"/>
     <w:lsdException w:name="footer" w:semiHidden="1" w:unhideWhenUsed="1"/>
     <w:lsdException w:name="index heading" w:semiHidden="1" w:unhideWhenUsed="1"/>
-    <w:lsdException w:name="caption" w:uiPriority="35" w:semiHidden="1" w:unhideWhenUsed="1" w:qFormat="1"/>
+    <w:lsdException w:name="caption" w:semiHidden="1" w:uiPriority="35" w:unhideWhenUsed="1" w:qFormat="1"/>
     <w:lsdException w:name="table of figures" w:semiHidden="1" w:unhideWhenUsed="1"/>
     <w:lsdException w:name="envelope address" w:semiHidden="1" w:unhideWhenUsed="1"/>
     <w:lsdException w:name="envelope return" w:semiHidden="1" w:unhideWhenUsed="1"/>
@@ -227,7 +1137,7 @@
     <w:lsdException w:name="Title" w:uiPriority="10" w:qFormat="1"/>
     <w:lsdException w:name="Closing" w:semiHidden="1" w:unhideWhenUsed="1"/>
     <w:lsdException w:name="Signature" w:semiHidden="1" w:unhideWhenUsed="1"/>
-    <w:lsdException w:name="Default Paragraph Font" w:uiPriority="1" w:semiHidden="1" w:unhideWhenUsed="1"/>
+    <w:lsdException w:name="Default Paragraph Font" w:semiHidden="1" w:uiPriority="1" w:unhideWhenUsed="1"/>
     <w:lsdException w:name="Body Text" w:semiHidden="1" w:unhideWhenUsed="1"/>
     <w:lsdException w:name="Body Text Indent" w:semiHidden="1" w:unhideWhenUsed="1"/>
     <w:lsdException w:name="List Continue" w:semiHidden="1" w:unhideWhenUsed="1"/>
@@ -427,8 +1337,8 @@
     <w:lsdException w:name="Subtle Reference" w:uiPriority="31" w:qFormat="1"/>
     <w:lsdException w:name="Intense Reference" w:uiPriority="32" w:qFormat="1"/>
     <w:lsdException w:name="Book Title" w:uiPriority="33" w:qFormat="1"/>
-    <w:lsdException w:name="Bibliography" w:uiPriority="37" w:semiHidden="1" w:unhideWhenUsed="1"/>
-    <w:lsdException w:name="TOC Heading" w:uiPriority="39" w:semiHidden="1" w:unhideWhenUsed="1" w:qFormat="1"/>
+    <w:lsdException w:name="Bibliography" w:semiHidden="1" w:uiPriority="37" w:unhideWhenUsed="1"/>
+    <w:lsdException w:name="TOC Heading" w:semiHidden="1" w:uiPriority="39" w:unhideWhenUsed="1" w:qFormat="1"/>
     <w:lsdException w:name="Plain Table 1" w:uiPriority="41"/>
     <w:lsdException w:name="Plain Table 2" w:uiPriority="42"/>
     <w:lsdException w:name="Plain Table 3" w:uiPriority="43"/>
@@ -539,7 +1449,7 @@
     <w:lsdException w:name="Unresolved Mention" w:semiHidden="1" w:unhideWhenUsed="1"/>
     <w:lsdException w:name="Smart Link" w:semiHidden="1" w:unhideWhenUsed="1"/>
   </w:latentStyles>
-  <w:style w:type="paragraph" w:styleId="Normal" w:default="1">
+  <w:style w:type="paragraph" w:default="1" w:styleId="Normal">
     <w:name w:val="Normal"/>
     <w:qFormat/>
   </w:style>
@@ -558,7 +1468,7 @@
       <w:outlineLvl w:val="0"/>
     </w:pPr>
     <w:rPr>
-      <w:rFonts w:asciiTheme="majorHAnsi" w:hAnsiTheme="majorHAnsi" w:eastAsiaTheme="majorEastAsia" w:cstheme="majorBidi"/>
+      <w:rFonts w:asciiTheme="majorHAnsi" w:eastAsiaTheme="majorEastAsia" w:hAnsiTheme="majorHAnsi" w:cstheme="majorBidi"/>
       <w:color w:val="0F4761" w:themeColor="accent1" w:themeShade="BF"/>
       <w:sz w:val="40"/>
       <w:szCs w:val="40"/>
@@ -580,7 +1490,7 @@
       <w:outlineLvl w:val="1"/>
     </w:pPr>
     <w:rPr>
-      <w:rFonts w:asciiTheme="majorHAnsi" w:hAnsiTheme="majorHAnsi" w:eastAsiaTheme="majorEastAsia" w:cstheme="majorBidi"/>
+      <w:rFonts w:asciiTheme="majorHAnsi" w:eastAsiaTheme="majorEastAsia" w:hAnsiTheme="majorHAnsi" w:cstheme="majorBidi"/>
       <w:color w:val="0F4761" w:themeColor="accent1" w:themeShade="BF"/>
       <w:sz w:val="32"/>
       <w:szCs w:val="32"/>
@@ -739,13 +1649,13 @@
       <w:color w:val="272727" w:themeColor="text1" w:themeTint="D8"/>
     </w:rPr>
   </w:style>
-  <w:style w:type="character" w:styleId="DefaultParagraphFont" w:default="1">
+  <w:style w:type="character" w:default="1" w:styleId="DefaultParagraphFont">
     <w:name w:val="Default Paragraph Font"/>
     <w:uiPriority w:val="1"/>
     <w:semiHidden/>
     <w:unhideWhenUsed/>
   </w:style>
-  <w:style w:type="table" w:styleId="TableNormal" w:default="1">
+  <w:style w:type="table" w:default="1" w:styleId="TableNormal">
     <w:name w:val="Normal Table"/>
     <w:uiPriority w:val="99"/>
     <w:semiHidden/>
@@ -760,39 +1670,39 @@
       </w:tblCellMar>
     </w:tblPr>
   </w:style>
-  <w:style w:type="numbering" w:styleId="NoList" w:default="1">
+  <w:style w:type="numbering" w:default="1" w:styleId="NoList">
     <w:name w:val="No List"/>
     <w:uiPriority w:val="99"/>
     <w:semiHidden/>
     <w:unhideWhenUsed/>
   </w:style>
-  <w:style w:type="character" w:styleId="Heading1Char" w:customStyle="1">
+  <w:style w:type="character" w:customStyle="1" w:styleId="Heading1Char">
     <w:name w:val="Heading 1 Char"/>
     <w:basedOn w:val="DefaultParagraphFont"/>
     <w:link w:val="Heading1"/>
     <w:uiPriority w:val="9"/>
     <w:rsid w:val="00015547"/>
     <w:rPr>
-      <w:rFonts w:asciiTheme="majorHAnsi" w:hAnsiTheme="majorHAnsi" w:eastAsiaTheme="majorEastAsia" w:cstheme="majorBidi"/>
+      <w:rFonts w:asciiTheme="majorHAnsi" w:eastAsiaTheme="majorEastAsia" w:hAnsiTheme="majorHAnsi" w:cstheme="majorBidi"/>
       <w:color w:val="0F4761" w:themeColor="accent1" w:themeShade="BF"/>
       <w:sz w:val="40"/>
       <w:szCs w:val="40"/>
     </w:rPr>
   </w:style>
-  <w:style w:type="character" w:styleId="Heading2Char" w:customStyle="1">
+  <w:style w:type="character" w:customStyle="1" w:styleId="Heading2Char">
     <w:name w:val="Heading 2 Char"/>
     <w:basedOn w:val="DefaultParagraphFont"/>
     <w:link w:val="Heading2"/>
     <w:uiPriority w:val="9"/>
     <w:rsid w:val="00015547"/>
     <w:rPr>
-      <w:rFonts w:asciiTheme="majorHAnsi" w:hAnsiTheme="majorHAnsi" w:eastAsiaTheme="majorEastAsia" w:cstheme="majorBidi"/>
+      <w:rFonts w:asciiTheme="majorHAnsi" w:eastAsiaTheme="majorEastAsia" w:hAnsiTheme="majorHAnsi" w:cstheme="majorBidi"/>
       <w:color w:val="0F4761" w:themeColor="accent1" w:themeShade="BF"/>
       <w:sz w:val="32"/>
       <w:szCs w:val="32"/>
     </w:rPr>
   </w:style>
-  <w:style w:type="character" w:styleId="Heading3Char" w:customStyle="1">
+  <w:style w:type="character" w:customStyle="1" w:styleId="Heading3Char">
     <w:name w:val="Heading 3 Char"/>
     <w:basedOn w:val="DefaultParagraphFont"/>
     <w:link w:val="Heading3"/>
@@ -805,7 +1715,7 @@
       <w:szCs w:val="28"/>
     </w:rPr>
   </w:style>
-  <w:style w:type="character" w:styleId="Heading4Char" w:customStyle="1">
+  <w:style w:type="character" w:customStyle="1" w:styleId="Heading4Char">
     <w:name w:val="Heading 4 Char"/>
     <w:basedOn w:val="DefaultParagraphFont"/>
     <w:link w:val="Heading4"/>
@@ -818,7 +1728,7 @@
       <w:color w:val="0F4761" w:themeColor="accent1" w:themeShade="BF"/>
     </w:rPr>
   </w:style>
-  <w:style w:type="character" w:styleId="Heading5Char" w:customStyle="1">
+  <w:style w:type="character" w:customStyle="1" w:styleId="Heading5Char">
     <w:name w:val="Heading 5 Char"/>
     <w:basedOn w:val="DefaultParagraphFont"/>
     <w:link w:val="Heading5"/>
@@ -830,7 +1740,7 @@
       <w:color w:val="0F4761" w:themeColor="accent1" w:themeShade="BF"/>
     </w:rPr>
   </w:style>
-  <w:style w:type="character" w:styleId="Heading6Char" w:customStyle="1">
+  <w:style w:type="character" w:customStyle="1" w:styleId="Heading6Char">
     <w:name w:val="Heading 6 Char"/>
     <w:basedOn w:val="DefaultParagraphFont"/>
     <w:link w:val="Heading6"/>
@@ -844,7 +1754,7 @@
       <w:color w:val="595959" w:themeColor="text1" w:themeTint="A6"/>
     </w:rPr>
   </w:style>
-  <w:style w:type="character" w:styleId="Heading7Char" w:customStyle="1">
+  <w:style w:type="character" w:customStyle="1" w:styleId="Heading7Char">
     <w:name w:val="Heading 7 Char"/>
     <w:basedOn w:val="DefaultParagraphFont"/>
     <w:link w:val="Heading7"/>
@@ -856,7 +1766,7 @@
       <w:color w:val="595959" w:themeColor="text1" w:themeTint="A6"/>
     </w:rPr>
   </w:style>
-  <w:style w:type="character" w:styleId="Heading8Char" w:customStyle="1">
+  <w:style w:type="character" w:customStyle="1" w:styleId="Heading8Char">
     <w:name w:val="Heading 8 Char"/>
     <w:basedOn w:val="DefaultParagraphFont"/>
     <w:link w:val="Heading8"/>
@@ -870,7 +1780,7 @@
       <w:color w:val="272727" w:themeColor="text1" w:themeTint="D8"/>
     </w:rPr>
   </w:style>
-  <w:style w:type="character" w:styleId="Heading9Char" w:customStyle="1">
+  <w:style w:type="character" w:customStyle="1" w:styleId="Heading9Char">
     <w:name w:val="Heading 9 Char"/>
     <w:basedOn w:val="DefaultParagraphFont"/>
     <w:link w:val="Heading9"/>
@@ -895,21 +1805,21 @@
       <w:contextualSpacing/>
     </w:pPr>
     <w:rPr>
-      <w:rFonts w:asciiTheme="majorHAnsi" w:hAnsiTheme="majorHAnsi" w:eastAsiaTheme="majorEastAsia" w:cstheme="majorBidi"/>
+      <w:rFonts w:asciiTheme="majorHAnsi" w:eastAsiaTheme="majorEastAsia" w:hAnsiTheme="majorHAnsi" w:cstheme="majorBidi"/>
       <w:spacing w:val="-10"/>
       <w:kern w:val="28"/>
       <w:sz w:val="56"/>
       <w:szCs w:val="56"/>
     </w:rPr>
   </w:style>
-  <w:style w:type="character" w:styleId="TitleChar" w:customStyle="1">
+  <w:style w:type="character" w:customStyle="1" w:styleId="TitleChar">
     <w:name w:val="Title Char"/>
     <w:basedOn w:val="DefaultParagraphFont"/>
     <w:link w:val="Title"/>
     <w:uiPriority w:val="10"/>
     <w:rsid w:val="00015547"/>
     <w:rPr>
-      <w:rFonts w:asciiTheme="majorHAnsi" w:hAnsiTheme="majorHAnsi" w:eastAsiaTheme="majorEastAsia" w:cstheme="majorBidi"/>
+      <w:rFonts w:asciiTheme="majorHAnsi" w:eastAsiaTheme="majorEastAsia" w:hAnsiTheme="majorHAnsi" w:cstheme="majorBidi"/>
       <w:spacing w:val="-10"/>
       <w:kern w:val="28"/>
       <w:sz w:val="56"/>
@@ -937,7 +1847,7 @@
       <w:szCs w:val="28"/>
     </w:rPr>
   </w:style>
-  <w:style w:type="character" w:styleId="SubtitleChar" w:customStyle="1">
+  <w:style w:type="character" w:customStyle="1" w:styleId="SubtitleChar">
     <w:name w:val="Subtitle Char"/>
     <w:basedOn w:val="DefaultParagraphFont"/>
     <w:link w:val="Subtitle"/>
@@ -969,7 +1879,7 @@
       <w:color w:val="404040" w:themeColor="text1" w:themeTint="BF"/>
     </w:rPr>
   </w:style>
-  <w:style w:type="character" w:styleId="QuoteChar" w:customStyle="1">
+  <w:style w:type="character" w:customStyle="1" w:styleId="QuoteChar">
     <w:name w:val="Quote Char"/>
     <w:basedOn w:val="DefaultParagraphFont"/>
     <w:link w:val="Quote"/>
@@ -1014,8 +1924,8 @@
     <w:rsid w:val="00015547"/>
     <w:pPr>
       <w:pBdr>
-        <w:top w:val="single" w:color="0F4761" w:themeColor="accent1" w:themeShade="BF" w:sz="4" w:space="10"/>
-        <w:bottom w:val="single" w:color="0F4761" w:themeColor="accent1" w:themeShade="BF" w:sz="4" w:space="10"/>
+        <w:top w:val="single" w:sz="4" w:space="10" w:color="0F4761" w:themeColor="accent1" w:themeShade="BF"/>
+        <w:bottom w:val="single" w:sz="4" w:space="10" w:color="0F4761" w:themeColor="accent1" w:themeShade="BF"/>
       </w:pBdr>
       <w:spacing w:before="360" w:after="360"/>
       <w:ind w:left="864" w:right="864"/>
@@ -1027,7 +1937,7 @@
       <w:color w:val="0F4761" w:themeColor="accent1" w:themeShade="BF"/>
     </w:rPr>
   </w:style>
-  <w:style w:type="character" w:styleId="IntenseQuoteChar" w:customStyle="1">
+  <w:style w:type="character" w:customStyle="1" w:styleId="IntenseQuoteChar">
     <w:name w:val="Intense Quote Char"/>
     <w:basedOn w:val="DefaultParagraphFont"/>
     <w:link w:val="IntenseQuote"/>
@@ -1057,7 +1967,7 @@
 </file>
 
 <file path=word/theme/theme1.xml><?xml version="1.0" encoding="utf-8"?>
-<a:theme xmlns:a="http://schemas.openxmlformats.org/drawingml/2006/main" xmlns:thm15="http://schemas.microsoft.com/office/thememl/2012/main" name="Office Theme">
+<a:theme xmlns:a="http://schemas.openxmlformats.org/drawingml/2006/main" name="Office Theme">
   <a:themeElements>
     <a:clrScheme name="Office">
       <a:dk1>
@@ -1352,6 +2262,23 @@
 </file>
 
 <file path=customXml/item1.xml><?xml version="1.0" encoding="utf-8"?>
+<?mso-contentType ?>
+<FormTemplates xmlns="http://schemas.microsoft.com/sharepoint/v3/contenttype/forms">
+  <Display>DocumentLibraryForm</Display>
+  <Edit>DocumentLibraryForm</Edit>
+  <New>DocumentLibraryForm</New>
+</FormTemplates>
+</file>
+
+<file path=customXml/item2.xml><?xml version="1.0" encoding="utf-8"?>
+<p:properties xmlns:p="http://schemas.microsoft.com/office/2006/metadata/properties" xmlns:xsi="http://www.w3.org/2001/XMLSchema-instance" xmlns:pc="http://schemas.microsoft.com/office/infopath/2007/PartnerControls">
+  <documentManagement>
+    <_activity xmlns="c464522a-a754-430f-b544-fd87d4c168c2" xsi:nil="true"/>
+  </documentManagement>
+</p:properties>
+</file>
+
+<file path=customXml/item3.xml><?xml version="1.0" encoding="utf-8"?>
 <ct:contentTypeSchema xmlns:ct="http://schemas.microsoft.com/office/2006/metadata/contentType" xmlns:ma="http://schemas.microsoft.com/office/2006/metadata/properties/metaAttributes" ct:_="" ma:_="" ma:contentTypeName="Document" ma:contentTypeID="0x010100FD220758017CC846AA909CC7164ED159" ma:contentTypeVersion="9" ma:contentTypeDescription="Create a new document." ma:contentTypeScope="" ma:versionID="107195f5180327e81a14725ad49c53b2">
   <xsd:schema xmlns:xsd="http://www.w3.org/2001/XMLSchema" xmlns:xs="http://www.w3.org/2001/XMLSchema" xmlns:p="http://schemas.microsoft.com/office/2006/metadata/properties" xmlns:ns3="c464522a-a754-430f-b544-fd87d4c168c2" targetNamespace="http://schemas.microsoft.com/office/2006/metadata/properties" ma:root="true" ma:fieldsID="f73c64e9107e8a5bfbbc1902deeb9531" ns3:_="">
     <xsd:import namespace="c464522a-a754-430f-b544-fd87d4c168c2"/>
@@ -1525,24 +2452,31 @@
 </ct:contentTypeSchema>
 </file>
 
-<file path=customXml/item2.xml><?xml version="1.0" encoding="utf-8"?>
-<?mso-contentType ?>
-<FormTemplates xmlns="http://schemas.microsoft.com/sharepoint/v3/contenttype/forms">
-  <Display>DocumentLibraryForm</Display>
-  <Edit>DocumentLibraryForm</Edit>
-  <New>DocumentLibraryForm</New>
-</FormTemplates>
+<file path=customXml/itemProps1.xml><?xml version="1.0" encoding="utf-8"?>
+<ds:datastoreItem xmlns:ds="http://schemas.openxmlformats.org/officeDocument/2006/customXml" ds:itemID="{C1AA33A3-61AD-4339-9E8A-C5DBB01DCEDF}">
+  <ds:schemaRefs>
+    <ds:schemaRef ds:uri="http://schemas.microsoft.com/sharepoint/v3/contenttype/forms"/>
+  </ds:schemaRefs>
+</ds:datastoreItem>
 </file>
 
-<file path=customXml/item3.xml><?xml version="1.0" encoding="utf-8"?>
-<p:properties xmlns:p="http://schemas.microsoft.com/office/2006/metadata/properties" xmlns:xsi="http://www.w3.org/2001/XMLSchema-instance" xmlns:pc="http://schemas.microsoft.com/office/infopath/2007/PartnerControls">
-  <documentManagement>
-    <_activity xmlns="c464522a-a754-430f-b544-fd87d4c168c2" xsi:nil="true"/>
-  </documentManagement>
-</p:properties>
+<file path=customXml/itemProps2.xml><?xml version="1.0" encoding="utf-8"?>
+<ds:datastoreItem xmlns:ds="http://schemas.openxmlformats.org/officeDocument/2006/customXml" ds:itemID="{F79638DA-D241-4BF3-8AD6-7F74018D56BD}">
+  <ds:schemaRefs>
+    <ds:schemaRef ds:uri="http://schemas.openxmlformats.org/package/2006/metadata/core-properties"/>
+    <ds:schemaRef ds:uri="http://purl.org/dc/elements/1.1/"/>
+    <ds:schemaRef ds:uri="http://www.w3.org/XML/1998/namespace"/>
+    <ds:schemaRef ds:uri="c464522a-a754-430f-b544-fd87d4c168c2"/>
+    <ds:schemaRef ds:uri="http://schemas.microsoft.com/office/2006/documentManagement/types"/>
+    <ds:schemaRef ds:uri="http://schemas.microsoft.com/office/2006/metadata/properties"/>
+    <ds:schemaRef ds:uri="http://schemas.microsoft.com/office/infopath/2007/PartnerControls"/>
+    <ds:schemaRef ds:uri="http://purl.org/dc/dcmitype/"/>
+    <ds:schemaRef ds:uri="http://purl.org/dc/terms/"/>
+  </ds:schemaRefs>
+</ds:datastoreItem>
 </file>
 
-<file path=customXml/itemProps1.xml><?xml version="1.0" encoding="utf-8"?>
+<file path=customXml/itemProps3.xml><?xml version="1.0" encoding="utf-8"?>
 <ds:datastoreItem xmlns:ds="http://schemas.openxmlformats.org/officeDocument/2006/customXml" ds:itemID="{DF38D78A-FDB7-47F3-B2C0-0D7B5F170E7B}">
   <ds:schemaRefs>
     <ds:schemaRef ds:uri="http://schemas.microsoft.com/office/2006/metadata/contentType"/>
@@ -1558,22 +2492,4 @@
     <ds:schemaRef ds:uri="http://schemas.microsoft.com/internal/obd"/>
   </ds:schemaRefs>
 </ds:datastoreItem>
-</file>
-
-<file path=customXml/itemProps2.xml><?xml version="1.0" encoding="utf-8"?>
-<ds:datastoreItem xmlns:ds="http://schemas.openxmlformats.org/officeDocument/2006/customXml" ds:itemID="{C1AA33A3-61AD-4339-9E8A-C5DBB01DCEDF}">
-  <ds:schemaRefs>
-    <ds:schemaRef ds:uri="http://schemas.microsoft.com/sharepoint/v3/contenttype/forms"/>
-  </ds:schemaRefs>
-</ds:datastoreItem>
-</file>
-
-<file path=customXml/itemProps3.xml><?xml version="1.0" encoding="utf-8"?>
-<ds:datastoreItem xmlns:ds="http://schemas.openxmlformats.org/officeDocument/2006/customXml" ds:itemID="{F79638DA-D241-4BF3-8AD6-7F74018D56BD}">
-  <ds:schemaRefs>
-    <ds:schemaRef ds:uri="http://schemas.microsoft.com/office/2006/metadata/properties"/>
-    <ds:schemaRef ds:uri="http://schemas.microsoft.com/office/infopath/2007/PartnerControls"/>
-    <ds:schemaRef ds:uri="c464522a-a754-430f-b544-fd87d4c168c2"/>
-  </ds:schemaRefs>
-</ds:datastoreItem>
 </file>
</xml_diff>

<commit_message>
Basic Login UI. - basic db interaction. - changed some file names to better fit functionality. - removed clutter from generic expo screens etc.
</commit_message>
<xml_diff>
--- a/Documentation/COMP3000 - Progress Report.docx
+++ b/Documentation/COMP3000 - Progress Report.docx
@@ -804,8 +804,6 @@
     <w:p>
       <w:pPr>
         <w:rPr>
-          <w:b/>
-          <w:bCs/>
           <w:lang w:val="en-US"/>
         </w:rPr>
       </w:pPr>
@@ -920,6 +918,597 @@
           <w:lang w:val="en-US"/>
         </w:rPr>
         <w:t>added In for temporary testing purposes (as I have very little experience with TypeScript and Firestore!</w:t>
+      </w:r>
+    </w:p>
+    <w:p>
+      <w:pPr>
+        <w:rPr>
+          <w:lang w:val="en-US"/>
+        </w:rPr>
+      </w:pPr>
+      <w:r>
+        <w:rPr>
+          <w:lang w:val="en-US"/>
+        </w:rPr>
+        <w:br w:type="page"/>
+      </w:r>
+    </w:p>
+    <w:p>
+      <w:pPr>
+        <w:rPr>
+          <w:b/>
+          <w:bCs/>
+          <w:lang w:val="en-US"/>
+        </w:rPr>
+      </w:pPr>
+      <w:r>
+        <w:rPr>
+          <w:b/>
+          <w:bCs/>
+          <w:lang w:val="en-US"/>
+        </w:rPr>
+        <w:lastRenderedPageBreak/>
+        <w:t>Index.tsx</w:t>
+      </w:r>
+      <w:r>
+        <w:rPr>
+          <w:b/>
+          <w:bCs/>
+          <w:lang w:val="en-US"/>
+        </w:rPr>
+        <w:br/>
+      </w:r>
+      <w:r>
+        <w:rPr>
+          <w:lang w:val="en-US"/>
+        </w:rPr>
+        <w:t xml:space="preserve">- </w:t>
+      </w:r>
+      <w:r>
+        <w:rPr>
+          <w:lang w:val="en-US"/>
+        </w:rPr>
+        <w:t xml:space="preserve">Removed placeholder text (step 1, step 2 etc.) and cleaned up page. </w:t>
+      </w:r>
+      <w:r>
+        <w:rPr>
+          <w:lang w:val="en-US"/>
+        </w:rPr>
+        <w:br/>
+        <w:t xml:space="preserve">- </w:t>
+      </w:r>
+      <w:r>
+        <w:rPr>
+          <w:lang w:val="en-US"/>
+        </w:rPr>
+        <w:t xml:space="preserve">Replaced </w:t>
+      </w:r>
+      <w:proofErr w:type="spellStart"/>
+      <w:r>
+        <w:rPr>
+          <w:lang w:val="en-US"/>
+        </w:rPr>
+        <w:t>HomeScreen</w:t>
+      </w:r>
+      <w:proofErr w:type="spellEnd"/>
+      <w:r>
+        <w:rPr>
+          <w:lang w:val="en-US"/>
+        </w:rPr>
+        <w:t xml:space="preserve"> with </w:t>
+      </w:r>
+      <w:proofErr w:type="spellStart"/>
+      <w:r>
+        <w:rPr>
+          <w:lang w:val="en-US"/>
+        </w:rPr>
+        <w:t>LoginScreen</w:t>
+      </w:r>
+      <w:proofErr w:type="spellEnd"/>
+      <w:r>
+        <w:rPr>
+          <w:lang w:val="en-US"/>
+        </w:rPr>
+        <w:t xml:space="preserve"> with </w:t>
+      </w:r>
+      <w:r>
+        <w:rPr>
+          <w:lang w:val="en-US"/>
+        </w:rPr>
+        <w:t>basic username and password fields.</w:t>
+      </w:r>
+      <w:r>
+        <w:rPr>
+          <w:lang w:val="en-US"/>
+        </w:rPr>
+        <w:br/>
+        <w:t>- Stores</w:t>
+      </w:r>
+      <w:r>
+        <w:rPr>
+          <w:lang w:val="en-US"/>
+        </w:rPr>
+        <w:t xml:space="preserve"> in Firestore database separately from test user data with separate fields for username and password.</w:t>
+      </w:r>
+    </w:p>
+    <w:p>
+      <w:pPr>
+        <w:rPr>
+          <w:lang w:val="en-US"/>
+        </w:rPr>
+      </w:pPr>
+      <w:r>
+        <w:rPr>
+          <w:noProof/>
+          <w:lang w:val="en-US"/>
+        </w:rPr>
+        <w:drawing>
+          <wp:inline distT="0" distB="0" distL="0" distR="0" wp14:anchorId="59D744AC" wp14:editId="00564AF2">
+            <wp:extent cx="2789027" cy="2457780"/>
+            <wp:effectExtent l="0" t="0" r="0" b="0"/>
+            <wp:docPr id="1800197188" name="Picture 1" descr="A computer screen shot of a program code&#10;&#10;AI-generated content may be incorrect."/>
+            <wp:cNvGraphicFramePr>
+              <a:graphicFrameLocks xmlns:a="http://schemas.openxmlformats.org/drawingml/2006/main" noChangeAspect="1"/>
+            </wp:cNvGraphicFramePr>
+            <a:graphic xmlns:a="http://schemas.openxmlformats.org/drawingml/2006/main">
+              <a:graphicData uri="http://schemas.openxmlformats.org/drawingml/2006/picture">
+                <pic:pic xmlns:pic="http://schemas.openxmlformats.org/drawingml/2006/picture">
+                  <pic:nvPicPr>
+                    <pic:cNvPr id="1800197188" name="Picture 1" descr="A computer screen shot of a program code&#10;&#10;AI-generated content may be incorrect."/>
+                    <pic:cNvPicPr/>
+                  </pic:nvPicPr>
+                  <pic:blipFill>
+                    <a:blip r:embed="rId15"/>
+                    <a:stretch>
+                      <a:fillRect/>
+                    </a:stretch>
+                  </pic:blipFill>
+                  <pic:spPr>
+                    <a:xfrm>
+                      <a:off x="0" y="0"/>
+                      <a:ext cx="2798928" cy="2466505"/>
+                    </a:xfrm>
+                    <a:prstGeom prst="rect">
+                      <a:avLst/>
+                    </a:prstGeom>
+                  </pic:spPr>
+                </pic:pic>
+              </a:graphicData>
+            </a:graphic>
+          </wp:inline>
+        </w:drawing>
+      </w:r>
+      <w:r>
+        <w:rPr>
+          <w:noProof/>
+          <w:lang w:val="en-US"/>
+        </w:rPr>
+        <w:drawing>
+          <wp:inline distT="0" distB="0" distL="0" distR="0" wp14:anchorId="2AA990BB" wp14:editId="73B24825">
+            <wp:extent cx="4524430" cy="1927870"/>
+            <wp:effectExtent l="0" t="0" r="9525" b="0"/>
+            <wp:docPr id="931292876" name="Picture 1" descr="A screenshot of a computer program&#10;&#10;AI-generated content may be incorrect."/>
+            <wp:cNvGraphicFramePr>
+              <a:graphicFrameLocks xmlns:a="http://schemas.openxmlformats.org/drawingml/2006/main" noChangeAspect="1"/>
+            </wp:cNvGraphicFramePr>
+            <a:graphic xmlns:a="http://schemas.openxmlformats.org/drawingml/2006/main">
+              <a:graphicData uri="http://schemas.openxmlformats.org/drawingml/2006/picture">
+                <pic:pic xmlns:pic="http://schemas.openxmlformats.org/drawingml/2006/picture">
+                  <pic:nvPicPr>
+                    <pic:cNvPr id="931292876" name="Picture 1" descr="A screenshot of a computer program&#10;&#10;AI-generated content may be incorrect."/>
+                    <pic:cNvPicPr/>
+                  </pic:nvPicPr>
+                  <pic:blipFill>
+                    <a:blip r:embed="rId16"/>
+                    <a:stretch>
+                      <a:fillRect/>
+                    </a:stretch>
+                  </pic:blipFill>
+                  <pic:spPr>
+                    <a:xfrm>
+                      <a:off x="0" y="0"/>
+                      <a:ext cx="4532936" cy="1931494"/>
+                    </a:xfrm>
+                    <a:prstGeom prst="rect">
+                      <a:avLst/>
+                    </a:prstGeom>
+                  </pic:spPr>
+                </pic:pic>
+              </a:graphicData>
+            </a:graphic>
+          </wp:inline>
+        </w:drawing>
+      </w:r>
+      <w:r>
+        <w:rPr>
+          <w:lang w:val="en-US"/>
+        </w:rPr>
+        <w:br/>
+      </w:r>
+    </w:p>
+    <w:p>
+      <w:pPr>
+        <w:rPr>
+          <w:lang w:val="en-US"/>
+        </w:rPr>
+      </w:pPr>
+      <w:r>
+        <w:rPr>
+          <w:b/>
+          <w:bCs/>
+          <w:lang w:val="en-US"/>
+        </w:rPr>
+        <w:lastRenderedPageBreak/>
+        <w:t>firestoreTest.js</w:t>
+      </w:r>
+      <w:r>
+        <w:rPr>
+          <w:b/>
+          <w:bCs/>
+          <w:lang w:val="en-US"/>
+        </w:rPr>
+        <w:t xml:space="preserve"> </w:t>
+      </w:r>
+      <w:r>
+        <w:rPr>
+          <w:b/>
+          <w:bCs/>
+          <w:color w:val="00B050"/>
+          <w:lang w:val="en-US"/>
+        </w:rPr>
+        <w:t xml:space="preserve">NOW CALLED firestore.js </w:t>
+      </w:r>
+      <w:r>
+        <w:rPr>
+          <w:lang w:val="en-US"/>
+        </w:rPr>
+        <w:br/>
+        <w:t>- Added basic functionality for storing  a</w:t>
+      </w:r>
+      <w:r>
+        <w:rPr>
+          <w:lang w:val="en-US"/>
+        </w:rPr>
+        <w:t xml:space="preserve"> user and renamed old function for test data user.</w:t>
+      </w:r>
+      <w:r>
+        <w:rPr>
+          <w:lang w:val="en-US"/>
+        </w:rPr>
+        <w:br/>
+      </w:r>
+      <w:r>
+        <w:rPr>
+          <w:noProof/>
+          <w:lang w:val="en-US"/>
+        </w:rPr>
+        <w:drawing>
+          <wp:inline distT="0" distB="0" distL="0" distR="0" wp14:anchorId="1A9EB566" wp14:editId="48850610">
+            <wp:extent cx="2638238" cy="3055048"/>
+            <wp:effectExtent l="0" t="0" r="0" b="0"/>
+            <wp:docPr id="159686663" name="Picture 1" descr="A screenshot of a computer program&#10;&#10;AI-generated content may be incorrect."/>
+            <wp:cNvGraphicFramePr>
+              <a:graphicFrameLocks xmlns:a="http://schemas.openxmlformats.org/drawingml/2006/main" noChangeAspect="1"/>
+            </wp:cNvGraphicFramePr>
+            <a:graphic xmlns:a="http://schemas.openxmlformats.org/drawingml/2006/main">
+              <a:graphicData uri="http://schemas.openxmlformats.org/drawingml/2006/picture">
+                <pic:pic xmlns:pic="http://schemas.openxmlformats.org/drawingml/2006/picture">
+                  <pic:nvPicPr>
+                    <pic:cNvPr id="159686663" name="Picture 1" descr="A screenshot of a computer program&#10;&#10;AI-generated content may be incorrect."/>
+                    <pic:cNvPicPr/>
+                  </pic:nvPicPr>
+                  <pic:blipFill>
+                    <a:blip r:embed="rId17"/>
+                    <a:stretch>
+                      <a:fillRect/>
+                    </a:stretch>
+                  </pic:blipFill>
+                  <pic:spPr>
+                    <a:xfrm>
+                      <a:off x="0" y="0"/>
+                      <a:ext cx="2641534" cy="3058864"/>
+                    </a:xfrm>
+                    <a:prstGeom prst="rect">
+                      <a:avLst/>
+                    </a:prstGeom>
+                  </pic:spPr>
+                </pic:pic>
+              </a:graphicData>
+            </a:graphic>
+          </wp:inline>
+        </w:drawing>
+      </w:r>
+    </w:p>
+    <w:p>
+      <w:pPr>
+        <w:rPr>
+          <w:b/>
+          <w:bCs/>
+          <w:color w:val="EE0000"/>
+          <w:lang w:val="en-US"/>
+        </w:rPr>
+      </w:pPr>
+      <w:r>
+        <w:rPr>
+          <w:lang w:val="en-US"/>
+        </w:rPr>
+        <w:t>// MUST REPLACE THE PASSWORD SAVING LOGIC LATER TO USE FIREBASE AUTH INSTEAD!! NOT SAFE!!</w:t>
+      </w:r>
+      <w:r>
+        <w:rPr>
+          <w:lang w:val="en-US"/>
+        </w:rPr>
+        <w:br/>
+      </w:r>
+      <w:r>
+        <w:rPr>
+          <w:lang w:val="en-US"/>
+        </w:rPr>
+        <w:br/>
+      </w:r>
+    </w:p>
+    <w:p>
+      <w:pPr>
+        <w:rPr>
+          <w:b/>
+          <w:bCs/>
+          <w:color w:val="EE0000"/>
+          <w:lang w:val="en-US"/>
+        </w:rPr>
+      </w:pPr>
+      <w:r>
+        <w:rPr>
+          <w:b/>
+          <w:bCs/>
+          <w:color w:val="EE0000"/>
+          <w:lang w:val="en-US"/>
+        </w:rPr>
+        <w:br w:type="page"/>
+      </w:r>
+    </w:p>
+    <w:p>
+      <w:pPr>
+        <w:rPr>
+          <w:color w:val="EE0000"/>
+          <w:lang w:val="en-US"/>
+        </w:rPr>
+      </w:pPr>
+      <w:r>
+        <w:rPr>
+          <w:b/>
+          <w:bCs/>
+          <w:color w:val="EE0000"/>
+          <w:lang w:val="en-US"/>
+        </w:rPr>
+        <w:lastRenderedPageBreak/>
+        <w:t>ISSUES:</w:t>
+      </w:r>
+      <w:r>
+        <w:rPr>
+          <w:color w:val="EE0000"/>
+          <w:lang w:val="en-US"/>
+        </w:rPr>
+        <w:br/>
+      </w:r>
+      <w:r>
+        <w:rPr>
+          <w:color w:val="EE0000"/>
+          <w:lang w:val="en-US"/>
+        </w:rPr>
+        <w:br/>
+      </w:r>
+      <w:r>
+        <w:rPr>
+          <w:color w:val="EE0000"/>
+          <w:lang w:val="en-US"/>
+        </w:rPr>
+        <w:t>Android emulator stopped working, so had to develop further on web version (not ideal!)</w:t>
+      </w:r>
+      <w:r>
+        <w:rPr>
+          <w:color w:val="EE0000"/>
+          <w:lang w:val="en-US"/>
+        </w:rPr>
+        <w:br/>
+      </w:r>
+      <w:r>
+        <w:rPr>
+          <w:color w:val="EE0000"/>
+          <w:lang w:val="en-US"/>
+        </w:rPr>
+        <w:br/>
+      </w:r>
+      <w:r>
+        <w:rPr>
+          <w:noProof/>
+          <w:lang w:val="en-US"/>
+        </w:rPr>
+        <w:drawing>
+          <wp:inline distT="0" distB="0" distL="0" distR="0" wp14:anchorId="4433F66B" wp14:editId="16C2135E">
+            <wp:extent cx="4313008" cy="2045644"/>
+            <wp:effectExtent l="0" t="0" r="0" b="0"/>
+            <wp:docPr id="1537136193" name="Picture 1" descr="A computer screen with a white and blue stripe&#10;&#10;AI-generated content may be incorrect."/>
+            <wp:cNvGraphicFramePr>
+              <a:graphicFrameLocks xmlns:a="http://schemas.openxmlformats.org/drawingml/2006/main" noChangeAspect="1"/>
+            </wp:cNvGraphicFramePr>
+            <a:graphic xmlns:a="http://schemas.openxmlformats.org/drawingml/2006/main">
+              <a:graphicData uri="http://schemas.openxmlformats.org/drawingml/2006/picture">
+                <pic:pic xmlns:pic="http://schemas.openxmlformats.org/drawingml/2006/picture">
+                  <pic:nvPicPr>
+                    <pic:cNvPr id="1537136193" name="Picture 1" descr="A computer screen with a white and blue stripe&#10;&#10;AI-generated content may be incorrect."/>
+                    <pic:cNvPicPr/>
+                  </pic:nvPicPr>
+                  <pic:blipFill>
+                    <a:blip r:embed="rId18"/>
+                    <a:stretch>
+                      <a:fillRect/>
+                    </a:stretch>
+                  </pic:blipFill>
+                  <pic:spPr>
+                    <a:xfrm>
+                      <a:off x="0" y="0"/>
+                      <a:ext cx="4329431" cy="2053433"/>
+                    </a:xfrm>
+                    <a:prstGeom prst="rect">
+                      <a:avLst/>
+                    </a:prstGeom>
+                  </pic:spPr>
+                </pic:pic>
+              </a:graphicData>
+            </a:graphic>
+          </wp:inline>
+        </w:drawing>
+      </w:r>
+      <w:r>
+        <w:rPr>
+          <w:noProof/>
+          <w:color w:val="EE0000"/>
+          <w:lang w:val="en-US"/>
+        </w:rPr>
+        <w:drawing>
+          <wp:inline distT="0" distB="0" distL="0" distR="0" wp14:anchorId="354C0C2A" wp14:editId="79303379">
+            <wp:extent cx="6310946" cy="2696101"/>
+            <wp:effectExtent l="0" t="0" r="0" b="9525"/>
+            <wp:docPr id="542365620" name="Picture 1" descr="A screenshot of a computer&#10;&#10;AI-generated content may be incorrect."/>
+            <wp:cNvGraphicFramePr>
+              <a:graphicFrameLocks xmlns:a="http://schemas.openxmlformats.org/drawingml/2006/main" noChangeAspect="1"/>
+            </wp:cNvGraphicFramePr>
+            <a:graphic xmlns:a="http://schemas.openxmlformats.org/drawingml/2006/main">
+              <a:graphicData uri="http://schemas.openxmlformats.org/drawingml/2006/picture">
+                <pic:pic xmlns:pic="http://schemas.openxmlformats.org/drawingml/2006/picture">
+                  <pic:nvPicPr>
+                    <pic:cNvPr id="542365620" name="Picture 1" descr="A screenshot of a computer&#10;&#10;AI-generated content may be incorrect."/>
+                    <pic:cNvPicPr/>
+                  </pic:nvPicPr>
+                  <pic:blipFill>
+                    <a:blip r:embed="rId19"/>
+                    <a:stretch>
+                      <a:fillRect/>
+                    </a:stretch>
+                  </pic:blipFill>
+                  <pic:spPr>
+                    <a:xfrm>
+                      <a:off x="0" y="0"/>
+                      <a:ext cx="6352432" cy="2713824"/>
+                    </a:xfrm>
+                    <a:prstGeom prst="rect">
+                      <a:avLst/>
+                    </a:prstGeom>
+                  </pic:spPr>
+                </pic:pic>
+              </a:graphicData>
+            </a:graphic>
+          </wp:inline>
+        </w:drawing>
+      </w:r>
+    </w:p>
+    <w:p>
+      <w:pPr>
+        <w:rPr>
+          <w:b/>
+          <w:bCs/>
+          <w:color w:val="EE0000"/>
+          <w:lang w:val="en-US"/>
+        </w:rPr>
+      </w:pPr>
+      <w:r>
+        <w:rPr>
+          <w:b/>
+          <w:bCs/>
+          <w:color w:val="EE0000"/>
+          <w:lang w:val="en-US"/>
+        </w:rPr>
+        <w:br w:type="page"/>
+      </w:r>
+    </w:p>
+    <w:p>
+      <w:pPr>
+        <w:rPr>
+          <w:color w:val="EE0000"/>
+          <w:lang w:val="en-US"/>
+        </w:rPr>
+      </w:pPr>
+      <w:r>
+        <w:rPr>
+          <w:b/>
+          <w:bCs/>
+          <w:color w:val="EE0000"/>
+          <w:lang w:val="en-US"/>
+        </w:rPr>
+        <w:lastRenderedPageBreak/>
+        <w:t>UPDATE!</w:t>
+      </w:r>
+      <w:r>
+        <w:rPr>
+          <w:b/>
+          <w:bCs/>
+          <w:color w:val="EE0000"/>
+          <w:lang w:val="en-US"/>
+        </w:rPr>
+        <w:br/>
+      </w:r>
+      <w:r>
+        <w:rPr>
+          <w:color w:val="EE0000"/>
+          <w:lang w:val="en-US"/>
+        </w:rPr>
+        <w:t>Wiped data on emulator phone and now it works fine!</w:t>
+      </w:r>
+      <w:r>
+        <w:rPr>
+          <w:color w:val="EE0000"/>
+          <w:lang w:val="en-US"/>
+        </w:rPr>
+        <w:br/>
+      </w:r>
+      <w:r>
+        <w:rPr>
+          <w:color w:val="EE0000"/>
+          <w:lang w:val="en-US"/>
+        </w:rPr>
+        <w:br/>
+      </w:r>
+      <w:r>
+        <w:rPr>
+          <w:noProof/>
+          <w:color w:val="EE0000"/>
+          <w:lang w:val="en-US"/>
+        </w:rPr>
+        <w:drawing>
+          <wp:inline distT="0" distB="0" distL="0" distR="0" wp14:anchorId="1290627D" wp14:editId="1DD9FA9D">
+            <wp:extent cx="2261661" cy="5116412"/>
+            <wp:effectExtent l="0" t="0" r="5715" b="8255"/>
+            <wp:docPr id="1461906375" name="Picture 1" descr="A screenshot of a login form&#10;&#10;AI-generated content may be incorrect."/>
+            <wp:cNvGraphicFramePr>
+              <a:graphicFrameLocks xmlns:a="http://schemas.openxmlformats.org/drawingml/2006/main" noChangeAspect="1"/>
+            </wp:cNvGraphicFramePr>
+            <a:graphic xmlns:a="http://schemas.openxmlformats.org/drawingml/2006/main">
+              <a:graphicData uri="http://schemas.openxmlformats.org/drawingml/2006/picture">
+                <pic:pic xmlns:pic="http://schemas.openxmlformats.org/drawingml/2006/picture">
+                  <pic:nvPicPr>
+                    <pic:cNvPr id="1461906375" name="Picture 1" descr="A screenshot of a login form&#10;&#10;AI-generated content may be incorrect."/>
+                    <pic:cNvPicPr/>
+                  </pic:nvPicPr>
+                  <pic:blipFill>
+                    <a:blip r:embed="rId20"/>
+                    <a:stretch>
+                      <a:fillRect/>
+                    </a:stretch>
+                  </pic:blipFill>
+                  <pic:spPr>
+                    <a:xfrm>
+                      <a:off x="0" y="0"/>
+                      <a:ext cx="2267236" cy="5129024"/>
+                    </a:xfrm>
+                    <a:prstGeom prst="rect">
+                      <a:avLst/>
+                    </a:prstGeom>
+                  </pic:spPr>
+                </pic:pic>
+              </a:graphicData>
+            </a:graphic>
+          </wp:inline>
+        </w:drawing>
       </w:r>
     </w:p>
     <w:sectPr>
@@ -2262,20 +2851,20 @@
 </file>
 
 <file path=customXml/item1.xml><?xml version="1.0" encoding="utf-8"?>
+<p:properties xmlns:p="http://schemas.microsoft.com/office/2006/metadata/properties" xmlns:xsi="http://www.w3.org/2001/XMLSchema-instance" xmlns:pc="http://schemas.microsoft.com/office/infopath/2007/PartnerControls">
+  <documentManagement>
+    <_activity xmlns="c464522a-a754-430f-b544-fd87d4c168c2" xsi:nil="true"/>
+  </documentManagement>
+</p:properties>
+</file>
+
+<file path=customXml/item2.xml><?xml version="1.0" encoding="utf-8"?>
 <?mso-contentType ?>
 <FormTemplates xmlns="http://schemas.microsoft.com/sharepoint/v3/contenttype/forms">
   <Display>DocumentLibraryForm</Display>
   <Edit>DocumentLibraryForm</Edit>
   <New>DocumentLibraryForm</New>
 </FormTemplates>
-</file>
-
-<file path=customXml/item2.xml><?xml version="1.0" encoding="utf-8"?>
-<p:properties xmlns:p="http://schemas.microsoft.com/office/2006/metadata/properties" xmlns:xsi="http://www.w3.org/2001/XMLSchema-instance" xmlns:pc="http://schemas.microsoft.com/office/infopath/2007/PartnerControls">
-  <documentManagement>
-    <_activity xmlns="c464522a-a754-430f-b544-fd87d4c168c2" xsi:nil="true"/>
-  </documentManagement>
-</p:properties>
 </file>
 
 <file path=customXml/item3.xml><?xml version="1.0" encoding="utf-8"?>
@@ -2453,25 +3042,25 @@
 </file>
 
 <file path=customXml/itemProps1.xml><?xml version="1.0" encoding="utf-8"?>
-<ds:datastoreItem xmlns:ds="http://schemas.openxmlformats.org/officeDocument/2006/customXml" ds:itemID="{C1AA33A3-61AD-4339-9E8A-C5DBB01DCEDF}">
+<ds:datastoreItem xmlns:ds="http://schemas.openxmlformats.org/officeDocument/2006/customXml" ds:itemID="{F79638DA-D241-4BF3-8AD6-7F74018D56BD}">
   <ds:schemaRefs>
-    <ds:schemaRef ds:uri="http://schemas.microsoft.com/sharepoint/v3/contenttype/forms"/>
+    <ds:schemaRef ds:uri="http://schemas.microsoft.com/office/infopath/2007/PartnerControls"/>
+    <ds:schemaRef ds:uri="http://purl.org/dc/elements/1.1/"/>
+    <ds:schemaRef ds:uri="http://www.w3.org/XML/1998/namespace"/>
+    <ds:schemaRef ds:uri="http://schemas.microsoft.com/office/2006/metadata/properties"/>
+    <ds:schemaRef ds:uri="http://purl.org/dc/terms/"/>
+    <ds:schemaRef ds:uri="http://schemas.microsoft.com/office/2006/documentManagement/types"/>
+    <ds:schemaRef ds:uri="http://schemas.openxmlformats.org/package/2006/metadata/core-properties"/>
+    <ds:schemaRef ds:uri="c464522a-a754-430f-b544-fd87d4c168c2"/>
+    <ds:schemaRef ds:uri="http://purl.org/dc/dcmitype/"/>
   </ds:schemaRefs>
 </ds:datastoreItem>
 </file>
 
 <file path=customXml/itemProps2.xml><?xml version="1.0" encoding="utf-8"?>
-<ds:datastoreItem xmlns:ds="http://schemas.openxmlformats.org/officeDocument/2006/customXml" ds:itemID="{F79638DA-D241-4BF3-8AD6-7F74018D56BD}">
+<ds:datastoreItem xmlns:ds="http://schemas.openxmlformats.org/officeDocument/2006/customXml" ds:itemID="{C1AA33A3-61AD-4339-9E8A-C5DBB01DCEDF}">
   <ds:schemaRefs>
-    <ds:schemaRef ds:uri="http://schemas.openxmlformats.org/package/2006/metadata/core-properties"/>
-    <ds:schemaRef ds:uri="http://purl.org/dc/elements/1.1/"/>
-    <ds:schemaRef ds:uri="http://www.w3.org/XML/1998/namespace"/>
-    <ds:schemaRef ds:uri="c464522a-a754-430f-b544-fd87d4c168c2"/>
-    <ds:schemaRef ds:uri="http://schemas.microsoft.com/office/2006/documentManagement/types"/>
-    <ds:schemaRef ds:uri="http://schemas.microsoft.com/office/2006/metadata/properties"/>
-    <ds:schemaRef ds:uri="http://schemas.microsoft.com/office/infopath/2007/PartnerControls"/>
-    <ds:schemaRef ds:uri="http://purl.org/dc/dcmitype/"/>
-    <ds:schemaRef ds:uri="http://purl.org/dc/terms/"/>
+    <ds:schemaRef ds:uri="http://schemas.microsoft.com/sharepoint/v3/contenttype/forms"/>
   </ds:schemaRefs>
 </ds:datastoreItem>
 </file>

</xml_diff>

<commit_message>
Basic Login Validation. - Updated Documentation, forgot to upload with main push.
</commit_message>
<xml_diff>
--- a/Documentation/COMP3000 - Progress Report.docx
+++ b/Documentation/COMP3000 - Progress Report.docx
@@ -9,12 +9,14 @@
           <w:lang w:val="en-US"/>
         </w:rPr>
       </w:pPr>
+      <w:bookmarkStart w:id="0" w:name="_Toc212816832"/>
       <w:r>
         <w:rPr>
           <w:lang w:val="en-US"/>
         </w:rPr>
         <w:t>COMP3000 – ‘GainTrain’ Progress Report</w:t>
       </w:r>
+      <w:bookmarkEnd w:id="0"/>
     </w:p>
     <w:p>
       <w:pPr>
@@ -42,6 +44,435 @@
         </w:rPr>
       </w:pPr>
     </w:p>
+    <w:sdt>
+      <w:sdtPr>
+        <w:id w:val="1211540222"/>
+        <w:docPartObj>
+          <w:docPartGallery w:val="Table of Contents"/>
+          <w:docPartUnique/>
+        </w:docPartObj>
+      </w:sdtPr>
+      <w:sdtEndPr>
+        <w:rPr>
+          <w:rFonts w:asciiTheme="minorHAnsi" w:eastAsiaTheme="minorHAnsi" w:hAnsiTheme="minorHAnsi" w:cstheme="minorBidi"/>
+          <w:b/>
+          <w:bCs/>
+          <w:noProof/>
+          <w:color w:val="auto"/>
+          <w:kern w:val="2"/>
+          <w:sz w:val="22"/>
+          <w:szCs w:val="22"/>
+          <w:lang w:val="en-GB"/>
+          <w14:ligatures w14:val="standardContextual"/>
+        </w:rPr>
+      </w:sdtEndPr>
+      <w:sdtContent>
+        <w:p>
+          <w:pPr>
+            <w:pStyle w:val="TOCHeading"/>
+          </w:pPr>
+          <w:r>
+            <w:t>Contents</w:t>
+          </w:r>
+        </w:p>
+        <w:p>
+          <w:pPr>
+            <w:pStyle w:val="TOC1"/>
+            <w:tabs>
+              <w:tab w:val="right" w:leader="dot" w:pos="9016"/>
+            </w:tabs>
+            <w:rPr>
+              <w:noProof/>
+            </w:rPr>
+          </w:pPr>
+          <w:r>
+            <w:fldChar w:fldCharType="begin"/>
+          </w:r>
+          <w:r>
+            <w:instrText xml:space="preserve"> TOC \o "1-3" \h \z \u </w:instrText>
+          </w:r>
+          <w:r>
+            <w:fldChar w:fldCharType="separate"/>
+          </w:r>
+          <w:hyperlink w:anchor="_Toc212816832" w:history="1">
+            <w:r>
+              <w:rPr>
+                <w:rStyle w:val="Hyperlink"/>
+                <w:noProof/>
+                <w:lang w:val="en-US"/>
+              </w:rPr>
+              <w:t>COMP3000 – ‘GainTrain’ Progress Report</w:t>
+            </w:r>
+            <w:r>
+              <w:rPr>
+                <w:noProof/>
+                <w:webHidden/>
+              </w:rPr>
+              <w:tab/>
+            </w:r>
+            <w:r>
+              <w:rPr>
+                <w:noProof/>
+                <w:webHidden/>
+              </w:rPr>
+              <w:fldChar w:fldCharType="begin"/>
+            </w:r>
+            <w:r>
+              <w:rPr>
+                <w:noProof/>
+                <w:webHidden/>
+              </w:rPr>
+              <w:instrText xml:space="preserve"> PAGEREF _Toc212816832 \h </w:instrText>
+            </w:r>
+            <w:r>
+              <w:rPr>
+                <w:noProof/>
+                <w:webHidden/>
+              </w:rPr>
+            </w:r>
+            <w:r>
+              <w:rPr>
+                <w:noProof/>
+                <w:webHidden/>
+              </w:rPr>
+              <w:fldChar w:fldCharType="separate"/>
+            </w:r>
+            <w:r>
+              <w:rPr>
+                <w:noProof/>
+                <w:webHidden/>
+              </w:rPr>
+              <w:t>1</w:t>
+            </w:r>
+            <w:r>
+              <w:rPr>
+                <w:noProof/>
+                <w:webHidden/>
+              </w:rPr>
+              <w:fldChar w:fldCharType="end"/>
+            </w:r>
+          </w:hyperlink>
+        </w:p>
+        <w:p>
+          <w:pPr>
+            <w:pStyle w:val="TOC2"/>
+            <w:tabs>
+              <w:tab w:val="right" w:leader="dot" w:pos="9016"/>
+            </w:tabs>
+            <w:rPr>
+              <w:noProof/>
+            </w:rPr>
+          </w:pPr>
+          <w:hyperlink w:anchor="_Toc212816833" w:history="1">
+            <w:r>
+              <w:rPr>
+                <w:rStyle w:val="Hyperlink"/>
+                <w:noProof/>
+                <w:lang w:val="en-US"/>
+              </w:rPr>
+              <w:t>Sprints</w:t>
+            </w:r>
+            <w:r>
+              <w:rPr>
+                <w:noProof/>
+                <w:webHidden/>
+              </w:rPr>
+              <w:tab/>
+            </w:r>
+            <w:r>
+              <w:rPr>
+                <w:noProof/>
+                <w:webHidden/>
+              </w:rPr>
+              <w:fldChar w:fldCharType="begin"/>
+            </w:r>
+            <w:r>
+              <w:rPr>
+                <w:noProof/>
+                <w:webHidden/>
+              </w:rPr>
+              <w:instrText xml:space="preserve"> PAGEREF _Toc212816833 \h </w:instrText>
+            </w:r>
+            <w:r>
+              <w:rPr>
+                <w:noProof/>
+                <w:webHidden/>
+              </w:rPr>
+            </w:r>
+            <w:r>
+              <w:rPr>
+                <w:noProof/>
+                <w:webHidden/>
+              </w:rPr>
+              <w:fldChar w:fldCharType="separate"/>
+            </w:r>
+            <w:r>
+              <w:rPr>
+                <w:noProof/>
+                <w:webHidden/>
+              </w:rPr>
+              <w:t>2</w:t>
+            </w:r>
+            <w:r>
+              <w:rPr>
+                <w:noProof/>
+                <w:webHidden/>
+              </w:rPr>
+              <w:fldChar w:fldCharType="end"/>
+            </w:r>
+          </w:hyperlink>
+        </w:p>
+        <w:p>
+          <w:pPr>
+            <w:pStyle w:val="TOC3"/>
+            <w:tabs>
+              <w:tab w:val="right" w:leader="dot" w:pos="9016"/>
+            </w:tabs>
+            <w:rPr>
+              <w:noProof/>
+            </w:rPr>
+          </w:pPr>
+          <w:hyperlink w:anchor="_Toc212816834" w:history="1">
+            <w:r>
+              <w:rPr>
+                <w:rStyle w:val="Hyperlink"/>
+                <w:noProof/>
+                <w:lang w:val="en-US"/>
+              </w:rPr>
+              <w:t>Sprint 0, Due 17/10/2025</w:t>
+            </w:r>
+            <w:r>
+              <w:rPr>
+                <w:noProof/>
+                <w:webHidden/>
+              </w:rPr>
+              <w:tab/>
+            </w:r>
+            <w:r>
+              <w:rPr>
+                <w:noProof/>
+                <w:webHidden/>
+              </w:rPr>
+              <w:fldChar w:fldCharType="begin"/>
+            </w:r>
+            <w:r>
+              <w:rPr>
+                <w:noProof/>
+                <w:webHidden/>
+              </w:rPr>
+              <w:instrText xml:space="preserve"> PAGEREF _Toc212816834 \h </w:instrText>
+            </w:r>
+            <w:r>
+              <w:rPr>
+                <w:noProof/>
+                <w:webHidden/>
+              </w:rPr>
+            </w:r>
+            <w:r>
+              <w:rPr>
+                <w:noProof/>
+                <w:webHidden/>
+              </w:rPr>
+              <w:fldChar w:fldCharType="separate"/>
+            </w:r>
+            <w:r>
+              <w:rPr>
+                <w:noProof/>
+                <w:webHidden/>
+              </w:rPr>
+              <w:t>2</w:t>
+            </w:r>
+            <w:r>
+              <w:rPr>
+                <w:noProof/>
+                <w:webHidden/>
+              </w:rPr>
+              <w:fldChar w:fldCharType="end"/>
+            </w:r>
+          </w:hyperlink>
+        </w:p>
+        <w:p>
+          <w:pPr>
+            <w:pStyle w:val="TOC3"/>
+            <w:tabs>
+              <w:tab w:val="right" w:leader="dot" w:pos="9016"/>
+            </w:tabs>
+            <w:rPr>
+              <w:noProof/>
+            </w:rPr>
+          </w:pPr>
+          <w:hyperlink w:anchor="_Toc212816835" w:history="1">
+            <w:r>
+              <w:rPr>
+                <w:rStyle w:val="Hyperlink"/>
+                <w:noProof/>
+                <w:lang w:val="en-US"/>
+              </w:rPr>
+              <w:t>Sprint 1, Due 31/10/2025</w:t>
+            </w:r>
+            <w:r>
+              <w:rPr>
+                <w:noProof/>
+                <w:webHidden/>
+              </w:rPr>
+              <w:tab/>
+            </w:r>
+            <w:r>
+              <w:rPr>
+                <w:noProof/>
+                <w:webHidden/>
+              </w:rPr>
+              <w:fldChar w:fldCharType="begin"/>
+            </w:r>
+            <w:r>
+              <w:rPr>
+                <w:noProof/>
+                <w:webHidden/>
+              </w:rPr>
+              <w:instrText xml:space="preserve"> PAGEREF _Toc212816835 \h </w:instrText>
+            </w:r>
+            <w:r>
+              <w:rPr>
+                <w:noProof/>
+                <w:webHidden/>
+              </w:rPr>
+            </w:r>
+            <w:r>
+              <w:rPr>
+                <w:noProof/>
+                <w:webHidden/>
+              </w:rPr>
+              <w:fldChar w:fldCharType="separate"/>
+            </w:r>
+            <w:r>
+              <w:rPr>
+                <w:noProof/>
+                <w:webHidden/>
+              </w:rPr>
+              <w:t>3</w:t>
+            </w:r>
+            <w:r>
+              <w:rPr>
+                <w:noProof/>
+                <w:webHidden/>
+              </w:rPr>
+              <w:fldChar w:fldCharType="end"/>
+            </w:r>
+          </w:hyperlink>
+        </w:p>
+        <w:p>
+          <w:pPr>
+            <w:pStyle w:val="TOC3"/>
+            <w:tabs>
+              <w:tab w:val="right" w:leader="dot" w:pos="9016"/>
+            </w:tabs>
+            <w:rPr>
+              <w:noProof/>
+            </w:rPr>
+          </w:pPr>
+          <w:hyperlink w:anchor="_Toc212816836" w:history="1">
+            <w:r>
+              <w:rPr>
+                <w:rStyle w:val="Hyperlink"/>
+                <w:noProof/>
+                <w:lang w:val="en-US"/>
+              </w:rPr>
+              <w:t>Sprint 2, Due 14/11/2025</w:t>
+            </w:r>
+            <w:r>
+              <w:rPr>
+                <w:noProof/>
+                <w:webHidden/>
+              </w:rPr>
+              <w:tab/>
+            </w:r>
+            <w:r>
+              <w:rPr>
+                <w:noProof/>
+                <w:webHidden/>
+              </w:rPr>
+              <w:fldChar w:fldCharType="begin"/>
+            </w:r>
+            <w:r>
+              <w:rPr>
+                <w:noProof/>
+                <w:webHidden/>
+              </w:rPr>
+              <w:instrText xml:space="preserve"> PAGEREF _Toc212816836 \h </w:instrText>
+            </w:r>
+            <w:r>
+              <w:rPr>
+                <w:noProof/>
+                <w:webHidden/>
+              </w:rPr>
+            </w:r>
+            <w:r>
+              <w:rPr>
+                <w:noProof/>
+                <w:webHidden/>
+              </w:rPr>
+              <w:fldChar w:fldCharType="separate"/>
+            </w:r>
+            <w:r>
+              <w:rPr>
+                <w:noProof/>
+                <w:webHidden/>
+              </w:rPr>
+              <w:t>10</w:t>
+            </w:r>
+            <w:r>
+              <w:rPr>
+                <w:noProof/>
+                <w:webHidden/>
+              </w:rPr>
+              <w:fldChar w:fldCharType="end"/>
+            </w:r>
+          </w:hyperlink>
+        </w:p>
+        <w:p>
+          <w:r>
+            <w:rPr>
+              <w:b/>
+              <w:bCs/>
+              <w:noProof/>
+            </w:rPr>
+            <w:fldChar w:fldCharType="end"/>
+          </w:r>
+        </w:p>
+      </w:sdtContent>
+    </w:sdt>
+    <w:p>
+      <w:pPr>
+        <w:rPr>
+          <w:rFonts w:asciiTheme="majorHAnsi" w:eastAsiaTheme="majorEastAsia" w:hAnsiTheme="majorHAnsi" w:cstheme="majorBidi"/>
+          <w:color w:val="0F4761" w:themeColor="accent1" w:themeShade="BF"/>
+          <w:sz w:val="32"/>
+          <w:szCs w:val="32"/>
+          <w:u w:val="single"/>
+          <w:lang w:val="en-US"/>
+        </w:rPr>
+      </w:pPr>
+    </w:p>
+    <w:p>
+      <w:pPr>
+        <w:rPr>
+          <w:rFonts w:asciiTheme="majorHAnsi" w:eastAsiaTheme="majorEastAsia" w:hAnsiTheme="majorHAnsi" w:cstheme="majorBidi"/>
+          <w:color w:val="0F4761" w:themeColor="accent1" w:themeShade="BF"/>
+          <w:sz w:val="32"/>
+          <w:szCs w:val="32"/>
+          <w:u w:val="single"/>
+          <w:lang w:val="en-US"/>
+        </w:rPr>
+      </w:pPr>
+      <w:bookmarkStart w:id="1" w:name="_Toc212816833"/>
+      <w:r>
+        <w:rPr>
+          <w:u w:val="single"/>
+          <w:lang w:val="en-US"/>
+        </w:rPr>
+        <w:br w:type="page"/>
+      </w:r>
+    </w:p>
     <w:p>
       <w:pPr>
         <w:pStyle w:val="Heading2"/>
@@ -55,8 +486,10 @@
           <w:u w:val="single"/>
           <w:lang w:val="en-US"/>
         </w:rPr>
+        <w:lastRenderedPageBreak/>
         <w:t>Sprints</w:t>
       </w:r>
+      <w:bookmarkEnd w:id="1"/>
     </w:p>
     <w:p>
       <w:pPr>
@@ -65,6 +498,7 @@
           <w:lang w:val="en-US"/>
         </w:rPr>
       </w:pPr>
+      <w:bookmarkStart w:id="2" w:name="_Toc212816834"/>
       <w:r>
         <w:rPr>
           <w:lang w:val="en-US"/>
@@ -75,7 +509,47 @@
         <w:rPr>
           <w:lang w:val="en-US"/>
         </w:rPr>
-        <w:t>, Due 24/10/2025</w:t>
+        <w:t xml:space="preserve">, Due </w:t>
+      </w:r>
+      <w:r>
+        <w:rPr>
+          <w:lang w:val="en-US"/>
+        </w:rPr>
+        <w:t>17</w:t>
+      </w:r>
+      <w:r>
+        <w:rPr>
+          <w:lang w:val="en-US"/>
+        </w:rPr>
+        <w:t>/10/2025</w:t>
+      </w:r>
+      <w:bookmarkEnd w:id="2"/>
+    </w:p>
+    <w:p>
+      <w:pPr>
+        <w:rPr>
+          <w:lang w:val="en-US"/>
+        </w:rPr>
+      </w:pPr>
+    </w:p>
+    <w:p>
+      <w:pPr>
+        <w:pStyle w:val="Heading4"/>
+        <w:rPr>
+          <w:lang w:val="en-US"/>
+        </w:rPr>
+      </w:pPr>
+      <w:r>
+        <w:rPr>
+          <w:lang w:val="en-US"/>
+        </w:rPr>
+        <w:t xml:space="preserve">End-Of-Sprint </w:t>
+      </w:r>
+      <w:r>
+        <w:rPr>
+          <w:lang w:val="en-US"/>
+        </w:rPr>
+        <w:t>Progress:</w:t>
       </w:r>
     </w:p>
     <w:p>
@@ -104,7 +578,7 @@
                     <pic:cNvPicPr/>
                   </pic:nvPicPr>
                   <pic:blipFill>
-                    <a:blip r:embed="rId8" cstate="print">
+                    <a:blip r:embed="rId9" cstate="print">
                       <a:extLst>
                         <a:ext uri="{28A0092B-C50C-407E-A947-70E740481C1C}">
                           <a14:useLocalDpi xmlns:a14="http://schemas.microsoft.com/office/drawing/2010/main" val="0"/>
@@ -137,6 +611,46 @@
     <w:p>
       <w:pPr>
         <w:rPr>
+          <w:rFonts w:eastAsiaTheme="majorEastAsia" w:cstheme="majorBidi"/>
+          <w:color w:val="0F4761" w:themeColor="accent1" w:themeShade="BF"/>
+          <w:sz w:val="28"/>
+          <w:szCs w:val="28"/>
+          <w:lang w:val="en-US"/>
+        </w:rPr>
+      </w:pPr>
+      <w:r>
+        <w:rPr>
+          <w:lang w:val="en-US"/>
+        </w:rPr>
+        <w:br w:type="page"/>
+      </w:r>
+    </w:p>
+    <w:p>
+      <w:pPr>
+        <w:pStyle w:val="Heading3"/>
+        <w:rPr>
+          <w:lang w:val="en-US"/>
+        </w:rPr>
+      </w:pPr>
+      <w:bookmarkStart w:id="3" w:name="_Toc212816835"/>
+      <w:r>
+        <w:rPr>
+          <w:lang w:val="en-US"/>
+        </w:rPr>
+        <w:lastRenderedPageBreak/>
+        <w:t>Sprint 1, Due 3</w:t>
+      </w:r>
+      <w:r>
+        <w:rPr>
+          <w:lang w:val="en-US"/>
+        </w:rPr>
+        <w:t>1/10/2025</w:t>
+      </w:r>
+      <w:bookmarkEnd w:id="3"/>
+    </w:p>
+    <w:p>
+      <w:pPr>
+        <w:rPr>
           <w:lang w:val="en-US"/>
         </w:rPr>
       </w:pPr>
@@ -244,22 +758,6 @@
           <w:bCs/>
           <w:lang w:val="en-US"/>
         </w:rPr>
-        <w:br w:type="page"/>
-      </w:r>
-    </w:p>
-    <w:p>
-      <w:pPr>
-        <w:rPr>
-          <w:lang w:val="en-US"/>
-        </w:rPr>
-      </w:pPr>
-      <w:r>
-        <w:rPr>
-          <w:b/>
-          <w:bCs/>
-          <w:lang w:val="en-US"/>
-        </w:rPr>
-        <w:lastRenderedPageBreak/>
         <w:t>firebase.js:</w:t>
       </w:r>
       <w:r>
@@ -311,9 +809,9 @@
           <w:lang w:val="en-US"/>
         </w:rPr>
         <w:drawing>
-          <wp:inline distT="0" distB="0" distL="0" distR="0" wp14:anchorId="4622DF5B" wp14:editId="0D036CE1">
-            <wp:extent cx="2171184" cy="2151219"/>
-            <wp:effectExtent l="0" t="0" r="635" b="1905"/>
+          <wp:inline distT="0" distB="0" distL="0" distR="0" wp14:anchorId="4622DF5B" wp14:editId="22B19B49">
+            <wp:extent cx="2452495" cy="2429943"/>
+            <wp:effectExtent l="0" t="0" r="5080" b="8890"/>
             <wp:docPr id="102780249" name="Picture 1" descr="A screenshot of a computer program&#10;&#10;AI-generated content may be incorrect."/>
             <wp:cNvGraphicFramePr>
               <a:graphicFrameLocks xmlns:a="http://schemas.openxmlformats.org/drawingml/2006/main" noChangeAspect="1"/>
@@ -326,7 +824,7 @@
                     <pic:cNvPicPr/>
                   </pic:nvPicPr>
                   <pic:blipFill>
-                    <a:blip r:embed="rId9"/>
+                    <a:blip r:embed="rId10"/>
                     <a:stretch>
                       <a:fillRect/>
                     </a:stretch>
@@ -334,7 +832,7 @@
                   <pic:spPr>
                     <a:xfrm>
                       <a:off x="0" y="0"/>
-                      <a:ext cx="2190788" cy="2170642"/>
+                      <a:ext cx="2480129" cy="2457323"/>
                     </a:xfrm>
                     <a:prstGeom prst="rect">
                       <a:avLst/>
@@ -417,9 +915,9 @@
           <w:lang w:val="en-US"/>
         </w:rPr>
         <w:drawing>
-          <wp:inline distT="0" distB="0" distL="0" distR="0" wp14:anchorId="37D2155C" wp14:editId="4C1DA6AF">
-            <wp:extent cx="2537064" cy="1889727"/>
-            <wp:effectExtent l="0" t="0" r="0" b="0"/>
+          <wp:inline distT="0" distB="0" distL="0" distR="0" wp14:anchorId="37D2155C" wp14:editId="4AAD2AAB">
+            <wp:extent cx="3065535" cy="2283358"/>
+            <wp:effectExtent l="0" t="0" r="1905" b="3175"/>
             <wp:docPr id="1478083659" name="Picture 1" descr="A screen shot of a computer program&#10;&#10;AI-generated content may be incorrect."/>
             <wp:cNvGraphicFramePr>
               <a:graphicFrameLocks xmlns:a="http://schemas.openxmlformats.org/drawingml/2006/main" noChangeAspect="1"/>
@@ -432,7 +930,7 @@
                     <pic:cNvPicPr/>
                   </pic:nvPicPr>
                   <pic:blipFill>
-                    <a:blip r:embed="rId10"/>
+                    <a:blip r:embed="rId11"/>
                     <a:stretch>
                       <a:fillRect/>
                     </a:stretch>
@@ -440,7 +938,7 @@
                   <pic:spPr>
                     <a:xfrm>
                       <a:off x="0" y="0"/>
-                      <a:ext cx="2552037" cy="1900880"/>
+                      <a:ext cx="3092070" cy="2303123"/>
                     </a:xfrm>
                     <a:prstGeom prst="rect">
                       <a:avLst/>
@@ -462,6 +960,7 @@
         <w:rPr>
           <w:lang w:val="en-US"/>
         </w:rPr>
+        <w:lastRenderedPageBreak/>
         <w:br/>
       </w:r>
       <w:r>
@@ -472,9 +971,9 @@
           <w:lang w:val="en-US"/>
         </w:rPr>
         <w:drawing>
-          <wp:inline distT="0" distB="0" distL="0" distR="0" wp14:anchorId="2F8E942E" wp14:editId="597F0398">
-            <wp:extent cx="3022801" cy="2235788"/>
-            <wp:effectExtent l="0" t="0" r="6350" b="0"/>
+          <wp:inline distT="0" distB="0" distL="0" distR="0" wp14:anchorId="2F8E942E" wp14:editId="0A0D7D8B">
+            <wp:extent cx="3525461" cy="2607575"/>
+            <wp:effectExtent l="0" t="0" r="0" b="2540"/>
             <wp:docPr id="1701736993" name="Picture 1" descr="A screenshot of a computer&#10;&#10;AI-generated content may be incorrect."/>
             <wp:cNvGraphicFramePr>
               <a:graphicFrameLocks xmlns:a="http://schemas.openxmlformats.org/drawingml/2006/main" noChangeAspect="1"/>
@@ -487,7 +986,7 @@
                     <pic:cNvPicPr/>
                   </pic:nvPicPr>
                   <pic:blipFill>
-                    <a:blip r:embed="rId11"/>
+                    <a:blip r:embed="rId12"/>
                     <a:stretch>
                       <a:fillRect/>
                     </a:stretch>
@@ -495,7 +994,7 @@
                   <pic:spPr>
                     <a:xfrm>
                       <a:off x="0" y="0"/>
-                      <a:ext cx="3030307" cy="2241339"/>
+                      <a:ext cx="3539334" cy="2617836"/>
                     </a:xfrm>
                     <a:prstGeom prst="rect">
                       <a:avLst/>
@@ -546,6 +1045,12 @@
           <w:bCs/>
           <w:lang w:val="en-US"/>
         </w:rPr>
+        <w:t>firebaseTest.tsx:</w:t>
+      </w:r>
+      <w:r>
+        <w:rPr>
+          <w:lang w:val="en-US"/>
+        </w:rPr>
         <w:br/>
       </w:r>
       <w:r>
@@ -554,29 +1059,6 @@
           <w:bCs/>
           <w:lang w:val="en-US"/>
         </w:rPr>
-        <w:br/>
-      </w:r>
-      <w:r>
-        <w:rPr>
-          <w:b/>
-          <w:bCs/>
-          <w:lang w:val="en-US"/>
-        </w:rPr>
-        <w:lastRenderedPageBreak/>
-        <w:t>firebaseTest.tsx:</w:t>
-      </w:r>
-      <w:r>
-        <w:rPr>
-          <w:lang w:val="en-US"/>
-        </w:rPr>
-        <w:br/>
-      </w:r>
-      <w:r>
-        <w:rPr>
-          <w:b/>
-          <w:bCs/>
-          <w:lang w:val="en-US"/>
-        </w:rPr>
         <w:t xml:space="preserve">- </w:t>
       </w:r>
       <w:r>
@@ -614,9 +1096,9 @@
           <w:lang w:val="en-US"/>
         </w:rPr>
         <w:drawing>
-          <wp:inline distT="0" distB="0" distL="0" distR="0" wp14:anchorId="034EBD50" wp14:editId="6D9347AA">
-            <wp:extent cx="2886496" cy="1712518"/>
-            <wp:effectExtent l="0" t="0" r="0" b="2540"/>
+          <wp:inline distT="0" distB="0" distL="0" distR="0" wp14:anchorId="034EBD50" wp14:editId="1A606D51">
+            <wp:extent cx="3519030" cy="2087791"/>
+            <wp:effectExtent l="0" t="0" r="5715" b="8255"/>
             <wp:docPr id="858932646" name="Picture 1" descr="A screen shot of a computer program&#10;&#10;AI-generated content may be incorrect."/>
             <wp:cNvGraphicFramePr>
               <a:graphicFrameLocks xmlns:a="http://schemas.openxmlformats.org/drawingml/2006/main" noChangeAspect="1"/>
@@ -629,7 +1111,7 @@
                     <pic:cNvPicPr/>
                   </pic:nvPicPr>
                   <pic:blipFill>
-                    <a:blip r:embed="rId12"/>
+                    <a:blip r:embed="rId13"/>
                     <a:stretch>
                       <a:fillRect/>
                     </a:stretch>
@@ -637,7 +1119,7 @@
                   <pic:spPr>
                     <a:xfrm>
                       <a:off x="0" y="0"/>
-                      <a:ext cx="2902169" cy="1721816"/>
+                      <a:ext cx="3546227" cy="2103926"/>
                     </a:xfrm>
                     <a:prstGeom prst="rect">
                       <a:avLst/>
@@ -653,6 +1135,8 @@
     <w:p>
       <w:pPr>
         <w:rPr>
+          <w:b/>
+          <w:bCs/>
           <w:lang w:val="en-US"/>
         </w:rPr>
       </w:pPr>
@@ -664,12 +1148,37 @@
         </w:rPr>
         <w:br/>
       </w:r>
-      <w:r>
-        <w:rPr>
-          <w:b/>
-          <w:bCs/>
-          <w:lang w:val="en-US"/>
-        </w:rPr>
+    </w:p>
+    <w:p>
+      <w:pPr>
+        <w:rPr>
+          <w:b/>
+          <w:bCs/>
+          <w:lang w:val="en-US"/>
+        </w:rPr>
+      </w:pPr>
+      <w:r>
+        <w:rPr>
+          <w:b/>
+          <w:bCs/>
+          <w:lang w:val="en-US"/>
+        </w:rPr>
+        <w:br w:type="page"/>
+      </w:r>
+    </w:p>
+    <w:p>
+      <w:pPr>
+        <w:rPr>
+          <w:lang w:val="en-US"/>
+        </w:rPr>
+      </w:pPr>
+      <w:r>
+        <w:rPr>
+          <w:b/>
+          <w:bCs/>
+          <w:lang w:val="en-US"/>
+        </w:rPr>
+        <w:lastRenderedPageBreak/>
         <w:t>Index.tsx</w:t>
       </w:r>
       <w:r>
@@ -815,9 +1324,9 @@
           <w:lang w:val="en-US"/>
         </w:rPr>
         <w:drawing>
-          <wp:inline distT="0" distB="0" distL="0" distR="0" wp14:anchorId="6503EFDF" wp14:editId="7A74FA02">
-            <wp:extent cx="3453070" cy="2739578"/>
-            <wp:effectExtent l="0" t="0" r="0" b="3810"/>
+          <wp:inline distT="0" distB="0" distL="0" distR="0" wp14:anchorId="6503EFDF" wp14:editId="0055248A">
+            <wp:extent cx="3752290" cy="2976972"/>
+            <wp:effectExtent l="0" t="0" r="635" b="0"/>
             <wp:docPr id="2004694687" name="Picture 1" descr="A computer screen shot of a program&#10;&#10;AI-generated content may be incorrect."/>
             <wp:cNvGraphicFramePr>
               <a:graphicFrameLocks xmlns:a="http://schemas.openxmlformats.org/drawingml/2006/main" noChangeAspect="1"/>
@@ -830,7 +1339,7 @@
                     <pic:cNvPicPr/>
                   </pic:nvPicPr>
                   <pic:blipFill>
-                    <a:blip r:embed="rId13"/>
+                    <a:blip r:embed="rId14"/>
                     <a:stretch>
                       <a:fillRect/>
                     </a:stretch>
@@ -838,7 +1347,7 @@
                   <pic:spPr>
                     <a:xfrm>
                       <a:off x="0" y="0"/>
-                      <a:ext cx="3459375" cy="2744580"/>
+                      <a:ext cx="3770801" cy="2991658"/>
                     </a:xfrm>
                     <a:prstGeom prst="rect">
                       <a:avLst/>
@@ -873,7 +1382,7 @@
                     <pic:cNvPicPr/>
                   </pic:nvPicPr>
                   <pic:blipFill>
-                    <a:blip r:embed="rId14"/>
+                    <a:blip r:embed="rId15"/>
                     <a:stretch>
                       <a:fillRect/>
                     </a:stretch>
@@ -1043,8 +1552,8 @@
           <w:lang w:val="en-US"/>
         </w:rPr>
         <w:drawing>
-          <wp:inline distT="0" distB="0" distL="0" distR="0" wp14:anchorId="59D744AC" wp14:editId="00564AF2">
-            <wp:extent cx="2789027" cy="2457780"/>
+          <wp:inline distT="0" distB="0" distL="0" distR="0" wp14:anchorId="59D744AC" wp14:editId="0B678AF4">
+            <wp:extent cx="3490784" cy="3076190"/>
             <wp:effectExtent l="0" t="0" r="0" b="0"/>
             <wp:docPr id="1800197188" name="Picture 1" descr="A computer screen shot of a program code&#10;&#10;AI-generated content may be incorrect."/>
             <wp:cNvGraphicFramePr>
@@ -1058,7 +1567,7 @@
                     <pic:cNvPicPr/>
                   </pic:nvPicPr>
                   <pic:blipFill>
-                    <a:blip r:embed="rId15"/>
+                    <a:blip r:embed="rId16"/>
                     <a:stretch>
                       <a:fillRect/>
                     </a:stretch>
@@ -1066,7 +1575,7 @@
                   <pic:spPr>
                     <a:xfrm>
                       <a:off x="0" y="0"/>
-                      <a:ext cx="2798928" cy="2466505"/>
+                      <a:ext cx="3509398" cy="3092593"/>
                     </a:xfrm>
                     <a:prstGeom prst="rect">
                       <a:avLst/>
@@ -1084,9 +1593,9 @@
           <w:lang w:val="en-US"/>
         </w:rPr>
         <w:drawing>
-          <wp:inline distT="0" distB="0" distL="0" distR="0" wp14:anchorId="2AA990BB" wp14:editId="73B24825">
-            <wp:extent cx="4524430" cy="1927870"/>
-            <wp:effectExtent l="0" t="0" r="9525" b="0"/>
+          <wp:inline distT="0" distB="0" distL="0" distR="0" wp14:anchorId="2AA990BB" wp14:editId="42FEF368">
+            <wp:extent cx="5830076" cy="2484208"/>
+            <wp:effectExtent l="0" t="0" r="0" b="0"/>
             <wp:docPr id="931292876" name="Picture 1" descr="A screenshot of a computer program&#10;&#10;AI-generated content may be incorrect."/>
             <wp:cNvGraphicFramePr>
               <a:graphicFrameLocks xmlns:a="http://schemas.openxmlformats.org/drawingml/2006/main" noChangeAspect="1"/>
@@ -1099,7 +1608,7 @@
                     <pic:cNvPicPr/>
                   </pic:nvPicPr>
                   <pic:blipFill>
-                    <a:blip r:embed="rId16"/>
+                    <a:blip r:embed="rId17"/>
                     <a:stretch>
                       <a:fillRect/>
                     </a:stretch>
@@ -1107,7 +1616,7 @@
                   <pic:spPr>
                     <a:xfrm>
                       <a:off x="0" y="0"/>
-                      <a:ext cx="4532936" cy="1931494"/>
+                      <a:ext cx="5854970" cy="2494815"/>
                     </a:xfrm>
                     <a:prstGeom prst="rect">
                       <a:avLst/>
@@ -1183,9 +1692,9 @@
           <w:lang w:val="en-US"/>
         </w:rPr>
         <w:drawing>
-          <wp:inline distT="0" distB="0" distL="0" distR="0" wp14:anchorId="1A9EB566" wp14:editId="48850610">
-            <wp:extent cx="2638238" cy="3055048"/>
-            <wp:effectExtent l="0" t="0" r="0" b="0"/>
+          <wp:inline distT="0" distB="0" distL="0" distR="0" wp14:anchorId="1A9EB566" wp14:editId="0F6B238A">
+            <wp:extent cx="3964162" cy="4590452"/>
+            <wp:effectExtent l="0" t="0" r="0" b="635"/>
             <wp:docPr id="159686663" name="Picture 1" descr="A screenshot of a computer program&#10;&#10;AI-generated content may be incorrect."/>
             <wp:cNvGraphicFramePr>
               <a:graphicFrameLocks xmlns:a="http://schemas.openxmlformats.org/drawingml/2006/main" noChangeAspect="1"/>
@@ -1198,7 +1707,7 @@
                     <pic:cNvPicPr/>
                   </pic:nvPicPr>
                   <pic:blipFill>
-                    <a:blip r:embed="rId17"/>
+                    <a:blip r:embed="rId18"/>
                     <a:stretch>
                       <a:fillRect/>
                     </a:stretch>
@@ -1206,7 +1715,7 @@
                   <pic:spPr>
                     <a:xfrm>
                       <a:off x="0" y="0"/>
-                      <a:ext cx="2641534" cy="3058864"/>
+                      <a:ext cx="3977463" cy="4605854"/>
                     </a:xfrm>
                     <a:prstGeom prst="rect">
                       <a:avLst/>
@@ -1268,6 +1777,21 @@
     </w:p>
     <w:p>
       <w:pPr>
+        <w:pStyle w:val="Heading4"/>
+        <w:rPr>
+          <w:lang w:val="en-US"/>
+        </w:rPr>
+      </w:pPr>
+      <w:r>
+        <w:rPr>
+          <w:lang w:val="en-US"/>
+        </w:rPr>
+        <w:lastRenderedPageBreak/>
+        <w:t>Sprint Issues &amp; Solutions:</w:t>
+      </w:r>
+    </w:p>
+    <w:p>
+      <w:pPr>
         <w:rPr>
           <w:color w:val="EE0000"/>
           <w:lang w:val="en-US"/>
@@ -1280,7 +1804,6 @@
           <w:color w:val="EE0000"/>
           <w:lang w:val="en-US"/>
         </w:rPr>
-        <w:lastRenderedPageBreak/>
         <w:t>ISSUES:</w:t>
       </w:r>
       <w:r>
@@ -1339,7 +1862,7 @@
                     <pic:cNvPicPr/>
                   </pic:nvPicPr>
                   <pic:blipFill>
-                    <a:blip r:embed="rId18"/>
+                    <a:blip r:embed="rId19"/>
                     <a:stretch>
                       <a:fillRect/>
                     </a:stretch>
@@ -1366,9 +1889,9 @@
           <w:lang w:val="en-US"/>
         </w:rPr>
         <w:drawing>
-          <wp:inline distT="0" distB="0" distL="0" distR="0" wp14:anchorId="354C0C2A" wp14:editId="79303379">
-            <wp:extent cx="6310946" cy="2696101"/>
-            <wp:effectExtent l="0" t="0" r="0" b="9525"/>
+          <wp:inline distT="0" distB="0" distL="0" distR="0" wp14:anchorId="354C0C2A" wp14:editId="740490DF">
+            <wp:extent cx="5666109" cy="2420620"/>
+            <wp:effectExtent l="0" t="0" r="0" b="0"/>
             <wp:docPr id="542365620" name="Picture 1" descr="A screenshot of a computer&#10;&#10;AI-generated content may be incorrect."/>
             <wp:cNvGraphicFramePr>
               <a:graphicFrameLocks xmlns:a="http://schemas.openxmlformats.org/drawingml/2006/main" noChangeAspect="1"/>
@@ -1381,7 +1904,7 @@
                     <pic:cNvPicPr/>
                   </pic:nvPicPr>
                   <pic:blipFill>
-                    <a:blip r:embed="rId19"/>
+                    <a:blip r:embed="rId20"/>
                     <a:stretch>
                       <a:fillRect/>
                     </a:stretch>
@@ -1389,7 +1912,7 @@
                   <pic:spPr>
                     <a:xfrm>
                       <a:off x="0" y="0"/>
-                      <a:ext cx="6352432" cy="2713824"/>
+                      <a:ext cx="5718402" cy="2442960"/>
                     </a:xfrm>
                     <a:prstGeom prst="rect">
                       <a:avLst/>
@@ -1475,9 +1998,9 @@
           <w:lang w:val="en-US"/>
         </w:rPr>
         <w:drawing>
-          <wp:inline distT="0" distB="0" distL="0" distR="0" wp14:anchorId="1290627D" wp14:editId="1DD9FA9D">
-            <wp:extent cx="2261661" cy="5116412"/>
-            <wp:effectExtent l="0" t="0" r="5715" b="8255"/>
+          <wp:inline distT="0" distB="0" distL="0" distR="0" wp14:anchorId="1290627D" wp14:editId="33895DA1">
+            <wp:extent cx="1787366" cy="4043445"/>
+            <wp:effectExtent l="0" t="0" r="3810" b="0"/>
             <wp:docPr id="1461906375" name="Picture 1" descr="A screenshot of a login form&#10;&#10;AI-generated content may be incorrect."/>
             <wp:cNvGraphicFramePr>
               <a:graphicFrameLocks xmlns:a="http://schemas.openxmlformats.org/drawingml/2006/main" noChangeAspect="1"/>
@@ -1490,7 +2013,7 @@
                     <pic:cNvPicPr/>
                   </pic:nvPicPr>
                   <pic:blipFill>
-                    <a:blip r:embed="rId20"/>
+                    <a:blip r:embed="rId21"/>
                     <a:stretch>
                       <a:fillRect/>
                     </a:stretch>
@@ -1498,7 +2021,533 @@
                   <pic:spPr>
                     <a:xfrm>
                       <a:off x="0" y="0"/>
-                      <a:ext cx="2267236" cy="5129024"/>
+                      <a:ext cx="1798766" cy="4069235"/>
+                    </a:xfrm>
+                    <a:prstGeom prst="rect">
+                      <a:avLst/>
+                    </a:prstGeom>
+                  </pic:spPr>
+                </pic:pic>
+              </a:graphicData>
+            </a:graphic>
+          </wp:inline>
+        </w:drawing>
+      </w:r>
+    </w:p>
+    <w:p>
+      <w:pPr>
+        <w:rPr>
+          <w:color w:val="EE0000"/>
+          <w:lang w:val="en-US"/>
+        </w:rPr>
+      </w:pPr>
+    </w:p>
+    <w:p>
+      <w:pPr>
+        <w:pStyle w:val="Heading4"/>
+        <w:rPr>
+          <w:lang w:val="en-US"/>
+        </w:rPr>
+      </w:pPr>
+      <w:r>
+        <w:rPr>
+          <w:lang w:val="en-US"/>
+        </w:rPr>
+        <w:t>End-Of-Sprint Progress:</w:t>
+      </w:r>
+    </w:p>
+    <w:p>
+      <w:pPr>
+        <w:rPr>
+          <w:lang w:val="en-US"/>
+        </w:rPr>
+      </w:pPr>
+      <w:r>
+        <w:rPr>
+          <w:lang w:val="en-US"/>
+        </w:rPr>
+        <w:drawing>
+          <wp:inline distT="0" distB="0" distL="0" distR="0" wp14:anchorId="4767C19A" wp14:editId="13594F9A">
+            <wp:extent cx="5731510" cy="2884170"/>
+            <wp:effectExtent l="0" t="0" r="2540" b="0"/>
+            <wp:docPr id="1114916945" name="Picture 1" descr="A screenshot of a computer&#10;&#10;AI-generated content may be incorrect."/>
+            <wp:cNvGraphicFramePr>
+              <a:graphicFrameLocks xmlns:a="http://schemas.openxmlformats.org/drawingml/2006/main" noChangeAspect="1"/>
+            </wp:cNvGraphicFramePr>
+            <a:graphic xmlns:a="http://schemas.openxmlformats.org/drawingml/2006/main">
+              <a:graphicData uri="http://schemas.openxmlformats.org/drawingml/2006/picture">
+                <pic:pic xmlns:pic="http://schemas.openxmlformats.org/drawingml/2006/picture">
+                  <pic:nvPicPr>
+                    <pic:cNvPr id="1114916945" name="Picture 1" descr="A screenshot of a computer&#10;&#10;AI-generated content may be incorrect."/>
+                    <pic:cNvPicPr/>
+                  </pic:nvPicPr>
+                  <pic:blipFill>
+                    <a:blip r:embed="rId22"/>
+                    <a:stretch>
+                      <a:fillRect/>
+                    </a:stretch>
+                  </pic:blipFill>
+                  <pic:spPr>
+                    <a:xfrm>
+                      <a:off x="0" y="0"/>
+                      <a:ext cx="5731510" cy="2884170"/>
+                    </a:xfrm>
+                    <a:prstGeom prst="rect">
+                      <a:avLst/>
+                    </a:prstGeom>
+                  </pic:spPr>
+                </pic:pic>
+              </a:graphicData>
+            </a:graphic>
+          </wp:inline>
+        </w:drawing>
+      </w:r>
+    </w:p>
+    <w:p>
+      <w:pPr>
+        <w:rPr>
+          <w:lang w:val="en-US"/>
+        </w:rPr>
+      </w:pPr>
+      <w:r>
+        <w:rPr>
+          <w:lang w:val="en-US"/>
+        </w:rPr>
+        <w:br w:type="page"/>
+      </w:r>
+    </w:p>
+    <w:p>
+      <w:pPr>
+        <w:pStyle w:val="Heading3"/>
+        <w:rPr>
+          <w:lang w:val="en-US"/>
+        </w:rPr>
+      </w:pPr>
+      <w:bookmarkStart w:id="4" w:name="_Toc212816836"/>
+      <w:r>
+        <w:rPr>
+          <w:lang w:val="en-US"/>
+        </w:rPr>
+        <w:lastRenderedPageBreak/>
+        <w:t>Sprint 2, Due</w:t>
+      </w:r>
+      <w:r>
+        <w:rPr>
+          <w:lang w:val="en-US"/>
+        </w:rPr>
+        <w:t xml:space="preserve"> </w:t>
+      </w:r>
+      <w:r>
+        <w:rPr>
+          <w:lang w:val="en-US"/>
+        </w:rPr>
+        <w:t>14/11/2025</w:t>
+      </w:r>
+      <w:bookmarkEnd w:id="4"/>
+    </w:p>
+    <w:p>
+      <w:pPr>
+        <w:rPr>
+          <w:b/>
+          <w:bCs/>
+          <w:lang w:val="en-US"/>
+        </w:rPr>
+      </w:pPr>
+      <w:r>
+        <w:rPr>
+          <w:b/>
+          <w:bCs/>
+          <w:lang w:val="en-US"/>
+        </w:rPr>
+        <w:t>firestore.js:</w:t>
+      </w:r>
+    </w:p>
+    <w:p>
+      <w:pPr>
+        <w:pStyle w:val="ListParagraph"/>
+        <w:numPr>
+          <w:ilvl w:val="0"/>
+          <w:numId w:val="1"/>
+        </w:numPr>
+        <w:rPr>
+          <w:b/>
+          <w:bCs/>
+          <w:lang w:val="en-US"/>
+        </w:rPr>
+      </w:pPr>
+      <w:r>
+        <w:rPr>
+          <w:lang w:val="en-US"/>
+        </w:rPr>
+        <w:t>Added basic validation, reading from ‘users’ collection on the Firestore database</w:t>
+      </w:r>
+      <w:r>
+        <w:rPr>
+          <w:lang w:val="en-US"/>
+        </w:rPr>
+        <w:t xml:space="preserve"> to check whether a username already exists upon account creation.</w:t>
+      </w:r>
+    </w:p>
+    <w:p>
+      <w:pPr>
+        <w:ind w:left="360"/>
+        <w:rPr>
+          <w:b/>
+          <w:bCs/>
+          <w:lang w:val="en-US"/>
+        </w:rPr>
+      </w:pPr>
+      <w:r>
+        <w:rPr>
+          <w:b/>
+          <w:bCs/>
+          <w:lang w:val="en-US"/>
+        </w:rPr>
+        <w:drawing>
+          <wp:inline distT="0" distB="0" distL="0" distR="0" wp14:anchorId="3899B61E" wp14:editId="0A4A245B">
+            <wp:extent cx="1561456" cy="3456749"/>
+            <wp:effectExtent l="0" t="0" r="1270" b="0"/>
+            <wp:docPr id="947291218" name="Picture 1" descr="A screenshot of a computer&#10;&#10;AI-generated content may be incorrect."/>
+            <wp:cNvGraphicFramePr>
+              <a:graphicFrameLocks xmlns:a="http://schemas.openxmlformats.org/drawingml/2006/main" noChangeAspect="1"/>
+            </wp:cNvGraphicFramePr>
+            <a:graphic xmlns:a="http://schemas.openxmlformats.org/drawingml/2006/main">
+              <a:graphicData uri="http://schemas.openxmlformats.org/drawingml/2006/picture">
+                <pic:pic xmlns:pic="http://schemas.openxmlformats.org/drawingml/2006/picture">
+                  <pic:nvPicPr>
+                    <pic:cNvPr id="947291218" name="Picture 1" descr="A screenshot of a computer&#10;&#10;AI-generated content may be incorrect."/>
+                    <pic:cNvPicPr/>
+                  </pic:nvPicPr>
+                  <pic:blipFill>
+                    <a:blip r:embed="rId23"/>
+                    <a:stretch>
+                      <a:fillRect/>
+                    </a:stretch>
+                  </pic:blipFill>
+                  <pic:spPr>
+                    <a:xfrm>
+                      <a:off x="0" y="0"/>
+                      <a:ext cx="1572140" cy="3480402"/>
+                    </a:xfrm>
+                    <a:prstGeom prst="rect">
+                      <a:avLst/>
+                    </a:prstGeom>
+                  </pic:spPr>
+                </pic:pic>
+              </a:graphicData>
+            </a:graphic>
+          </wp:inline>
+        </w:drawing>
+      </w:r>
+      <w:r>
+        <w:rPr>
+          <w:b/>
+          <w:bCs/>
+          <w:lang w:val="en-US"/>
+        </w:rPr>
+        <w:drawing>
+          <wp:inline distT="0" distB="0" distL="0" distR="0" wp14:anchorId="32F44E32" wp14:editId="6493C932">
+            <wp:extent cx="3583602" cy="966373"/>
+            <wp:effectExtent l="0" t="0" r="0" b="5715"/>
+            <wp:docPr id="146027758" name="Picture 1" descr="A screen shot of a computer code&#10;&#10;AI-generated content may be incorrect."/>
+            <wp:cNvGraphicFramePr>
+              <a:graphicFrameLocks xmlns:a="http://schemas.openxmlformats.org/drawingml/2006/main" noChangeAspect="1"/>
+            </wp:cNvGraphicFramePr>
+            <a:graphic xmlns:a="http://schemas.openxmlformats.org/drawingml/2006/main">
+              <a:graphicData uri="http://schemas.openxmlformats.org/drawingml/2006/picture">
+                <pic:pic xmlns:pic="http://schemas.openxmlformats.org/drawingml/2006/picture">
+                  <pic:nvPicPr>
+                    <pic:cNvPr id="146027758" name="Picture 1" descr="A screen shot of a computer code&#10;&#10;AI-generated content may be incorrect."/>
+                    <pic:cNvPicPr/>
+                  </pic:nvPicPr>
+                  <pic:blipFill>
+                    <a:blip r:embed="rId24"/>
+                    <a:stretch>
+                      <a:fillRect/>
+                    </a:stretch>
+                  </pic:blipFill>
+                  <pic:spPr>
+                    <a:xfrm>
+                      <a:off x="0" y="0"/>
+                      <a:ext cx="3624602" cy="977429"/>
+                    </a:xfrm>
+                    <a:prstGeom prst="rect">
+                      <a:avLst/>
+                    </a:prstGeom>
+                  </pic:spPr>
+                </pic:pic>
+              </a:graphicData>
+            </a:graphic>
+          </wp:inline>
+        </w:drawing>
+      </w:r>
+    </w:p>
+    <w:p>
+      <w:pPr>
+        <w:rPr>
+          <w:b/>
+          <w:bCs/>
+          <w:lang w:val="en-US"/>
+        </w:rPr>
+      </w:pPr>
+      <w:r>
+        <w:rPr>
+          <w:b/>
+          <w:bCs/>
+          <w:lang w:val="en-US"/>
+        </w:rPr>
+        <w:t>i</w:t>
+      </w:r>
+      <w:r>
+        <w:rPr>
+          <w:b/>
+          <w:bCs/>
+          <w:lang w:val="en-US"/>
+        </w:rPr>
+        <w:t>ndex</w:t>
+      </w:r>
+      <w:r>
+        <w:rPr>
+          <w:b/>
+          <w:bCs/>
+          <w:lang w:val="en-US"/>
+        </w:rPr>
+        <w:t>.tsx:</w:t>
+      </w:r>
+    </w:p>
+    <w:p>
+      <w:pPr>
+        <w:pStyle w:val="ListParagraph"/>
+        <w:numPr>
+          <w:ilvl w:val="0"/>
+          <w:numId w:val="1"/>
+        </w:numPr>
+        <w:rPr>
+          <w:b/>
+          <w:bCs/>
+          <w:lang w:val="en-US"/>
+        </w:rPr>
+      </w:pPr>
+      <w:r>
+        <w:rPr>
+          <w:lang w:val="en-US"/>
+        </w:rPr>
+        <w:t>Updated to include validation check made in firestore.js.</w:t>
+      </w:r>
+    </w:p>
+    <w:p>
+      <w:pPr>
+        <w:rPr>
+          <w:b/>
+          <w:bCs/>
+          <w:lang w:val="en-US"/>
+        </w:rPr>
+      </w:pPr>
+      <w:r>
+        <w:rPr>
+          <w:b/>
+          <w:bCs/>
+          <w:lang w:val="en-US"/>
+        </w:rPr>
+        <w:drawing>
+          <wp:inline distT="0" distB="0" distL="0" distR="0" wp14:anchorId="555F7562" wp14:editId="158A1271">
+            <wp:extent cx="4455718" cy="1648803"/>
+            <wp:effectExtent l="0" t="0" r="2540" b="8890"/>
+            <wp:docPr id="1607069614" name="Picture 1" descr="A screen shot of a computer code&#10;&#10;AI-generated content may be incorrect."/>
+            <wp:cNvGraphicFramePr>
+              <a:graphicFrameLocks xmlns:a="http://schemas.openxmlformats.org/drawingml/2006/main" noChangeAspect="1"/>
+            </wp:cNvGraphicFramePr>
+            <a:graphic xmlns:a="http://schemas.openxmlformats.org/drawingml/2006/main">
+              <a:graphicData uri="http://schemas.openxmlformats.org/drawingml/2006/picture">
+                <pic:pic xmlns:pic="http://schemas.openxmlformats.org/drawingml/2006/picture">
+                  <pic:nvPicPr>
+                    <pic:cNvPr id="1607069614" name="Picture 1" descr="A screen shot of a computer code&#10;&#10;AI-generated content may be incorrect."/>
+                    <pic:cNvPicPr/>
+                  </pic:nvPicPr>
+                  <pic:blipFill>
+                    <a:blip r:embed="rId25"/>
+                    <a:stretch>
+                      <a:fillRect/>
+                    </a:stretch>
+                  </pic:blipFill>
+                  <pic:spPr>
+                    <a:xfrm>
+                      <a:off x="0" y="0"/>
+                      <a:ext cx="4477399" cy="1656826"/>
+                    </a:xfrm>
+                    <a:prstGeom prst="rect">
+                      <a:avLst/>
+                    </a:prstGeom>
+                  </pic:spPr>
+                </pic:pic>
+              </a:graphicData>
+            </a:graphic>
+          </wp:inline>
+        </w:drawing>
+      </w:r>
+    </w:p>
+    <w:p>
+      <w:pPr>
+        <w:rPr>
+          <w:rFonts w:eastAsiaTheme="majorEastAsia" w:cstheme="majorBidi"/>
+          <w:i/>
+          <w:iCs/>
+          <w:color w:val="0F4761" w:themeColor="accent1" w:themeShade="BF"/>
+          <w:lang w:val="en-US"/>
+        </w:rPr>
+      </w:pPr>
+      <w:r>
+        <w:rPr>
+          <w:lang w:val="en-US"/>
+        </w:rPr>
+        <w:br w:type="page"/>
+      </w:r>
+    </w:p>
+    <w:p>
+      <w:pPr>
+        <w:pStyle w:val="Heading4"/>
+        <w:rPr>
+          <w:lang w:val="en-US"/>
+        </w:rPr>
+      </w:pPr>
+      <w:r>
+        <w:rPr>
+          <w:lang w:val="en-US"/>
+        </w:rPr>
+        <w:lastRenderedPageBreak/>
+        <w:t>Sprint Issues and Solutions:</w:t>
+      </w:r>
+    </w:p>
+    <w:p>
+      <w:pPr>
+        <w:pStyle w:val="ListParagraph"/>
+        <w:numPr>
+          <w:ilvl w:val="0"/>
+          <w:numId w:val="1"/>
+        </w:numPr>
+        <w:rPr>
+          <w:lang w:val="en-US"/>
+        </w:rPr>
+      </w:pPr>
+      <w:r>
+        <w:rPr>
+          <w:lang w:val="en-US"/>
+        </w:rPr>
+        <w:t>Slight annoyance with indentation in TypeScript files,</w:t>
+      </w:r>
+      <w:r>
+        <w:rPr>
+          <w:lang w:val="en-US"/>
+        </w:rPr>
+        <w:t xml:space="preserve"> lower</w:t>
+      </w:r>
+      <w:r>
+        <w:rPr>
+          <w:lang w:val="en-US"/>
+        </w:rPr>
+        <w:t xml:space="preserve"> </w:t>
+      </w:r>
+      <w:r>
+        <w:rPr>
+          <w:lang w:val="en-US"/>
+        </w:rPr>
+        <w:t xml:space="preserve">curly brackets </w:t>
+      </w:r>
+      <w:r>
+        <w:rPr>
+          <w:lang w:val="en-US"/>
+        </w:rPr>
+        <w:t xml:space="preserve">not going directly </w:t>
+      </w:r>
+      <w:r>
+        <w:rPr>
+          <w:lang w:val="en-US"/>
+        </w:rPr>
+        <w:t>below function/top bracket when pressing enter! Manually</w:t>
+      </w:r>
+      <w:r>
+        <w:rPr>
+          <w:lang w:val="en-US"/>
+        </w:rPr>
+        <w:t xml:space="preserve"> changing indentation.</w:t>
+      </w:r>
+    </w:p>
+    <w:p>
+      <w:pPr>
+        <w:ind w:left="360"/>
+        <w:rPr>
+          <w:lang w:val="en-US"/>
+        </w:rPr>
+      </w:pPr>
+      <w:r>
+        <w:rPr>
+          <w:lang w:val="en-US"/>
+        </w:rPr>
+        <w:drawing>
+          <wp:inline distT="0" distB="0" distL="0" distR="0" wp14:anchorId="23EA2754" wp14:editId="7ABA9907">
+            <wp:extent cx="2315070" cy="591200"/>
+            <wp:effectExtent l="0" t="0" r="9525" b="0"/>
+            <wp:docPr id="385859402" name="Picture 1" descr="A black screen with white text&#10;&#10;AI-generated content may be incorrect."/>
+            <wp:cNvGraphicFramePr>
+              <a:graphicFrameLocks xmlns:a="http://schemas.openxmlformats.org/drawingml/2006/main" noChangeAspect="1"/>
+            </wp:cNvGraphicFramePr>
+            <a:graphic xmlns:a="http://schemas.openxmlformats.org/drawingml/2006/main">
+              <a:graphicData uri="http://schemas.openxmlformats.org/drawingml/2006/picture">
+                <pic:pic xmlns:pic="http://schemas.openxmlformats.org/drawingml/2006/picture">
+                  <pic:nvPicPr>
+                    <pic:cNvPr id="385859402" name="Picture 1" descr="A black screen with white text&#10;&#10;AI-generated content may be incorrect."/>
+                    <pic:cNvPicPr/>
+                  </pic:nvPicPr>
+                  <pic:blipFill>
+                    <a:blip r:embed="rId26"/>
+                    <a:stretch>
+                      <a:fillRect/>
+                    </a:stretch>
+                  </pic:blipFill>
+                  <pic:spPr>
+                    <a:xfrm>
+                      <a:off x="0" y="0"/>
+                      <a:ext cx="2338445" cy="597169"/>
+                    </a:xfrm>
+                    <a:prstGeom prst="rect">
+                      <a:avLst/>
+                    </a:prstGeom>
+                  </pic:spPr>
+                </pic:pic>
+              </a:graphicData>
+            </a:graphic>
+          </wp:inline>
+        </w:drawing>
+      </w:r>
+      <w:r>
+        <w:rPr>
+          <w:lang w:val="en-US"/>
+        </w:rPr>
+        <w:drawing>
+          <wp:inline distT="0" distB="0" distL="0" distR="0" wp14:anchorId="1D6A3F8D" wp14:editId="288C1B7B">
+            <wp:extent cx="2563492" cy="572492"/>
+            <wp:effectExtent l="0" t="0" r="0" b="0"/>
+            <wp:docPr id="1482250042" name="Picture 1" descr="A black background with white text&#10;&#10;AI-generated content may be incorrect."/>
+            <wp:cNvGraphicFramePr>
+              <a:graphicFrameLocks xmlns:a="http://schemas.openxmlformats.org/drawingml/2006/main" noChangeAspect="1"/>
+            </wp:cNvGraphicFramePr>
+            <a:graphic xmlns:a="http://schemas.openxmlformats.org/drawingml/2006/main">
+              <a:graphicData uri="http://schemas.openxmlformats.org/drawingml/2006/picture">
+                <pic:pic xmlns:pic="http://schemas.openxmlformats.org/drawingml/2006/picture">
+                  <pic:nvPicPr>
+                    <pic:cNvPr id="1482250042" name="Picture 1" descr="A black background with white text&#10;&#10;AI-generated content may be incorrect."/>
+                    <pic:cNvPicPr/>
+                  </pic:nvPicPr>
+                  <pic:blipFill>
+                    <a:blip r:embed="rId27"/>
+                    <a:stretch>
+                      <a:fillRect/>
+                    </a:stretch>
+                  </pic:blipFill>
+                  <pic:spPr>
+                    <a:xfrm>
+                      <a:off x="0" y="0"/>
+                      <a:ext cx="2634160" cy="588274"/>
                     </a:xfrm>
                     <a:prstGeom prst="rect">
                       <a:avLst/>
@@ -2552,6 +3601,75 @@
       <w:spacing w:val="5"/>
     </w:rPr>
   </w:style>
+  <w:style w:type="paragraph" w:styleId="TOCHeading">
+    <w:name w:val="TOC Heading"/>
+    <w:basedOn w:val="Heading1"/>
+    <w:next w:val="Normal"/>
+    <w:uiPriority w:val="39"/>
+    <w:unhideWhenUsed/>
+    <w:qFormat/>
+    <w:rsid w:val="002049F1"/>
+    <w:pPr>
+      <w:spacing w:before="240" w:after="0"/>
+      <w:outlineLvl w:val="9"/>
+    </w:pPr>
+    <w:rPr>
+      <w:kern w:val="0"/>
+      <w:sz w:val="32"/>
+      <w:szCs w:val="32"/>
+      <w:lang w:val="en-US"/>
+      <w14:ligatures w14:val="none"/>
+    </w:rPr>
+  </w:style>
+  <w:style w:type="paragraph" w:styleId="TOC1">
+    <w:name w:val="toc 1"/>
+    <w:basedOn w:val="Normal"/>
+    <w:next w:val="Normal"/>
+    <w:autoRedefine/>
+    <w:uiPriority w:val="39"/>
+    <w:unhideWhenUsed/>
+    <w:rsid w:val="002049F1"/>
+    <w:pPr>
+      <w:spacing w:after="100"/>
+    </w:pPr>
+  </w:style>
+  <w:style w:type="paragraph" w:styleId="TOC2">
+    <w:name w:val="toc 2"/>
+    <w:basedOn w:val="Normal"/>
+    <w:next w:val="Normal"/>
+    <w:autoRedefine/>
+    <w:uiPriority w:val="39"/>
+    <w:unhideWhenUsed/>
+    <w:rsid w:val="002049F1"/>
+    <w:pPr>
+      <w:spacing w:after="100"/>
+      <w:ind w:left="220"/>
+    </w:pPr>
+  </w:style>
+  <w:style w:type="paragraph" w:styleId="TOC3">
+    <w:name w:val="toc 3"/>
+    <w:basedOn w:val="Normal"/>
+    <w:next w:val="Normal"/>
+    <w:autoRedefine/>
+    <w:uiPriority w:val="39"/>
+    <w:unhideWhenUsed/>
+    <w:rsid w:val="002049F1"/>
+    <w:pPr>
+      <w:spacing w:after="100"/>
+      <w:ind w:left="440"/>
+    </w:pPr>
+  </w:style>
+  <w:style w:type="character" w:styleId="Hyperlink">
+    <w:name w:val="Hyperlink"/>
+    <w:basedOn w:val="DefaultParagraphFont"/>
+    <w:uiPriority w:val="99"/>
+    <w:unhideWhenUsed/>
+    <w:rsid w:val="002049F1"/>
+    <w:rPr>
+      <w:color w:val="467886" w:themeColor="hyperlink"/>
+      <w:u w:val="single"/>
+    </w:rPr>
+  </w:style>
 </w:styles>
 </file>
 
@@ -3041,18 +4159,22 @@
 </ct:contentTypeSchema>
 </file>
 
+<file path=customXml/item4.xml><?xml version="1.0" encoding="utf-8"?>
+<b:Sources xmlns:b="http://schemas.openxmlformats.org/officeDocument/2006/bibliography" xmlns="http://schemas.openxmlformats.org/officeDocument/2006/bibliography" SelectedStyle="\APASixthEditionOfficeOnline.xsl" StyleName="APA" Version="6"/>
+</file>
+
 <file path=customXml/itemProps1.xml><?xml version="1.0" encoding="utf-8"?>
 <ds:datastoreItem xmlns:ds="http://schemas.openxmlformats.org/officeDocument/2006/customXml" ds:itemID="{F79638DA-D241-4BF3-8AD6-7F74018D56BD}">
   <ds:schemaRefs>
+    <ds:schemaRef ds:uri="http://schemas.openxmlformats.org/package/2006/metadata/core-properties"/>
     <ds:schemaRef ds:uri="http://schemas.microsoft.com/office/infopath/2007/PartnerControls"/>
+    <ds:schemaRef ds:uri="http://schemas.microsoft.com/office/2006/metadata/properties"/>
+    <ds:schemaRef ds:uri="http://purl.org/dc/dcmitype/"/>
+    <ds:schemaRef ds:uri="http://purl.org/dc/terms/"/>
+    <ds:schemaRef ds:uri="http://www.w3.org/XML/1998/namespace"/>
+    <ds:schemaRef ds:uri="http://schemas.microsoft.com/office/2006/documentManagement/types"/>
+    <ds:schemaRef ds:uri="c464522a-a754-430f-b544-fd87d4c168c2"/>
     <ds:schemaRef ds:uri="http://purl.org/dc/elements/1.1/"/>
-    <ds:schemaRef ds:uri="http://www.w3.org/XML/1998/namespace"/>
-    <ds:schemaRef ds:uri="http://schemas.microsoft.com/office/2006/metadata/properties"/>
-    <ds:schemaRef ds:uri="http://purl.org/dc/terms/"/>
-    <ds:schemaRef ds:uri="http://schemas.microsoft.com/office/2006/documentManagement/types"/>
-    <ds:schemaRef ds:uri="http://schemas.openxmlformats.org/package/2006/metadata/core-properties"/>
-    <ds:schemaRef ds:uri="c464522a-a754-430f-b544-fd87d4c168c2"/>
-    <ds:schemaRef ds:uri="http://purl.org/dc/dcmitype/"/>
   </ds:schemaRefs>
 </ds:datastoreItem>
 </file>
@@ -3081,4 +4203,12 @@
     <ds:schemaRef ds:uri="http://schemas.microsoft.com/internal/obd"/>
   </ds:schemaRefs>
 </ds:datastoreItem>
+</file>
+
+<file path=customXml/itemProps4.xml><?xml version="1.0" encoding="utf-8"?>
+<ds:datastoreItem xmlns:ds="http://schemas.openxmlformats.org/officeDocument/2006/customXml" ds:itemID="{238C6C0A-4621-4E84-9BEB-57ADB3D29432}">
+  <ds:schemaRefs>
+    <ds:schemaRef ds:uri="http://schemas.openxmlformats.org/officeDocument/2006/bibliography"/>
+  </ds:schemaRefs>
+</ds:datastoreItem>
 </file>
</xml_diff>

<commit_message>
Added Login Screen and made naming changes. - Made login.tsx. - Basic verifying username and password with database data. - Added links between login and sign up screens.
</commit_message>
<xml_diff>
--- a/Documentation/COMP3000 - Progress Report.docx
+++ b/Documentation/COMP3000 - Progress Report.docx
@@ -46,6 +46,15 @@
     </w:p>
     <w:sdt>
       <w:sdtPr>
+        <w:rPr>
+          <w:rFonts w:asciiTheme="minorHAnsi" w:eastAsiaTheme="minorHAnsi" w:hAnsiTheme="minorHAnsi" w:cstheme="minorBidi"/>
+          <w:color w:val="auto"/>
+          <w:kern w:val="2"/>
+          <w:sz w:val="22"/>
+          <w:szCs w:val="22"/>
+          <w:lang w:val="en-GB"/>
+          <w14:ligatures w14:val="standardContextual"/>
+        </w:rPr>
         <w:id w:val="1211540222"/>
         <w:docPartObj>
           <w:docPartGallery w:val="Table of Contents"/>
@@ -54,16 +63,9 @@
       </w:sdtPr>
       <w:sdtEndPr>
         <w:rPr>
-          <w:rFonts w:asciiTheme="minorHAnsi" w:eastAsiaTheme="minorHAnsi" w:hAnsiTheme="minorHAnsi" w:cstheme="minorBidi"/>
           <w:b/>
           <w:bCs/>
           <w:noProof/>
-          <w:color w:val="auto"/>
-          <w:kern w:val="2"/>
-          <w:sz w:val="22"/>
-          <w:szCs w:val="22"/>
-          <w:lang w:val="en-GB"/>
-          <w14:ligatures w14:val="standardContextual"/>
         </w:rPr>
       </w:sdtEndPr>
       <w:sdtContent>
@@ -1934,11 +1936,19 @@
           <w:lang w:val="en-US"/>
         </w:rPr>
       </w:pPr>
-      <w:r>
-        <w:rPr>
-          <w:b/>
-          <w:bCs/>
-          <w:color w:val="EE0000"/>
+    </w:p>
+    <w:p>
+      <w:pPr>
+        <w:rPr>
+          <w:b/>
+          <w:bCs/>
+          <w:lang w:val="en-US"/>
+        </w:rPr>
+      </w:pPr>
+      <w:r>
+        <w:rPr>
+          <w:b/>
+          <w:bCs/>
           <w:lang w:val="en-US"/>
         </w:rPr>
         <w:br w:type="page"/>
@@ -2064,6 +2074,7 @@
       </w:pPr>
       <w:r>
         <w:rPr>
+          <w:noProof/>
           <w:lang w:val="en-US"/>
         </w:rPr>
         <w:drawing>
@@ -2201,6 +2212,7 @@
         <w:rPr>
           <w:b/>
           <w:bCs/>
+          <w:noProof/>
           <w:lang w:val="en-US"/>
         </w:rPr>
         <w:drawing>
@@ -2243,6 +2255,7 @@
         <w:rPr>
           <w:b/>
           <w:bCs/>
+          <w:noProof/>
           <w:lang w:val="en-US"/>
         </w:rPr>
         <w:drawing>
@@ -2347,6 +2360,7 @@
         <w:rPr>
           <w:b/>
           <w:bCs/>
+          <w:noProof/>
           <w:lang w:val="en-US"/>
         </w:rPr>
         <w:drawing>
@@ -2389,15 +2403,584 @@
     <w:p>
       <w:pPr>
         <w:rPr>
-          <w:rFonts w:eastAsiaTheme="majorEastAsia" w:cstheme="majorBidi"/>
-          <w:i/>
-          <w:iCs/>
-          <w:color w:val="0F4761" w:themeColor="accent1" w:themeShade="BF"/>
-          <w:lang w:val="en-US"/>
-        </w:rPr>
-      </w:pPr>
-      <w:r>
-        <w:rPr>
+          <w:lang w:val="en-US"/>
+        </w:rPr>
+      </w:pPr>
+    </w:p>
+    <w:p>
+      <w:pPr>
+        <w:rPr>
+          <w:lang w:val="en-US"/>
+        </w:rPr>
+      </w:pPr>
+      <w:r>
+        <w:rPr>
+          <w:lang w:val="en-US"/>
+        </w:rPr>
+        <w:br w:type="page"/>
+      </w:r>
+    </w:p>
+    <w:p>
+      <w:pPr>
+        <w:rPr>
+          <w:b/>
+          <w:bCs/>
+          <w:lang w:val="en-US"/>
+        </w:rPr>
+      </w:pPr>
+      <w:r>
+        <w:rPr>
+          <w:b/>
+          <w:bCs/>
+          <w:lang w:val="en-US"/>
+        </w:rPr>
+        <w:lastRenderedPageBreak/>
+        <w:t>Development of login screen and functionality</w:t>
+      </w:r>
+    </w:p>
+    <w:p>
+      <w:pPr>
+        <w:rPr>
+          <w:b/>
+          <w:bCs/>
+          <w:lang w:val="en-US"/>
+        </w:rPr>
+      </w:pPr>
+    </w:p>
+    <w:p>
+      <w:pPr>
+        <w:rPr>
+          <w:b/>
+          <w:bCs/>
+          <w:lang w:val="en-US"/>
+        </w:rPr>
+      </w:pPr>
+      <w:r>
+        <w:rPr>
+          <w:b/>
+          <w:bCs/>
+          <w:lang w:val="en-US"/>
+        </w:rPr>
+        <w:t>login.tsx:</w:t>
+      </w:r>
+    </w:p>
+    <w:p>
+      <w:pPr>
+        <w:rPr>
+          <w:b/>
+          <w:bCs/>
+          <w:lang w:val="en-US"/>
+        </w:rPr>
+      </w:pPr>
+      <w:r>
+        <w:rPr>
+          <w:b/>
+          <w:bCs/>
+          <w:lang w:val="en-US"/>
+        </w:rPr>
+        <w:drawing>
+          <wp:inline distT="0" distB="0" distL="0" distR="0" wp14:anchorId="10E94A8F" wp14:editId="6D078055">
+            <wp:extent cx="5603358" cy="3322532"/>
+            <wp:effectExtent l="0" t="0" r="0" b="0"/>
+            <wp:docPr id="376808078" name="Picture 1" descr="A screen shot of a computer program&#10;&#10;AI-generated content may be incorrect."/>
+            <wp:cNvGraphicFramePr>
+              <a:graphicFrameLocks xmlns:a="http://schemas.openxmlformats.org/drawingml/2006/main" noChangeAspect="1"/>
+            </wp:cNvGraphicFramePr>
+            <a:graphic xmlns:a="http://schemas.openxmlformats.org/drawingml/2006/main">
+              <a:graphicData uri="http://schemas.openxmlformats.org/drawingml/2006/picture">
+                <pic:pic xmlns:pic="http://schemas.openxmlformats.org/drawingml/2006/picture">
+                  <pic:nvPicPr>
+                    <pic:cNvPr id="376808078" name="Picture 1" descr="A screen shot of a computer program&#10;&#10;AI-generated content may be incorrect."/>
+                    <pic:cNvPicPr/>
+                  </pic:nvPicPr>
+                  <pic:blipFill>
+                    <a:blip r:embed="rId26"/>
+                    <a:stretch>
+                      <a:fillRect/>
+                    </a:stretch>
+                  </pic:blipFill>
+                  <pic:spPr>
+                    <a:xfrm>
+                      <a:off x="0" y="0"/>
+                      <a:ext cx="5610027" cy="3326486"/>
+                    </a:xfrm>
+                    <a:prstGeom prst="rect">
+                      <a:avLst/>
+                    </a:prstGeom>
+                  </pic:spPr>
+                </pic:pic>
+              </a:graphicData>
+            </a:graphic>
+          </wp:inline>
+        </w:drawing>
+      </w:r>
+    </w:p>
+    <w:p>
+      <w:pPr>
+        <w:rPr>
+          <w:b/>
+          <w:bCs/>
+          <w:lang w:val="en-US"/>
+        </w:rPr>
+      </w:pPr>
+      <w:r>
+        <w:rPr>
+          <w:b/>
+          <w:bCs/>
+          <w:lang w:val="en-US"/>
+        </w:rPr>
+        <w:t>firestore.js:</w:t>
+      </w:r>
+    </w:p>
+    <w:p>
+      <w:pPr>
+        <w:rPr>
+          <w:b/>
+          <w:bCs/>
+          <w:lang w:val="en-US"/>
+        </w:rPr>
+      </w:pPr>
+      <w:r>
+        <w:rPr>
+          <w:b/>
+          <w:bCs/>
+          <w:lang w:val="en-US"/>
+        </w:rPr>
+        <w:drawing>
+          <wp:inline distT="0" distB="0" distL="0" distR="0" wp14:anchorId="094DECD2" wp14:editId="4C39B4CA">
+            <wp:extent cx="4129848" cy="3372145"/>
+            <wp:effectExtent l="0" t="0" r="4445" b="0"/>
+            <wp:docPr id="67609395" name="Picture 1" descr="A computer screen with text and symbols&#10;&#10;AI-generated content may be incorrect."/>
+            <wp:cNvGraphicFramePr>
+              <a:graphicFrameLocks xmlns:a="http://schemas.openxmlformats.org/drawingml/2006/main" noChangeAspect="1"/>
+            </wp:cNvGraphicFramePr>
+            <a:graphic xmlns:a="http://schemas.openxmlformats.org/drawingml/2006/main">
+              <a:graphicData uri="http://schemas.openxmlformats.org/drawingml/2006/picture">
+                <pic:pic xmlns:pic="http://schemas.openxmlformats.org/drawingml/2006/picture">
+                  <pic:nvPicPr>
+                    <pic:cNvPr id="67609395" name="Picture 1" descr="A computer screen with text and symbols&#10;&#10;AI-generated content may be incorrect."/>
+                    <pic:cNvPicPr/>
+                  </pic:nvPicPr>
+                  <pic:blipFill>
+                    <a:blip r:embed="rId27"/>
+                    <a:stretch>
+                      <a:fillRect/>
+                    </a:stretch>
+                  </pic:blipFill>
+                  <pic:spPr>
+                    <a:xfrm>
+                      <a:off x="0" y="0"/>
+                      <a:ext cx="4134143" cy="3375652"/>
+                    </a:xfrm>
+                    <a:prstGeom prst="rect">
+                      <a:avLst/>
+                    </a:prstGeom>
+                  </pic:spPr>
+                </pic:pic>
+              </a:graphicData>
+            </a:graphic>
+          </wp:inline>
+        </w:drawing>
+      </w:r>
+    </w:p>
+    <w:p>
+      <w:pPr>
+        <w:rPr>
+          <w:b/>
+          <w:bCs/>
+          <w:lang w:val="en-US"/>
+        </w:rPr>
+      </w:pPr>
+    </w:p>
+    <w:p>
+      <w:pPr>
+        <w:rPr>
+          <w:b/>
+          <w:bCs/>
+          <w:lang w:val="en-US"/>
+        </w:rPr>
+      </w:pPr>
+    </w:p>
+    <w:p>
+      <w:pPr>
+        <w:rPr>
+          <w:b/>
+          <w:bCs/>
+          <w:lang w:val="en-US"/>
+        </w:rPr>
+      </w:pPr>
+    </w:p>
+    <w:p>
+      <w:pPr>
+        <w:rPr>
+          <w:b/>
+          <w:bCs/>
+          <w:lang w:val="en-US"/>
+        </w:rPr>
+      </w:pPr>
+      <w:r>
+        <w:rPr>
+          <w:b/>
+          <w:bCs/>
+          <w:lang w:val="en-US"/>
+        </w:rPr>
+        <w:lastRenderedPageBreak/>
+        <w:t>login.tsx:</w:t>
+      </w:r>
+    </w:p>
+    <w:p>
+      <w:pPr>
+        <w:rPr>
+          <w:b/>
+          <w:bCs/>
+          <w:lang w:val="en-US"/>
+        </w:rPr>
+      </w:pPr>
+      <w:r>
+        <w:rPr>
+          <w:b/>
+          <w:bCs/>
+          <w:lang w:val="en-US"/>
+        </w:rPr>
+        <w:drawing>
+          <wp:inline distT="0" distB="0" distL="0" distR="0" wp14:anchorId="1F5BDF9C" wp14:editId="0EDD2FA7">
+            <wp:extent cx="3413051" cy="1849082"/>
+            <wp:effectExtent l="0" t="0" r="0" b="0"/>
+            <wp:docPr id="316237824" name="Picture 1" descr="A computer screen shot of a program code&#10;&#10;AI-generated content may be incorrect."/>
+            <wp:cNvGraphicFramePr>
+              <a:graphicFrameLocks xmlns:a="http://schemas.openxmlformats.org/drawingml/2006/main" noChangeAspect="1"/>
+            </wp:cNvGraphicFramePr>
+            <a:graphic xmlns:a="http://schemas.openxmlformats.org/drawingml/2006/main">
+              <a:graphicData uri="http://schemas.openxmlformats.org/drawingml/2006/picture">
+                <pic:pic xmlns:pic="http://schemas.openxmlformats.org/drawingml/2006/picture">
+                  <pic:nvPicPr>
+                    <pic:cNvPr id="316237824" name="Picture 1" descr="A computer screen shot of a program code&#10;&#10;AI-generated content may be incorrect."/>
+                    <pic:cNvPicPr/>
+                  </pic:nvPicPr>
+                  <pic:blipFill>
+                    <a:blip r:embed="rId28"/>
+                    <a:stretch>
+                      <a:fillRect/>
+                    </a:stretch>
+                  </pic:blipFill>
+                  <pic:spPr>
+                    <a:xfrm>
+                      <a:off x="0" y="0"/>
+                      <a:ext cx="3426157" cy="1856182"/>
+                    </a:xfrm>
+                    <a:prstGeom prst="rect">
+                      <a:avLst/>
+                    </a:prstGeom>
+                  </pic:spPr>
+                </pic:pic>
+              </a:graphicData>
+            </a:graphic>
+          </wp:inline>
+        </w:drawing>
+      </w:r>
+    </w:p>
+    <w:p>
+      <w:pPr>
+        <w:rPr>
+          <w:b/>
+          <w:bCs/>
+          <w:lang w:val="en-US"/>
+        </w:rPr>
+      </w:pPr>
+    </w:p>
+    <w:p>
+      <w:pPr>
+        <w:rPr>
+          <w:b/>
+          <w:bCs/>
+          <w:lang w:val="en-US"/>
+        </w:rPr>
+      </w:pPr>
+      <w:r>
+        <w:rPr>
+          <w:b/>
+          <w:bCs/>
+          <w:lang w:val="en-US"/>
+        </w:rPr>
+        <w:drawing>
+          <wp:anchor distT="0" distB="0" distL="114300" distR="114300" simplePos="0" relativeHeight="251658240" behindDoc="0" locked="0" layoutInCell="1" allowOverlap="1" wp14:anchorId="25E96966" wp14:editId="45518A0B">
+            <wp:simplePos x="0" y="0"/>
+            <wp:positionH relativeFrom="column">
+              <wp:posOffset>2497735</wp:posOffset>
+            </wp:positionH>
+            <wp:positionV relativeFrom="paragraph">
+              <wp:posOffset>367045</wp:posOffset>
+            </wp:positionV>
+            <wp:extent cx="2139315" cy="1764665"/>
+            <wp:effectExtent l="0" t="0" r="0" b="6985"/>
+            <wp:wrapSquare wrapText="bothSides"/>
+            <wp:docPr id="326758978" name="Picture 1" descr="A screenshot of a login screen&#10;&#10;AI-generated content may be incorrect."/>
+            <wp:cNvGraphicFramePr>
+              <a:graphicFrameLocks xmlns:a="http://schemas.openxmlformats.org/drawingml/2006/main" noChangeAspect="1"/>
+            </wp:cNvGraphicFramePr>
+            <a:graphic xmlns:a="http://schemas.openxmlformats.org/drawingml/2006/main">
+              <a:graphicData uri="http://schemas.openxmlformats.org/drawingml/2006/picture">
+                <pic:pic xmlns:pic="http://schemas.openxmlformats.org/drawingml/2006/picture">
+                  <pic:nvPicPr>
+                    <pic:cNvPr id="326758978" name="Picture 1" descr="A screenshot of a login screen&#10;&#10;AI-generated content may be incorrect."/>
+                    <pic:cNvPicPr/>
+                  </pic:nvPicPr>
+                  <pic:blipFill>
+                    <a:blip r:embed="rId29">
+                      <a:extLst>
+                        <a:ext uri="{28A0092B-C50C-407E-A947-70E740481C1C}">
+                          <a14:useLocalDpi xmlns:a14="http://schemas.microsoft.com/office/drawing/2010/main" val="0"/>
+                        </a:ext>
+                      </a:extLst>
+                    </a:blip>
+                    <a:stretch>
+                      <a:fillRect/>
+                    </a:stretch>
+                  </pic:blipFill>
+                  <pic:spPr>
+                    <a:xfrm>
+                      <a:off x="0" y="0"/>
+                      <a:ext cx="2139315" cy="1764665"/>
+                    </a:xfrm>
+                    <a:prstGeom prst="rect">
+                      <a:avLst/>
+                    </a:prstGeom>
+                  </pic:spPr>
+                </pic:pic>
+              </a:graphicData>
+            </a:graphic>
+            <wp14:sizeRelH relativeFrom="page">
+              <wp14:pctWidth>0</wp14:pctWidth>
+            </wp14:sizeRelH>
+            <wp14:sizeRelV relativeFrom="page">
+              <wp14:pctHeight>0</wp14:pctHeight>
+            </wp14:sizeRelV>
+          </wp:anchor>
+        </w:drawing>
+      </w:r>
+      <w:r>
+        <w:rPr>
+          <w:b/>
+          <w:bCs/>
+          <w:lang w:val="en-US"/>
+        </w:rPr>
+        <w:drawing>
+          <wp:anchor distT="0" distB="0" distL="114300" distR="114300" simplePos="0" relativeHeight="251659264" behindDoc="0" locked="0" layoutInCell="1" allowOverlap="1" wp14:anchorId="05DA159A" wp14:editId="3999BDB5">
+            <wp:simplePos x="0" y="0"/>
+            <wp:positionH relativeFrom="margin">
+              <wp:align>left</wp:align>
+            </wp:positionH>
+            <wp:positionV relativeFrom="paragraph">
+              <wp:posOffset>332592</wp:posOffset>
+            </wp:positionV>
+            <wp:extent cx="2224316" cy="4986670"/>
+            <wp:effectExtent l="0" t="0" r="5080" b="4445"/>
+            <wp:wrapSquare wrapText="bothSides"/>
+            <wp:docPr id="67638156" name="Picture 1" descr="A screenshot of a login box&#10;&#10;AI-generated content may be incorrect."/>
+            <wp:cNvGraphicFramePr>
+              <a:graphicFrameLocks xmlns:a="http://schemas.openxmlformats.org/drawingml/2006/main" noChangeAspect="1"/>
+            </wp:cNvGraphicFramePr>
+            <a:graphic xmlns:a="http://schemas.openxmlformats.org/drawingml/2006/main">
+              <a:graphicData uri="http://schemas.openxmlformats.org/drawingml/2006/picture">
+                <pic:pic xmlns:pic="http://schemas.openxmlformats.org/drawingml/2006/picture">
+                  <pic:nvPicPr>
+                    <pic:cNvPr id="67638156" name="Picture 1" descr="A screenshot of a login box&#10;&#10;AI-generated content may be incorrect."/>
+                    <pic:cNvPicPr/>
+                  </pic:nvPicPr>
+                  <pic:blipFill>
+                    <a:blip r:embed="rId30">
+                      <a:extLst>
+                        <a:ext uri="{28A0092B-C50C-407E-A947-70E740481C1C}">
+                          <a14:useLocalDpi xmlns:a14="http://schemas.microsoft.com/office/drawing/2010/main" val="0"/>
+                        </a:ext>
+                      </a:extLst>
+                    </a:blip>
+                    <a:stretch>
+                      <a:fillRect/>
+                    </a:stretch>
+                  </pic:blipFill>
+                  <pic:spPr>
+                    <a:xfrm>
+                      <a:off x="0" y="0"/>
+                      <a:ext cx="2224316" cy="4986670"/>
+                    </a:xfrm>
+                    <a:prstGeom prst="rect">
+                      <a:avLst/>
+                    </a:prstGeom>
+                  </pic:spPr>
+                </pic:pic>
+              </a:graphicData>
+            </a:graphic>
+            <wp14:sizeRelH relativeFrom="page">
+              <wp14:pctWidth>0</wp14:pctWidth>
+            </wp14:sizeRelH>
+            <wp14:sizeRelV relativeFrom="page">
+              <wp14:pctHeight>0</wp14:pctHeight>
+            </wp14:sizeRelV>
+          </wp:anchor>
+        </w:drawing>
+      </w:r>
+      <w:r>
+        <w:rPr>
+          <w:b/>
+          <w:bCs/>
+          <w:lang w:val="en-US"/>
+        </w:rPr>
+        <w:t>Testing logging in to newly created account:</w:t>
+      </w:r>
+      <w:r>
+        <w:rPr>
+          <w:b/>
+          <w:bCs/>
+          <w:lang w:val="en-US"/>
+        </w:rPr>
+        <w:br/>
+      </w:r>
+      <w:r>
+        <w:rPr>
+          <w:b/>
+          <w:bCs/>
+          <w:lang w:val="en-US"/>
+        </w:rPr>
+        <w:br/>
+      </w:r>
+    </w:p>
+    <w:p>
+      <w:pPr>
+        <w:rPr>
+          <w:b/>
+          <w:bCs/>
+          <w:lang w:val="en-US"/>
+        </w:rPr>
+      </w:pPr>
+      <w:r>
+        <w:rPr>
+          <w:b/>
+          <w:bCs/>
+          <w:lang w:val="en-US"/>
+        </w:rPr>
+        <w:drawing>
+          <wp:anchor distT="0" distB="0" distL="114300" distR="114300" simplePos="0" relativeHeight="251661312" behindDoc="0" locked="0" layoutInCell="1" allowOverlap="1" wp14:anchorId="5C791666" wp14:editId="19238023">
+            <wp:simplePos x="0" y="0"/>
+            <wp:positionH relativeFrom="page">
+              <wp:posOffset>3582670</wp:posOffset>
+            </wp:positionH>
+            <wp:positionV relativeFrom="paragraph">
+              <wp:posOffset>1548130</wp:posOffset>
+            </wp:positionV>
+            <wp:extent cx="1924050" cy="1812925"/>
+            <wp:effectExtent l="0" t="0" r="0" b="0"/>
+            <wp:wrapSquare wrapText="bothSides"/>
+            <wp:docPr id="1339172656" name="Picture 1" descr="A screenshot of a login box&#10;&#10;AI-generated content may be incorrect."/>
+            <wp:cNvGraphicFramePr>
+              <a:graphicFrameLocks xmlns:a="http://schemas.openxmlformats.org/drawingml/2006/main" noChangeAspect="1"/>
+            </wp:cNvGraphicFramePr>
+            <a:graphic xmlns:a="http://schemas.openxmlformats.org/drawingml/2006/main">
+              <a:graphicData uri="http://schemas.openxmlformats.org/drawingml/2006/picture">
+                <pic:pic xmlns:pic="http://schemas.openxmlformats.org/drawingml/2006/picture">
+                  <pic:nvPicPr>
+                    <pic:cNvPr id="1339172656" name="Picture 1" descr="A screenshot of a login box&#10;&#10;AI-generated content may be incorrect."/>
+                    <pic:cNvPicPr/>
+                  </pic:nvPicPr>
+                  <pic:blipFill>
+                    <a:blip r:embed="rId31">
+                      <a:extLst>
+                        <a:ext uri="{28A0092B-C50C-407E-A947-70E740481C1C}">
+                          <a14:useLocalDpi xmlns:a14="http://schemas.microsoft.com/office/drawing/2010/main" val="0"/>
+                        </a:ext>
+                      </a:extLst>
+                    </a:blip>
+                    <a:stretch>
+                      <a:fillRect/>
+                    </a:stretch>
+                  </pic:blipFill>
+                  <pic:spPr>
+                    <a:xfrm>
+                      <a:off x="0" y="0"/>
+                      <a:ext cx="1924050" cy="1812925"/>
+                    </a:xfrm>
+                    <a:prstGeom prst="rect">
+                      <a:avLst/>
+                    </a:prstGeom>
+                  </pic:spPr>
+                </pic:pic>
+              </a:graphicData>
+            </a:graphic>
+            <wp14:sizeRelH relativeFrom="page">
+              <wp14:pctWidth>0</wp14:pctWidth>
+            </wp14:sizeRelH>
+            <wp14:sizeRelV relativeFrom="page">
+              <wp14:pctHeight>0</wp14:pctHeight>
+            </wp14:sizeRelV>
+          </wp:anchor>
+        </w:drawing>
+      </w:r>
+      <w:r>
+        <w:rPr>
+          <w:b/>
+          <w:bCs/>
+          <w:lang w:val="en-US"/>
+        </w:rPr>
+        <w:drawing>
+          <wp:anchor distT="0" distB="0" distL="114300" distR="114300" simplePos="0" relativeHeight="251660288" behindDoc="0" locked="0" layoutInCell="1" allowOverlap="1" wp14:anchorId="50A5A512" wp14:editId="01F76C0D">
+            <wp:simplePos x="0" y="0"/>
+            <wp:positionH relativeFrom="margin">
+              <wp:align>left</wp:align>
+            </wp:positionH>
+            <wp:positionV relativeFrom="paragraph">
+              <wp:posOffset>3456438</wp:posOffset>
+            </wp:positionV>
+            <wp:extent cx="5826125" cy="1908810"/>
+            <wp:effectExtent l="0" t="0" r="3175" b="0"/>
+            <wp:wrapSquare wrapText="bothSides"/>
+            <wp:docPr id="1352976350" name="Picture 1" descr="A screenshot of a computer&#10;&#10;AI-generated content may be incorrect."/>
+            <wp:cNvGraphicFramePr>
+              <a:graphicFrameLocks xmlns:a="http://schemas.openxmlformats.org/drawingml/2006/main" noChangeAspect="1"/>
+            </wp:cNvGraphicFramePr>
+            <a:graphic xmlns:a="http://schemas.openxmlformats.org/drawingml/2006/main">
+              <a:graphicData uri="http://schemas.openxmlformats.org/drawingml/2006/picture">
+                <pic:pic xmlns:pic="http://schemas.openxmlformats.org/drawingml/2006/picture">
+                  <pic:nvPicPr>
+                    <pic:cNvPr id="1352976350" name="Picture 1" descr="A screenshot of a computer&#10;&#10;AI-generated content may be incorrect."/>
+                    <pic:cNvPicPr/>
+                  </pic:nvPicPr>
+                  <pic:blipFill>
+                    <a:blip r:embed="rId32" cstate="print">
+                      <a:extLst>
+                        <a:ext uri="{28A0092B-C50C-407E-A947-70E740481C1C}">
+                          <a14:useLocalDpi xmlns:a14="http://schemas.microsoft.com/office/drawing/2010/main" val="0"/>
+                        </a:ext>
+                      </a:extLst>
+                    </a:blip>
+                    <a:stretch>
+                      <a:fillRect/>
+                    </a:stretch>
+                  </pic:blipFill>
+                  <pic:spPr>
+                    <a:xfrm>
+                      <a:off x="0" y="0"/>
+                      <a:ext cx="5826125" cy="1908810"/>
+                    </a:xfrm>
+                    <a:prstGeom prst="rect">
+                      <a:avLst/>
+                    </a:prstGeom>
+                  </pic:spPr>
+                </pic:pic>
+              </a:graphicData>
+            </a:graphic>
+            <wp14:sizeRelH relativeFrom="page">
+              <wp14:pctWidth>0</wp14:pctWidth>
+            </wp14:sizeRelH>
+            <wp14:sizeRelV relativeFrom="page">
+              <wp14:pctHeight>0</wp14:pctHeight>
+            </wp14:sizeRelV>
+          </wp:anchor>
+        </w:drawing>
+      </w:r>
+      <w:r>
+        <w:rPr>
+          <w:b/>
+          <w:bCs/>
           <w:lang w:val="en-US"/>
         </w:rPr>
         <w:br w:type="page"/>
@@ -2481,6 +3064,7 @@
       </w:pPr>
       <w:r>
         <w:rPr>
+          <w:noProof/>
           <w:lang w:val="en-US"/>
         </w:rPr>
         <w:drawing>
@@ -2499,7 +3083,7 @@
                     <pic:cNvPicPr/>
                   </pic:nvPicPr>
                   <pic:blipFill>
-                    <a:blip r:embed="rId26"/>
+                    <a:blip r:embed="rId33"/>
                     <a:stretch>
                       <a:fillRect/>
                     </a:stretch>
@@ -2521,6 +3105,7 @@
       </w:r>
       <w:r>
         <w:rPr>
+          <w:noProof/>
           <w:lang w:val="en-US"/>
         </w:rPr>
         <w:drawing>
@@ -2539,7 +3124,7 @@
                     <pic:cNvPicPr/>
                   </pic:nvPicPr>
                   <pic:blipFill>
-                    <a:blip r:embed="rId27"/>
+                    <a:blip r:embed="rId34"/>
                     <a:stretch>
                       <a:fillRect/>
                     </a:stretch>
@@ -3969,14 +4554,6 @@
 </file>
 
 <file path=customXml/item1.xml><?xml version="1.0" encoding="utf-8"?>
-<p:properties xmlns:p="http://schemas.microsoft.com/office/2006/metadata/properties" xmlns:xsi="http://www.w3.org/2001/XMLSchema-instance" xmlns:pc="http://schemas.microsoft.com/office/infopath/2007/PartnerControls">
-  <documentManagement>
-    <_activity xmlns="c464522a-a754-430f-b544-fd87d4c168c2" xsi:nil="true"/>
-  </documentManagement>
-</p:properties>
-</file>
-
-<file path=customXml/item2.xml><?xml version="1.0" encoding="utf-8"?>
 <?mso-contentType ?>
 <FormTemplates xmlns="http://schemas.microsoft.com/sharepoint/v3/contenttype/forms">
   <Display>DocumentLibraryForm</Display>
@@ -3985,7 +4562,19 @@
 </FormTemplates>
 </file>
 
+<file path=customXml/item2.xml><?xml version="1.0" encoding="utf-8"?>
+<p:properties xmlns:p="http://schemas.microsoft.com/office/2006/metadata/properties" xmlns:xsi="http://www.w3.org/2001/XMLSchema-instance" xmlns:pc="http://schemas.microsoft.com/office/infopath/2007/PartnerControls">
+  <documentManagement>
+    <_activity xmlns="c464522a-a754-430f-b544-fd87d4c168c2" xsi:nil="true"/>
+  </documentManagement>
+</p:properties>
+</file>
+
 <file path=customXml/item3.xml><?xml version="1.0" encoding="utf-8"?>
+<b:Sources xmlns:b="http://schemas.openxmlformats.org/officeDocument/2006/bibliography" xmlns="http://schemas.openxmlformats.org/officeDocument/2006/bibliography" SelectedStyle="\APASixthEditionOfficeOnline.xsl" StyleName="APA" Version="6"/>
+</file>
+
+<file path=customXml/item4.xml><?xml version="1.0" encoding="utf-8"?>
 <ct:contentTypeSchema xmlns:ct="http://schemas.microsoft.com/office/2006/metadata/contentType" xmlns:ma="http://schemas.microsoft.com/office/2006/metadata/properties/metaAttributes" ct:_="" ma:_="" ma:contentTypeName="Document" ma:contentTypeID="0x010100FD220758017CC846AA909CC7164ED159" ma:contentTypeVersion="9" ma:contentTypeDescription="Create a new document." ma:contentTypeScope="" ma:versionID="107195f5180327e81a14725ad49c53b2">
   <xsd:schema xmlns:xsd="http://www.w3.org/2001/XMLSchema" xmlns:xs="http://www.w3.org/2001/XMLSchema" xmlns:p="http://schemas.microsoft.com/office/2006/metadata/properties" xmlns:ns3="c464522a-a754-430f-b544-fd87d4c168c2" targetNamespace="http://schemas.microsoft.com/office/2006/metadata/properties" ma:root="true" ma:fieldsID="f73c64e9107e8a5bfbbc1902deeb9531" ns3:_="">
     <xsd:import namespace="c464522a-a754-430f-b544-fd87d4c168c2"/>
@@ -4159,27 +4748,7 @@
 </ct:contentTypeSchema>
 </file>
 
-<file path=customXml/item4.xml><?xml version="1.0" encoding="utf-8"?>
-<b:Sources xmlns:b="http://schemas.openxmlformats.org/officeDocument/2006/bibliography" xmlns="http://schemas.openxmlformats.org/officeDocument/2006/bibliography" SelectedStyle="\APASixthEditionOfficeOnline.xsl" StyleName="APA" Version="6"/>
-</file>
-
 <file path=customXml/itemProps1.xml><?xml version="1.0" encoding="utf-8"?>
-<ds:datastoreItem xmlns:ds="http://schemas.openxmlformats.org/officeDocument/2006/customXml" ds:itemID="{F79638DA-D241-4BF3-8AD6-7F74018D56BD}">
-  <ds:schemaRefs>
-    <ds:schemaRef ds:uri="http://schemas.openxmlformats.org/package/2006/metadata/core-properties"/>
-    <ds:schemaRef ds:uri="http://schemas.microsoft.com/office/infopath/2007/PartnerControls"/>
-    <ds:schemaRef ds:uri="http://schemas.microsoft.com/office/2006/metadata/properties"/>
-    <ds:schemaRef ds:uri="http://purl.org/dc/dcmitype/"/>
-    <ds:schemaRef ds:uri="http://purl.org/dc/terms/"/>
-    <ds:schemaRef ds:uri="http://www.w3.org/XML/1998/namespace"/>
-    <ds:schemaRef ds:uri="http://schemas.microsoft.com/office/2006/documentManagement/types"/>
-    <ds:schemaRef ds:uri="c464522a-a754-430f-b544-fd87d4c168c2"/>
-    <ds:schemaRef ds:uri="http://purl.org/dc/elements/1.1/"/>
-  </ds:schemaRefs>
-</ds:datastoreItem>
-</file>
-
-<file path=customXml/itemProps2.xml><?xml version="1.0" encoding="utf-8"?>
 <ds:datastoreItem xmlns:ds="http://schemas.openxmlformats.org/officeDocument/2006/customXml" ds:itemID="{C1AA33A3-61AD-4339-9E8A-C5DBB01DCEDF}">
   <ds:schemaRefs>
     <ds:schemaRef ds:uri="http://schemas.microsoft.com/sharepoint/v3/contenttype/forms"/>
@@ -4187,7 +4756,25 @@
 </ds:datastoreItem>
 </file>
 
+<file path=customXml/itemProps2.xml><?xml version="1.0" encoding="utf-8"?>
+<ds:datastoreItem xmlns:ds="http://schemas.openxmlformats.org/officeDocument/2006/customXml" ds:itemID="{F79638DA-D241-4BF3-8AD6-7F74018D56BD}">
+  <ds:schemaRefs>
+    <ds:schemaRef ds:uri="http://schemas.microsoft.com/office/2006/metadata/properties"/>
+    <ds:schemaRef ds:uri="http://schemas.microsoft.com/office/infopath/2007/PartnerControls"/>
+    <ds:schemaRef ds:uri="c464522a-a754-430f-b544-fd87d4c168c2"/>
+  </ds:schemaRefs>
+</ds:datastoreItem>
+</file>
+
 <file path=customXml/itemProps3.xml><?xml version="1.0" encoding="utf-8"?>
+<ds:datastoreItem xmlns:ds="http://schemas.openxmlformats.org/officeDocument/2006/customXml" ds:itemID="{238C6C0A-4621-4E84-9BEB-57ADB3D29432}">
+  <ds:schemaRefs>
+    <ds:schemaRef ds:uri="http://schemas.openxmlformats.org/officeDocument/2006/bibliography"/>
+  </ds:schemaRefs>
+</ds:datastoreItem>
+</file>
+
+<file path=customXml/itemProps4.xml><?xml version="1.0" encoding="utf-8"?>
 <ds:datastoreItem xmlns:ds="http://schemas.openxmlformats.org/officeDocument/2006/customXml" ds:itemID="{DF38D78A-FDB7-47F3-B2C0-0D7B5F170E7B}">
   <ds:schemaRefs>
     <ds:schemaRef ds:uri="http://schemas.microsoft.com/office/2006/metadata/contentType"/>
@@ -4203,12 +4790,4 @@
     <ds:schemaRef ds:uri="http://schemas.microsoft.com/internal/obd"/>
   </ds:schemaRefs>
 </ds:datastoreItem>
-</file>
-
-<file path=customXml/itemProps4.xml><?xml version="1.0" encoding="utf-8"?>
-<ds:datastoreItem xmlns:ds="http://schemas.openxmlformats.org/officeDocument/2006/customXml" ds:itemID="{238C6C0A-4621-4E84-9BEB-57ADB3D29432}">
-  <ds:schemaRefs>
-    <ds:schemaRef ds:uri="http://schemas.openxmlformats.org/officeDocument/2006/bibliography"/>
-  </ds:schemaRefs>
-</ds:datastoreItem>
 </file>
</xml_diff>

<commit_message>
Further Work on Login & Sign Up Appearance
</commit_message>
<xml_diff>
--- a/Documentation/COMP3000 - Progress Report.docx
+++ b/Documentation/COMP3000 - Progress Report.docx
@@ -2476,6 +2476,7 @@
         <w:rPr>
           <w:b/>
           <w:bCs/>
+          <w:noProof/>
           <w:lang w:val="en-US"/>
         </w:rPr>
         <w:drawing>
@@ -2544,6 +2545,7 @@
         <w:rPr>
           <w:b/>
           <w:bCs/>
+          <w:noProof/>
           <w:lang w:val="en-US"/>
         </w:rPr>
         <w:drawing>
@@ -2640,6 +2642,7 @@
         <w:rPr>
           <w:b/>
           <w:bCs/>
+          <w:noProof/>
           <w:lang w:val="en-US"/>
         </w:rPr>
         <w:drawing>
@@ -2700,6 +2703,7 @@
         <w:rPr>
           <w:b/>
           <w:bCs/>
+          <w:noProof/>
           <w:lang w:val="en-US"/>
         </w:rPr>
         <w:drawing>
@@ -2762,6 +2766,7 @@
         <w:rPr>
           <w:b/>
           <w:bCs/>
+          <w:noProof/>
           <w:lang w:val="en-US"/>
         </w:rPr>
         <w:drawing>
@@ -2857,6 +2862,7 @@
         <w:rPr>
           <w:b/>
           <w:bCs/>
+          <w:noProof/>
           <w:lang w:val="en-US"/>
         </w:rPr>
         <w:drawing>
@@ -2919,6 +2925,7 @@
         <w:rPr>
           <w:b/>
           <w:bCs/>
+          <w:noProof/>
           <w:lang w:val="en-US"/>
         </w:rPr>
         <w:drawing>
@@ -2988,6 +2995,422 @@
     </w:p>
     <w:p>
       <w:pPr>
+        <w:rPr>
+          <w:b/>
+          <w:bCs/>
+          <w:lang w:val="en-US"/>
+        </w:rPr>
+      </w:pPr>
+      <w:r>
+        <w:rPr>
+          <w:b/>
+          <w:bCs/>
+          <w:lang w:val="en-US"/>
+        </w:rPr>
+        <w:lastRenderedPageBreak/>
+        <w:t>Updated appearance of login and sign up screens</w:t>
+      </w:r>
+    </w:p>
+    <w:p>
+      <w:pPr>
+        <w:rPr>
+          <w:b/>
+          <w:bCs/>
+          <w:lang w:val="en-US"/>
+        </w:rPr>
+      </w:pPr>
+      <w:r>
+        <w:rPr>
+          <w:b/>
+          <w:bCs/>
+          <w:lang w:val="en-US"/>
+        </w:rPr>
+        <w:drawing>
+          <wp:anchor distT="0" distB="0" distL="114300" distR="114300" simplePos="0" relativeHeight="251663360" behindDoc="0" locked="0" layoutInCell="1" allowOverlap="1" wp14:anchorId="6B890EEF" wp14:editId="1412A090">
+            <wp:simplePos x="0" y="0"/>
+            <wp:positionH relativeFrom="column">
+              <wp:posOffset>3430270</wp:posOffset>
+            </wp:positionH>
+            <wp:positionV relativeFrom="paragraph">
+              <wp:posOffset>285750</wp:posOffset>
+            </wp:positionV>
+            <wp:extent cx="1522730" cy="3202940"/>
+            <wp:effectExtent l="0" t="0" r="1270" b="0"/>
+            <wp:wrapSquare wrapText="bothSides"/>
+            <wp:docPr id="305323267" name="Picture 1"/>
+            <wp:cNvGraphicFramePr>
+              <a:graphicFrameLocks xmlns:a="http://schemas.openxmlformats.org/drawingml/2006/main" noChangeAspect="1"/>
+            </wp:cNvGraphicFramePr>
+            <a:graphic xmlns:a="http://schemas.openxmlformats.org/drawingml/2006/main">
+              <a:graphicData uri="http://schemas.openxmlformats.org/drawingml/2006/picture">
+                <pic:pic xmlns:pic="http://schemas.openxmlformats.org/drawingml/2006/picture">
+                  <pic:nvPicPr>
+                    <pic:cNvPr id="305323267" name=""/>
+                    <pic:cNvPicPr/>
+                  </pic:nvPicPr>
+                  <pic:blipFill>
+                    <a:blip r:embed="rId33">
+                      <a:extLst>
+                        <a:ext uri="{28A0092B-C50C-407E-A947-70E740481C1C}">
+                          <a14:useLocalDpi xmlns:a14="http://schemas.microsoft.com/office/drawing/2010/main" val="0"/>
+                        </a:ext>
+                      </a:extLst>
+                    </a:blip>
+                    <a:stretch>
+                      <a:fillRect/>
+                    </a:stretch>
+                  </pic:blipFill>
+                  <pic:spPr>
+                    <a:xfrm>
+                      <a:off x="0" y="0"/>
+                      <a:ext cx="1522730" cy="3202940"/>
+                    </a:xfrm>
+                    <a:prstGeom prst="rect">
+                      <a:avLst/>
+                    </a:prstGeom>
+                  </pic:spPr>
+                </pic:pic>
+              </a:graphicData>
+            </a:graphic>
+            <wp14:sizeRelH relativeFrom="page">
+              <wp14:pctWidth>0</wp14:pctWidth>
+            </wp14:sizeRelH>
+            <wp14:sizeRelV relativeFrom="page">
+              <wp14:pctHeight>0</wp14:pctHeight>
+            </wp14:sizeRelV>
+          </wp:anchor>
+        </w:drawing>
+      </w:r>
+      <w:r>
+        <w:rPr>
+          <w:b/>
+          <w:bCs/>
+          <w:lang w:val="en-US"/>
+        </w:rPr>
+        <w:drawing>
+          <wp:anchor distT="0" distB="0" distL="114300" distR="114300" simplePos="0" relativeHeight="251664384" behindDoc="1" locked="0" layoutInCell="1" allowOverlap="1" wp14:anchorId="71F3FFD7" wp14:editId="01C93F7B">
+            <wp:simplePos x="0" y="0"/>
+            <wp:positionH relativeFrom="column">
+              <wp:posOffset>-15240</wp:posOffset>
+            </wp:positionH>
+            <wp:positionV relativeFrom="paragraph">
+              <wp:posOffset>285115</wp:posOffset>
+            </wp:positionV>
+            <wp:extent cx="3281680" cy="3203575"/>
+            <wp:effectExtent l="0" t="0" r="0" b="0"/>
+            <wp:wrapTight wrapText="bothSides">
+              <wp:wrapPolygon edited="0">
+                <wp:start x="0" y="0"/>
+                <wp:lineTo x="0" y="21450"/>
+                <wp:lineTo x="21441" y="21450"/>
+                <wp:lineTo x="21441" y="0"/>
+                <wp:lineTo x="0" y="0"/>
+              </wp:wrapPolygon>
+            </wp:wrapTight>
+            <wp:docPr id="1145596690" name="Picture 1"/>
+            <wp:cNvGraphicFramePr>
+              <a:graphicFrameLocks xmlns:a="http://schemas.openxmlformats.org/drawingml/2006/main" noChangeAspect="1"/>
+            </wp:cNvGraphicFramePr>
+            <a:graphic xmlns:a="http://schemas.openxmlformats.org/drawingml/2006/main">
+              <a:graphicData uri="http://schemas.openxmlformats.org/drawingml/2006/picture">
+                <pic:pic xmlns:pic="http://schemas.openxmlformats.org/drawingml/2006/picture">
+                  <pic:nvPicPr>
+                    <pic:cNvPr id="1145596690" name=""/>
+                    <pic:cNvPicPr/>
+                  </pic:nvPicPr>
+                  <pic:blipFill>
+                    <a:blip r:embed="rId34" cstate="print">
+                      <a:extLst>
+                        <a:ext uri="{28A0092B-C50C-407E-A947-70E740481C1C}">
+                          <a14:useLocalDpi xmlns:a14="http://schemas.microsoft.com/office/drawing/2010/main" val="0"/>
+                        </a:ext>
+                      </a:extLst>
+                    </a:blip>
+                    <a:stretch>
+                      <a:fillRect/>
+                    </a:stretch>
+                  </pic:blipFill>
+                  <pic:spPr>
+                    <a:xfrm>
+                      <a:off x="0" y="0"/>
+                      <a:ext cx="3281680" cy="3203575"/>
+                    </a:xfrm>
+                    <a:prstGeom prst="rect">
+                      <a:avLst/>
+                    </a:prstGeom>
+                  </pic:spPr>
+                </pic:pic>
+              </a:graphicData>
+            </a:graphic>
+            <wp14:sizeRelH relativeFrom="page">
+              <wp14:pctWidth>0</wp14:pctWidth>
+            </wp14:sizeRelH>
+            <wp14:sizeRelV relativeFrom="page">
+              <wp14:pctHeight>0</wp14:pctHeight>
+            </wp14:sizeRelV>
+          </wp:anchor>
+        </w:drawing>
+      </w:r>
+      <w:r>
+        <w:rPr>
+          <w:b/>
+          <w:bCs/>
+          <w:lang w:val="en-US"/>
+        </w:rPr>
+        <w:t>Index.tsx:</w:t>
+      </w:r>
+    </w:p>
+    <w:p>
+      <w:pPr>
+        <w:rPr>
+          <w:b/>
+          <w:bCs/>
+          <w:lang w:val="en-US"/>
+        </w:rPr>
+      </w:pPr>
+    </w:p>
+    <w:p>
+      <w:pPr>
+        <w:rPr>
+          <w:b/>
+          <w:bCs/>
+          <w:lang w:val="en-US"/>
+        </w:rPr>
+      </w:pPr>
+    </w:p>
+    <w:p>
+      <w:pPr>
+        <w:rPr>
+          <w:b/>
+          <w:bCs/>
+          <w:lang w:val="en-US"/>
+        </w:rPr>
+      </w:pPr>
+    </w:p>
+    <w:p>
+      <w:pPr>
+        <w:rPr>
+          <w:b/>
+          <w:bCs/>
+          <w:lang w:val="en-US"/>
+        </w:rPr>
+      </w:pPr>
+    </w:p>
+    <w:p>
+      <w:pPr>
+        <w:rPr>
+          <w:b/>
+          <w:bCs/>
+          <w:lang w:val="en-US"/>
+        </w:rPr>
+      </w:pPr>
+    </w:p>
+    <w:p>
+      <w:pPr>
+        <w:rPr>
+          <w:b/>
+          <w:bCs/>
+          <w:lang w:val="en-US"/>
+        </w:rPr>
+      </w:pPr>
+    </w:p>
+    <w:p>
+      <w:pPr>
+        <w:rPr>
+          <w:b/>
+          <w:bCs/>
+          <w:lang w:val="en-US"/>
+        </w:rPr>
+      </w:pPr>
+    </w:p>
+    <w:p>
+      <w:pPr>
+        <w:rPr>
+          <w:b/>
+          <w:bCs/>
+          <w:lang w:val="en-US"/>
+        </w:rPr>
+      </w:pPr>
+    </w:p>
+    <w:p>
+      <w:pPr>
+        <w:rPr>
+          <w:b/>
+          <w:bCs/>
+          <w:lang w:val="en-US"/>
+        </w:rPr>
+      </w:pPr>
+    </w:p>
+    <w:p>
+      <w:pPr>
+        <w:rPr>
+          <w:b/>
+          <w:bCs/>
+          <w:lang w:val="en-US"/>
+        </w:rPr>
+      </w:pPr>
+    </w:p>
+    <w:p>
+      <w:pPr>
+        <w:rPr>
+          <w:b/>
+          <w:bCs/>
+          <w:lang w:val="en-US"/>
+        </w:rPr>
+      </w:pPr>
+    </w:p>
+    <w:p>
+      <w:pPr>
+        <w:rPr>
+          <w:b/>
+          <w:bCs/>
+          <w:lang w:val="en-US"/>
+        </w:rPr>
+      </w:pPr>
+    </w:p>
+    <w:p>
+      <w:pPr>
+        <w:rPr>
+          <w:b/>
+          <w:bCs/>
+          <w:lang w:val="en-US"/>
+        </w:rPr>
+      </w:pPr>
+      <w:r>
+        <w:rPr>
+          <w:b/>
+          <w:bCs/>
+          <w:lang w:val="en-US"/>
+        </w:rPr>
+        <w:drawing>
+          <wp:anchor distT="0" distB="0" distL="114300" distR="114300" simplePos="0" relativeHeight="251666432" behindDoc="0" locked="0" layoutInCell="1" allowOverlap="1" wp14:anchorId="56452892" wp14:editId="088C19DF">
+            <wp:simplePos x="0" y="0"/>
+            <wp:positionH relativeFrom="column">
+              <wp:posOffset>1748155</wp:posOffset>
+            </wp:positionH>
+            <wp:positionV relativeFrom="paragraph">
+              <wp:posOffset>9525</wp:posOffset>
+            </wp:positionV>
+            <wp:extent cx="1601470" cy="3688715"/>
+            <wp:effectExtent l="0" t="0" r="0" b="6985"/>
+            <wp:wrapSquare wrapText="bothSides"/>
+            <wp:docPr id="935007804" name="Picture 1" descr="A screenshot of a login form&#10;&#10;AI-generated content may be incorrect."/>
+            <wp:cNvGraphicFramePr>
+              <a:graphicFrameLocks xmlns:a="http://schemas.openxmlformats.org/drawingml/2006/main" noChangeAspect="1"/>
+            </wp:cNvGraphicFramePr>
+            <a:graphic xmlns:a="http://schemas.openxmlformats.org/drawingml/2006/main">
+              <a:graphicData uri="http://schemas.openxmlformats.org/drawingml/2006/picture">
+                <pic:pic xmlns:pic="http://schemas.openxmlformats.org/drawingml/2006/picture">
+                  <pic:nvPicPr>
+                    <pic:cNvPr id="935007804" name="Picture 1" descr="A screenshot of a login form&#10;&#10;AI-generated content may be incorrect."/>
+                    <pic:cNvPicPr/>
+                  </pic:nvPicPr>
+                  <pic:blipFill>
+                    <a:blip r:embed="rId35" cstate="print">
+                      <a:extLst>
+                        <a:ext uri="{28A0092B-C50C-407E-A947-70E740481C1C}">
+                          <a14:useLocalDpi xmlns:a14="http://schemas.microsoft.com/office/drawing/2010/main" val="0"/>
+                        </a:ext>
+                      </a:extLst>
+                    </a:blip>
+                    <a:stretch>
+                      <a:fillRect/>
+                    </a:stretch>
+                  </pic:blipFill>
+                  <pic:spPr>
+                    <a:xfrm>
+                      <a:off x="0" y="0"/>
+                      <a:ext cx="1601470" cy="3688715"/>
+                    </a:xfrm>
+                    <a:prstGeom prst="rect">
+                      <a:avLst/>
+                    </a:prstGeom>
+                  </pic:spPr>
+                </pic:pic>
+              </a:graphicData>
+            </a:graphic>
+            <wp14:sizeRelH relativeFrom="page">
+              <wp14:pctWidth>0</wp14:pctWidth>
+            </wp14:sizeRelH>
+            <wp14:sizeRelV relativeFrom="page">
+              <wp14:pctHeight>0</wp14:pctHeight>
+            </wp14:sizeRelV>
+          </wp:anchor>
+        </w:drawing>
+      </w:r>
+      <w:r>
+        <w:rPr>
+          <w:b/>
+          <w:bCs/>
+          <w:lang w:val="en-US"/>
+        </w:rPr>
+        <w:drawing>
+          <wp:anchor distT="0" distB="0" distL="114300" distR="114300" simplePos="0" relativeHeight="251665408" behindDoc="0" locked="0" layoutInCell="1" allowOverlap="1" wp14:anchorId="15635525" wp14:editId="23477CD1">
+            <wp:simplePos x="0" y="0"/>
+            <wp:positionH relativeFrom="column">
+              <wp:posOffset>0</wp:posOffset>
+            </wp:positionH>
+            <wp:positionV relativeFrom="paragraph">
+              <wp:posOffset>2819</wp:posOffset>
+            </wp:positionV>
+            <wp:extent cx="1617916" cy="3716122"/>
+            <wp:effectExtent l="0" t="0" r="1905" b="0"/>
+            <wp:wrapSquare wrapText="bothSides"/>
+            <wp:docPr id="1305982199" name="Picture 1"/>
+            <wp:cNvGraphicFramePr>
+              <a:graphicFrameLocks xmlns:a="http://schemas.openxmlformats.org/drawingml/2006/main" noChangeAspect="1"/>
+            </wp:cNvGraphicFramePr>
+            <a:graphic xmlns:a="http://schemas.openxmlformats.org/drawingml/2006/main">
+              <a:graphicData uri="http://schemas.openxmlformats.org/drawingml/2006/picture">
+                <pic:pic xmlns:pic="http://schemas.openxmlformats.org/drawingml/2006/picture">
+                  <pic:nvPicPr>
+                    <pic:cNvPr id="1305982199" name=""/>
+                    <pic:cNvPicPr/>
+                  </pic:nvPicPr>
+                  <pic:blipFill>
+                    <a:blip r:embed="rId36" cstate="print">
+                      <a:extLst>
+                        <a:ext uri="{28A0092B-C50C-407E-A947-70E740481C1C}">
+                          <a14:useLocalDpi xmlns:a14="http://schemas.microsoft.com/office/drawing/2010/main" val="0"/>
+                        </a:ext>
+                      </a:extLst>
+                    </a:blip>
+                    <a:stretch>
+                      <a:fillRect/>
+                    </a:stretch>
+                  </pic:blipFill>
+                  <pic:spPr>
+                    <a:xfrm>
+                      <a:off x="0" y="0"/>
+                      <a:ext cx="1617916" cy="3716122"/>
+                    </a:xfrm>
+                    <a:prstGeom prst="rect">
+                      <a:avLst/>
+                    </a:prstGeom>
+                  </pic:spPr>
+                </pic:pic>
+              </a:graphicData>
+            </a:graphic>
+            <wp14:sizeRelH relativeFrom="page">
+              <wp14:pctWidth>0</wp14:pctWidth>
+            </wp14:sizeRelH>
+            <wp14:sizeRelV relativeFrom="page">
+              <wp14:pctHeight>0</wp14:pctHeight>
+            </wp14:sizeRelV>
+          </wp:anchor>
+        </w:drawing>
+      </w:r>
+      <w:r>
+        <w:rPr>
+          <w:b/>
+          <w:bCs/>
+          <w:lang w:val="en-US"/>
+        </w:rPr>
+        <w:br w:type="page"/>
+      </w:r>
+    </w:p>
+    <w:p>
+      <w:pPr>
         <w:pStyle w:val="Heading4"/>
         <w:rPr>
           <w:lang w:val="en-US"/>
@@ -3083,7 +3506,7 @@
                     <pic:cNvPicPr/>
                   </pic:nvPicPr>
                   <pic:blipFill>
-                    <a:blip r:embed="rId33"/>
+                    <a:blip r:embed="rId37"/>
                     <a:stretch>
                       <a:fillRect/>
                     </a:stretch>
@@ -3124,7 +3547,7 @@
                     <pic:cNvPicPr/>
                   </pic:nvPicPr>
                   <pic:blipFill>
-                    <a:blip r:embed="rId34"/>
+                    <a:blip r:embed="rId38"/>
                     <a:stretch>
                       <a:fillRect/>
                     </a:stretch>
@@ -4554,6 +4977,14 @@
 </file>
 
 <file path=customXml/item1.xml><?xml version="1.0" encoding="utf-8"?>
+<p:properties xmlns:p="http://schemas.microsoft.com/office/2006/metadata/properties" xmlns:xsi="http://www.w3.org/2001/XMLSchema-instance" xmlns:pc="http://schemas.microsoft.com/office/infopath/2007/PartnerControls">
+  <documentManagement>
+    <_activity xmlns="c464522a-a754-430f-b544-fd87d4c168c2" xsi:nil="true"/>
+  </documentManagement>
+</p:properties>
+</file>
+
+<file path=customXml/item2.xml><?xml version="1.0" encoding="utf-8"?>
 <?mso-contentType ?>
 <FormTemplates xmlns="http://schemas.microsoft.com/sharepoint/v3/contenttype/forms">
   <Display>DocumentLibraryForm</Display>
@@ -4562,19 +4993,7 @@
 </FormTemplates>
 </file>
 
-<file path=customXml/item2.xml><?xml version="1.0" encoding="utf-8"?>
-<p:properties xmlns:p="http://schemas.microsoft.com/office/2006/metadata/properties" xmlns:xsi="http://www.w3.org/2001/XMLSchema-instance" xmlns:pc="http://schemas.microsoft.com/office/infopath/2007/PartnerControls">
-  <documentManagement>
-    <_activity xmlns="c464522a-a754-430f-b544-fd87d4c168c2" xsi:nil="true"/>
-  </documentManagement>
-</p:properties>
-</file>
-
 <file path=customXml/item3.xml><?xml version="1.0" encoding="utf-8"?>
-<b:Sources xmlns:b="http://schemas.openxmlformats.org/officeDocument/2006/bibliography" xmlns="http://schemas.openxmlformats.org/officeDocument/2006/bibliography" SelectedStyle="\APASixthEditionOfficeOnline.xsl" StyleName="APA" Version="6"/>
-</file>
-
-<file path=customXml/item4.xml><?xml version="1.0" encoding="utf-8"?>
 <ct:contentTypeSchema xmlns:ct="http://schemas.microsoft.com/office/2006/metadata/contentType" xmlns:ma="http://schemas.microsoft.com/office/2006/metadata/properties/metaAttributes" ct:_="" ma:_="" ma:contentTypeName="Document" ma:contentTypeID="0x010100FD220758017CC846AA909CC7164ED159" ma:contentTypeVersion="9" ma:contentTypeDescription="Create a new document." ma:contentTypeScope="" ma:versionID="107195f5180327e81a14725ad49c53b2">
   <xsd:schema xmlns:xsd="http://www.w3.org/2001/XMLSchema" xmlns:xs="http://www.w3.org/2001/XMLSchema" xmlns:p="http://schemas.microsoft.com/office/2006/metadata/properties" xmlns:ns3="c464522a-a754-430f-b544-fd87d4c168c2" targetNamespace="http://schemas.microsoft.com/office/2006/metadata/properties" ma:root="true" ma:fieldsID="f73c64e9107e8a5bfbbc1902deeb9531" ns3:_="">
     <xsd:import namespace="c464522a-a754-430f-b544-fd87d4c168c2"/>
@@ -4748,15 +5167,11 @@
 </ct:contentTypeSchema>
 </file>
 
-<file path=customXml/itemProps1.xml><?xml version="1.0" encoding="utf-8"?>
-<ds:datastoreItem xmlns:ds="http://schemas.openxmlformats.org/officeDocument/2006/customXml" ds:itemID="{C1AA33A3-61AD-4339-9E8A-C5DBB01DCEDF}">
-  <ds:schemaRefs>
-    <ds:schemaRef ds:uri="http://schemas.microsoft.com/sharepoint/v3/contenttype/forms"/>
-  </ds:schemaRefs>
-</ds:datastoreItem>
+<file path=customXml/item4.xml><?xml version="1.0" encoding="utf-8"?>
+<b:Sources xmlns:b="http://schemas.openxmlformats.org/officeDocument/2006/bibliography" xmlns="http://schemas.openxmlformats.org/officeDocument/2006/bibliography" SelectedStyle="\APASixthEditionOfficeOnline.xsl" StyleName="APA" Version="6"/>
 </file>
 
-<file path=customXml/itemProps2.xml><?xml version="1.0" encoding="utf-8"?>
+<file path=customXml/itemProps1.xml><?xml version="1.0" encoding="utf-8"?>
 <ds:datastoreItem xmlns:ds="http://schemas.openxmlformats.org/officeDocument/2006/customXml" ds:itemID="{F79638DA-D241-4BF3-8AD6-7F74018D56BD}">
   <ds:schemaRefs>
     <ds:schemaRef ds:uri="http://schemas.microsoft.com/office/2006/metadata/properties"/>
@@ -4766,15 +5181,15 @@
 </ds:datastoreItem>
 </file>
 
-<file path=customXml/itemProps3.xml><?xml version="1.0" encoding="utf-8"?>
-<ds:datastoreItem xmlns:ds="http://schemas.openxmlformats.org/officeDocument/2006/customXml" ds:itemID="{238C6C0A-4621-4E84-9BEB-57ADB3D29432}">
+<file path=customXml/itemProps2.xml><?xml version="1.0" encoding="utf-8"?>
+<ds:datastoreItem xmlns:ds="http://schemas.openxmlformats.org/officeDocument/2006/customXml" ds:itemID="{C1AA33A3-61AD-4339-9E8A-C5DBB01DCEDF}">
   <ds:schemaRefs>
-    <ds:schemaRef ds:uri="http://schemas.openxmlformats.org/officeDocument/2006/bibliography"/>
+    <ds:schemaRef ds:uri="http://schemas.microsoft.com/sharepoint/v3/contenttype/forms"/>
   </ds:schemaRefs>
 </ds:datastoreItem>
 </file>
 
-<file path=customXml/itemProps4.xml><?xml version="1.0" encoding="utf-8"?>
+<file path=customXml/itemProps3.xml><?xml version="1.0" encoding="utf-8"?>
 <ds:datastoreItem xmlns:ds="http://schemas.openxmlformats.org/officeDocument/2006/customXml" ds:itemID="{DF38D78A-FDB7-47F3-B2C0-0D7B5F170E7B}">
   <ds:schemaRefs>
     <ds:schemaRef ds:uri="http://schemas.microsoft.com/office/2006/metadata/contentType"/>
@@ -4790,4 +5205,12 @@
     <ds:schemaRef ds:uri="http://schemas.microsoft.com/internal/obd"/>
   </ds:schemaRefs>
 </ds:datastoreItem>
+</file>
+
+<file path=customXml/itemProps4.xml><?xml version="1.0" encoding="utf-8"?>
+<ds:datastoreItem xmlns:ds="http://schemas.openxmlformats.org/officeDocument/2006/customXml" ds:itemID="{238C6C0A-4621-4E84-9BEB-57ADB3D29432}">
+  <ds:schemaRefs>
+    <ds:schemaRef ds:uri="http://schemas.openxmlformats.org/officeDocument/2006/bibliography"/>
+  </ds:schemaRefs>
+</ds:datastoreItem>
 </file>
</xml_diff>

<commit_message>
Added Firebase Auth to Accounts. - Changed login & Sign up to use firestore auth with email aliases that use "@example.com". - Added auto login to log users in once they have signed up. - Added more comments for future understanding etc.
</commit_message>
<xml_diff>
--- a/Documentation/COMP3000 - Progress Report.docx
+++ b/Documentation/COMP3000 - Progress Report.docx
@@ -1271,21 +1271,7 @@
         <w:rPr>
           <w:lang w:val="en-US"/>
         </w:rPr>
-        <w:t xml:space="preserve">triggering the FirebaseTestScreen() function, which then triggers the </w:t>
-      </w:r>
-      <w:proofErr w:type="spellStart"/>
-      <w:r>
-        <w:rPr>
-          <w:lang w:val="en-US"/>
-        </w:rPr>
-        <w:t>addUser</w:t>
-      </w:r>
-      <w:proofErr w:type="spellEnd"/>
-      <w:r>
-        <w:rPr>
-          <w:lang w:val="en-US"/>
-        </w:rPr>
-        <w:t xml:space="preserve">() function to add </w:t>
+        <w:t xml:space="preserve">triggering the FirebaseTestScreen() function, which then triggers the addUser() function to add </w:t>
       </w:r>
       <w:r>
         <w:rPr>
@@ -2425,13 +2411,15 @@
         <w:rPr>
           <w:b/>
           <w:bCs/>
-          <w:lang w:val="en-US"/>
-        </w:rPr>
-      </w:pPr>
-      <w:r>
-        <w:rPr>
-          <w:b/>
-          <w:bCs/>
+          <w:u w:val="single"/>
+          <w:lang w:val="en-US"/>
+        </w:rPr>
+      </w:pPr>
+      <w:r>
+        <w:rPr>
+          <w:b/>
+          <w:bCs/>
+          <w:u w:val="single"/>
           <w:lang w:val="en-US"/>
         </w:rPr>
         <w:lastRenderedPageBreak/>
@@ -2696,6 +2684,7 @@
         <w:rPr>
           <w:b/>
           <w:bCs/>
+          <w:u w:val="single"/>
           <w:lang w:val="en-US"/>
         </w:rPr>
       </w:pPr>
@@ -2704,6 +2693,7 @@
           <w:b/>
           <w:bCs/>
           <w:noProof/>
+          <w:u w:val="single"/>
           <w:lang w:val="en-US"/>
         </w:rPr>
         <w:drawing>
@@ -2767,6 +2757,7 @@
           <w:b/>
           <w:bCs/>
           <w:noProof/>
+          <w:u w:val="single"/>
           <w:lang w:val="en-US"/>
         </w:rPr>
         <w:drawing>
@@ -2829,6 +2820,7 @@
         <w:rPr>
           <w:b/>
           <w:bCs/>
+          <w:u w:val="single"/>
           <w:lang w:val="en-US"/>
         </w:rPr>
         <w:t>Testing logging in to newly created account:</w:t>
@@ -2837,14 +2829,16 @@
         <w:rPr>
           <w:b/>
           <w:bCs/>
-          <w:lang w:val="en-US"/>
-        </w:rPr>
-        <w:br/>
-      </w:r>
-      <w:r>
-        <w:rPr>
-          <w:b/>
-          <w:bCs/>
+          <w:u w:val="single"/>
+          <w:lang w:val="en-US"/>
+        </w:rPr>
+        <w:br/>
+      </w:r>
+      <w:r>
+        <w:rPr>
+          <w:b/>
+          <w:bCs/>
+          <w:u w:val="single"/>
           <w:lang w:val="en-US"/>
         </w:rPr>
         <w:br/>
@@ -2998,13 +2992,15 @@
         <w:rPr>
           <w:b/>
           <w:bCs/>
-          <w:lang w:val="en-US"/>
-        </w:rPr>
-      </w:pPr>
-      <w:r>
-        <w:rPr>
-          <w:b/>
-          <w:bCs/>
+          <w:u w:val="single"/>
+          <w:lang w:val="en-US"/>
+        </w:rPr>
+      </w:pPr>
+      <w:r>
+        <w:rPr>
+          <w:b/>
+          <w:bCs/>
+          <w:u w:val="single"/>
           <w:lang w:val="en-US"/>
         </w:rPr>
         <w:lastRenderedPageBreak/>
@@ -3023,6 +3019,7 @@
         <w:rPr>
           <w:b/>
           <w:bCs/>
+          <w:noProof/>
           <w:lang w:val="en-US"/>
         </w:rPr>
         <w:drawing>
@@ -3085,10 +3082,11 @@
         <w:rPr>
           <w:b/>
           <w:bCs/>
+          <w:noProof/>
           <w:lang w:val="en-US"/>
         </w:rPr>
         <w:drawing>
-          <wp:anchor distT="0" distB="0" distL="114300" distR="114300" simplePos="0" relativeHeight="251664384" behindDoc="1" locked="0" layoutInCell="1" allowOverlap="1" wp14:anchorId="71F3FFD7" wp14:editId="01C93F7B">
+          <wp:anchor distT="0" distB="0" distL="114300" distR="114300" simplePos="0" relativeHeight="251664384" behindDoc="1" locked="0" layoutInCell="1" allowOverlap="1" wp14:anchorId="71F3FFD7" wp14:editId="167FEDEC">
             <wp:simplePos x="0" y="0"/>
             <wp:positionH relativeFrom="column">
               <wp:posOffset>-15240</wp:posOffset>
@@ -3280,10 +3278,11 @@
         <w:rPr>
           <w:b/>
           <w:bCs/>
+          <w:noProof/>
           <w:lang w:val="en-US"/>
         </w:rPr>
         <w:drawing>
-          <wp:anchor distT="0" distB="0" distL="114300" distR="114300" simplePos="0" relativeHeight="251666432" behindDoc="0" locked="0" layoutInCell="1" allowOverlap="1" wp14:anchorId="56452892" wp14:editId="088C19DF">
+          <wp:anchor distT="0" distB="0" distL="114300" distR="114300" simplePos="0" relativeHeight="251666432" behindDoc="0" locked="0" layoutInCell="1" allowOverlap="1" wp14:anchorId="56452892" wp14:editId="0C9A4CC6">
             <wp:simplePos x="0" y="0"/>
             <wp:positionH relativeFrom="column">
               <wp:posOffset>1748155</wp:posOffset>
@@ -3342,10 +3341,11 @@
         <w:rPr>
           <w:b/>
           <w:bCs/>
+          <w:noProof/>
           <w:lang w:val="en-US"/>
         </w:rPr>
         <w:drawing>
-          <wp:anchor distT="0" distB="0" distL="114300" distR="114300" simplePos="0" relativeHeight="251665408" behindDoc="0" locked="0" layoutInCell="1" allowOverlap="1" wp14:anchorId="15635525" wp14:editId="23477CD1">
+          <wp:anchor distT="0" distB="0" distL="114300" distR="114300" simplePos="0" relativeHeight="251665408" behindDoc="0" locked="0" layoutInCell="1" allowOverlap="1" wp14:anchorId="15635525" wp14:editId="6ECEBFA0">
             <wp:simplePos x="0" y="0"/>
             <wp:positionH relativeFrom="column">
               <wp:posOffset>0</wp:posOffset>
@@ -3411,6 +3411,1336 @@
     </w:p>
     <w:p>
       <w:pPr>
+        <w:rPr>
+          <w:b/>
+          <w:bCs/>
+          <w:lang w:val="en-US"/>
+        </w:rPr>
+      </w:pPr>
+      <w:r>
+        <w:rPr>
+          <w:b/>
+          <w:bCs/>
+          <w:u w:val="single"/>
+          <w:lang w:val="en-US"/>
+        </w:rPr>
+        <w:lastRenderedPageBreak/>
+        <w:t>Started work on basic dashboard, passing username through router from login to dashboard screen.</w:t>
+      </w:r>
+      <w:r>
+        <w:rPr>
+          <w:b/>
+          <w:bCs/>
+          <w:u w:val="single"/>
+          <w:lang w:val="en-US"/>
+        </w:rPr>
+        <w:t xml:space="preserve"> (</w:t>
+      </w:r>
+      <w:r>
+        <w:rPr>
+          <w:b/>
+          <w:bCs/>
+          <w:sz w:val="24"/>
+          <w:szCs w:val="24"/>
+          <w:u w:val="single"/>
+          <w:lang w:val="en-US"/>
+        </w:rPr>
+        <w:t>Pre data persistence</w:t>
+      </w:r>
+      <w:r>
+        <w:rPr>
+          <w:b/>
+          <w:bCs/>
+          <w:u w:val="single"/>
+          <w:lang w:val="en-US"/>
+        </w:rPr>
+        <w:t>)</w:t>
+      </w:r>
+      <w:r>
+        <w:rPr>
+          <w:b/>
+          <w:bCs/>
+          <w:lang w:val="en-US"/>
+        </w:rPr>
+        <w:br/>
+      </w:r>
+      <w:r>
+        <w:rPr>
+          <w:b/>
+          <w:bCs/>
+          <w:lang w:val="en-US"/>
+        </w:rPr>
+        <w:br/>
+        <w:t>login.tsx:</w:t>
+      </w:r>
+      <w:r>
+        <w:rPr>
+          <w:b/>
+          <w:bCs/>
+          <w:lang w:val="en-US"/>
+        </w:rPr>
+        <w:br/>
+      </w:r>
+      <w:r>
+        <w:rPr>
+          <w:b/>
+          <w:bCs/>
+          <w:lang w:val="en-US"/>
+        </w:rPr>
+        <w:br/>
+      </w:r>
+      <w:r>
+        <w:rPr>
+          <w:noProof/>
+          <w:lang w:val="en-US"/>
+        </w:rPr>
+        <w:drawing>
+          <wp:inline distT="0" distB="0" distL="0" distR="0" wp14:anchorId="0FD57C41" wp14:editId="01FB370D">
+            <wp:extent cx="3971808" cy="3364992"/>
+            <wp:effectExtent l="0" t="0" r="0" b="6985"/>
+            <wp:docPr id="1194121519" name="Picture 1"/>
+            <wp:cNvGraphicFramePr>
+              <a:graphicFrameLocks xmlns:a="http://schemas.openxmlformats.org/drawingml/2006/main" noChangeAspect="1"/>
+            </wp:cNvGraphicFramePr>
+            <a:graphic xmlns:a="http://schemas.openxmlformats.org/drawingml/2006/main">
+              <a:graphicData uri="http://schemas.openxmlformats.org/drawingml/2006/picture">
+                <pic:pic xmlns:pic="http://schemas.openxmlformats.org/drawingml/2006/picture">
+                  <pic:nvPicPr>
+                    <pic:cNvPr id="1194121519" name=""/>
+                    <pic:cNvPicPr/>
+                  </pic:nvPicPr>
+                  <pic:blipFill>
+                    <a:blip r:embed="rId37"/>
+                    <a:stretch>
+                      <a:fillRect/>
+                    </a:stretch>
+                  </pic:blipFill>
+                  <pic:spPr>
+                    <a:xfrm>
+                      <a:off x="0" y="0"/>
+                      <a:ext cx="3976276" cy="3368777"/>
+                    </a:xfrm>
+                    <a:prstGeom prst="rect">
+                      <a:avLst/>
+                    </a:prstGeom>
+                  </pic:spPr>
+                </pic:pic>
+              </a:graphicData>
+            </a:graphic>
+          </wp:inline>
+        </w:drawing>
+      </w:r>
+    </w:p>
+    <w:p>
+      <w:pPr>
+        <w:rPr>
+          <w:b/>
+          <w:bCs/>
+          <w:lang w:val="en-US"/>
+        </w:rPr>
+      </w:pPr>
+      <w:r>
+        <w:rPr>
+          <w:b/>
+          <w:bCs/>
+          <w:lang w:val="en-US"/>
+        </w:rPr>
+        <w:t>Dashboard.tsx:</w:t>
+      </w:r>
+    </w:p>
+    <w:p>
+      <w:pPr>
+        <w:rPr>
+          <w:b/>
+          <w:bCs/>
+          <w:lang w:val="en-US"/>
+        </w:rPr>
+      </w:pPr>
+      <w:r>
+        <w:rPr>
+          <w:noProof/>
+          <w:lang w:val="en-US"/>
+        </w:rPr>
+        <w:drawing>
+          <wp:inline distT="0" distB="0" distL="0" distR="0" wp14:anchorId="38E75278" wp14:editId="7DF1CB03">
+            <wp:extent cx="3708806" cy="2737843"/>
+            <wp:effectExtent l="0" t="0" r="6350" b="5715"/>
+            <wp:docPr id="204131647" name="Picture 1"/>
+            <wp:cNvGraphicFramePr>
+              <a:graphicFrameLocks xmlns:a="http://schemas.openxmlformats.org/drawingml/2006/main" noChangeAspect="1"/>
+            </wp:cNvGraphicFramePr>
+            <a:graphic xmlns:a="http://schemas.openxmlformats.org/drawingml/2006/main">
+              <a:graphicData uri="http://schemas.openxmlformats.org/drawingml/2006/picture">
+                <pic:pic xmlns:pic="http://schemas.openxmlformats.org/drawingml/2006/picture">
+                  <pic:nvPicPr>
+                    <pic:cNvPr id="204131647" name=""/>
+                    <pic:cNvPicPr/>
+                  </pic:nvPicPr>
+                  <pic:blipFill>
+                    <a:blip r:embed="rId38"/>
+                    <a:stretch>
+                      <a:fillRect/>
+                    </a:stretch>
+                  </pic:blipFill>
+                  <pic:spPr>
+                    <a:xfrm>
+                      <a:off x="0" y="0"/>
+                      <a:ext cx="3713047" cy="2740973"/>
+                    </a:xfrm>
+                    <a:prstGeom prst="rect">
+                      <a:avLst/>
+                    </a:prstGeom>
+                  </pic:spPr>
+                </pic:pic>
+              </a:graphicData>
+            </a:graphic>
+          </wp:inline>
+        </w:drawing>
+      </w:r>
+      <w:r>
+        <w:rPr>
+          <w:lang w:val="en-US"/>
+        </w:rPr>
+        <w:br w:type="page"/>
+      </w:r>
+      <w:r>
+        <w:rPr>
+          <w:lang w:val="en-US"/>
+        </w:rPr>
+        <w:lastRenderedPageBreak/>
+        <w:br/>
+      </w:r>
+      <w:r>
+        <w:rPr>
+          <w:lang w:val="en-US"/>
+        </w:rPr>
+        <w:br/>
+      </w:r>
+      <w:r>
+        <w:rPr>
+          <w:lang w:val="en-US"/>
+        </w:rPr>
+        <w:br/>
+      </w:r>
+      <w:r>
+        <w:rPr>
+          <w:lang w:val="en-US"/>
+        </w:rPr>
+        <w:br/>
+      </w:r>
+      <w:r>
+        <w:rPr>
+          <w:lang w:val="en-US"/>
+        </w:rPr>
+        <w:br/>
+      </w:r>
+      <w:r>
+        <w:rPr>
+          <w:lang w:val="en-US"/>
+        </w:rPr>
+        <w:br/>
+      </w:r>
+      <w:r>
+        <w:rPr>
+          <w:lang w:val="en-US"/>
+        </w:rPr>
+        <w:br/>
+      </w:r>
+      <w:r>
+        <w:rPr>
+          <w:lang w:val="en-US"/>
+        </w:rPr>
+        <w:br/>
+      </w:r>
+      <w:r>
+        <w:rPr>
+          <w:lang w:val="en-US"/>
+        </w:rPr>
+        <w:br/>
+      </w:r>
+      <w:r>
+        <w:rPr>
+          <w:lang w:val="en-US"/>
+        </w:rPr>
+        <w:br/>
+      </w:r>
+      <w:r>
+        <w:rPr>
+          <w:lang w:val="en-US"/>
+        </w:rPr>
+        <w:br/>
+      </w:r>
+      <w:r>
+        <w:rPr>
+          <w:lang w:val="en-US"/>
+        </w:rPr>
+        <w:br/>
+      </w:r>
+      <w:r>
+        <w:rPr>
+          <w:lang w:val="en-US"/>
+        </w:rPr>
+        <w:br/>
+      </w:r>
+      <w:r>
+        <w:rPr>
+          <w:lang w:val="en-US"/>
+        </w:rPr>
+        <w:br/>
+      </w:r>
+      <w:r>
+        <w:rPr>
+          <w:lang w:val="en-US"/>
+        </w:rPr>
+        <w:br/>
+      </w:r>
+      <w:r>
+        <w:rPr>
+          <w:lang w:val="en-US"/>
+        </w:rPr>
+        <w:br/>
+      </w:r>
+      <w:r>
+        <w:rPr>
+          <w:lang w:val="en-US"/>
+        </w:rPr>
+        <w:br/>
+      </w:r>
+      <w:r>
+        <w:rPr>
+          <w:lang w:val="en-US"/>
+        </w:rPr>
+        <w:br/>
+      </w:r>
+      <w:r>
+        <w:rPr>
+          <w:lang w:val="en-US"/>
+        </w:rPr>
+        <w:br/>
+      </w:r>
+      <w:r>
+        <w:rPr>
+          <w:lang w:val="en-US"/>
+        </w:rPr>
+        <w:br/>
+      </w:r>
+      <w:r>
+        <w:rPr>
+          <w:lang w:val="en-US"/>
+        </w:rPr>
+        <w:br/>
+      </w:r>
+      <w:r>
+        <w:rPr>
+          <w:lang w:val="en-US"/>
+        </w:rPr>
+        <w:br/>
+      </w:r>
+      <w:r>
+        <w:rPr>
+          <w:lang w:val="en-US"/>
+        </w:rPr>
+        <w:br/>
+      </w:r>
+      <w:r>
+        <w:rPr>
+          <w:lang w:val="en-US"/>
+        </w:rPr>
+        <w:br/>
+      </w:r>
+      <w:r>
+        <w:rPr>
+          <w:lang w:val="en-US"/>
+        </w:rPr>
+        <w:br/>
+      </w:r>
+      <w:r>
+        <w:rPr>
+          <w:lang w:val="en-US"/>
+        </w:rPr>
+        <w:br/>
+      </w:r>
+      <w:r>
+        <w:rPr>
+          <w:lang w:val="en-US"/>
+        </w:rPr>
+        <w:br/>
+      </w:r>
+      <w:r>
+        <w:rPr>
+          <w:noProof/>
+          <w:u w:val="single"/>
+          <w:lang w:val="en-US"/>
+        </w:rPr>
+        <w:drawing>
+          <wp:anchor distT="0" distB="0" distL="114300" distR="114300" simplePos="0" relativeHeight="251668480" behindDoc="0" locked="0" layoutInCell="1" allowOverlap="1" wp14:anchorId="324513B7" wp14:editId="0CD793CE">
+            <wp:simplePos x="0" y="0"/>
+            <wp:positionH relativeFrom="margin">
+              <wp:posOffset>2267712</wp:posOffset>
+            </wp:positionH>
+            <wp:positionV relativeFrom="paragraph">
+              <wp:posOffset>358</wp:posOffset>
+            </wp:positionV>
+            <wp:extent cx="2011680" cy="4638241"/>
+            <wp:effectExtent l="0" t="0" r="7620" b="0"/>
+            <wp:wrapSquare wrapText="bothSides"/>
+            <wp:docPr id="787979570" name="Picture 1"/>
+            <wp:cNvGraphicFramePr>
+              <a:graphicFrameLocks xmlns:a="http://schemas.openxmlformats.org/drawingml/2006/main" noChangeAspect="1"/>
+            </wp:cNvGraphicFramePr>
+            <a:graphic xmlns:a="http://schemas.openxmlformats.org/drawingml/2006/main">
+              <a:graphicData uri="http://schemas.openxmlformats.org/drawingml/2006/picture">
+                <pic:pic xmlns:pic="http://schemas.openxmlformats.org/drawingml/2006/picture">
+                  <pic:nvPicPr>
+                    <pic:cNvPr id="787979570" name=""/>
+                    <pic:cNvPicPr/>
+                  </pic:nvPicPr>
+                  <pic:blipFill>
+                    <a:blip r:embed="rId39">
+                      <a:extLst>
+                        <a:ext uri="{28A0092B-C50C-407E-A947-70E740481C1C}">
+                          <a14:useLocalDpi xmlns:a14="http://schemas.microsoft.com/office/drawing/2010/main" val="0"/>
+                        </a:ext>
+                      </a:extLst>
+                    </a:blip>
+                    <a:stretch>
+                      <a:fillRect/>
+                    </a:stretch>
+                  </pic:blipFill>
+                  <pic:spPr>
+                    <a:xfrm>
+                      <a:off x="0" y="0"/>
+                      <a:ext cx="2011767" cy="4638442"/>
+                    </a:xfrm>
+                    <a:prstGeom prst="rect">
+                      <a:avLst/>
+                    </a:prstGeom>
+                  </pic:spPr>
+                </pic:pic>
+              </a:graphicData>
+            </a:graphic>
+            <wp14:sizeRelH relativeFrom="page">
+              <wp14:pctWidth>0</wp14:pctWidth>
+            </wp14:sizeRelH>
+            <wp14:sizeRelV relativeFrom="page">
+              <wp14:pctHeight>0</wp14:pctHeight>
+            </wp14:sizeRelV>
+          </wp:anchor>
+        </w:drawing>
+      </w:r>
+      <w:r>
+        <w:rPr>
+          <w:noProof/>
+          <w:u w:val="single"/>
+          <w:lang w:val="en-US"/>
+        </w:rPr>
+        <w:drawing>
+          <wp:anchor distT="0" distB="0" distL="114300" distR="114300" simplePos="0" relativeHeight="251667456" behindDoc="0" locked="0" layoutInCell="1" allowOverlap="1" wp14:anchorId="064744A9" wp14:editId="4246A9EB">
+            <wp:simplePos x="0" y="0"/>
+            <wp:positionH relativeFrom="column">
+              <wp:posOffset>0</wp:posOffset>
+            </wp:positionH>
+            <wp:positionV relativeFrom="paragraph">
+              <wp:posOffset>0</wp:posOffset>
+            </wp:positionV>
+            <wp:extent cx="2036631" cy="4667098"/>
+            <wp:effectExtent l="0" t="0" r="1905" b="635"/>
+            <wp:wrapSquare wrapText="bothSides"/>
+            <wp:docPr id="1877833923" name="Picture 1"/>
+            <wp:cNvGraphicFramePr>
+              <a:graphicFrameLocks xmlns:a="http://schemas.openxmlformats.org/drawingml/2006/main" noChangeAspect="1"/>
+            </wp:cNvGraphicFramePr>
+            <a:graphic xmlns:a="http://schemas.openxmlformats.org/drawingml/2006/main">
+              <a:graphicData uri="http://schemas.openxmlformats.org/drawingml/2006/picture">
+                <pic:pic xmlns:pic="http://schemas.openxmlformats.org/drawingml/2006/picture">
+                  <pic:nvPicPr>
+                    <pic:cNvPr id="1877833923" name=""/>
+                    <pic:cNvPicPr/>
+                  </pic:nvPicPr>
+                  <pic:blipFill>
+                    <a:blip r:embed="rId40">
+                      <a:extLst>
+                        <a:ext uri="{28A0092B-C50C-407E-A947-70E740481C1C}">
+                          <a14:useLocalDpi xmlns:a14="http://schemas.microsoft.com/office/drawing/2010/main" val="0"/>
+                        </a:ext>
+                      </a:extLst>
+                    </a:blip>
+                    <a:stretch>
+                      <a:fillRect/>
+                    </a:stretch>
+                  </pic:blipFill>
+                  <pic:spPr>
+                    <a:xfrm>
+                      <a:off x="0" y="0"/>
+                      <a:ext cx="2036631" cy="4667098"/>
+                    </a:xfrm>
+                    <a:prstGeom prst="rect">
+                      <a:avLst/>
+                    </a:prstGeom>
+                  </pic:spPr>
+                </pic:pic>
+              </a:graphicData>
+            </a:graphic>
+            <wp14:sizeRelH relativeFrom="page">
+              <wp14:pctWidth>0</wp14:pctWidth>
+            </wp14:sizeRelH>
+            <wp14:sizeRelV relativeFrom="page">
+              <wp14:pctHeight>0</wp14:pctHeight>
+            </wp14:sizeRelV>
+          </wp:anchor>
+        </w:drawing>
+      </w:r>
+      <w:r>
+        <w:rPr>
+          <w:b/>
+          <w:bCs/>
+          <w:u w:val="single"/>
+          <w:lang w:val="en-US"/>
+        </w:rPr>
+        <w:t>Added basic Log out functionality (and added basic styling to match other pages!):</w:t>
+      </w:r>
+    </w:p>
+    <w:p>
+      <w:pPr>
+        <w:rPr>
+          <w:b/>
+          <w:bCs/>
+          <w:lang w:val="en-US"/>
+        </w:rPr>
+      </w:pPr>
+      <w:r>
+        <w:rPr>
+          <w:b/>
+          <w:bCs/>
+          <w:lang w:val="en-US"/>
+        </w:rPr>
+        <w:t>dashboard.tsx:</w:t>
+      </w:r>
+    </w:p>
+    <w:p>
+      <w:pPr>
+        <w:rPr>
+          <w:lang w:val="en-US"/>
+        </w:rPr>
+      </w:pPr>
+      <w:r>
+        <w:rPr>
+          <w:noProof/>
+          <w:lang w:val="en-US"/>
+        </w:rPr>
+        <w:drawing>
+          <wp:anchor distT="0" distB="0" distL="114300" distR="114300" simplePos="0" relativeHeight="251670528" behindDoc="0" locked="0" layoutInCell="1" allowOverlap="1" wp14:anchorId="0CE19326" wp14:editId="5F7E52DD">
+            <wp:simplePos x="0" y="0"/>
+            <wp:positionH relativeFrom="margin">
+              <wp:posOffset>2406244</wp:posOffset>
+            </wp:positionH>
+            <wp:positionV relativeFrom="paragraph">
+              <wp:posOffset>31191</wp:posOffset>
+            </wp:positionV>
+            <wp:extent cx="1378585" cy="3149600"/>
+            <wp:effectExtent l="0" t="0" r="0" b="0"/>
+            <wp:wrapSquare wrapText="bothSides"/>
+            <wp:docPr id="1313019710" name="Picture 1"/>
+            <wp:cNvGraphicFramePr>
+              <a:graphicFrameLocks xmlns:a="http://schemas.openxmlformats.org/drawingml/2006/main" noChangeAspect="1"/>
+            </wp:cNvGraphicFramePr>
+            <a:graphic xmlns:a="http://schemas.openxmlformats.org/drawingml/2006/main">
+              <a:graphicData uri="http://schemas.openxmlformats.org/drawingml/2006/picture">
+                <pic:pic xmlns:pic="http://schemas.openxmlformats.org/drawingml/2006/picture">
+                  <pic:nvPicPr>
+                    <pic:cNvPr id="1313019710" name=""/>
+                    <pic:cNvPicPr/>
+                  </pic:nvPicPr>
+                  <pic:blipFill>
+                    <a:blip r:embed="rId41" cstate="print">
+                      <a:extLst>
+                        <a:ext uri="{28A0092B-C50C-407E-A947-70E740481C1C}">
+                          <a14:useLocalDpi xmlns:a14="http://schemas.microsoft.com/office/drawing/2010/main" val="0"/>
+                        </a:ext>
+                      </a:extLst>
+                    </a:blip>
+                    <a:stretch>
+                      <a:fillRect/>
+                    </a:stretch>
+                  </pic:blipFill>
+                  <pic:spPr>
+                    <a:xfrm>
+                      <a:off x="0" y="0"/>
+                      <a:ext cx="1378585" cy="3149600"/>
+                    </a:xfrm>
+                    <a:prstGeom prst="rect">
+                      <a:avLst/>
+                    </a:prstGeom>
+                  </pic:spPr>
+                </pic:pic>
+              </a:graphicData>
+            </a:graphic>
+            <wp14:sizeRelH relativeFrom="page">
+              <wp14:pctWidth>0</wp14:pctWidth>
+            </wp14:sizeRelH>
+            <wp14:sizeRelV relativeFrom="page">
+              <wp14:pctHeight>0</wp14:pctHeight>
+            </wp14:sizeRelV>
+          </wp:anchor>
+        </w:drawing>
+      </w:r>
+      <w:r>
+        <w:rPr>
+          <w:noProof/>
+          <w:lang w:val="en-US"/>
+        </w:rPr>
+        <w:drawing>
+          <wp:anchor distT="0" distB="0" distL="114300" distR="114300" simplePos="0" relativeHeight="251669504" behindDoc="0" locked="0" layoutInCell="1" allowOverlap="1" wp14:anchorId="2647CCE9" wp14:editId="00A32755">
+            <wp:simplePos x="0" y="0"/>
+            <wp:positionH relativeFrom="margin">
+              <wp:align>left</wp:align>
+            </wp:positionH>
+            <wp:positionV relativeFrom="paragraph">
+              <wp:posOffset>48235</wp:posOffset>
+            </wp:positionV>
+            <wp:extent cx="2187245" cy="1633581"/>
+            <wp:effectExtent l="0" t="0" r="3810" b="5080"/>
+            <wp:wrapSquare wrapText="bothSides"/>
+            <wp:docPr id="1669406277" name="Picture 1"/>
+            <wp:cNvGraphicFramePr>
+              <a:graphicFrameLocks xmlns:a="http://schemas.openxmlformats.org/drawingml/2006/main" noChangeAspect="1"/>
+            </wp:cNvGraphicFramePr>
+            <a:graphic xmlns:a="http://schemas.openxmlformats.org/drawingml/2006/main">
+              <a:graphicData uri="http://schemas.openxmlformats.org/drawingml/2006/picture">
+                <pic:pic xmlns:pic="http://schemas.openxmlformats.org/drawingml/2006/picture">
+                  <pic:nvPicPr>
+                    <pic:cNvPr id="1669406277" name=""/>
+                    <pic:cNvPicPr/>
+                  </pic:nvPicPr>
+                  <pic:blipFill>
+                    <a:blip r:embed="rId42">
+                      <a:extLst>
+                        <a:ext uri="{28A0092B-C50C-407E-A947-70E740481C1C}">
+                          <a14:useLocalDpi xmlns:a14="http://schemas.microsoft.com/office/drawing/2010/main" val="0"/>
+                        </a:ext>
+                      </a:extLst>
+                    </a:blip>
+                    <a:stretch>
+                      <a:fillRect/>
+                    </a:stretch>
+                  </pic:blipFill>
+                  <pic:spPr>
+                    <a:xfrm>
+                      <a:off x="0" y="0"/>
+                      <a:ext cx="2187245" cy="1633581"/>
+                    </a:xfrm>
+                    <a:prstGeom prst="rect">
+                      <a:avLst/>
+                    </a:prstGeom>
+                  </pic:spPr>
+                </pic:pic>
+              </a:graphicData>
+            </a:graphic>
+            <wp14:sizeRelH relativeFrom="page">
+              <wp14:pctWidth>0</wp14:pctWidth>
+            </wp14:sizeRelH>
+            <wp14:sizeRelV relativeFrom="page">
+              <wp14:pctHeight>0</wp14:pctHeight>
+            </wp14:sizeRelV>
+          </wp:anchor>
+        </w:drawing>
+      </w:r>
+      <w:r>
+        <w:rPr>
+          <w:lang w:val="en-US"/>
+        </w:rPr>
+        <w:br w:type="page"/>
+      </w:r>
+    </w:p>
+    <w:p>
+      <w:pPr>
+        <w:rPr>
+          <w:b/>
+          <w:bCs/>
+          <w:u w:val="single"/>
+          <w:lang w:val="en-US"/>
+        </w:rPr>
+      </w:pPr>
+      <w:r>
+        <w:rPr>
+          <w:b/>
+          <w:bCs/>
+          <w:u w:val="single"/>
+          <w:lang w:val="en-US"/>
+        </w:rPr>
+        <w:lastRenderedPageBreak/>
+        <w:t>Adding</w:t>
+      </w:r>
+      <w:r>
+        <w:rPr>
+          <w:b/>
+          <w:bCs/>
+          <w:u w:val="single"/>
+          <w:lang w:val="en-US"/>
+        </w:rPr>
+        <w:t xml:space="preserve"> jQuery and</w:t>
+      </w:r>
+      <w:r>
+        <w:rPr>
+          <w:b/>
+          <w:bCs/>
+          <w:u w:val="single"/>
+          <w:lang w:val="en-US"/>
+        </w:rPr>
+        <w:t xml:space="preserve"> firebase auth</w:t>
+      </w:r>
+      <w:r>
+        <w:rPr>
+          <w:b/>
+          <w:bCs/>
+          <w:u w:val="single"/>
+          <w:lang w:val="en-US"/>
+        </w:rPr>
+        <w:t xml:space="preserve"> to login/sign up:</w:t>
+      </w:r>
+    </w:p>
+    <w:p>
+      <w:pPr>
+        <w:pStyle w:val="ListParagraph"/>
+        <w:numPr>
+          <w:ilvl w:val="0"/>
+          <w:numId w:val="1"/>
+        </w:numPr>
+        <w:rPr>
+          <w:b/>
+          <w:bCs/>
+          <w:lang w:val="en-US"/>
+        </w:rPr>
+      </w:pPr>
+      <w:r>
+        <w:rPr>
+          <w:b/>
+          <w:bCs/>
+          <w:lang w:val="en-US"/>
+        </w:rPr>
+        <w:t>Focused slightly more on commenting and QoL</w:t>
+      </w:r>
+    </w:p>
+    <w:p>
+      <w:pPr>
+        <w:rPr>
+          <w:b/>
+          <w:bCs/>
+          <w:lang w:val="en-US"/>
+        </w:rPr>
+      </w:pPr>
+      <w:r>
+        <w:rPr>
+          <w:b/>
+          <w:bCs/>
+          <w:lang w:val="en-US"/>
+        </w:rPr>
+        <w:t>Firebase.js:</w:t>
+      </w:r>
+    </w:p>
+    <w:p>
+      <w:pPr>
+        <w:pStyle w:val="ListParagraph"/>
+        <w:numPr>
+          <w:ilvl w:val="0"/>
+          <w:numId w:val="1"/>
+        </w:numPr>
+        <w:rPr>
+          <w:lang w:val="en-US"/>
+        </w:rPr>
+      </w:pPr>
+      <w:r>
+        <w:rPr>
+          <w:lang w:val="en-US"/>
+        </w:rPr>
+        <w:t xml:space="preserve">Actually set up Authentication </w:t>
+      </w:r>
+      <w:r>
+        <w:rPr>
+          <w:lang w:val="en-US"/>
+        </w:rPr>
+        <w:t>with firebase.</w:t>
+      </w:r>
+    </w:p>
+    <w:p>
+      <w:pPr>
+        <w:pStyle w:val="ListParagraph"/>
+        <w:numPr>
+          <w:ilvl w:val="0"/>
+          <w:numId w:val="1"/>
+        </w:numPr>
+        <w:rPr>
+          <w:lang w:val="en-US"/>
+        </w:rPr>
+      </w:pPr>
+      <w:r>
+        <w:rPr>
+          <w:lang w:val="en-US"/>
+        </w:rPr>
+        <w:t>Imported auth into firebase.js:</w:t>
+      </w:r>
+    </w:p>
+    <w:p>
+      <w:pPr>
+        <w:rPr>
+          <w:lang w:val="en-US"/>
+        </w:rPr>
+      </w:pPr>
+      <w:r>
+        <w:rPr>
+          <w:lang w:val="en-US"/>
+        </w:rPr>
+        <w:drawing>
+          <wp:inline distT="0" distB="0" distL="0" distR="0" wp14:anchorId="36C9E0C9" wp14:editId="0AA2D447">
+            <wp:extent cx="4563112" cy="4610743"/>
+            <wp:effectExtent l="0" t="0" r="8890" b="0"/>
+            <wp:docPr id="1687148131" name="Picture 1" descr="A screenshot of a computer program&#10;&#10;AI-generated content may be incorrect."/>
+            <wp:cNvGraphicFramePr>
+              <a:graphicFrameLocks xmlns:a="http://schemas.openxmlformats.org/drawingml/2006/main" noChangeAspect="1"/>
+            </wp:cNvGraphicFramePr>
+            <a:graphic xmlns:a="http://schemas.openxmlformats.org/drawingml/2006/main">
+              <a:graphicData uri="http://schemas.openxmlformats.org/drawingml/2006/picture">
+                <pic:pic xmlns:pic="http://schemas.openxmlformats.org/drawingml/2006/picture">
+                  <pic:nvPicPr>
+                    <pic:cNvPr id="1687148131" name="Picture 1" descr="A screenshot of a computer program&#10;&#10;AI-generated content may be incorrect."/>
+                    <pic:cNvPicPr/>
+                  </pic:nvPicPr>
+                  <pic:blipFill>
+                    <a:blip r:embed="rId43"/>
+                    <a:stretch>
+                      <a:fillRect/>
+                    </a:stretch>
+                  </pic:blipFill>
+                  <pic:spPr>
+                    <a:xfrm>
+                      <a:off x="0" y="0"/>
+                      <a:ext cx="4563112" cy="4610743"/>
+                    </a:xfrm>
+                    <a:prstGeom prst="rect">
+                      <a:avLst/>
+                    </a:prstGeom>
+                  </pic:spPr>
+                </pic:pic>
+              </a:graphicData>
+            </a:graphic>
+          </wp:inline>
+        </w:drawing>
+      </w:r>
+    </w:p>
+    <w:p>
+      <w:pPr>
+        <w:rPr>
+          <w:b/>
+          <w:bCs/>
+          <w:lang w:val="en-US"/>
+        </w:rPr>
+      </w:pPr>
+      <w:r>
+        <w:rPr>
+          <w:b/>
+          <w:bCs/>
+          <w:lang w:val="en-US"/>
+        </w:rPr>
+        <w:br w:type="page"/>
+      </w:r>
+    </w:p>
+    <w:p>
+      <w:pPr>
+        <w:rPr>
+          <w:lang w:val="en-US"/>
+        </w:rPr>
+      </w:pPr>
+      <w:r>
+        <w:rPr>
+          <w:b/>
+          <w:bCs/>
+          <w:lang w:val="en-US"/>
+        </w:rPr>
+        <w:lastRenderedPageBreak/>
+        <w:t>Firestore.js:</w:t>
+      </w:r>
+      <w:r>
+        <w:rPr>
+          <w:b/>
+          <w:bCs/>
+          <w:lang w:val="en-US"/>
+        </w:rPr>
+        <w:br/>
+      </w:r>
+      <w:r>
+        <w:rPr>
+          <w:b/>
+          <w:bCs/>
+          <w:lang w:val="en-US"/>
+        </w:rPr>
+        <w:br/>
+      </w:r>
+      <w:r>
+        <w:rPr>
+          <w:lang w:val="en-US"/>
+        </w:rPr>
+        <w:t>- Using more from firebase/auth:</w:t>
+      </w:r>
+      <w:r>
+        <w:rPr>
+          <w:lang w:val="en-US"/>
+        </w:rPr>
+        <w:br/>
+      </w:r>
+      <w:r>
+        <w:rPr>
+          <w:lang w:val="en-US"/>
+        </w:rPr>
+        <w:tab/>
+        <w:t>- createUserWithEmailAndPassword, signInWithEmailAndPassword, signOut, onAuthStateChanged (for logging current user etc).</w:t>
+      </w:r>
+    </w:p>
+    <w:p>
+      <w:pPr>
+        <w:rPr>
+          <w:lang w:val="en-US"/>
+        </w:rPr>
+      </w:pPr>
+      <w:r>
+        <w:rPr>
+          <w:lang w:val="en-US"/>
+        </w:rPr>
+        <w:br/>
+        <w:t>- Changed addUser() to use jQuery alongside the firebase auth imports.</w:t>
+      </w:r>
+      <w:r>
+        <w:rPr>
+          <w:lang w:val="en-US"/>
+        </w:rPr>
+        <w:br/>
+      </w:r>
+      <w:r>
+        <w:rPr>
+          <w:lang w:val="en-US"/>
+        </w:rPr>
+        <w:br/>
+        <w:t>- Using an email alias to create a fake email to work with firebase, but still only ever take a username and password from user. (Don’t want to collect emails etc for University project).</w:t>
+      </w:r>
+    </w:p>
+    <w:p>
+      <w:pPr>
+        <w:rPr>
+          <w:b/>
+          <w:bCs/>
+          <w:lang w:val="en-US"/>
+        </w:rPr>
+      </w:pPr>
+      <w:r>
+        <w:rPr>
+          <w:b/>
+          <w:bCs/>
+          <w:lang w:val="en-US"/>
+        </w:rPr>
+        <w:drawing>
+          <wp:anchor distT="0" distB="0" distL="114300" distR="114300" simplePos="0" relativeHeight="251671552" behindDoc="0" locked="0" layoutInCell="1" allowOverlap="1" wp14:anchorId="60B08CDD" wp14:editId="0EC9D2BA">
+            <wp:simplePos x="0" y="0"/>
+            <wp:positionH relativeFrom="margin">
+              <wp:align>left</wp:align>
+            </wp:positionH>
+            <wp:positionV relativeFrom="paragraph">
+              <wp:posOffset>-3810</wp:posOffset>
+            </wp:positionV>
+            <wp:extent cx="5267325" cy="3387725"/>
+            <wp:effectExtent l="0" t="0" r="0" b="3175"/>
+            <wp:wrapSquare wrapText="bothSides"/>
+            <wp:docPr id="1356711447" name="Picture 1" descr="A screen shot of a computer program&#10;&#10;AI-generated content may be incorrect."/>
+            <wp:cNvGraphicFramePr>
+              <a:graphicFrameLocks xmlns:a="http://schemas.openxmlformats.org/drawingml/2006/main" noChangeAspect="1"/>
+            </wp:cNvGraphicFramePr>
+            <a:graphic xmlns:a="http://schemas.openxmlformats.org/drawingml/2006/main">
+              <a:graphicData uri="http://schemas.openxmlformats.org/drawingml/2006/picture">
+                <pic:pic xmlns:pic="http://schemas.openxmlformats.org/drawingml/2006/picture">
+                  <pic:nvPicPr>
+                    <pic:cNvPr id="1356711447" name="Picture 1" descr="A screen shot of a computer program&#10;&#10;AI-generated content may be incorrect."/>
+                    <pic:cNvPicPr/>
+                  </pic:nvPicPr>
+                  <pic:blipFill>
+                    <a:blip r:embed="rId44">
+                      <a:extLst>
+                        <a:ext uri="{28A0092B-C50C-407E-A947-70E740481C1C}">
+                          <a14:useLocalDpi xmlns:a14="http://schemas.microsoft.com/office/drawing/2010/main" val="0"/>
+                        </a:ext>
+                      </a:extLst>
+                    </a:blip>
+                    <a:stretch>
+                      <a:fillRect/>
+                    </a:stretch>
+                  </pic:blipFill>
+                  <pic:spPr>
+                    <a:xfrm>
+                      <a:off x="0" y="0"/>
+                      <a:ext cx="5275360" cy="3393048"/>
+                    </a:xfrm>
+                    <a:prstGeom prst="rect">
+                      <a:avLst/>
+                    </a:prstGeom>
+                  </pic:spPr>
+                </pic:pic>
+              </a:graphicData>
+            </a:graphic>
+            <wp14:sizeRelH relativeFrom="page">
+              <wp14:pctWidth>0</wp14:pctWidth>
+            </wp14:sizeRelH>
+            <wp14:sizeRelV relativeFrom="page">
+              <wp14:pctHeight>0</wp14:pctHeight>
+            </wp14:sizeRelV>
+          </wp:anchor>
+        </w:drawing>
+      </w:r>
+      <w:r>
+        <w:rPr>
+          <w:lang w:val="en-US"/>
+        </w:rPr>
+        <w:drawing>
+          <wp:anchor distT="0" distB="0" distL="114300" distR="114300" simplePos="0" relativeHeight="251672576" behindDoc="0" locked="0" layoutInCell="1" allowOverlap="1" wp14:anchorId="3139CD58" wp14:editId="2E08E5E3">
+            <wp:simplePos x="0" y="0"/>
+            <wp:positionH relativeFrom="margin">
+              <wp:align>left</wp:align>
+            </wp:positionH>
+            <wp:positionV relativeFrom="paragraph">
+              <wp:posOffset>3505310</wp:posOffset>
+            </wp:positionV>
+            <wp:extent cx="5147945" cy="3002915"/>
+            <wp:effectExtent l="0" t="0" r="0" b="6985"/>
+            <wp:wrapSquare wrapText="bothSides"/>
+            <wp:docPr id="1608652747" name="Picture 1" descr="A computer screen with white text&#10;&#10;AI-generated content may be incorrect."/>
+            <wp:cNvGraphicFramePr>
+              <a:graphicFrameLocks xmlns:a="http://schemas.openxmlformats.org/drawingml/2006/main" noChangeAspect="1"/>
+            </wp:cNvGraphicFramePr>
+            <a:graphic xmlns:a="http://schemas.openxmlformats.org/drawingml/2006/main">
+              <a:graphicData uri="http://schemas.openxmlformats.org/drawingml/2006/picture">
+                <pic:pic xmlns:pic="http://schemas.openxmlformats.org/drawingml/2006/picture">
+                  <pic:nvPicPr>
+                    <pic:cNvPr id="1608652747" name="Picture 1" descr="A computer screen with white text&#10;&#10;AI-generated content may be incorrect."/>
+                    <pic:cNvPicPr/>
+                  </pic:nvPicPr>
+                  <pic:blipFill>
+                    <a:blip r:embed="rId45">
+                      <a:extLst>
+                        <a:ext uri="{28A0092B-C50C-407E-A947-70E740481C1C}">
+                          <a14:useLocalDpi xmlns:a14="http://schemas.microsoft.com/office/drawing/2010/main" val="0"/>
+                        </a:ext>
+                      </a:extLst>
+                    </a:blip>
+                    <a:stretch>
+                      <a:fillRect/>
+                    </a:stretch>
+                  </pic:blipFill>
+                  <pic:spPr>
+                    <a:xfrm>
+                      <a:off x="0" y="0"/>
+                      <a:ext cx="5147945" cy="3002915"/>
+                    </a:xfrm>
+                    <a:prstGeom prst="rect">
+                      <a:avLst/>
+                    </a:prstGeom>
+                  </pic:spPr>
+                </pic:pic>
+              </a:graphicData>
+            </a:graphic>
+            <wp14:sizeRelH relativeFrom="page">
+              <wp14:pctWidth>0</wp14:pctWidth>
+            </wp14:sizeRelH>
+            <wp14:sizeRelV relativeFrom="page">
+              <wp14:pctHeight>0</wp14:pctHeight>
+            </wp14:sizeRelV>
+          </wp:anchor>
+        </w:drawing>
+      </w:r>
+      <w:r>
+        <w:rPr>
+          <w:b/>
+          <w:bCs/>
+          <w:lang w:val="en-US"/>
+        </w:rPr>
+        <w:br w:type="page"/>
+      </w:r>
+    </w:p>
+    <w:p>
+      <w:pPr>
+        <w:rPr>
+          <w:b/>
+          <w:bCs/>
+          <w:lang w:val="en-US"/>
+        </w:rPr>
+      </w:pPr>
+      <w:r>
+        <w:rPr>
+          <w:b/>
+          <w:bCs/>
+          <w:lang w:val="en-US"/>
+        </w:rPr>
+        <w:lastRenderedPageBreak/>
+        <w:t>Index.tsx:</w:t>
+      </w:r>
+    </w:p>
+    <w:p>
+      <w:pPr>
+        <w:pStyle w:val="ListParagraph"/>
+        <w:numPr>
+          <w:ilvl w:val="0"/>
+          <w:numId w:val="1"/>
+        </w:numPr>
+        <w:rPr>
+          <w:lang w:val="en-US"/>
+        </w:rPr>
+      </w:pPr>
+      <w:r>
+        <w:rPr>
+          <w:lang w:val="en-US"/>
+        </w:rPr>
+        <w:t>Updated signUpClicked() to automatically log users in after creating an account.</w:t>
+      </w:r>
+    </w:p>
+    <w:p>
+      <w:pPr>
+        <w:pStyle w:val="ListParagraph"/>
+        <w:numPr>
+          <w:ilvl w:val="0"/>
+          <w:numId w:val="1"/>
+        </w:numPr>
+        <w:rPr>
+          <w:lang w:val="en-US"/>
+        </w:rPr>
+      </w:pPr>
+      <w:r>
+        <w:rPr>
+          <w:lang w:val="en-US"/>
+        </w:rPr>
+        <w:t>Uses the updated addUser() and verifyUserLogin() from Firestore.js.</w:t>
+      </w:r>
+    </w:p>
+    <w:p>
+      <w:pPr>
+        <w:pStyle w:val="ListParagraph"/>
+        <w:numPr>
+          <w:ilvl w:val="0"/>
+          <w:numId w:val="1"/>
+        </w:numPr>
+        <w:rPr>
+          <w:b/>
+          <w:bCs/>
+          <w:lang w:val="en-US"/>
+        </w:rPr>
+      </w:pPr>
+      <w:r>
+        <w:rPr>
+          <w:b/>
+          <w:bCs/>
+          <w:lang w:val="en-US"/>
+        </w:rPr>
+        <w:drawing>
+          <wp:anchor distT="0" distB="0" distL="114300" distR="114300" simplePos="0" relativeHeight="251674624" behindDoc="0" locked="0" layoutInCell="1" allowOverlap="1" wp14:anchorId="3BDF8E0E" wp14:editId="45085BE7">
+            <wp:simplePos x="0" y="0"/>
+            <wp:positionH relativeFrom="column">
+              <wp:posOffset>467139</wp:posOffset>
+            </wp:positionH>
+            <wp:positionV relativeFrom="paragraph">
+              <wp:posOffset>5379306</wp:posOffset>
+            </wp:positionV>
+            <wp:extent cx="4505325" cy="914400"/>
+            <wp:effectExtent l="0" t="0" r="9525" b="0"/>
+            <wp:wrapSquare wrapText="bothSides"/>
+            <wp:docPr id="1179211561" name="Picture 1" descr="A screenshot of a computer screen&#10;&#10;AI-generated content may be incorrect."/>
+            <wp:cNvGraphicFramePr>
+              <a:graphicFrameLocks xmlns:a="http://schemas.openxmlformats.org/drawingml/2006/main" noChangeAspect="1"/>
+            </wp:cNvGraphicFramePr>
+            <a:graphic xmlns:a="http://schemas.openxmlformats.org/drawingml/2006/main">
+              <a:graphicData uri="http://schemas.openxmlformats.org/drawingml/2006/picture">
+                <pic:pic xmlns:pic="http://schemas.openxmlformats.org/drawingml/2006/picture">
+                  <pic:nvPicPr>
+                    <pic:cNvPr id="1179211561" name="Picture 1" descr="A screenshot of a computer screen&#10;&#10;AI-generated content may be incorrect."/>
+                    <pic:cNvPicPr/>
+                  </pic:nvPicPr>
+                  <pic:blipFill>
+                    <a:blip r:embed="rId46">
+                      <a:extLst>
+                        <a:ext uri="{28A0092B-C50C-407E-A947-70E740481C1C}">
+                          <a14:useLocalDpi xmlns:a14="http://schemas.microsoft.com/office/drawing/2010/main" val="0"/>
+                        </a:ext>
+                      </a:extLst>
+                    </a:blip>
+                    <a:stretch>
+                      <a:fillRect/>
+                    </a:stretch>
+                  </pic:blipFill>
+                  <pic:spPr>
+                    <a:xfrm>
+                      <a:off x="0" y="0"/>
+                      <a:ext cx="4505325" cy="914400"/>
+                    </a:xfrm>
+                    <a:prstGeom prst="rect">
+                      <a:avLst/>
+                    </a:prstGeom>
+                  </pic:spPr>
+                </pic:pic>
+              </a:graphicData>
+            </a:graphic>
+            <wp14:sizeRelH relativeFrom="page">
+              <wp14:pctWidth>0</wp14:pctWidth>
+            </wp14:sizeRelH>
+            <wp14:sizeRelV relativeFrom="page">
+              <wp14:pctHeight>0</wp14:pctHeight>
+            </wp14:sizeRelV>
+          </wp:anchor>
+        </w:drawing>
+      </w:r>
+      <w:r>
+        <w:rPr>
+          <w:b/>
+          <w:bCs/>
+          <w:lang w:val="en-US"/>
+        </w:rPr>
+        <w:drawing>
+          <wp:anchor distT="0" distB="0" distL="114300" distR="114300" simplePos="0" relativeHeight="251675648" behindDoc="0" locked="0" layoutInCell="1" allowOverlap="1" wp14:anchorId="3D11AA44" wp14:editId="3F4807B1">
+            <wp:simplePos x="0" y="0"/>
+            <wp:positionH relativeFrom="column">
+              <wp:posOffset>4541934</wp:posOffset>
+            </wp:positionH>
+            <wp:positionV relativeFrom="paragraph">
+              <wp:posOffset>595851</wp:posOffset>
+            </wp:positionV>
+            <wp:extent cx="1634490" cy="3710305"/>
+            <wp:effectExtent l="0" t="0" r="3810" b="4445"/>
+            <wp:wrapSquare wrapText="bothSides"/>
+            <wp:docPr id="1142551555" name="Picture 1" descr="A screenshot of a phone&#10;&#10;AI-generated content may be incorrect."/>
+            <wp:cNvGraphicFramePr>
+              <a:graphicFrameLocks xmlns:a="http://schemas.openxmlformats.org/drawingml/2006/main" noChangeAspect="1"/>
+            </wp:cNvGraphicFramePr>
+            <a:graphic xmlns:a="http://schemas.openxmlformats.org/drawingml/2006/main">
+              <a:graphicData uri="http://schemas.openxmlformats.org/drawingml/2006/picture">
+                <pic:pic xmlns:pic="http://schemas.openxmlformats.org/drawingml/2006/picture">
+                  <pic:nvPicPr>
+                    <pic:cNvPr id="1142551555" name="Picture 1" descr="A screenshot of a phone&#10;&#10;AI-generated content may be incorrect."/>
+                    <pic:cNvPicPr/>
+                  </pic:nvPicPr>
+                  <pic:blipFill>
+                    <a:blip r:embed="rId47">
+                      <a:extLst>
+                        <a:ext uri="{28A0092B-C50C-407E-A947-70E740481C1C}">
+                          <a14:useLocalDpi xmlns:a14="http://schemas.microsoft.com/office/drawing/2010/main" val="0"/>
+                        </a:ext>
+                      </a:extLst>
+                    </a:blip>
+                    <a:stretch>
+                      <a:fillRect/>
+                    </a:stretch>
+                  </pic:blipFill>
+                  <pic:spPr>
+                    <a:xfrm>
+                      <a:off x="0" y="0"/>
+                      <a:ext cx="1634490" cy="3710305"/>
+                    </a:xfrm>
+                    <a:prstGeom prst="rect">
+                      <a:avLst/>
+                    </a:prstGeom>
+                  </pic:spPr>
+                </pic:pic>
+              </a:graphicData>
+            </a:graphic>
+            <wp14:sizeRelH relativeFrom="page">
+              <wp14:pctWidth>0</wp14:pctWidth>
+            </wp14:sizeRelH>
+            <wp14:sizeRelV relativeFrom="page">
+              <wp14:pctHeight>0</wp14:pctHeight>
+            </wp14:sizeRelV>
+          </wp:anchor>
+        </w:drawing>
+      </w:r>
+      <w:r>
+        <w:rPr>
+          <w:b/>
+          <w:bCs/>
+          <w:lang w:val="en-US"/>
+        </w:rPr>
+        <w:drawing>
+          <wp:anchor distT="0" distB="0" distL="114300" distR="114300" simplePos="0" relativeHeight="251673600" behindDoc="0" locked="0" layoutInCell="1" allowOverlap="1" wp14:anchorId="5F6CD0F5" wp14:editId="63E9B422">
+            <wp:simplePos x="0" y="0"/>
+            <wp:positionH relativeFrom="column">
+              <wp:posOffset>457200</wp:posOffset>
+            </wp:positionH>
+            <wp:positionV relativeFrom="paragraph">
+              <wp:posOffset>2568</wp:posOffset>
+            </wp:positionV>
+            <wp:extent cx="3965713" cy="4932317"/>
+            <wp:effectExtent l="0" t="0" r="0" b="1905"/>
+            <wp:wrapSquare wrapText="bothSides"/>
+            <wp:docPr id="300786297" name="Picture 1" descr="A screen shot of a computer program&#10;&#10;AI-generated content may be incorrect."/>
+            <wp:cNvGraphicFramePr>
+              <a:graphicFrameLocks xmlns:a="http://schemas.openxmlformats.org/drawingml/2006/main" noChangeAspect="1"/>
+            </wp:cNvGraphicFramePr>
+            <a:graphic xmlns:a="http://schemas.openxmlformats.org/drawingml/2006/main">
+              <a:graphicData uri="http://schemas.openxmlformats.org/drawingml/2006/picture">
+                <pic:pic xmlns:pic="http://schemas.openxmlformats.org/drawingml/2006/picture">
+                  <pic:nvPicPr>
+                    <pic:cNvPr id="300786297" name="Picture 1" descr="A screen shot of a computer program&#10;&#10;AI-generated content may be incorrect."/>
+                    <pic:cNvPicPr/>
+                  </pic:nvPicPr>
+                  <pic:blipFill>
+                    <a:blip r:embed="rId48">
+                      <a:extLst>
+                        <a:ext uri="{28A0092B-C50C-407E-A947-70E740481C1C}">
+                          <a14:useLocalDpi xmlns:a14="http://schemas.microsoft.com/office/drawing/2010/main" val="0"/>
+                        </a:ext>
+                      </a:extLst>
+                    </a:blip>
+                    <a:stretch>
+                      <a:fillRect/>
+                    </a:stretch>
+                  </pic:blipFill>
+                  <pic:spPr>
+                    <a:xfrm>
+                      <a:off x="0" y="0"/>
+                      <a:ext cx="3965713" cy="4932317"/>
+                    </a:xfrm>
+                    <a:prstGeom prst="rect">
+                      <a:avLst/>
+                    </a:prstGeom>
+                  </pic:spPr>
+                </pic:pic>
+              </a:graphicData>
+            </a:graphic>
+            <wp14:sizeRelH relativeFrom="page">
+              <wp14:pctWidth>0</wp14:pctWidth>
+            </wp14:sizeRelH>
+            <wp14:sizeRelV relativeFrom="page">
+              <wp14:pctHeight>0</wp14:pctHeight>
+            </wp14:sizeRelV>
+          </wp:anchor>
+        </w:drawing>
+      </w:r>
+      <w:r>
+        <w:rPr>
+          <w:b/>
+          <w:bCs/>
+          <w:lang w:val="en-US"/>
+        </w:rPr>
+        <w:br/>
+      </w:r>
+      <w:r>
+        <w:rPr>
+          <w:b/>
+          <w:bCs/>
+          <w:lang w:val="en-US"/>
+        </w:rPr>
+        <w:br/>
+      </w:r>
+      <w:r>
+        <w:rPr>
+          <w:b/>
+          <w:bCs/>
+          <w:lang w:val="en-US"/>
+        </w:rPr>
+        <w:br w:type="page"/>
+      </w:r>
+    </w:p>
+    <w:p>
+      <w:pPr>
         <w:pStyle w:val="Heading4"/>
         <w:rPr>
           <w:lang w:val="en-US"/>
@@ -3506,7 +4836,7 @@
                     <pic:cNvPicPr/>
                   </pic:nvPicPr>
                   <pic:blipFill>
-                    <a:blip r:embed="rId37"/>
+                    <a:blip r:embed="rId49"/>
                     <a:stretch>
                       <a:fillRect/>
                     </a:stretch>
@@ -3547,7 +4877,7 @@
                     <pic:cNvPicPr/>
                   </pic:nvPicPr>
                   <pic:blipFill>
-                    <a:blip r:embed="rId38"/>
+                    <a:blip r:embed="rId50"/>
                     <a:stretch>
                       <a:fillRect/>
                     </a:stretch>
@@ -4678,6 +6008,18 @@
       <w:u w:val="single"/>
     </w:rPr>
   </w:style>
+  <w:style w:type="character" w:styleId="FollowedHyperlink">
+    <w:name w:val="FollowedHyperlink"/>
+    <w:basedOn w:val="DefaultParagraphFont"/>
+    <w:uiPriority w:val="99"/>
+    <w:semiHidden/>
+    <w:unhideWhenUsed/>
+    <w:rsid w:val="001756EA"/>
+    <w:rPr>
+      <w:color w:val="96607D" w:themeColor="followedHyperlink"/>
+      <w:u w:val="single"/>
+    </w:rPr>
+  </w:style>
 </w:styles>
 </file>
 

</xml_diff>

<commit_message>
Big Friend System Update: - Added sendFriendRequests and getIncomingRequests to firestore.js so users can send and view requests. - Created friends.tsx for testing sending and viewing friend requests. - Changed the way in which user details are passed to and from each tab, now using AsyncStorage and useIsFocused instead of passing params through router.
</commit_message>
<xml_diff>
--- a/Documentation/COMP3000 - Progress Report.docx
+++ b/Documentation/COMP3000 - Progress Report.docx
@@ -46,6 +46,15 @@
     </w:p>
     <w:sdt>
       <w:sdtPr>
+        <w:rPr>
+          <w:rFonts w:asciiTheme="minorHAnsi" w:eastAsiaTheme="minorHAnsi" w:hAnsiTheme="minorHAnsi" w:cstheme="minorBidi"/>
+          <w:color w:val="auto"/>
+          <w:kern w:val="2"/>
+          <w:sz w:val="22"/>
+          <w:szCs w:val="22"/>
+          <w:lang w:val="en-GB"/>
+          <w14:ligatures w14:val="standardContextual"/>
+        </w:rPr>
         <w:id w:val="1795943004"/>
         <w:docPartObj>
           <w:docPartGallery w:val="Table of Contents"/>
@@ -54,16 +63,9 @@
       </w:sdtPr>
       <w:sdtEndPr>
         <w:rPr>
-          <w:rFonts w:asciiTheme="minorHAnsi" w:eastAsiaTheme="minorHAnsi" w:hAnsiTheme="minorHAnsi" w:cstheme="minorBidi"/>
           <w:b/>
           <w:bCs/>
           <w:noProof/>
-          <w:color w:val="auto"/>
-          <w:kern w:val="2"/>
-          <w:sz w:val="22"/>
-          <w:szCs w:val="22"/>
-          <w:lang w:val="en-GB"/>
-          <w14:ligatures w14:val="standardContextual"/>
         </w:rPr>
       </w:sdtEndPr>
       <w:sdtContent>
@@ -2169,7 +2171,7 @@
           <w:lang w:val="en-US"/>
         </w:rPr>
         <w:drawing>
-          <wp:anchor distT="0" distB="0" distL="114300" distR="114300" simplePos="0" relativeHeight="251677696" behindDoc="0" locked="0" layoutInCell="1" allowOverlap="1" wp14:anchorId="4767C19A" wp14:editId="51E6A9CB">
+          <wp:anchor distT="0" distB="0" distL="114300" distR="114300" simplePos="0" relativeHeight="251677696" behindDoc="0" locked="0" layoutInCell="1" allowOverlap="1" wp14:anchorId="4767C19A" wp14:editId="5DFB8E44">
             <wp:simplePos x="0" y="0"/>
             <wp:positionH relativeFrom="column">
               <wp:posOffset>-725474</wp:posOffset>
@@ -3198,7 +3200,7 @@
           <w:lang w:val="en-US"/>
         </w:rPr>
         <w:drawing>
-          <wp:anchor distT="0" distB="0" distL="114300" distR="114300" simplePos="0" relativeHeight="251664384" behindDoc="1" locked="0" layoutInCell="1" allowOverlap="1" wp14:anchorId="71F3FFD7" wp14:editId="1F351155">
+          <wp:anchor distT="0" distB="0" distL="114300" distR="114300" simplePos="0" relativeHeight="251664384" behindDoc="1" locked="0" layoutInCell="1" allowOverlap="1" wp14:anchorId="71F3FFD7" wp14:editId="0A75A304">
             <wp:simplePos x="0" y="0"/>
             <wp:positionH relativeFrom="column">
               <wp:posOffset>-15240</wp:posOffset>
@@ -3394,7 +3396,7 @@
           <w:lang w:val="en-US"/>
         </w:rPr>
         <w:drawing>
-          <wp:anchor distT="0" distB="0" distL="114300" distR="114300" simplePos="0" relativeHeight="251666432" behindDoc="0" locked="0" layoutInCell="1" allowOverlap="1" wp14:anchorId="56452892" wp14:editId="444ED458">
+          <wp:anchor distT="0" distB="0" distL="114300" distR="114300" simplePos="0" relativeHeight="251666432" behindDoc="0" locked="0" layoutInCell="1" allowOverlap="1" wp14:anchorId="56452892" wp14:editId="72ED08C0">
             <wp:simplePos x="0" y="0"/>
             <wp:positionH relativeFrom="column">
               <wp:posOffset>1748155</wp:posOffset>
@@ -3457,7 +3459,7 @@
           <w:lang w:val="en-US"/>
         </w:rPr>
         <w:drawing>
-          <wp:anchor distT="0" distB="0" distL="114300" distR="114300" simplePos="0" relativeHeight="251665408" behindDoc="0" locked="0" layoutInCell="1" allowOverlap="1" wp14:anchorId="15635525" wp14:editId="5D55EC15">
+          <wp:anchor distT="0" distB="0" distL="114300" distR="114300" simplePos="0" relativeHeight="251665408" behindDoc="0" locked="0" layoutInCell="1" allowOverlap="1" wp14:anchorId="15635525" wp14:editId="26A71568">
             <wp:simplePos x="0" y="0"/>
             <wp:positionH relativeFrom="column">
               <wp:posOffset>0</wp:posOffset>
@@ -5033,10 +5035,11 @@
       </w:pPr>
       <w:r>
         <w:rPr>
+          <w:noProof/>
           <w:lang w:val="en-US"/>
         </w:rPr>
         <w:drawing>
-          <wp:anchor distT="0" distB="0" distL="114300" distR="114300" simplePos="0" relativeHeight="251678720" behindDoc="0" locked="0" layoutInCell="1" allowOverlap="1" wp14:anchorId="5E963EF8" wp14:editId="3A6C0704">
+          <wp:anchor distT="0" distB="0" distL="114300" distR="114300" simplePos="0" relativeHeight="251678720" behindDoc="0" locked="0" layoutInCell="1" allowOverlap="1" wp14:anchorId="5E963EF8" wp14:editId="2A1FF281">
             <wp:simplePos x="0" y="0"/>
             <wp:positionH relativeFrom="margin">
               <wp:align>center</wp:align>
@@ -5199,6 +5202,3764 @@
         </w:rPr>
       </w:pPr>
     </w:p>
+    <w:p>
+      <w:pPr>
+        <w:rPr>
+          <w:lang w:val="en-US"/>
+        </w:rPr>
+      </w:pPr>
+      <w:r>
+        <w:rPr>
+          <w:rStyle w:val="Heading4Char"/>
+        </w:rPr>
+        <w:t>Created Market Research Document:</w:t>
+      </w:r>
+      <w:r>
+        <w:rPr>
+          <w:b/>
+          <w:bCs/>
+          <w:lang w:val="en-US"/>
+        </w:rPr>
+        <w:br/>
+      </w:r>
+      <w:hyperlink r:id="rId52" w:history="1">
+        <w:r>
+          <w:rPr>
+            <w:rStyle w:val="Hyperlink"/>
+            <w:lang w:val="en-US"/>
+          </w:rPr>
+          <w:t>https://github.com/OsbournD/COMP3000-Douglas-Osbourn/blob/main/Documentation/COMP3000%20-%20Market%20Research.docx</w:t>
+        </w:r>
+      </w:hyperlink>
+    </w:p>
+    <w:p>
+      <w:pPr>
+        <w:rPr>
+          <w:b/>
+          <w:bCs/>
+          <w:lang w:val="en-US"/>
+        </w:rPr>
+      </w:pPr>
+    </w:p>
+    <w:p>
+      <w:pPr>
+        <w:rPr>
+          <w:b/>
+          <w:bCs/>
+          <w:lang w:val="en-US"/>
+        </w:rPr>
+      </w:pPr>
+      <w:r>
+        <w:rPr>
+          <w:rStyle w:val="Heading4Char"/>
+        </w:rPr>
+        <w:t>Adding friend system</w:t>
+      </w:r>
+      <w:r>
+        <w:rPr>
+          <w:b/>
+          <w:bCs/>
+          <w:lang w:val="en-US"/>
+        </w:rPr>
+        <w:br/>
+      </w:r>
+      <w:r>
+        <w:rPr>
+          <w:b/>
+          <w:bCs/>
+          <w:lang w:val="en-US"/>
+        </w:rPr>
+        <w:br/>
+        <w:t>1. Adding a send friend request function and creating “friendRequests” collection for managing requests.</w:t>
+      </w:r>
+    </w:p>
+    <w:p>
+      <w:pPr>
+        <w:rPr>
+          <w:b/>
+          <w:bCs/>
+          <w:lang w:val="en-US"/>
+        </w:rPr>
+      </w:pPr>
+      <w:r>
+        <w:rPr>
+          <w:b/>
+          <w:bCs/>
+          <w:lang w:val="en-US"/>
+        </w:rPr>
+        <w:drawing>
+          <wp:inline distT="0" distB="0" distL="0" distR="0" wp14:anchorId="62334E47" wp14:editId="06E5FD88">
+            <wp:extent cx="4357868" cy="3081311"/>
+            <wp:effectExtent l="0" t="0" r="5080" b="5080"/>
+            <wp:docPr id="2031773365" name="Picture 1" descr="A computer screen shot of a program&#10;&#10;AI-generated content may be incorrect."/>
+            <wp:cNvGraphicFramePr>
+              <a:graphicFrameLocks xmlns:a="http://schemas.openxmlformats.org/drawingml/2006/main" noChangeAspect="1"/>
+            </wp:cNvGraphicFramePr>
+            <a:graphic xmlns:a="http://schemas.openxmlformats.org/drawingml/2006/main">
+              <a:graphicData uri="http://schemas.openxmlformats.org/drawingml/2006/picture">
+                <pic:pic xmlns:pic="http://schemas.openxmlformats.org/drawingml/2006/picture">
+                  <pic:nvPicPr>
+                    <pic:cNvPr id="2031773365" name="Picture 1" descr="A computer screen shot of a program&#10;&#10;AI-generated content may be incorrect."/>
+                    <pic:cNvPicPr/>
+                  </pic:nvPicPr>
+                  <pic:blipFill>
+                    <a:blip r:embed="rId53"/>
+                    <a:stretch>
+                      <a:fillRect/>
+                    </a:stretch>
+                  </pic:blipFill>
+                  <pic:spPr>
+                    <a:xfrm>
+                      <a:off x="0" y="0"/>
+                      <a:ext cx="4362015" cy="3084244"/>
+                    </a:xfrm>
+                    <a:prstGeom prst="rect">
+                      <a:avLst/>
+                    </a:prstGeom>
+                  </pic:spPr>
+                </pic:pic>
+              </a:graphicData>
+            </a:graphic>
+          </wp:inline>
+        </w:drawing>
+      </w:r>
+    </w:p>
+    <w:p>
+      <w:pPr>
+        <w:rPr>
+          <w:b/>
+          <w:bCs/>
+          <w:lang w:val="en-US"/>
+        </w:rPr>
+      </w:pPr>
+      <w:r>
+        <w:rPr>
+          <w:b/>
+          <w:bCs/>
+          <w:lang w:val="en-US"/>
+        </w:rPr>
+        <w:t>2. Added a function to get friend requests:</w:t>
+      </w:r>
+      <w:r>
+        <w:rPr>
+          <w:b/>
+          <w:bCs/>
+          <w:lang w:val="en-US"/>
+        </w:rPr>
+        <w:br/>
+      </w:r>
+      <w:r>
+        <w:rPr>
+          <w:b/>
+          <w:bCs/>
+          <w:lang w:val="en-US"/>
+        </w:rPr>
+        <w:drawing>
+          <wp:inline distT="0" distB="0" distL="0" distR="0" wp14:anchorId="168E8277" wp14:editId="03C9BCFB">
+            <wp:extent cx="5731510" cy="2471420"/>
+            <wp:effectExtent l="0" t="0" r="2540" b="5080"/>
+            <wp:docPr id="1609259585" name="Picture 1" descr="A screen shot of a computer&#10;&#10;AI-generated content may be incorrect."/>
+            <wp:cNvGraphicFramePr>
+              <a:graphicFrameLocks xmlns:a="http://schemas.openxmlformats.org/drawingml/2006/main" noChangeAspect="1"/>
+            </wp:cNvGraphicFramePr>
+            <a:graphic xmlns:a="http://schemas.openxmlformats.org/drawingml/2006/main">
+              <a:graphicData uri="http://schemas.openxmlformats.org/drawingml/2006/picture">
+                <pic:pic xmlns:pic="http://schemas.openxmlformats.org/drawingml/2006/picture">
+                  <pic:nvPicPr>
+                    <pic:cNvPr id="1609259585" name="Picture 1" descr="A screen shot of a computer&#10;&#10;AI-generated content may be incorrect."/>
+                    <pic:cNvPicPr/>
+                  </pic:nvPicPr>
+                  <pic:blipFill>
+                    <a:blip r:embed="rId54"/>
+                    <a:stretch>
+                      <a:fillRect/>
+                    </a:stretch>
+                  </pic:blipFill>
+                  <pic:spPr>
+                    <a:xfrm>
+                      <a:off x="0" y="0"/>
+                      <a:ext cx="5731510" cy="2471420"/>
+                    </a:xfrm>
+                    <a:prstGeom prst="rect">
+                      <a:avLst/>
+                    </a:prstGeom>
+                  </pic:spPr>
+                </pic:pic>
+              </a:graphicData>
+            </a:graphic>
+          </wp:inline>
+        </w:drawing>
+      </w:r>
+    </w:p>
+    <w:p>
+      <w:pPr>
+        <w:rPr>
+          <w:b/>
+          <w:bCs/>
+          <w:lang w:val="en-US"/>
+        </w:rPr>
+      </w:pPr>
+    </w:p>
+    <w:p>
+      <w:pPr>
+        <w:rPr>
+          <w:b/>
+          <w:bCs/>
+          <w:lang w:val="en-US"/>
+        </w:rPr>
+      </w:pPr>
+      <w:r>
+        <w:rPr>
+          <w:b/>
+          <w:bCs/>
+          <w:lang w:val="en-US"/>
+        </w:rPr>
+        <w:br w:type="page"/>
+      </w:r>
+    </w:p>
+    <w:p>
+      <w:pPr>
+        <w:rPr>
+          <w:b/>
+          <w:bCs/>
+          <w:lang w:val="en-US"/>
+        </w:rPr>
+      </w:pPr>
+      <w:r>
+        <w:rPr>
+          <w:b/>
+          <w:bCs/>
+          <w:lang w:val="en-US"/>
+        </w:rPr>
+        <w:lastRenderedPageBreak/>
+        <w:t>3.</w:t>
+      </w:r>
+      <w:r>
+        <w:rPr>
+          <w:b/>
+          <w:bCs/>
+          <w:lang w:val="en-US"/>
+        </w:rPr>
+        <w:t xml:space="preserve"> Creating friends screen to show requests</w:t>
+      </w:r>
+      <w:r>
+        <w:rPr>
+          <w:b/>
+          <w:bCs/>
+          <w:lang w:val="en-US"/>
+        </w:rPr>
+        <w:t>:</w:t>
+      </w:r>
+    </w:p>
+    <w:p>
+      <w:pPr>
+        <w:rPr>
+          <w:b/>
+          <w:bCs/>
+          <w:lang w:val="en-US"/>
+        </w:rPr>
+      </w:pPr>
+      <w:r>
+        <w:rPr>
+          <w:b/>
+          <w:bCs/>
+          <w:lang w:val="en-US"/>
+        </w:rPr>
+        <w:t xml:space="preserve">- Developed </w:t>
+      </w:r>
+      <w:proofErr w:type="spellStart"/>
+      <w:r>
+        <w:rPr>
+          <w:b/>
+          <w:bCs/>
+          <w:lang w:val="en-US"/>
+        </w:rPr>
+        <w:t>friends.tsx</w:t>
+      </w:r>
+      <w:proofErr w:type="spellEnd"/>
+      <w:r>
+        <w:rPr>
+          <w:b/>
+          <w:bCs/>
+          <w:lang w:val="en-US"/>
+        </w:rPr>
+        <w:t xml:space="preserve"> tab further to show this:</w:t>
+      </w:r>
+    </w:p>
+    <w:p>
+      <w:pPr>
+        <w:rPr>
+          <w:b/>
+          <w:bCs/>
+          <w:lang w:val="en-US"/>
+        </w:rPr>
+      </w:pPr>
+      <w:r>
+        <w:rPr>
+          <w:b/>
+          <w:bCs/>
+          <w:lang w:val="en-US"/>
+        </w:rPr>
+        <w:t xml:space="preserve">Referenced for </w:t>
+      </w:r>
+      <w:proofErr w:type="spellStart"/>
+      <w:r>
+        <w:rPr>
+          <w:b/>
+          <w:bCs/>
+          <w:lang w:val="en-US"/>
+        </w:rPr>
+        <w:t>FlatList</w:t>
+      </w:r>
+      <w:proofErr w:type="spellEnd"/>
+      <w:r>
+        <w:rPr>
+          <w:b/>
+          <w:bCs/>
+          <w:lang w:val="en-US"/>
+        </w:rPr>
+        <w:t xml:space="preserve"> usage: </w:t>
+      </w:r>
+      <w:hyperlink r:id="rId55" w:history="1">
+        <w:r>
+          <w:rPr>
+            <w:rStyle w:val="Hyperlink"/>
+            <w:b/>
+            <w:bCs/>
+            <w:lang w:val="en-US"/>
+          </w:rPr>
+          <w:t>https://reactnative.dev/docs/flatlist</w:t>
+        </w:r>
+      </w:hyperlink>
+      <w:r>
+        <w:rPr>
+          <w:b/>
+          <w:bCs/>
+          <w:lang w:val="en-US"/>
+        </w:rPr>
+        <w:t xml:space="preserve"> (Accessed 20/11/2025)</w:t>
+      </w:r>
+    </w:p>
+    <w:p>
+      <w:pPr>
+        <w:rPr>
+          <w:b/>
+          <w:bCs/>
+          <w:lang w:val="en-US"/>
+        </w:rPr>
+      </w:pPr>
+      <w:r>
+        <w:rPr>
+          <w:b/>
+          <w:bCs/>
+          <w:lang w:val="en-US"/>
+        </w:rPr>
+        <w:drawing>
+          <wp:anchor distT="0" distB="0" distL="114300" distR="114300" simplePos="0" relativeHeight="251680768" behindDoc="0" locked="0" layoutInCell="1" allowOverlap="1" wp14:anchorId="1428C8BE" wp14:editId="6416B969">
+            <wp:simplePos x="0" y="0"/>
+            <wp:positionH relativeFrom="column">
+              <wp:posOffset>-70485</wp:posOffset>
+            </wp:positionH>
+            <wp:positionV relativeFrom="paragraph">
+              <wp:posOffset>40005</wp:posOffset>
+            </wp:positionV>
+            <wp:extent cx="4803140" cy="4784725"/>
+            <wp:effectExtent l="0" t="0" r="0" b="0"/>
+            <wp:wrapSquare wrapText="bothSides"/>
+            <wp:docPr id="540003608" name="Picture 1" descr="A screen shot of a computer program&#10;&#10;AI-generated content may be incorrect."/>
+            <wp:cNvGraphicFramePr>
+              <a:graphicFrameLocks xmlns:a="http://schemas.openxmlformats.org/drawingml/2006/main" noChangeAspect="1"/>
+            </wp:cNvGraphicFramePr>
+            <a:graphic xmlns:a="http://schemas.openxmlformats.org/drawingml/2006/main">
+              <a:graphicData uri="http://schemas.openxmlformats.org/drawingml/2006/picture">
+                <pic:pic xmlns:pic="http://schemas.openxmlformats.org/drawingml/2006/picture">
+                  <pic:nvPicPr>
+                    <pic:cNvPr id="540003608" name="Picture 1" descr="A screen shot of a computer program&#10;&#10;AI-generated content may be incorrect."/>
+                    <pic:cNvPicPr/>
+                  </pic:nvPicPr>
+                  <pic:blipFill>
+                    <a:blip r:embed="rId56" cstate="print">
+                      <a:extLst>
+                        <a:ext uri="{28A0092B-C50C-407E-A947-70E740481C1C}">
+                          <a14:useLocalDpi xmlns:a14="http://schemas.microsoft.com/office/drawing/2010/main" val="0"/>
+                        </a:ext>
+                      </a:extLst>
+                    </a:blip>
+                    <a:stretch>
+                      <a:fillRect/>
+                    </a:stretch>
+                  </pic:blipFill>
+                  <pic:spPr>
+                    <a:xfrm>
+                      <a:off x="0" y="0"/>
+                      <a:ext cx="4803140" cy="4784725"/>
+                    </a:xfrm>
+                    <a:prstGeom prst="rect">
+                      <a:avLst/>
+                    </a:prstGeom>
+                  </pic:spPr>
+                </pic:pic>
+              </a:graphicData>
+            </a:graphic>
+            <wp14:sizeRelH relativeFrom="page">
+              <wp14:pctWidth>0</wp14:pctWidth>
+            </wp14:sizeRelH>
+            <wp14:sizeRelV relativeFrom="page">
+              <wp14:pctHeight>0</wp14:pctHeight>
+            </wp14:sizeRelV>
+          </wp:anchor>
+        </w:drawing>
+      </w:r>
+    </w:p>
+    <w:p>
+      <w:pPr>
+        <w:rPr>
+          <w:b/>
+          <w:bCs/>
+          <w:lang w:val="en-US"/>
+        </w:rPr>
+      </w:pPr>
+      <w:r>
+        <w:rPr>
+          <w:b/>
+          <w:bCs/>
+          <w:lang w:val="en-US"/>
+        </w:rPr>
+        <w:drawing>
+          <wp:anchor distT="0" distB="0" distL="114300" distR="114300" simplePos="0" relativeHeight="251679744" behindDoc="0" locked="0" layoutInCell="1" allowOverlap="1" wp14:anchorId="4D46F843" wp14:editId="5AB81BFE">
+            <wp:simplePos x="0" y="0"/>
+            <wp:positionH relativeFrom="column">
+              <wp:posOffset>-138921</wp:posOffset>
+            </wp:positionH>
+            <wp:positionV relativeFrom="paragraph">
+              <wp:posOffset>3261432</wp:posOffset>
+            </wp:positionV>
+            <wp:extent cx="4858385" cy="2985770"/>
+            <wp:effectExtent l="0" t="0" r="0" b="5080"/>
+            <wp:wrapSquare wrapText="bothSides"/>
+            <wp:docPr id="454037106" name="Picture 1" descr="A screen shot of a computer code&#10;&#10;AI-generated content may be incorrect."/>
+            <wp:cNvGraphicFramePr>
+              <a:graphicFrameLocks xmlns:a="http://schemas.openxmlformats.org/drawingml/2006/main" noChangeAspect="1"/>
+            </wp:cNvGraphicFramePr>
+            <a:graphic xmlns:a="http://schemas.openxmlformats.org/drawingml/2006/main">
+              <a:graphicData uri="http://schemas.openxmlformats.org/drawingml/2006/picture">
+                <pic:pic xmlns:pic="http://schemas.openxmlformats.org/drawingml/2006/picture">
+                  <pic:nvPicPr>
+                    <pic:cNvPr id="454037106" name="Picture 1" descr="A screen shot of a computer code&#10;&#10;AI-generated content may be incorrect."/>
+                    <pic:cNvPicPr/>
+                  </pic:nvPicPr>
+                  <pic:blipFill>
+                    <a:blip r:embed="rId57" cstate="print">
+                      <a:extLst>
+                        <a:ext uri="{28A0092B-C50C-407E-A947-70E740481C1C}">
+                          <a14:useLocalDpi xmlns:a14="http://schemas.microsoft.com/office/drawing/2010/main" val="0"/>
+                        </a:ext>
+                      </a:extLst>
+                    </a:blip>
+                    <a:stretch>
+                      <a:fillRect/>
+                    </a:stretch>
+                  </pic:blipFill>
+                  <pic:spPr>
+                    <a:xfrm>
+                      <a:off x="0" y="0"/>
+                      <a:ext cx="4858385" cy="2985770"/>
+                    </a:xfrm>
+                    <a:prstGeom prst="rect">
+                      <a:avLst/>
+                    </a:prstGeom>
+                  </pic:spPr>
+                </pic:pic>
+              </a:graphicData>
+            </a:graphic>
+            <wp14:sizeRelH relativeFrom="page">
+              <wp14:pctWidth>0</wp14:pctWidth>
+            </wp14:sizeRelH>
+            <wp14:sizeRelV relativeFrom="page">
+              <wp14:pctHeight>0</wp14:pctHeight>
+            </wp14:sizeRelV>
+          </wp:anchor>
+        </w:drawing>
+      </w:r>
+    </w:p>
+    <w:p>
+      <w:pPr>
+        <w:rPr>
+          <w:lang w:val="en-US"/>
+        </w:rPr>
+      </w:pPr>
+    </w:p>
+    <w:p>
+      <w:pPr>
+        <w:rPr>
+          <w:lang w:val="en-US"/>
+        </w:rPr>
+      </w:pPr>
+    </w:p>
+    <w:p>
+      <w:pPr>
+        <w:rPr>
+          <w:lang w:val="en-US"/>
+        </w:rPr>
+      </w:pPr>
+    </w:p>
+    <w:p>
+      <w:pPr>
+        <w:rPr>
+          <w:lang w:val="en-US"/>
+        </w:rPr>
+      </w:pPr>
+    </w:p>
+    <w:p>
+      <w:pPr>
+        <w:rPr>
+          <w:lang w:val="en-US"/>
+        </w:rPr>
+      </w:pPr>
+    </w:p>
+    <w:p>
+      <w:pPr>
+        <w:rPr>
+          <w:lang w:val="en-US"/>
+        </w:rPr>
+      </w:pPr>
+    </w:p>
+    <w:p>
+      <w:pPr>
+        <w:rPr>
+          <w:lang w:val="en-US"/>
+        </w:rPr>
+      </w:pPr>
+    </w:p>
+    <w:p>
+      <w:pPr>
+        <w:rPr>
+          <w:lang w:val="en-US"/>
+        </w:rPr>
+      </w:pPr>
+    </w:p>
+    <w:p>
+      <w:pPr>
+        <w:rPr>
+          <w:lang w:val="en-US"/>
+        </w:rPr>
+      </w:pPr>
+    </w:p>
+    <w:p>
+      <w:pPr>
+        <w:rPr>
+          <w:lang w:val="en-US"/>
+        </w:rPr>
+      </w:pPr>
+    </w:p>
+    <w:p>
+      <w:pPr>
+        <w:rPr>
+          <w:lang w:val="en-US"/>
+        </w:rPr>
+      </w:pPr>
+    </w:p>
+    <w:p>
+      <w:pPr>
+        <w:rPr>
+          <w:lang w:val="en-US"/>
+        </w:rPr>
+      </w:pPr>
+    </w:p>
+    <w:p>
+      <w:pPr>
+        <w:rPr>
+          <w:lang w:val="en-US"/>
+        </w:rPr>
+      </w:pPr>
+    </w:p>
+    <w:p>
+      <w:pPr>
+        <w:rPr>
+          <w:b/>
+          <w:bCs/>
+          <w:lang w:val="en-US"/>
+        </w:rPr>
+      </w:pPr>
+    </w:p>
+    <w:p>
+      <w:pPr>
+        <w:rPr>
+          <w:lang w:val="en-US"/>
+        </w:rPr>
+      </w:pPr>
+      <w:r>
+        <w:rPr>
+          <w:lang w:val="en-US"/>
+        </w:rPr>
+        <w:br/>
+      </w:r>
+      <w:r>
+        <w:rPr>
+          <w:lang w:val="en-US"/>
+        </w:rPr>
+        <w:br/>
+      </w:r>
+      <w:r>
+        <w:rPr>
+          <w:lang w:val="en-US"/>
+        </w:rPr>
+        <w:br/>
+      </w:r>
+      <w:r>
+        <w:rPr>
+          <w:lang w:val="en-US"/>
+        </w:rPr>
+        <w:br/>
+      </w:r>
+      <w:r>
+        <w:rPr>
+          <w:lang w:val="en-US"/>
+        </w:rPr>
+        <w:br/>
+      </w:r>
+      <w:r>
+        <w:rPr>
+          <w:lang w:val="en-US"/>
+        </w:rPr>
+        <w:br/>
+      </w:r>
+      <w:r>
+        <w:rPr>
+          <w:lang w:val="en-US"/>
+        </w:rPr>
+        <w:br/>
+      </w:r>
+      <w:r>
+        <w:rPr>
+          <w:lang w:val="en-US"/>
+        </w:rPr>
+        <w:br/>
+      </w:r>
+      <w:r>
+        <w:rPr>
+          <w:lang w:val="en-US"/>
+        </w:rPr>
+        <w:br/>
+      </w:r>
+      <w:r>
+        <w:rPr>
+          <w:lang w:val="en-US"/>
+        </w:rPr>
+        <w:br/>
+      </w:r>
+      <w:r>
+        <w:rPr>
+          <w:lang w:val="en-US"/>
+        </w:rPr>
+        <w:br/>
+      </w:r>
+    </w:p>
+    <w:p>
+      <w:pPr>
+        <w:rPr>
+          <w:lang w:val="en-US"/>
+        </w:rPr>
+      </w:pPr>
+      <w:r>
+        <w:rPr>
+          <w:lang w:val="en-US"/>
+        </w:rPr>
+        <w:br w:type="page"/>
+      </w:r>
+    </w:p>
+    <w:p>
+      <w:pPr>
+        <w:rPr>
+          <w:b/>
+          <w:bCs/>
+          <w:lang w:val="en-US"/>
+        </w:rPr>
+      </w:pPr>
+      <w:r>
+        <w:rPr>
+          <w:b/>
+          <w:bCs/>
+          <w:lang w:val="en-US"/>
+        </w:rPr>
+        <w:lastRenderedPageBreak/>
+        <w:t>4. Testing Friend Request Sending and Receiving:</w:t>
+      </w:r>
+    </w:p>
+    <w:p>
+      <w:pPr>
+        <w:rPr>
+          <w:b/>
+          <w:bCs/>
+          <w:lang w:val="en-US"/>
+        </w:rPr>
+      </w:pPr>
+    </w:p>
+    <w:p>
+      <w:pPr>
+        <w:rPr>
+          <w:b/>
+          <w:bCs/>
+          <w:u w:val="single"/>
+          <w:lang w:val="en-US"/>
+        </w:rPr>
+      </w:pPr>
+      <w:r>
+        <w:rPr>
+          <w:b/>
+          <w:bCs/>
+          <w:u w:val="single"/>
+          <w:lang w:val="en-US"/>
+        </w:rPr>
+        <w:t>Test 1:</w:t>
+      </w:r>
+    </w:p>
+    <w:p>
+      <w:pPr>
+        <w:pStyle w:val="ListParagraph"/>
+        <w:numPr>
+          <w:ilvl w:val="0"/>
+          <w:numId w:val="3"/>
+        </w:numPr>
+        <w:rPr>
+          <w:b/>
+          <w:bCs/>
+          <w:lang w:val="en-US"/>
+        </w:rPr>
+      </w:pPr>
+      <w:r>
+        <w:rPr>
+          <w:b/>
+          <w:bCs/>
+          <w:lang w:val="en-US"/>
+        </w:rPr>
+        <w:t xml:space="preserve">Sign up and log </w:t>
+      </w:r>
+      <w:r>
+        <w:rPr>
+          <w:b/>
+          <w:bCs/>
+          <w:lang w:val="en-US"/>
+        </w:rPr>
+        <w:t>in as UserA</w:t>
+      </w:r>
+      <w:r>
+        <w:rPr>
+          <w:b/>
+          <w:bCs/>
+          <w:lang w:val="en-US"/>
+        </w:rPr>
+        <w:t xml:space="preserve"> (password: TestAA),</w:t>
+      </w:r>
+    </w:p>
+    <w:p>
+      <w:pPr>
+        <w:pStyle w:val="ListParagraph"/>
+        <w:numPr>
+          <w:ilvl w:val="0"/>
+          <w:numId w:val="3"/>
+        </w:numPr>
+        <w:rPr>
+          <w:b/>
+          <w:bCs/>
+          <w:lang w:val="en-US"/>
+        </w:rPr>
+      </w:pPr>
+      <w:r>
+        <w:rPr>
+          <w:b/>
+          <w:bCs/>
+          <w:lang w:val="en-US"/>
+        </w:rPr>
+        <w:t>Sign up and log in as UserB (password: TestBB),</w:t>
+      </w:r>
+    </w:p>
+    <w:p>
+      <w:pPr>
+        <w:pStyle w:val="ListParagraph"/>
+        <w:numPr>
+          <w:ilvl w:val="0"/>
+          <w:numId w:val="3"/>
+        </w:numPr>
+        <w:rPr>
+          <w:b/>
+          <w:bCs/>
+          <w:lang w:val="en-US"/>
+        </w:rPr>
+      </w:pPr>
+      <w:r>
+        <w:rPr>
+          <w:b/>
+          <w:bCs/>
+          <w:lang w:val="en-US"/>
+        </w:rPr>
+        <w:t>Logging out,</w:t>
+      </w:r>
+    </w:p>
+    <w:p>
+      <w:pPr>
+        <w:pStyle w:val="ListParagraph"/>
+        <w:numPr>
+          <w:ilvl w:val="0"/>
+          <w:numId w:val="3"/>
+        </w:numPr>
+        <w:rPr>
+          <w:b/>
+          <w:bCs/>
+          <w:lang w:val="en-US"/>
+        </w:rPr>
+      </w:pPr>
+      <w:r>
+        <w:rPr>
+          <w:b/>
+          <w:bCs/>
+          <w:lang w:val="en-US"/>
+        </w:rPr>
+        <w:t>Log in as UserA,</w:t>
+      </w:r>
+    </w:p>
+    <w:p>
+      <w:pPr>
+        <w:pStyle w:val="ListParagraph"/>
+        <w:numPr>
+          <w:ilvl w:val="0"/>
+          <w:numId w:val="3"/>
+        </w:numPr>
+        <w:rPr>
+          <w:b/>
+          <w:bCs/>
+          <w:lang w:val="en-US"/>
+        </w:rPr>
+      </w:pPr>
+      <w:r>
+        <w:rPr>
+          <w:b/>
+          <w:bCs/>
+          <w:lang w:val="en-US"/>
+        </w:rPr>
+        <w:t>Opening friends tab,</w:t>
+      </w:r>
+    </w:p>
+    <w:p>
+      <w:pPr>
+        <w:pStyle w:val="ListParagraph"/>
+        <w:numPr>
+          <w:ilvl w:val="0"/>
+          <w:numId w:val="3"/>
+        </w:numPr>
+        <w:rPr>
+          <w:b/>
+          <w:bCs/>
+          <w:lang w:val="en-US"/>
+        </w:rPr>
+      </w:pPr>
+      <w:r>
+        <w:rPr>
+          <w:b/>
+          <w:bCs/>
+          <w:lang w:val="en-US"/>
+        </w:rPr>
+        <w:t>Sending Request to UserB,</w:t>
+      </w:r>
+    </w:p>
+    <w:p>
+      <w:pPr>
+        <w:pStyle w:val="ListParagraph"/>
+        <w:numPr>
+          <w:ilvl w:val="0"/>
+          <w:numId w:val="3"/>
+        </w:numPr>
+        <w:rPr>
+          <w:b/>
+          <w:bCs/>
+          <w:lang w:val="en-US"/>
+        </w:rPr>
+      </w:pPr>
+      <w:r>
+        <w:rPr>
+          <w:b/>
+          <w:bCs/>
+          <w:lang w:val="en-US"/>
+        </w:rPr>
+        <w:t>Logging out,</w:t>
+      </w:r>
+    </w:p>
+    <w:p>
+      <w:pPr>
+        <w:pStyle w:val="ListParagraph"/>
+        <w:numPr>
+          <w:ilvl w:val="0"/>
+          <w:numId w:val="3"/>
+        </w:numPr>
+        <w:rPr>
+          <w:b/>
+          <w:bCs/>
+          <w:lang w:val="en-US"/>
+        </w:rPr>
+      </w:pPr>
+      <w:r>
+        <w:rPr>
+          <w:b/>
+          <w:bCs/>
+          <w:lang w:val="en-US"/>
+        </w:rPr>
+        <w:t>Logging in as UserB,</w:t>
+      </w:r>
+    </w:p>
+    <w:p>
+      <w:pPr>
+        <w:pStyle w:val="ListParagraph"/>
+        <w:numPr>
+          <w:ilvl w:val="0"/>
+          <w:numId w:val="3"/>
+        </w:numPr>
+        <w:rPr>
+          <w:b/>
+          <w:bCs/>
+          <w:lang w:val="en-US"/>
+        </w:rPr>
+      </w:pPr>
+      <w:r>
+        <w:rPr>
+          <w:b/>
+          <w:bCs/>
+          <w:lang w:val="en-US"/>
+        </w:rPr>
+        <w:t>Opening Friends tab,</w:t>
+      </w:r>
+    </w:p>
+    <w:p>
+      <w:pPr>
+        <w:pStyle w:val="ListParagraph"/>
+        <w:numPr>
+          <w:ilvl w:val="0"/>
+          <w:numId w:val="3"/>
+        </w:numPr>
+        <w:rPr>
+          <w:b/>
+          <w:bCs/>
+          <w:lang w:val="en-US"/>
+        </w:rPr>
+      </w:pPr>
+      <w:r>
+        <w:rPr>
+          <w:b/>
+          <w:bCs/>
+          <w:lang w:val="en-US"/>
+        </w:rPr>
+        <w:t>Viewing Request</w:t>
+      </w:r>
+    </w:p>
+    <w:p>
+      <w:pPr>
+        <w:rPr>
+          <w:b/>
+          <w:bCs/>
+          <w:lang w:val="en-US"/>
+        </w:rPr>
+      </w:pPr>
+    </w:p>
+    <w:p>
+      <w:pPr>
+        <w:rPr>
+          <w:b/>
+          <w:bCs/>
+          <w:lang w:val="en-US"/>
+        </w:rPr>
+      </w:pPr>
+      <w:r>
+        <w:rPr>
+          <w:b/>
+          <w:bCs/>
+          <w:lang w:val="en-US"/>
+        </w:rPr>
+        <w:t>1 + 2</w:t>
+      </w:r>
+      <w:r>
+        <w:rPr>
+          <w:b/>
+          <w:bCs/>
+          <w:lang w:val="en-US"/>
+        </w:rPr>
+        <w:t xml:space="preserve"> + 3</w:t>
+      </w:r>
+      <w:r>
+        <w:rPr>
+          <w:b/>
+          <w:bCs/>
+          <w:lang w:val="en-US"/>
+        </w:rPr>
+        <w:t>:</w:t>
+      </w:r>
+      <w:r>
+        <w:rPr>
+          <w:b/>
+          <w:bCs/>
+          <w:lang w:val="en-US"/>
+        </w:rPr>
+        <w:br/>
+      </w:r>
+      <w:r>
+        <w:rPr>
+          <w:b/>
+          <w:bCs/>
+          <w:lang w:val="en-US"/>
+        </w:rPr>
+        <w:br/>
+      </w:r>
+      <w:r>
+        <w:rPr>
+          <w:b/>
+          <w:bCs/>
+          <w:lang w:val="en-US"/>
+        </w:rPr>
+        <w:drawing>
+          <wp:inline distT="0" distB="0" distL="0" distR="0" wp14:anchorId="418C23F7" wp14:editId="349AC20C">
+            <wp:extent cx="4392592" cy="3562350"/>
+            <wp:effectExtent l="0" t="0" r="8255" b="0"/>
+            <wp:docPr id="898603143" name="Picture 1" descr="A screenshot of a computer&#10;&#10;AI-generated content may be incorrect."/>
+            <wp:cNvGraphicFramePr>
+              <a:graphicFrameLocks xmlns:a="http://schemas.openxmlformats.org/drawingml/2006/main" noChangeAspect="1"/>
+            </wp:cNvGraphicFramePr>
+            <a:graphic xmlns:a="http://schemas.openxmlformats.org/drawingml/2006/main">
+              <a:graphicData uri="http://schemas.openxmlformats.org/drawingml/2006/picture">
+                <pic:pic xmlns:pic="http://schemas.openxmlformats.org/drawingml/2006/picture">
+                  <pic:nvPicPr>
+                    <pic:cNvPr id="898603143" name="Picture 1" descr="A screenshot of a computer&#10;&#10;AI-generated content may be incorrect."/>
+                    <pic:cNvPicPr/>
+                  </pic:nvPicPr>
+                  <pic:blipFill>
+                    <a:blip r:embed="rId58"/>
+                    <a:stretch>
+                      <a:fillRect/>
+                    </a:stretch>
+                  </pic:blipFill>
+                  <pic:spPr>
+                    <a:xfrm>
+                      <a:off x="0" y="0"/>
+                      <a:ext cx="4396628" cy="3565623"/>
+                    </a:xfrm>
+                    <a:prstGeom prst="rect">
+                      <a:avLst/>
+                    </a:prstGeom>
+                  </pic:spPr>
+                </pic:pic>
+              </a:graphicData>
+            </a:graphic>
+          </wp:inline>
+        </w:drawing>
+      </w:r>
+    </w:p>
+    <w:p>
+      <w:pPr>
+        <w:rPr>
+          <w:b/>
+          <w:bCs/>
+          <w:lang w:val="en-US"/>
+        </w:rPr>
+      </w:pPr>
+    </w:p>
+    <w:p>
+      <w:pPr>
+        <w:rPr>
+          <w:b/>
+          <w:bCs/>
+          <w:lang w:val="en-US"/>
+        </w:rPr>
+      </w:pPr>
+      <w:r>
+        <w:rPr>
+          <w:b/>
+          <w:bCs/>
+          <w:lang w:val="en-US"/>
+        </w:rPr>
+        <w:br w:type="page"/>
+      </w:r>
+    </w:p>
+    <w:p>
+      <w:pPr>
+        <w:rPr>
+          <w:b/>
+          <w:bCs/>
+          <w:color w:val="EE0000"/>
+          <w:lang w:val="en-US"/>
+        </w:rPr>
+      </w:pPr>
+      <w:r>
+        <w:rPr>
+          <w:b/>
+          <w:bCs/>
+          <w:lang w:val="en-US"/>
+        </w:rPr>
+        <w:lastRenderedPageBreak/>
+        <w:drawing>
+          <wp:anchor distT="0" distB="0" distL="114300" distR="114300" simplePos="0" relativeHeight="251681792" behindDoc="0" locked="0" layoutInCell="1" allowOverlap="1" wp14:anchorId="654FC1FA" wp14:editId="3588C4DC">
+            <wp:simplePos x="0" y="0"/>
+            <wp:positionH relativeFrom="page">
+              <wp:align>right</wp:align>
+            </wp:positionH>
+            <wp:positionV relativeFrom="paragraph">
+              <wp:posOffset>443835</wp:posOffset>
+            </wp:positionV>
+            <wp:extent cx="7523225" cy="585121"/>
+            <wp:effectExtent l="0" t="0" r="1905" b="5715"/>
+            <wp:wrapSquare wrapText="bothSides"/>
+            <wp:docPr id="603316" name="Picture 1"/>
+            <wp:cNvGraphicFramePr>
+              <a:graphicFrameLocks xmlns:a="http://schemas.openxmlformats.org/drawingml/2006/main" noChangeAspect="1"/>
+            </wp:cNvGraphicFramePr>
+            <a:graphic xmlns:a="http://schemas.openxmlformats.org/drawingml/2006/main">
+              <a:graphicData uri="http://schemas.openxmlformats.org/drawingml/2006/picture">
+                <pic:pic xmlns:pic="http://schemas.openxmlformats.org/drawingml/2006/picture">
+                  <pic:nvPicPr>
+                    <pic:cNvPr id="603316" name=""/>
+                    <pic:cNvPicPr/>
+                  </pic:nvPicPr>
+                  <pic:blipFill>
+                    <a:blip r:embed="rId59" cstate="print">
+                      <a:extLst>
+                        <a:ext uri="{28A0092B-C50C-407E-A947-70E740481C1C}">
+                          <a14:useLocalDpi xmlns:a14="http://schemas.microsoft.com/office/drawing/2010/main" val="0"/>
+                        </a:ext>
+                      </a:extLst>
+                    </a:blip>
+                    <a:stretch>
+                      <a:fillRect/>
+                    </a:stretch>
+                  </pic:blipFill>
+                  <pic:spPr>
+                    <a:xfrm>
+                      <a:off x="0" y="0"/>
+                      <a:ext cx="7523225" cy="585121"/>
+                    </a:xfrm>
+                    <a:prstGeom prst="rect">
+                      <a:avLst/>
+                    </a:prstGeom>
+                  </pic:spPr>
+                </pic:pic>
+              </a:graphicData>
+            </a:graphic>
+            <wp14:sizeRelH relativeFrom="page">
+              <wp14:pctWidth>0</wp14:pctWidth>
+            </wp14:sizeRelH>
+            <wp14:sizeRelV relativeFrom="page">
+              <wp14:pctHeight>0</wp14:pctHeight>
+            </wp14:sizeRelV>
+          </wp:anchor>
+        </w:drawing>
+      </w:r>
+      <w:r>
+        <w:rPr>
+          <w:b/>
+          <w:bCs/>
+          <w:lang w:val="en-US"/>
+        </w:rPr>
+        <w:t xml:space="preserve">4 </w:t>
+      </w:r>
+      <w:r>
+        <w:rPr>
+          <w:b/>
+          <w:bCs/>
+          <w:lang w:val="en-US"/>
+        </w:rPr>
+        <w:t xml:space="preserve">+ </w:t>
+      </w:r>
+      <w:r>
+        <w:rPr>
+          <w:b/>
+          <w:bCs/>
+          <w:lang w:val="en-US"/>
+        </w:rPr>
+        <w:t>5</w:t>
+      </w:r>
+      <w:r>
+        <w:rPr>
+          <w:b/>
+          <w:bCs/>
+          <w:lang w:val="en-US"/>
+        </w:rPr>
+        <w:t xml:space="preserve">: </w:t>
+      </w:r>
+      <w:r>
+        <w:rPr>
+          <w:b/>
+          <w:bCs/>
+          <w:lang w:val="en-US"/>
+        </w:rPr>
+        <w:t xml:space="preserve">(fun error when loading Friends Tab, assume </w:t>
+      </w:r>
+      <w:proofErr w:type="spellStart"/>
+      <w:r>
+        <w:rPr>
+          <w:b/>
+          <w:bCs/>
+          <w:lang w:val="en-US"/>
+        </w:rPr>
+        <w:t>its</w:t>
+      </w:r>
+      <w:proofErr w:type="spellEnd"/>
+      <w:r>
+        <w:rPr>
+          <w:b/>
+          <w:bCs/>
+          <w:lang w:val="en-US"/>
+        </w:rPr>
+        <w:t xml:space="preserve"> to do with there not being any requests to display and not having accounted for this in code :/)</w:t>
+      </w:r>
+      <w:r>
+        <w:rPr>
+          <w:b/>
+          <w:bCs/>
+          <w:lang w:val="en-US"/>
+        </w:rPr>
+        <w:t xml:space="preserve"> </w:t>
+      </w:r>
+      <w:r>
+        <w:rPr>
+          <w:b/>
+          <w:bCs/>
+          <w:color w:val="EE0000"/>
+          <w:lang w:val="en-US"/>
+        </w:rPr>
+        <w:t>WRONG, SEE NEXT PAGE</w:t>
+      </w:r>
+    </w:p>
+    <w:p>
+      <w:pPr>
+        <w:rPr>
+          <w:b/>
+          <w:bCs/>
+          <w:lang w:val="en-US"/>
+        </w:rPr>
+      </w:pPr>
+      <w:r>
+        <w:rPr>
+          <w:b/>
+          <w:bCs/>
+          <w:lang w:val="en-US"/>
+        </w:rPr>
+        <w:drawing>
+          <wp:anchor distT="0" distB="0" distL="114300" distR="114300" simplePos="0" relativeHeight="251682816" behindDoc="0" locked="0" layoutInCell="1" allowOverlap="1" wp14:anchorId="0AF89CA7" wp14:editId="4A8BD1B1">
+            <wp:simplePos x="0" y="0"/>
+            <wp:positionH relativeFrom="column">
+              <wp:posOffset>-388355</wp:posOffset>
+            </wp:positionH>
+            <wp:positionV relativeFrom="paragraph">
+              <wp:posOffset>742355</wp:posOffset>
+            </wp:positionV>
+            <wp:extent cx="3140075" cy="7092315"/>
+            <wp:effectExtent l="0" t="0" r="3175" b="0"/>
+            <wp:wrapSquare wrapText="bothSides"/>
+            <wp:docPr id="127295957" name="Picture 1" descr="A screenshot of a phone&#10;&#10;AI-generated content may be incorrect."/>
+            <wp:cNvGraphicFramePr>
+              <a:graphicFrameLocks xmlns:a="http://schemas.openxmlformats.org/drawingml/2006/main" noChangeAspect="1"/>
+            </wp:cNvGraphicFramePr>
+            <a:graphic xmlns:a="http://schemas.openxmlformats.org/drawingml/2006/main">
+              <a:graphicData uri="http://schemas.openxmlformats.org/drawingml/2006/picture">
+                <pic:pic xmlns:pic="http://schemas.openxmlformats.org/drawingml/2006/picture">
+                  <pic:nvPicPr>
+                    <pic:cNvPr id="127295957" name="Picture 1" descr="A screenshot of a phone&#10;&#10;AI-generated content may be incorrect."/>
+                    <pic:cNvPicPr/>
+                  </pic:nvPicPr>
+                  <pic:blipFill>
+                    <a:blip r:embed="rId60">
+                      <a:extLst>
+                        <a:ext uri="{28A0092B-C50C-407E-A947-70E740481C1C}">
+                          <a14:useLocalDpi xmlns:a14="http://schemas.microsoft.com/office/drawing/2010/main" val="0"/>
+                        </a:ext>
+                      </a:extLst>
+                    </a:blip>
+                    <a:stretch>
+                      <a:fillRect/>
+                    </a:stretch>
+                  </pic:blipFill>
+                  <pic:spPr>
+                    <a:xfrm>
+                      <a:off x="0" y="0"/>
+                      <a:ext cx="3140075" cy="7092315"/>
+                    </a:xfrm>
+                    <a:prstGeom prst="rect">
+                      <a:avLst/>
+                    </a:prstGeom>
+                  </pic:spPr>
+                </pic:pic>
+              </a:graphicData>
+            </a:graphic>
+            <wp14:sizeRelH relativeFrom="page">
+              <wp14:pctWidth>0</wp14:pctWidth>
+            </wp14:sizeRelH>
+            <wp14:sizeRelV relativeFrom="page">
+              <wp14:pctHeight>0</wp14:pctHeight>
+            </wp14:sizeRelV>
+          </wp:anchor>
+        </w:drawing>
+      </w:r>
+    </w:p>
+    <w:p>
+      <w:pPr>
+        <w:rPr>
+          <w:b/>
+          <w:bCs/>
+          <w:lang w:val="en-US"/>
+        </w:rPr>
+      </w:pPr>
+    </w:p>
+    <w:p>
+      <w:pPr>
+        <w:rPr>
+          <w:b/>
+          <w:bCs/>
+          <w:lang w:val="en-US"/>
+        </w:rPr>
+      </w:pPr>
+    </w:p>
+    <w:p>
+      <w:pPr>
+        <w:rPr>
+          <w:b/>
+          <w:bCs/>
+          <w:color w:val="EE0000"/>
+          <w:lang w:val="en-US"/>
+        </w:rPr>
+      </w:pPr>
+      <w:r>
+        <w:rPr>
+          <w:b/>
+          <w:bCs/>
+          <w:lang w:val="en-US"/>
+        </w:rPr>
+        <w:t>(happened when entering “UserB”).</w:t>
+      </w:r>
+      <w:r>
+        <w:rPr>
+          <w:b/>
+          <w:bCs/>
+          <w:lang w:val="en-US"/>
+        </w:rPr>
+        <w:br/>
+      </w:r>
+      <w:r>
+        <w:rPr>
+          <w:b/>
+          <w:bCs/>
+          <w:lang w:val="en-US"/>
+        </w:rPr>
+        <w:br/>
+      </w:r>
+      <w:r>
+        <w:rPr>
+          <w:b/>
+          <w:bCs/>
+          <w:lang w:val="en-US"/>
+        </w:rPr>
+        <w:br/>
+      </w:r>
+      <w:r>
+        <w:rPr>
+          <w:b/>
+          <w:bCs/>
+          <w:lang w:val="en-US"/>
+        </w:rPr>
+        <w:br/>
+      </w:r>
+      <w:r>
+        <w:rPr>
+          <w:b/>
+          <w:bCs/>
+          <w:lang w:val="en-US"/>
+        </w:rPr>
+        <w:br/>
+      </w:r>
+      <w:r>
+        <w:rPr>
+          <w:b/>
+          <w:bCs/>
+          <w:lang w:val="en-US"/>
+        </w:rPr>
+        <w:br/>
+      </w:r>
+      <w:r>
+        <w:rPr>
+          <w:b/>
+          <w:bCs/>
+          <w:lang w:val="en-US"/>
+        </w:rPr>
+        <w:br/>
+      </w:r>
+      <w:r>
+        <w:rPr>
+          <w:b/>
+          <w:bCs/>
+          <w:lang w:val="en-US"/>
+        </w:rPr>
+        <w:br/>
+      </w:r>
+      <w:r>
+        <w:rPr>
+          <w:b/>
+          <w:bCs/>
+          <w:lang w:val="en-US"/>
+        </w:rPr>
+        <w:br/>
+      </w:r>
+      <w:r>
+        <w:rPr>
+          <w:b/>
+          <w:bCs/>
+          <w:lang w:val="en-US"/>
+        </w:rPr>
+        <w:br/>
+      </w:r>
+      <w:r>
+        <w:rPr>
+          <w:b/>
+          <w:bCs/>
+          <w:lang w:val="en-US"/>
+        </w:rPr>
+        <w:br/>
+      </w:r>
+      <w:r>
+        <w:rPr>
+          <w:b/>
+          <w:bCs/>
+          <w:lang w:val="en-US"/>
+        </w:rPr>
+        <w:br/>
+      </w:r>
+      <w:r>
+        <w:rPr>
+          <w:b/>
+          <w:bCs/>
+          <w:lang w:val="en-US"/>
+        </w:rPr>
+        <w:br/>
+      </w:r>
+      <w:r>
+        <w:rPr>
+          <w:b/>
+          <w:bCs/>
+          <w:lang w:val="en-US"/>
+        </w:rPr>
+        <w:br/>
+      </w:r>
+      <w:r>
+        <w:rPr>
+          <w:b/>
+          <w:bCs/>
+          <w:lang w:val="en-US"/>
+        </w:rPr>
+        <w:br/>
+      </w:r>
+      <w:r>
+        <w:rPr>
+          <w:b/>
+          <w:bCs/>
+          <w:lang w:val="en-US"/>
+        </w:rPr>
+        <w:br/>
+      </w:r>
+      <w:r>
+        <w:rPr>
+          <w:b/>
+          <w:bCs/>
+          <w:lang w:val="en-US"/>
+        </w:rPr>
+        <w:br/>
+      </w:r>
+      <w:r>
+        <w:rPr>
+          <w:b/>
+          <w:bCs/>
+          <w:lang w:val="en-US"/>
+        </w:rPr>
+        <w:br/>
+      </w:r>
+      <w:r>
+        <w:rPr>
+          <w:b/>
+          <w:bCs/>
+          <w:lang w:val="en-US"/>
+        </w:rPr>
+        <w:br/>
+      </w:r>
+      <w:r>
+        <w:rPr>
+          <w:b/>
+          <w:bCs/>
+          <w:lang w:val="en-US"/>
+        </w:rPr>
+        <w:br/>
+      </w:r>
+      <w:r>
+        <w:rPr>
+          <w:b/>
+          <w:bCs/>
+          <w:lang w:val="en-US"/>
+        </w:rPr>
+        <w:br/>
+      </w:r>
+      <w:r>
+        <w:rPr>
+          <w:b/>
+          <w:bCs/>
+          <w:lang w:val="en-US"/>
+        </w:rPr>
+        <w:br/>
+      </w:r>
+      <w:r>
+        <w:rPr>
+          <w:b/>
+          <w:bCs/>
+          <w:lang w:val="en-US"/>
+        </w:rPr>
+        <w:br/>
+      </w:r>
+      <w:r>
+        <w:rPr>
+          <w:b/>
+          <w:bCs/>
+          <w:lang w:val="en-US"/>
+        </w:rPr>
+        <w:br/>
+      </w:r>
+      <w:r>
+        <w:rPr>
+          <w:b/>
+          <w:bCs/>
+          <w:lang w:val="en-US"/>
+        </w:rPr>
+        <w:br/>
+      </w:r>
+      <w:r>
+        <w:rPr>
+          <w:b/>
+          <w:bCs/>
+          <w:lang w:val="en-US"/>
+        </w:rPr>
+        <w:br/>
+      </w:r>
+      <w:r>
+        <w:rPr>
+          <w:b/>
+          <w:bCs/>
+          <w:lang w:val="en-US"/>
+        </w:rPr>
+        <w:br/>
+      </w:r>
+      <w:r>
+        <w:rPr>
+          <w:b/>
+          <w:bCs/>
+          <w:lang w:val="en-US"/>
+        </w:rPr>
+        <w:br/>
+      </w:r>
+      <w:r>
+        <w:rPr>
+          <w:b/>
+          <w:bCs/>
+          <w:lang w:val="en-US"/>
+        </w:rPr>
+        <w:br/>
+      </w:r>
+      <w:r>
+        <w:rPr>
+          <w:b/>
+          <w:bCs/>
+          <w:lang w:val="en-US"/>
+        </w:rPr>
+        <w:br/>
+      </w:r>
+      <w:r>
+        <w:rPr>
+          <w:b/>
+          <w:bCs/>
+          <w:lang w:val="en-US"/>
+        </w:rPr>
+        <w:br/>
+      </w:r>
+      <w:r>
+        <w:rPr>
+          <w:b/>
+          <w:bCs/>
+          <w:lang w:val="en-US"/>
+        </w:rPr>
+        <w:br/>
+      </w:r>
+      <w:r>
+        <w:rPr>
+          <w:b/>
+          <w:bCs/>
+          <w:lang w:val="en-US"/>
+        </w:rPr>
+        <w:br/>
+      </w:r>
+      <w:r>
+        <w:rPr>
+          <w:b/>
+          <w:bCs/>
+          <w:lang w:val="en-US"/>
+        </w:rPr>
+        <w:br/>
+      </w:r>
+      <w:r>
+        <w:rPr>
+          <w:b/>
+          <w:bCs/>
+          <w:lang w:val="en-US"/>
+        </w:rPr>
+        <w:br/>
+      </w:r>
+      <w:r>
+        <w:rPr>
+          <w:b/>
+          <w:bCs/>
+          <w:lang w:val="en-US"/>
+        </w:rPr>
+        <w:br/>
+      </w:r>
+      <w:r>
+        <w:rPr>
+          <w:b/>
+          <w:bCs/>
+          <w:lang w:val="en-US"/>
+        </w:rPr>
+        <w:lastRenderedPageBreak/>
+        <w:br/>
+      </w:r>
+      <w:r>
+        <w:rPr>
+          <w:b/>
+          <w:bCs/>
+          <w:color w:val="EE0000"/>
+          <w:lang w:val="en-US"/>
+        </w:rPr>
+        <w:t xml:space="preserve">Fix for </w:t>
+      </w:r>
+      <w:r>
+        <w:rPr>
+          <w:b/>
+          <w:bCs/>
+          <w:color w:val="EE0000"/>
+          <w:lang w:val="en-US"/>
+        </w:rPr>
+        <w:t>Friends page:</w:t>
+      </w:r>
+    </w:p>
+    <w:p>
+      <w:pPr>
+        <w:rPr>
+          <w:b/>
+          <w:bCs/>
+          <w:lang w:val="en-US"/>
+        </w:rPr>
+      </w:pPr>
+      <w:r>
+        <w:rPr>
+          <w:b/>
+          <w:bCs/>
+          <w:color w:val="EE0000"/>
+          <w:lang w:val="en-US"/>
+        </w:rPr>
+        <w:t xml:space="preserve">(SEE PAGE 26 FOR </w:t>
+      </w:r>
+      <w:r>
+        <w:rPr>
+          <w:b/>
+          <w:bCs/>
+          <w:color w:val="EE0000"/>
+          <w:u w:val="single"/>
+          <w:lang w:val="en-US"/>
+        </w:rPr>
+        <w:t>TEST 2</w:t>
+      </w:r>
+      <w:r>
+        <w:rPr>
+          <w:b/>
+          <w:bCs/>
+          <w:color w:val="EE0000"/>
+          <w:lang w:val="en-US"/>
+        </w:rPr>
+        <w:t xml:space="preserve"> POST FIX)</w:t>
+      </w:r>
+      <w:r>
+        <w:rPr>
+          <w:b/>
+          <w:bCs/>
+          <w:lang w:val="en-US"/>
+        </w:rPr>
+        <w:br/>
+      </w:r>
+      <w:r>
+        <w:rPr>
+          <w:b/>
+          <w:bCs/>
+          <w:lang w:val="en-US"/>
+        </w:rPr>
+        <w:br/>
+      </w:r>
+      <w:r>
+        <w:rPr>
+          <w:b/>
+          <w:bCs/>
+          <w:lang w:val="en-US"/>
+        </w:rPr>
+        <w:t>E</w:t>
+      </w:r>
+      <w:r>
+        <w:rPr>
+          <w:b/>
+          <w:bCs/>
+          <w:lang w:val="en-US"/>
+        </w:rPr>
+        <w:t>rror with useLocalSearchParams(); as that only retrieves data through the url, and I was navigating manually from the dashboard as UserA to the Friends tab, which didn’t pass UserA in the url (meaning username was empty in getIncomingRequests(username) and sendFriendRequest(username, targetUser).</w:t>
+      </w:r>
+    </w:p>
+    <w:p>
+      <w:pPr>
+        <w:rPr>
+          <w:b/>
+          <w:bCs/>
+          <w:lang w:val="en-US"/>
+        </w:rPr>
+      </w:pPr>
+      <w:r>
+        <w:rPr>
+          <w:b/>
+          <w:bCs/>
+          <w:lang w:val="en-US"/>
+        </w:rPr>
+        <w:t>Might be able to fix by using AsyncStorage to store the logged in</w:t>
+      </w:r>
+      <w:r>
+        <w:rPr>
+          <w:b/>
+          <w:bCs/>
+          <w:lang w:val="en-US"/>
+        </w:rPr>
+        <w:t xml:space="preserve">/signed up </w:t>
+      </w:r>
+      <w:r>
+        <w:rPr>
+          <w:b/>
+          <w:bCs/>
+          <w:lang w:val="en-US"/>
+        </w:rPr>
+        <w:t>user and retrieving the username for getting/sending requests.</w:t>
+      </w:r>
+    </w:p>
+    <w:p>
+      <w:pPr>
+        <w:rPr>
+          <w:b/>
+          <w:bCs/>
+          <w:lang w:val="en-US"/>
+        </w:rPr>
+      </w:pPr>
+      <w:r>
+        <w:rPr>
+          <w:b/>
+          <w:bCs/>
+          <w:lang w:val="en-US"/>
+        </w:rPr>
+        <w:t xml:space="preserve">Went on a tangent: </w:t>
+      </w:r>
+    </w:p>
+    <w:p>
+      <w:pPr>
+        <w:rPr>
+          <w:b/>
+          <w:bCs/>
+          <w:lang w:val="en-US"/>
+        </w:rPr>
+      </w:pPr>
+      <w:r>
+        <w:rPr>
+          <w:b/>
+          <w:bCs/>
+          <w:lang w:val="en-US"/>
+        </w:rPr>
+        <w:t>Also changed dashboard.tsx to get username from AsyncStorage and not router</w:t>
+      </w:r>
+      <w:r>
+        <w:rPr>
+          <w:b/>
+          <w:bCs/>
+          <w:lang w:val="en-US"/>
+        </w:rPr>
+        <w:t xml:space="preserve"> and useLocalSearchParams()</w:t>
+      </w:r>
+      <w:r>
+        <w:rPr>
+          <w:b/>
+          <w:bCs/>
+          <w:lang w:val="en-US"/>
+        </w:rPr>
+        <w:t>.</w:t>
+      </w:r>
+    </w:p>
+    <w:p>
+      <w:pPr>
+        <w:pStyle w:val="ListParagraph"/>
+        <w:numPr>
+          <w:ilvl w:val="0"/>
+          <w:numId w:val="1"/>
+        </w:numPr>
+        <w:rPr>
+          <w:b/>
+          <w:bCs/>
+          <w:lang w:val="en-US"/>
+        </w:rPr>
+      </w:pPr>
+      <w:r>
+        <w:rPr>
+          <w:b/>
+          <w:bCs/>
+          <w:lang w:val="en-US"/>
+        </w:rPr>
+        <w:t xml:space="preserve">Managed to pass username through AsyncStorage, </w:t>
+      </w:r>
+      <w:r>
+        <w:rPr>
+          <w:b/>
+          <w:bCs/>
+          <w:color w:val="EE0000"/>
+          <w:lang w:val="en-US"/>
+        </w:rPr>
+        <w:t xml:space="preserve">but username from original test user persists between logins (i.e. UserA logs in, then logs out successfully, UserB logs In but </w:t>
+      </w:r>
+      <w:r>
+        <w:rPr>
+          <w:b/>
+          <w:bCs/>
+          <w:color w:val="EE0000"/>
+          <w:lang w:val="en-US"/>
+        </w:rPr>
+        <w:t>“</w:t>
+      </w:r>
+      <w:r>
+        <w:rPr>
+          <w:b/>
+          <w:bCs/>
+          <w:color w:val="EE0000"/>
+          <w:lang w:val="en-US"/>
+        </w:rPr>
+        <w:t>Welcome, UserA!</w:t>
+      </w:r>
+      <w:r>
+        <w:rPr>
+          <w:b/>
+          <w:bCs/>
+          <w:color w:val="EE0000"/>
+          <w:lang w:val="en-US"/>
+        </w:rPr>
+        <w:t xml:space="preserve">” </w:t>
+      </w:r>
+      <w:r>
+        <w:rPr>
+          <w:b/>
+          <w:bCs/>
+          <w:color w:val="EE0000"/>
+          <w:lang w:val="en-US"/>
+        </w:rPr>
+        <w:t>Still shows</w:t>
+      </w:r>
+      <w:r>
+        <w:rPr>
+          <w:b/>
+          <w:bCs/>
+          <w:lang w:val="en-US"/>
+        </w:rPr>
+        <w:t>.</w:t>
+      </w:r>
+      <w:r>
+        <w:rPr>
+          <w:b/>
+          <w:bCs/>
+          <w:lang w:val="en-US"/>
+        </w:rPr>
+        <w:br/>
+      </w:r>
+    </w:p>
+    <w:p>
+      <w:pPr>
+        <w:pStyle w:val="ListParagraph"/>
+        <w:numPr>
+          <w:ilvl w:val="0"/>
+          <w:numId w:val="1"/>
+        </w:numPr>
+        <w:rPr>
+          <w:b/>
+          <w:bCs/>
+          <w:lang w:val="en-US"/>
+        </w:rPr>
+      </w:pPr>
+      <w:r>
+        <w:rPr>
+          <w:b/>
+          <w:bCs/>
+          <w:lang w:val="en-US"/>
+        </w:rPr>
+        <w:t xml:space="preserve">Using </w:t>
+      </w:r>
+      <w:proofErr w:type="spellStart"/>
+      <w:r>
+        <w:rPr>
+          <w:b/>
+          <w:bCs/>
+          <w:lang w:val="en-US"/>
+        </w:rPr>
+        <w:t>useIsFocused</w:t>
+      </w:r>
+      <w:proofErr w:type="spellEnd"/>
+      <w:r>
+        <w:rPr>
+          <w:b/>
+          <w:bCs/>
+          <w:lang w:val="en-US"/>
+        </w:rPr>
+        <w:t xml:space="preserve"> listener instead, returns “true” whenever the screen comes into view, meaning username updates every time you navigate to dashboard.</w:t>
+      </w:r>
+      <w:r>
+        <w:rPr>
+          <w:b/>
+          <w:bCs/>
+          <w:lang w:val="en-US"/>
+        </w:rPr>
+        <w:br/>
+      </w:r>
+    </w:p>
+    <w:p>
+      <w:pPr>
+        <w:pStyle w:val="ListParagraph"/>
+        <w:numPr>
+          <w:ilvl w:val="0"/>
+          <w:numId w:val="1"/>
+        </w:numPr>
+        <w:rPr>
+          <w:b/>
+          <w:bCs/>
+          <w:lang w:val="en-US"/>
+        </w:rPr>
+      </w:pPr>
+      <w:r>
+        <w:rPr>
+          <w:b/>
+          <w:bCs/>
+          <w:lang w:val="en-US"/>
+        </w:rPr>
+        <w:t>Username now correctly updates between user logins.</w:t>
+      </w:r>
+    </w:p>
+    <w:p>
+      <w:pPr>
+        <w:rPr>
+          <w:b/>
+          <w:bCs/>
+          <w:lang w:val="en-US"/>
+        </w:rPr>
+      </w:pPr>
+      <w:r>
+        <w:rPr>
+          <w:b/>
+          <w:bCs/>
+          <w:lang w:val="en-US"/>
+        </w:rPr>
+        <w:drawing>
+          <wp:inline distT="0" distB="0" distL="0" distR="0" wp14:anchorId="29264DC7" wp14:editId="6397CF05">
+            <wp:extent cx="2801073" cy="2753902"/>
+            <wp:effectExtent l="0" t="0" r="0" b="8890"/>
+            <wp:docPr id="370845695" name="Picture 1" descr="A screenshot of a computer&#10;&#10;AI-generated content may be incorrect."/>
+            <wp:cNvGraphicFramePr>
+              <a:graphicFrameLocks xmlns:a="http://schemas.openxmlformats.org/drawingml/2006/main" noChangeAspect="1"/>
+            </wp:cNvGraphicFramePr>
+            <a:graphic xmlns:a="http://schemas.openxmlformats.org/drawingml/2006/main">
+              <a:graphicData uri="http://schemas.openxmlformats.org/drawingml/2006/picture">
+                <pic:pic xmlns:pic="http://schemas.openxmlformats.org/drawingml/2006/picture">
+                  <pic:nvPicPr>
+                    <pic:cNvPr id="370845695" name="Picture 1" descr="A screenshot of a computer&#10;&#10;AI-generated content may be incorrect."/>
+                    <pic:cNvPicPr/>
+                  </pic:nvPicPr>
+                  <pic:blipFill>
+                    <a:blip r:embed="rId61"/>
+                    <a:stretch>
+                      <a:fillRect/>
+                    </a:stretch>
+                  </pic:blipFill>
+                  <pic:spPr>
+                    <a:xfrm>
+                      <a:off x="0" y="0"/>
+                      <a:ext cx="2804431" cy="2757204"/>
+                    </a:xfrm>
+                    <a:prstGeom prst="rect">
+                      <a:avLst/>
+                    </a:prstGeom>
+                  </pic:spPr>
+                </pic:pic>
+              </a:graphicData>
+            </a:graphic>
+          </wp:inline>
+        </w:drawing>
+      </w:r>
+      <w:r>
+        <w:rPr>
+          <w:b/>
+          <w:bCs/>
+          <w:lang w:val="en-US"/>
+        </w:rPr>
+        <w:br/>
+      </w:r>
+    </w:p>
+    <w:p>
+      <w:pPr>
+        <w:rPr>
+          <w:b/>
+          <w:bCs/>
+          <w:lang w:val="en-US"/>
+        </w:rPr>
+      </w:pPr>
+      <w:r>
+        <w:rPr>
+          <w:b/>
+          <w:bCs/>
+          <w:lang w:val="en-US"/>
+        </w:rPr>
+        <w:br w:type="page"/>
+      </w:r>
+    </w:p>
+    <w:p>
+      <w:pPr>
+        <w:rPr>
+          <w:b/>
+          <w:bCs/>
+          <w:lang w:val="en-US"/>
+        </w:rPr>
+      </w:pPr>
+      <w:r>
+        <w:rPr>
+          <w:b/>
+          <w:bCs/>
+          <w:lang w:val="en-US"/>
+        </w:rPr>
+        <w:lastRenderedPageBreak/>
+        <w:t>Back to fixing Friends page and incorporating AsyncStorage etc</w:t>
+      </w:r>
+      <w:r>
+        <w:rPr>
+          <w:b/>
+          <w:bCs/>
+          <w:lang w:val="en-US"/>
+        </w:rPr>
+        <w:t>:</w:t>
+      </w:r>
+    </w:p>
+    <w:p>
+      <w:pPr>
+        <w:pStyle w:val="ListParagraph"/>
+        <w:numPr>
+          <w:ilvl w:val="0"/>
+          <w:numId w:val="1"/>
+        </w:numPr>
+        <w:rPr>
+          <w:b/>
+          <w:bCs/>
+          <w:lang w:val="en-US"/>
+        </w:rPr>
+      </w:pPr>
+      <w:r>
+        <w:rPr>
+          <w:b/>
+          <w:bCs/>
+          <w:lang w:val="en-US"/>
+        </w:rPr>
+        <w:t xml:space="preserve">Removed </w:t>
+      </w:r>
+      <w:proofErr w:type="spellStart"/>
+      <w:r>
+        <w:rPr>
+          <w:b/>
+          <w:bCs/>
+          <w:lang w:val="en-US"/>
+        </w:rPr>
+        <w:t>localSearchParams</w:t>
+      </w:r>
+      <w:proofErr w:type="spellEnd"/>
+      <w:r>
+        <w:rPr>
+          <w:b/>
+          <w:bCs/>
+          <w:lang w:val="en-US"/>
+        </w:rPr>
+        <w:t xml:space="preserve"> and replaced with AsyncStorage and </w:t>
+      </w:r>
+      <w:proofErr w:type="spellStart"/>
+      <w:r>
+        <w:rPr>
+          <w:b/>
+          <w:bCs/>
+          <w:lang w:val="en-US"/>
+        </w:rPr>
+        <w:t>useIsFocused</w:t>
+      </w:r>
+      <w:proofErr w:type="spellEnd"/>
+      <w:r>
+        <w:rPr>
+          <w:b/>
+          <w:bCs/>
+          <w:lang w:val="en-US"/>
+        </w:rPr>
+        <w:t xml:space="preserve"> (same as dashboard.tsx).</w:t>
+      </w:r>
+      <w:r>
+        <w:rPr>
+          <w:b/>
+          <w:bCs/>
+          <w:lang w:val="en-US"/>
+        </w:rPr>
+        <w:br/>
+      </w:r>
+    </w:p>
+    <w:p>
+      <w:pPr>
+        <w:pStyle w:val="ListParagraph"/>
+        <w:numPr>
+          <w:ilvl w:val="0"/>
+          <w:numId w:val="1"/>
+        </w:numPr>
+        <w:rPr>
+          <w:b/>
+          <w:bCs/>
+          <w:lang w:val="en-US"/>
+        </w:rPr>
+      </w:pPr>
+      <w:r>
+        <w:rPr>
+          <w:b/>
+          <w:bCs/>
+          <w:lang w:val="en-US"/>
+        </w:rPr>
+        <w:drawing>
+          <wp:anchor distT="0" distB="0" distL="114300" distR="114300" simplePos="0" relativeHeight="251683840" behindDoc="0" locked="0" layoutInCell="1" allowOverlap="1" wp14:anchorId="078FDFF7" wp14:editId="3D55BF14">
+            <wp:simplePos x="0" y="0"/>
+            <wp:positionH relativeFrom="margin">
+              <wp:posOffset>132715</wp:posOffset>
+            </wp:positionH>
+            <wp:positionV relativeFrom="paragraph">
+              <wp:posOffset>391795</wp:posOffset>
+            </wp:positionV>
+            <wp:extent cx="5069205" cy="1692275"/>
+            <wp:effectExtent l="0" t="0" r="0" b="3175"/>
+            <wp:wrapSquare wrapText="bothSides"/>
+            <wp:docPr id="775478732" name="Picture 1" descr="A screen shot of a computer&#10;&#10;AI-generated content may be incorrect."/>
+            <wp:cNvGraphicFramePr>
+              <a:graphicFrameLocks xmlns:a="http://schemas.openxmlformats.org/drawingml/2006/main" noChangeAspect="1"/>
+            </wp:cNvGraphicFramePr>
+            <a:graphic xmlns:a="http://schemas.openxmlformats.org/drawingml/2006/main">
+              <a:graphicData uri="http://schemas.openxmlformats.org/drawingml/2006/picture">
+                <pic:pic xmlns:pic="http://schemas.openxmlformats.org/drawingml/2006/picture">
+                  <pic:nvPicPr>
+                    <pic:cNvPr id="775478732" name="Picture 1" descr="A screen shot of a computer&#10;&#10;AI-generated content may be incorrect."/>
+                    <pic:cNvPicPr/>
+                  </pic:nvPicPr>
+                  <pic:blipFill>
+                    <a:blip r:embed="rId62">
+                      <a:extLst>
+                        <a:ext uri="{28A0092B-C50C-407E-A947-70E740481C1C}">
+                          <a14:useLocalDpi xmlns:a14="http://schemas.microsoft.com/office/drawing/2010/main" val="0"/>
+                        </a:ext>
+                      </a:extLst>
+                    </a:blip>
+                    <a:stretch>
+                      <a:fillRect/>
+                    </a:stretch>
+                  </pic:blipFill>
+                  <pic:spPr>
+                    <a:xfrm>
+                      <a:off x="0" y="0"/>
+                      <a:ext cx="5069205" cy="1692275"/>
+                    </a:xfrm>
+                    <a:prstGeom prst="rect">
+                      <a:avLst/>
+                    </a:prstGeom>
+                  </pic:spPr>
+                </pic:pic>
+              </a:graphicData>
+            </a:graphic>
+            <wp14:sizeRelH relativeFrom="page">
+              <wp14:pctWidth>0</wp14:pctWidth>
+            </wp14:sizeRelH>
+            <wp14:sizeRelV relativeFrom="page">
+              <wp14:pctHeight>0</wp14:pctHeight>
+            </wp14:sizeRelV>
+          </wp:anchor>
+        </w:drawing>
+      </w:r>
+      <w:r>
+        <w:rPr>
+          <w:b/>
+          <w:bCs/>
+          <w:lang w:val="en-US"/>
+        </w:rPr>
+        <w:t>Copied over some code from dashboard.tsx with loading username when screen loaded etc:</w:t>
+      </w:r>
+      <w:r>
+        <w:rPr>
+          <w:b/>
+          <w:bCs/>
+          <w:lang w:val="en-US"/>
+        </w:rPr>
+        <w:br/>
+      </w:r>
+      <w:r>
+        <w:rPr>
+          <w:b/>
+          <w:bCs/>
+          <w:lang w:val="en-US"/>
+        </w:rPr>
+        <w:br/>
+      </w:r>
+      <w:r>
+        <w:rPr>
+          <w:b/>
+          <w:bCs/>
+          <w:lang w:val="en-US"/>
+        </w:rPr>
+        <w:br/>
+      </w:r>
+      <w:r>
+        <w:rPr>
+          <w:b/>
+          <w:bCs/>
+          <w:lang w:val="en-US"/>
+        </w:rPr>
+        <w:br/>
+      </w:r>
+    </w:p>
+    <w:p>
+      <w:pPr>
+        <w:rPr>
+          <w:b/>
+          <w:bCs/>
+          <w:lang w:val="en-US"/>
+        </w:rPr>
+      </w:pPr>
+    </w:p>
+    <w:p>
+      <w:pPr>
+        <w:rPr>
+          <w:b/>
+          <w:bCs/>
+          <w:lang w:val="en-US"/>
+        </w:rPr>
+      </w:pPr>
+    </w:p>
+    <w:p>
+      <w:pPr>
+        <w:rPr>
+          <w:b/>
+          <w:bCs/>
+          <w:lang w:val="en-US"/>
+        </w:rPr>
+      </w:pPr>
+    </w:p>
+    <w:p>
+      <w:pPr>
+        <w:rPr>
+          <w:b/>
+          <w:bCs/>
+          <w:lang w:val="en-US"/>
+        </w:rPr>
+      </w:pPr>
+    </w:p>
+    <w:p>
+      <w:pPr>
+        <w:rPr>
+          <w:b/>
+          <w:bCs/>
+          <w:u w:val="single"/>
+          <w:lang w:val="en-US"/>
+        </w:rPr>
+      </w:pPr>
+      <w:r>
+        <w:rPr>
+          <w:b/>
+          <w:bCs/>
+          <w:lang w:val="en-US"/>
+        </w:rPr>
+        <w:br/>
+        <w:t>See next page for test 2.</w:t>
+      </w:r>
+      <w:r>
+        <w:rPr>
+          <w:b/>
+          <w:bCs/>
+          <w:lang w:val="en-US"/>
+        </w:rPr>
+        <w:br/>
+      </w:r>
+    </w:p>
+    <w:p>
+      <w:pPr>
+        <w:rPr>
+          <w:b/>
+          <w:bCs/>
+          <w:u w:val="single"/>
+          <w:lang w:val="en-US"/>
+        </w:rPr>
+      </w:pPr>
+      <w:r>
+        <w:rPr>
+          <w:b/>
+          <w:bCs/>
+          <w:u w:val="single"/>
+          <w:lang w:val="en-US"/>
+        </w:rPr>
+        <w:br w:type="page"/>
+      </w:r>
+    </w:p>
+    <w:p>
+      <w:pPr>
+        <w:rPr>
+          <w:b/>
+          <w:bCs/>
+          <w:u w:val="single"/>
+          <w:lang w:val="en-US"/>
+        </w:rPr>
+      </w:pPr>
+      <w:r>
+        <w:rPr>
+          <w:b/>
+          <w:bCs/>
+          <w:u w:val="single"/>
+          <w:lang w:val="en-US"/>
+        </w:rPr>
+        <w:lastRenderedPageBreak/>
+        <w:t xml:space="preserve">Test </w:t>
+      </w:r>
+      <w:r>
+        <w:rPr>
+          <w:b/>
+          <w:bCs/>
+          <w:u w:val="single"/>
+          <w:lang w:val="en-US"/>
+        </w:rPr>
+        <w:t>2</w:t>
+      </w:r>
+      <w:r>
+        <w:rPr>
+          <w:b/>
+          <w:bCs/>
+          <w:u w:val="single"/>
+          <w:lang w:val="en-US"/>
+        </w:rPr>
+        <w:t>:</w:t>
+      </w:r>
+      <w:r>
+        <w:rPr>
+          <w:b/>
+          <w:bCs/>
+          <w:u w:val="single"/>
+          <w:lang w:val="en-US"/>
+        </w:rPr>
+        <w:t xml:space="preserve"> </w:t>
+      </w:r>
+    </w:p>
+    <w:p>
+      <w:pPr>
+        <w:pStyle w:val="ListParagraph"/>
+        <w:numPr>
+          <w:ilvl w:val="0"/>
+          <w:numId w:val="4"/>
+        </w:numPr>
+        <w:rPr>
+          <w:b/>
+          <w:bCs/>
+          <w:lang w:val="en-US"/>
+        </w:rPr>
+      </w:pPr>
+      <w:r>
+        <w:rPr>
+          <w:b/>
+          <w:bCs/>
+          <w:lang w:val="en-US"/>
+        </w:rPr>
+        <w:t xml:space="preserve">Sign up and log </w:t>
+      </w:r>
+      <w:r>
+        <w:rPr>
+          <w:b/>
+          <w:bCs/>
+          <w:lang w:val="en-US"/>
+        </w:rPr>
+        <w:t>in as UserA</w:t>
+      </w:r>
+      <w:r>
+        <w:rPr>
+          <w:b/>
+          <w:bCs/>
+          <w:lang w:val="en-US"/>
+        </w:rPr>
+        <w:t xml:space="preserve"> (password: TestAA),</w:t>
+      </w:r>
+    </w:p>
+    <w:p>
+      <w:pPr>
+        <w:pStyle w:val="ListParagraph"/>
+        <w:numPr>
+          <w:ilvl w:val="0"/>
+          <w:numId w:val="4"/>
+        </w:numPr>
+        <w:rPr>
+          <w:b/>
+          <w:bCs/>
+          <w:lang w:val="en-US"/>
+        </w:rPr>
+      </w:pPr>
+      <w:r>
+        <w:rPr>
+          <w:b/>
+          <w:bCs/>
+          <w:lang w:val="en-US"/>
+        </w:rPr>
+        <w:t>Sign up and log in as UserB (password: TestBB),</w:t>
+      </w:r>
+    </w:p>
+    <w:p>
+      <w:pPr>
+        <w:pStyle w:val="ListParagraph"/>
+        <w:numPr>
+          <w:ilvl w:val="0"/>
+          <w:numId w:val="4"/>
+        </w:numPr>
+        <w:rPr>
+          <w:b/>
+          <w:bCs/>
+          <w:lang w:val="en-US"/>
+        </w:rPr>
+      </w:pPr>
+      <w:r>
+        <w:rPr>
+          <w:b/>
+          <w:bCs/>
+          <w:lang w:val="en-US"/>
+        </w:rPr>
+        <w:t>Logging out,</w:t>
+      </w:r>
+    </w:p>
+    <w:p>
+      <w:pPr>
+        <w:pStyle w:val="ListParagraph"/>
+        <w:numPr>
+          <w:ilvl w:val="0"/>
+          <w:numId w:val="4"/>
+        </w:numPr>
+        <w:rPr>
+          <w:b/>
+          <w:bCs/>
+          <w:lang w:val="en-US"/>
+        </w:rPr>
+      </w:pPr>
+      <w:r>
+        <w:rPr>
+          <w:b/>
+          <w:bCs/>
+          <w:lang w:val="en-US"/>
+        </w:rPr>
+        <w:t>Log in as UserA,</w:t>
+      </w:r>
+    </w:p>
+    <w:p>
+      <w:pPr>
+        <w:pStyle w:val="ListParagraph"/>
+        <w:numPr>
+          <w:ilvl w:val="0"/>
+          <w:numId w:val="4"/>
+        </w:numPr>
+        <w:rPr>
+          <w:b/>
+          <w:bCs/>
+          <w:lang w:val="en-US"/>
+        </w:rPr>
+      </w:pPr>
+      <w:r>
+        <w:rPr>
+          <w:b/>
+          <w:bCs/>
+          <w:lang w:val="en-US"/>
+        </w:rPr>
+        <w:t>Opening friends tab,</w:t>
+      </w:r>
+    </w:p>
+    <w:p>
+      <w:pPr>
+        <w:pStyle w:val="ListParagraph"/>
+        <w:numPr>
+          <w:ilvl w:val="0"/>
+          <w:numId w:val="4"/>
+        </w:numPr>
+        <w:rPr>
+          <w:b/>
+          <w:bCs/>
+          <w:lang w:val="en-US"/>
+        </w:rPr>
+      </w:pPr>
+      <w:r>
+        <w:rPr>
+          <w:b/>
+          <w:bCs/>
+          <w:lang w:val="en-US"/>
+        </w:rPr>
+        <w:t>Sending Request to UserB,</w:t>
+      </w:r>
+    </w:p>
+    <w:p>
+      <w:pPr>
+        <w:pStyle w:val="ListParagraph"/>
+        <w:numPr>
+          <w:ilvl w:val="0"/>
+          <w:numId w:val="4"/>
+        </w:numPr>
+        <w:rPr>
+          <w:b/>
+          <w:bCs/>
+          <w:lang w:val="en-US"/>
+        </w:rPr>
+      </w:pPr>
+      <w:r>
+        <w:rPr>
+          <w:b/>
+          <w:bCs/>
+          <w:lang w:val="en-US"/>
+        </w:rPr>
+        <w:t>Logging out,</w:t>
+      </w:r>
+    </w:p>
+    <w:p>
+      <w:pPr>
+        <w:pStyle w:val="ListParagraph"/>
+        <w:numPr>
+          <w:ilvl w:val="0"/>
+          <w:numId w:val="4"/>
+        </w:numPr>
+        <w:rPr>
+          <w:b/>
+          <w:bCs/>
+          <w:lang w:val="en-US"/>
+        </w:rPr>
+      </w:pPr>
+      <w:r>
+        <w:rPr>
+          <w:b/>
+          <w:bCs/>
+          <w:lang w:val="en-US"/>
+        </w:rPr>
+        <w:t>Logging in as UserB,</w:t>
+      </w:r>
+    </w:p>
+    <w:p>
+      <w:pPr>
+        <w:pStyle w:val="ListParagraph"/>
+        <w:numPr>
+          <w:ilvl w:val="0"/>
+          <w:numId w:val="4"/>
+        </w:numPr>
+        <w:rPr>
+          <w:b/>
+          <w:bCs/>
+          <w:lang w:val="en-US"/>
+        </w:rPr>
+      </w:pPr>
+      <w:r>
+        <w:rPr>
+          <w:b/>
+          <w:bCs/>
+          <w:lang w:val="en-US"/>
+        </w:rPr>
+        <w:t>Opening Friends tab,</w:t>
+      </w:r>
+    </w:p>
+    <w:p>
+      <w:pPr>
+        <w:pStyle w:val="ListParagraph"/>
+        <w:numPr>
+          <w:ilvl w:val="0"/>
+          <w:numId w:val="4"/>
+        </w:numPr>
+        <w:rPr>
+          <w:b/>
+          <w:bCs/>
+          <w:lang w:val="en-US"/>
+        </w:rPr>
+      </w:pPr>
+      <w:r>
+        <w:rPr>
+          <w:b/>
+          <w:bCs/>
+          <w:lang w:val="en-US"/>
+        </w:rPr>
+        <w:t>Viewing Request</w:t>
+      </w:r>
+    </w:p>
+    <w:p>
+      <w:pPr>
+        <w:rPr>
+          <w:b/>
+          <w:bCs/>
+          <w:color w:val="EE0000"/>
+          <w:lang w:val="en-US"/>
+        </w:rPr>
+      </w:pPr>
+      <w:r>
+        <w:rPr>
+          <w:b/>
+          <w:bCs/>
+          <w:color w:val="EE0000"/>
+          <w:lang w:val="en-US"/>
+        </w:rPr>
+        <w:t>(wiped users collection</w:t>
+      </w:r>
+      <w:r>
+        <w:rPr>
+          <w:b/>
+          <w:bCs/>
+          <w:color w:val="EE0000"/>
+          <w:lang w:val="en-US"/>
+        </w:rPr>
+        <w:t xml:space="preserve"> AND AUTHENTICATION USERS</w:t>
+      </w:r>
+      <w:r>
+        <w:rPr>
+          <w:b/>
+          <w:bCs/>
+          <w:color w:val="EE0000"/>
+          <w:lang w:val="en-US"/>
+        </w:rPr>
+        <w:t xml:space="preserve"> on database before testing!)</w:t>
+      </w:r>
+    </w:p>
+    <w:p>
+      <w:pPr>
+        <w:rPr>
+          <w:b/>
+          <w:bCs/>
+          <w:lang w:val="en-US"/>
+        </w:rPr>
+      </w:pPr>
+    </w:p>
+    <w:p>
+      <w:pPr>
+        <w:rPr>
+          <w:b/>
+          <w:bCs/>
+          <w:lang w:val="en-US"/>
+        </w:rPr>
+      </w:pPr>
+      <w:r>
+        <w:rPr>
+          <w:b/>
+          <w:bCs/>
+          <w:lang w:val="en-US"/>
+        </w:rPr>
+        <w:drawing>
+          <wp:anchor distT="0" distB="0" distL="114300" distR="114300" simplePos="0" relativeHeight="251684864" behindDoc="0" locked="0" layoutInCell="1" allowOverlap="1" wp14:anchorId="3ABBC0FF" wp14:editId="3454DA4F">
+            <wp:simplePos x="0" y="0"/>
+            <wp:positionH relativeFrom="margin">
+              <wp:align>left</wp:align>
+            </wp:positionH>
+            <wp:positionV relativeFrom="paragraph">
+              <wp:posOffset>285115</wp:posOffset>
+            </wp:positionV>
+            <wp:extent cx="2297430" cy="1181100"/>
+            <wp:effectExtent l="0" t="0" r="7620" b="0"/>
+            <wp:wrapSquare wrapText="bothSides"/>
+            <wp:docPr id="327707525" name="Picture 1" descr="A screenshot of a computer screen&#10;&#10;AI-generated content may be incorrect."/>
+            <wp:cNvGraphicFramePr>
+              <a:graphicFrameLocks xmlns:a="http://schemas.openxmlformats.org/drawingml/2006/main" noChangeAspect="1"/>
+            </wp:cNvGraphicFramePr>
+            <a:graphic xmlns:a="http://schemas.openxmlformats.org/drawingml/2006/main">
+              <a:graphicData uri="http://schemas.openxmlformats.org/drawingml/2006/picture">
+                <pic:pic xmlns:pic="http://schemas.openxmlformats.org/drawingml/2006/picture">
+                  <pic:nvPicPr>
+                    <pic:cNvPr id="327707525" name="Picture 1" descr="A screenshot of a computer screen&#10;&#10;AI-generated content may be incorrect."/>
+                    <pic:cNvPicPr/>
+                  </pic:nvPicPr>
+                  <pic:blipFill>
+                    <a:blip r:embed="rId63">
+                      <a:extLst>
+                        <a:ext uri="{28A0092B-C50C-407E-A947-70E740481C1C}">
+                          <a14:useLocalDpi xmlns:a14="http://schemas.microsoft.com/office/drawing/2010/main" val="0"/>
+                        </a:ext>
+                      </a:extLst>
+                    </a:blip>
+                    <a:stretch>
+                      <a:fillRect/>
+                    </a:stretch>
+                  </pic:blipFill>
+                  <pic:spPr>
+                    <a:xfrm>
+                      <a:off x="0" y="0"/>
+                      <a:ext cx="2297430" cy="1181100"/>
+                    </a:xfrm>
+                    <a:prstGeom prst="rect">
+                      <a:avLst/>
+                    </a:prstGeom>
+                  </pic:spPr>
+                </pic:pic>
+              </a:graphicData>
+            </a:graphic>
+            <wp14:sizeRelH relativeFrom="page">
+              <wp14:pctWidth>0</wp14:pctWidth>
+            </wp14:sizeRelH>
+            <wp14:sizeRelV relativeFrom="page">
+              <wp14:pctHeight>0</wp14:pctHeight>
+            </wp14:sizeRelV>
+          </wp:anchor>
+        </w:drawing>
+      </w:r>
+      <w:r>
+        <w:rPr>
+          <w:b/>
+          <w:bCs/>
+          <w:lang w:val="en-US"/>
+        </w:rPr>
+        <w:t>1 + 2 + 3:</w:t>
+      </w:r>
+    </w:p>
+    <w:p>
+      <w:pPr>
+        <w:rPr>
+          <w:b/>
+          <w:bCs/>
+          <w:lang w:val="en-US"/>
+        </w:rPr>
+      </w:pPr>
+    </w:p>
+    <w:p>
+      <w:pPr>
+        <w:rPr>
+          <w:b/>
+          <w:bCs/>
+          <w:lang w:val="en-US"/>
+        </w:rPr>
+      </w:pPr>
+    </w:p>
+    <w:p>
+      <w:pPr>
+        <w:rPr>
+          <w:b/>
+          <w:bCs/>
+          <w:lang w:val="en-US"/>
+        </w:rPr>
+      </w:pPr>
+    </w:p>
+    <w:p>
+      <w:pPr>
+        <w:rPr>
+          <w:b/>
+          <w:bCs/>
+          <w:lang w:val="en-US"/>
+        </w:rPr>
+      </w:pPr>
+    </w:p>
+    <w:p>
+      <w:pPr>
+        <w:rPr>
+          <w:b/>
+          <w:bCs/>
+          <w:lang w:val="en-US"/>
+        </w:rPr>
+      </w:pPr>
+    </w:p>
+    <w:p>
+      <w:pPr>
+        <w:rPr>
+          <w:b/>
+          <w:bCs/>
+          <w:lang w:val="en-US"/>
+        </w:rPr>
+      </w:pPr>
+      <w:r>
+        <w:rPr>
+          <w:b/>
+          <w:bCs/>
+          <w:lang w:val="en-US"/>
+        </w:rPr>
+        <w:t>4 + 5:</w:t>
+      </w:r>
+      <w:r>
+        <w:rPr>
+          <w:b/>
+          <w:bCs/>
+          <w:lang w:val="en-US"/>
+        </w:rPr>
+        <w:tab/>
+      </w:r>
+      <w:r>
+        <w:rPr>
+          <w:b/>
+          <w:bCs/>
+          <w:lang w:val="en-US"/>
+        </w:rPr>
+        <w:tab/>
+      </w:r>
+      <w:r>
+        <w:rPr>
+          <w:b/>
+          <w:bCs/>
+          <w:lang w:val="en-US"/>
+        </w:rPr>
+        <w:tab/>
+      </w:r>
+      <w:r>
+        <w:rPr>
+          <w:b/>
+          <w:bCs/>
+          <w:lang w:val="en-US"/>
+        </w:rPr>
+        <w:tab/>
+      </w:r>
+      <w:r>
+        <w:rPr>
+          <w:b/>
+          <w:bCs/>
+          <w:lang w:val="en-US"/>
+        </w:rPr>
+        <w:tab/>
+      </w:r>
+      <w:r>
+        <w:rPr>
+          <w:b/>
+          <w:bCs/>
+          <w:lang w:val="en-US"/>
+        </w:rPr>
+        <w:tab/>
+      </w:r>
+      <w:r>
+        <w:rPr>
+          <w:b/>
+          <w:bCs/>
+          <w:lang w:val="en-US"/>
+        </w:rPr>
+        <w:tab/>
+      </w:r>
+      <w:r>
+        <w:rPr>
+          <w:b/>
+          <w:bCs/>
+          <w:lang w:val="en-US"/>
+        </w:rPr>
+        <w:tab/>
+      </w:r>
+      <w:r>
+        <w:rPr>
+          <w:b/>
+          <w:bCs/>
+          <w:lang w:val="en-US"/>
+        </w:rPr>
+        <w:tab/>
+      </w:r>
+    </w:p>
+    <w:p>
+      <w:pPr>
+        <w:rPr>
+          <w:b/>
+          <w:bCs/>
+          <w:lang w:val="en-US"/>
+        </w:rPr>
+      </w:pPr>
+      <w:r>
+        <w:rPr>
+          <w:b/>
+          <w:bCs/>
+          <w:lang w:val="en-US"/>
+        </w:rPr>
+        <w:drawing>
+          <wp:anchor distT="0" distB="0" distL="114300" distR="114300" simplePos="0" relativeHeight="251685888" behindDoc="0" locked="0" layoutInCell="1" allowOverlap="1" wp14:anchorId="5C96374C" wp14:editId="23B91F26">
+            <wp:simplePos x="0" y="0"/>
+            <wp:positionH relativeFrom="margin">
+              <wp:align>left</wp:align>
+            </wp:positionH>
+            <wp:positionV relativeFrom="paragraph">
+              <wp:posOffset>200596</wp:posOffset>
+            </wp:positionV>
+            <wp:extent cx="1684020" cy="3855720"/>
+            <wp:effectExtent l="0" t="0" r="0" b="0"/>
+            <wp:wrapSquare wrapText="bothSides"/>
+            <wp:docPr id="65222408" name="Picture 1" descr="A screenshot of a phone&#10;&#10;AI-generated content may be incorrect."/>
+            <wp:cNvGraphicFramePr>
+              <a:graphicFrameLocks xmlns:a="http://schemas.openxmlformats.org/drawingml/2006/main" noChangeAspect="1"/>
+            </wp:cNvGraphicFramePr>
+            <a:graphic xmlns:a="http://schemas.openxmlformats.org/drawingml/2006/main">
+              <a:graphicData uri="http://schemas.openxmlformats.org/drawingml/2006/picture">
+                <pic:pic xmlns:pic="http://schemas.openxmlformats.org/drawingml/2006/picture">
+                  <pic:nvPicPr>
+                    <pic:cNvPr id="65222408" name="Picture 1" descr="A screenshot of a phone&#10;&#10;AI-generated content may be incorrect."/>
+                    <pic:cNvPicPr/>
+                  </pic:nvPicPr>
+                  <pic:blipFill>
+                    <a:blip r:embed="rId64" cstate="print">
+                      <a:extLst>
+                        <a:ext uri="{28A0092B-C50C-407E-A947-70E740481C1C}">
+                          <a14:useLocalDpi xmlns:a14="http://schemas.microsoft.com/office/drawing/2010/main" val="0"/>
+                        </a:ext>
+                      </a:extLst>
+                    </a:blip>
+                    <a:stretch>
+                      <a:fillRect/>
+                    </a:stretch>
+                  </pic:blipFill>
+                  <pic:spPr>
+                    <a:xfrm>
+                      <a:off x="0" y="0"/>
+                      <a:ext cx="1684020" cy="3855720"/>
+                    </a:xfrm>
+                    <a:prstGeom prst="rect">
+                      <a:avLst/>
+                    </a:prstGeom>
+                  </pic:spPr>
+                </pic:pic>
+              </a:graphicData>
+            </a:graphic>
+            <wp14:sizeRelH relativeFrom="margin">
+              <wp14:pctWidth>0</wp14:pctWidth>
+            </wp14:sizeRelH>
+            <wp14:sizeRelV relativeFrom="margin">
+              <wp14:pctHeight>0</wp14:pctHeight>
+            </wp14:sizeRelV>
+          </wp:anchor>
+        </w:drawing>
+      </w:r>
+      <w:r>
+        <w:rPr>
+          <w:b/>
+          <w:bCs/>
+          <w:lang w:val="en-US"/>
+        </w:rPr>
+        <w:t>(No Errors on page load this time!)</w:t>
+      </w:r>
+    </w:p>
+    <w:p>
+      <w:pPr>
+        <w:rPr>
+          <w:b/>
+          <w:bCs/>
+          <w:lang w:val="en-US"/>
+        </w:rPr>
+      </w:pPr>
+      <w:r>
+        <w:rPr>
+          <w:b/>
+          <w:bCs/>
+          <w:lang w:val="en-US"/>
+        </w:rPr>
+        <w:br w:type="page"/>
+      </w:r>
+    </w:p>
+    <w:p>
+      <w:pPr>
+        <w:rPr>
+          <w:b/>
+          <w:bCs/>
+          <w:lang w:val="en-US"/>
+        </w:rPr>
+      </w:pPr>
+      <w:r>
+        <w:rPr>
+          <w:b/>
+          <w:bCs/>
+          <w:lang w:val="en-US"/>
+        </w:rPr>
+        <w:lastRenderedPageBreak/>
+        <w:t>6:</w:t>
+      </w:r>
+    </w:p>
+    <w:p>
+      <w:pPr>
+        <w:rPr>
+          <w:b/>
+          <w:bCs/>
+          <w:lang w:val="en-US"/>
+        </w:rPr>
+      </w:pPr>
+      <w:r>
+        <w:rPr>
+          <w:b/>
+          <w:bCs/>
+          <w:color w:val="00B050"/>
+          <w:lang w:val="en-US"/>
+        </w:rPr>
+        <w:drawing>
+          <wp:anchor distT="0" distB="0" distL="114300" distR="114300" simplePos="0" relativeHeight="251687936" behindDoc="0" locked="0" layoutInCell="1" allowOverlap="1" wp14:anchorId="08B7E99E" wp14:editId="41FE2CEF">
+            <wp:simplePos x="0" y="0"/>
+            <wp:positionH relativeFrom="page">
+              <wp:posOffset>2529069</wp:posOffset>
+            </wp:positionH>
+            <wp:positionV relativeFrom="paragraph">
+              <wp:posOffset>437844</wp:posOffset>
+            </wp:positionV>
+            <wp:extent cx="4236085" cy="2083435"/>
+            <wp:effectExtent l="0" t="0" r="0" b="0"/>
+            <wp:wrapSquare wrapText="bothSides"/>
+            <wp:docPr id="2073639463" name="Picture 1" descr="A screenshot of a computer&#10;&#10;AI-generated content may be incorrect."/>
+            <wp:cNvGraphicFramePr>
+              <a:graphicFrameLocks xmlns:a="http://schemas.openxmlformats.org/drawingml/2006/main" noChangeAspect="1"/>
+            </wp:cNvGraphicFramePr>
+            <a:graphic xmlns:a="http://schemas.openxmlformats.org/drawingml/2006/main">
+              <a:graphicData uri="http://schemas.openxmlformats.org/drawingml/2006/picture">
+                <pic:pic xmlns:pic="http://schemas.openxmlformats.org/drawingml/2006/picture">
+                  <pic:nvPicPr>
+                    <pic:cNvPr id="2073639463" name="Picture 1" descr="A screenshot of a computer&#10;&#10;AI-generated content may be incorrect."/>
+                    <pic:cNvPicPr/>
+                  </pic:nvPicPr>
+                  <pic:blipFill>
+                    <a:blip r:embed="rId65">
+                      <a:extLst>
+                        <a:ext uri="{28A0092B-C50C-407E-A947-70E740481C1C}">
+                          <a14:useLocalDpi xmlns:a14="http://schemas.microsoft.com/office/drawing/2010/main" val="0"/>
+                        </a:ext>
+                      </a:extLst>
+                    </a:blip>
+                    <a:stretch>
+                      <a:fillRect/>
+                    </a:stretch>
+                  </pic:blipFill>
+                  <pic:spPr>
+                    <a:xfrm>
+                      <a:off x="0" y="0"/>
+                      <a:ext cx="4236085" cy="2083435"/>
+                    </a:xfrm>
+                    <a:prstGeom prst="rect">
+                      <a:avLst/>
+                    </a:prstGeom>
+                  </pic:spPr>
+                </pic:pic>
+              </a:graphicData>
+            </a:graphic>
+            <wp14:sizeRelH relativeFrom="page">
+              <wp14:pctWidth>0</wp14:pctWidth>
+            </wp14:sizeRelH>
+            <wp14:sizeRelV relativeFrom="page">
+              <wp14:pctHeight>0</wp14:pctHeight>
+            </wp14:sizeRelV>
+          </wp:anchor>
+        </w:drawing>
+      </w:r>
+      <w:r>
+        <w:rPr>
+          <w:b/>
+          <w:bCs/>
+          <w:color w:val="00B050"/>
+          <w:lang w:val="en-US"/>
+        </w:rPr>
+        <w:drawing>
+          <wp:anchor distT="0" distB="0" distL="114300" distR="114300" simplePos="0" relativeHeight="251686912" behindDoc="0" locked="0" layoutInCell="1" allowOverlap="1" wp14:anchorId="0B985CC5" wp14:editId="00D5C37C">
+            <wp:simplePos x="0" y="0"/>
+            <wp:positionH relativeFrom="margin">
+              <wp:align>left</wp:align>
+            </wp:positionH>
+            <wp:positionV relativeFrom="paragraph">
+              <wp:posOffset>8698</wp:posOffset>
+            </wp:positionV>
+            <wp:extent cx="1452245" cy="3294380"/>
+            <wp:effectExtent l="0" t="0" r="0" b="1270"/>
+            <wp:wrapSquare wrapText="bothSides"/>
+            <wp:docPr id="1867291425" name="Picture 1" descr="A screenshot of a phone&#10;&#10;AI-generated content may be incorrect."/>
+            <wp:cNvGraphicFramePr>
+              <a:graphicFrameLocks xmlns:a="http://schemas.openxmlformats.org/drawingml/2006/main" noChangeAspect="1"/>
+            </wp:cNvGraphicFramePr>
+            <a:graphic xmlns:a="http://schemas.openxmlformats.org/drawingml/2006/main">
+              <a:graphicData uri="http://schemas.openxmlformats.org/drawingml/2006/picture">
+                <pic:pic xmlns:pic="http://schemas.openxmlformats.org/drawingml/2006/picture">
+                  <pic:nvPicPr>
+                    <pic:cNvPr id="1867291425" name="Picture 1" descr="A screenshot of a phone&#10;&#10;AI-generated content may be incorrect."/>
+                    <pic:cNvPicPr/>
+                  </pic:nvPicPr>
+                  <pic:blipFill>
+                    <a:blip r:embed="rId66" cstate="print">
+                      <a:extLst>
+                        <a:ext uri="{28A0092B-C50C-407E-A947-70E740481C1C}">
+                          <a14:useLocalDpi xmlns:a14="http://schemas.microsoft.com/office/drawing/2010/main" val="0"/>
+                        </a:ext>
+                      </a:extLst>
+                    </a:blip>
+                    <a:stretch>
+                      <a:fillRect/>
+                    </a:stretch>
+                  </pic:blipFill>
+                  <pic:spPr>
+                    <a:xfrm>
+                      <a:off x="0" y="0"/>
+                      <a:ext cx="1452245" cy="3294380"/>
+                    </a:xfrm>
+                    <a:prstGeom prst="rect">
+                      <a:avLst/>
+                    </a:prstGeom>
+                  </pic:spPr>
+                </pic:pic>
+              </a:graphicData>
+            </a:graphic>
+            <wp14:sizeRelH relativeFrom="page">
+              <wp14:pctWidth>0</wp14:pctWidth>
+            </wp14:sizeRelH>
+            <wp14:sizeRelV relativeFrom="page">
+              <wp14:pctHeight>0</wp14:pctHeight>
+            </wp14:sizeRelV>
+          </wp:anchor>
+        </w:drawing>
+      </w:r>
+      <w:r>
+        <w:rPr>
+          <w:b/>
+          <w:bCs/>
+          <w:color w:val="00B050"/>
+          <w:lang w:val="en-US"/>
+        </w:rPr>
+        <w:t>Friend Request sent and request was added correctly to friendRequests collection!!</w:t>
+      </w:r>
+      <w:r>
+        <w:rPr>
+          <w:b/>
+          <w:bCs/>
+          <w:lang w:val="en-US"/>
+        </w:rPr>
+        <w:br w:type="textWrapping" w:clear="all"/>
+      </w:r>
+    </w:p>
+    <w:p>
+      <w:pPr>
+        <w:rPr>
+          <w:b/>
+          <w:bCs/>
+          <w:lang w:val="en-US"/>
+        </w:rPr>
+      </w:pPr>
+    </w:p>
+    <w:p>
+      <w:pPr>
+        <w:rPr>
+          <w:b/>
+          <w:bCs/>
+          <w:lang w:val="en-US"/>
+        </w:rPr>
+      </w:pPr>
+      <w:r>
+        <w:rPr>
+          <w:b/>
+          <w:bCs/>
+          <w:lang w:val="en-US"/>
+        </w:rPr>
+        <w:t>7 + 8:</w:t>
+      </w:r>
+    </w:p>
+    <w:p>
+      <w:pPr>
+        <w:rPr>
+          <w:b/>
+          <w:bCs/>
+          <w:color w:val="EE0000"/>
+          <w:lang w:val="en-US"/>
+        </w:rPr>
+      </w:pPr>
+      <w:r>
+        <w:rPr>
+          <w:b/>
+          <w:bCs/>
+          <w:color w:val="EE0000"/>
+          <w:lang w:val="en-US"/>
+        </w:rPr>
+        <w:t>(Need to add button to redirect to dashboard from Friends, had to click Login tab at bottom instead)</w:t>
+      </w:r>
+    </w:p>
+    <w:p>
+      <w:pPr>
+        <w:rPr>
+          <w:b/>
+          <w:bCs/>
+          <w:lang w:val="en-US"/>
+        </w:rPr>
+      </w:pPr>
+      <w:r>
+        <w:rPr>
+          <w:b/>
+          <w:bCs/>
+          <w:lang w:val="en-US"/>
+        </w:rPr>
+        <w:drawing>
+          <wp:anchor distT="0" distB="0" distL="114300" distR="114300" simplePos="0" relativeHeight="251688960" behindDoc="0" locked="0" layoutInCell="1" allowOverlap="1" wp14:anchorId="60D49544" wp14:editId="08FE5028">
+            <wp:simplePos x="0" y="0"/>
+            <wp:positionH relativeFrom="margin">
+              <wp:align>left</wp:align>
+            </wp:positionH>
+            <wp:positionV relativeFrom="paragraph">
+              <wp:posOffset>-3175</wp:posOffset>
+            </wp:positionV>
+            <wp:extent cx="2204720" cy="1137920"/>
+            <wp:effectExtent l="0" t="0" r="5080" b="5080"/>
+            <wp:wrapSquare wrapText="bothSides"/>
+            <wp:docPr id="1120700351" name="Picture 1" descr="A blue and black sign with black text&#10;&#10;AI-generated content may be incorrect."/>
+            <wp:cNvGraphicFramePr>
+              <a:graphicFrameLocks xmlns:a="http://schemas.openxmlformats.org/drawingml/2006/main" noChangeAspect="1"/>
+            </wp:cNvGraphicFramePr>
+            <a:graphic xmlns:a="http://schemas.openxmlformats.org/drawingml/2006/main">
+              <a:graphicData uri="http://schemas.openxmlformats.org/drawingml/2006/picture">
+                <pic:pic xmlns:pic="http://schemas.openxmlformats.org/drawingml/2006/picture">
+                  <pic:nvPicPr>
+                    <pic:cNvPr id="1120700351" name="Picture 1" descr="A blue and black sign with black text&#10;&#10;AI-generated content may be incorrect."/>
+                    <pic:cNvPicPr/>
+                  </pic:nvPicPr>
+                  <pic:blipFill>
+                    <a:blip r:embed="rId67">
+                      <a:extLst>
+                        <a:ext uri="{28A0092B-C50C-407E-A947-70E740481C1C}">
+                          <a14:useLocalDpi xmlns:a14="http://schemas.microsoft.com/office/drawing/2010/main" val="0"/>
+                        </a:ext>
+                      </a:extLst>
+                    </a:blip>
+                    <a:stretch>
+                      <a:fillRect/>
+                    </a:stretch>
+                  </pic:blipFill>
+                  <pic:spPr>
+                    <a:xfrm>
+                      <a:off x="0" y="0"/>
+                      <a:ext cx="2204720" cy="1137920"/>
+                    </a:xfrm>
+                    <a:prstGeom prst="rect">
+                      <a:avLst/>
+                    </a:prstGeom>
+                  </pic:spPr>
+                </pic:pic>
+              </a:graphicData>
+            </a:graphic>
+            <wp14:sizeRelH relativeFrom="page">
+              <wp14:pctWidth>0</wp14:pctWidth>
+            </wp14:sizeRelH>
+            <wp14:sizeRelV relativeFrom="page">
+              <wp14:pctHeight>0</wp14:pctHeight>
+            </wp14:sizeRelV>
+          </wp:anchor>
+        </w:drawing>
+      </w:r>
+    </w:p>
+    <w:p>
+      <w:pPr>
+        <w:rPr>
+          <w:b/>
+          <w:bCs/>
+          <w:lang w:val="en-US"/>
+        </w:rPr>
+      </w:pPr>
+    </w:p>
+    <w:p>
+      <w:pPr>
+        <w:rPr>
+          <w:b/>
+          <w:bCs/>
+          <w:lang w:val="en-US"/>
+        </w:rPr>
+      </w:pPr>
+    </w:p>
+    <w:p>
+      <w:pPr>
+        <w:rPr>
+          <w:b/>
+          <w:bCs/>
+          <w:lang w:val="en-US"/>
+        </w:rPr>
+      </w:pPr>
+    </w:p>
+    <w:p>
+      <w:pPr>
+        <w:rPr>
+          <w:b/>
+          <w:bCs/>
+          <w:lang w:val="en-US"/>
+        </w:rPr>
+      </w:pPr>
+      <w:r>
+        <w:rPr>
+          <w:b/>
+          <w:bCs/>
+          <w:lang w:val="en-US"/>
+        </w:rPr>
+        <w:drawing>
+          <wp:anchor distT="0" distB="0" distL="114300" distR="114300" simplePos="0" relativeHeight="251689984" behindDoc="0" locked="0" layoutInCell="1" allowOverlap="1" wp14:anchorId="6595266A" wp14:editId="6309552C">
+            <wp:simplePos x="0" y="0"/>
+            <wp:positionH relativeFrom="margin">
+              <wp:posOffset>2957195</wp:posOffset>
+            </wp:positionH>
+            <wp:positionV relativeFrom="paragraph">
+              <wp:posOffset>229870</wp:posOffset>
+            </wp:positionV>
+            <wp:extent cx="2645410" cy="2567940"/>
+            <wp:effectExtent l="0" t="0" r="2540" b="3810"/>
+            <wp:wrapSquare wrapText="bothSides"/>
+            <wp:docPr id="559473472" name="Picture 1" descr="A screenshot of a phone&#10;&#10;AI-generated content may be incorrect."/>
+            <wp:cNvGraphicFramePr>
+              <a:graphicFrameLocks xmlns:a="http://schemas.openxmlformats.org/drawingml/2006/main" noChangeAspect="1"/>
+            </wp:cNvGraphicFramePr>
+            <a:graphic xmlns:a="http://schemas.openxmlformats.org/drawingml/2006/main">
+              <a:graphicData uri="http://schemas.openxmlformats.org/drawingml/2006/picture">
+                <pic:pic xmlns:pic="http://schemas.openxmlformats.org/drawingml/2006/picture">
+                  <pic:nvPicPr>
+                    <pic:cNvPr id="559473472" name="Picture 1" descr="A screenshot of a phone&#10;&#10;AI-generated content may be incorrect."/>
+                    <pic:cNvPicPr/>
+                  </pic:nvPicPr>
+                  <pic:blipFill>
+                    <a:blip r:embed="rId68">
+                      <a:extLst>
+                        <a:ext uri="{28A0092B-C50C-407E-A947-70E740481C1C}">
+                          <a14:useLocalDpi xmlns:a14="http://schemas.microsoft.com/office/drawing/2010/main" val="0"/>
+                        </a:ext>
+                      </a:extLst>
+                    </a:blip>
+                    <a:stretch>
+                      <a:fillRect/>
+                    </a:stretch>
+                  </pic:blipFill>
+                  <pic:spPr>
+                    <a:xfrm>
+                      <a:off x="0" y="0"/>
+                      <a:ext cx="2645410" cy="2567940"/>
+                    </a:xfrm>
+                    <a:prstGeom prst="rect">
+                      <a:avLst/>
+                    </a:prstGeom>
+                  </pic:spPr>
+                </pic:pic>
+              </a:graphicData>
+            </a:graphic>
+            <wp14:sizeRelH relativeFrom="page">
+              <wp14:pctWidth>0</wp14:pctWidth>
+            </wp14:sizeRelH>
+            <wp14:sizeRelV relativeFrom="page">
+              <wp14:pctHeight>0</wp14:pctHeight>
+            </wp14:sizeRelV>
+          </wp:anchor>
+        </w:drawing>
+      </w:r>
+    </w:p>
+    <w:p>
+      <w:pPr>
+        <w:rPr>
+          <w:b/>
+          <w:bCs/>
+          <w:lang w:val="en-US"/>
+        </w:rPr>
+      </w:pPr>
+      <w:r>
+        <w:rPr>
+          <w:b/>
+          <w:bCs/>
+          <w:lang w:val="en-US"/>
+        </w:rPr>
+        <w:t>9 + 10:</w:t>
+      </w:r>
+    </w:p>
+    <w:p>
+      <w:pPr>
+        <w:rPr>
+          <w:b/>
+          <w:bCs/>
+          <w:color w:val="EE0000"/>
+          <w:lang w:val="en-US"/>
+        </w:rPr>
+      </w:pPr>
+      <w:r>
+        <w:rPr>
+          <w:b/>
+          <w:bCs/>
+          <w:color w:val="00B050"/>
+          <w:lang w:val="en-US"/>
+        </w:rPr>
+        <w:t xml:space="preserve">Partially works!! </w:t>
+      </w:r>
+      <w:r>
+        <w:rPr>
+          <w:b/>
+          <w:bCs/>
+          <w:lang w:val="en-US"/>
+        </w:rPr>
+        <w:br/>
+      </w:r>
+      <w:r>
+        <w:rPr>
+          <w:b/>
+          <w:bCs/>
+          <w:color w:val="EE0000"/>
+          <w:lang w:val="en-US"/>
+        </w:rPr>
+        <w:t>“Send At” needs to not only be corrected to “Sent At” but the time is displaying extremely incorrectly!</w:t>
+      </w:r>
+    </w:p>
+    <w:p>
+      <w:pPr>
+        <w:rPr>
+          <w:b/>
+          <w:bCs/>
+          <w:lang w:val="en-US"/>
+        </w:rPr>
+      </w:pPr>
+      <w:r>
+        <w:rPr>
+          <w:b/>
+          <w:bCs/>
+          <w:lang w:val="en-US"/>
+        </w:rPr>
+        <w:br w:type="page"/>
+      </w:r>
+    </w:p>
+    <w:p>
+      <w:pPr>
+        <w:rPr>
+          <w:b/>
+          <w:bCs/>
+          <w:lang w:val="en-US"/>
+        </w:rPr>
+      </w:pPr>
+      <w:r>
+        <w:rPr>
+          <w:b/>
+          <w:bCs/>
+          <w:color w:val="EE0000"/>
+          <w:lang w:val="en-US"/>
+        </w:rPr>
+        <w:lastRenderedPageBreak/>
+        <w:drawing>
+          <wp:anchor distT="0" distB="0" distL="114300" distR="114300" simplePos="0" relativeHeight="251691008" behindDoc="0" locked="0" layoutInCell="1" allowOverlap="1" wp14:anchorId="386BB861" wp14:editId="3A5C361F">
+            <wp:simplePos x="0" y="0"/>
+            <wp:positionH relativeFrom="margin">
+              <wp:posOffset>3860125</wp:posOffset>
+            </wp:positionH>
+            <wp:positionV relativeFrom="paragraph">
+              <wp:posOffset>265</wp:posOffset>
+            </wp:positionV>
+            <wp:extent cx="1654810" cy="3836670"/>
+            <wp:effectExtent l="0" t="0" r="2540" b="0"/>
+            <wp:wrapSquare wrapText="bothSides"/>
+            <wp:docPr id="1176979517" name="Picture 1" descr="A screenshot of a phone&#10;&#10;AI-generated content may be incorrect."/>
+            <wp:cNvGraphicFramePr>
+              <a:graphicFrameLocks xmlns:a="http://schemas.openxmlformats.org/drawingml/2006/main" noChangeAspect="1"/>
+            </wp:cNvGraphicFramePr>
+            <a:graphic xmlns:a="http://schemas.openxmlformats.org/drawingml/2006/main">
+              <a:graphicData uri="http://schemas.openxmlformats.org/drawingml/2006/picture">
+                <pic:pic xmlns:pic="http://schemas.openxmlformats.org/drawingml/2006/picture">
+                  <pic:nvPicPr>
+                    <pic:cNvPr id="1176979517" name="Picture 1" descr="A screenshot of a phone&#10;&#10;AI-generated content may be incorrect."/>
+                    <pic:cNvPicPr/>
+                  </pic:nvPicPr>
+                  <pic:blipFill>
+                    <a:blip r:embed="rId69" cstate="print">
+                      <a:extLst>
+                        <a:ext uri="{28A0092B-C50C-407E-A947-70E740481C1C}">
+                          <a14:useLocalDpi xmlns:a14="http://schemas.microsoft.com/office/drawing/2010/main" val="0"/>
+                        </a:ext>
+                      </a:extLst>
+                    </a:blip>
+                    <a:stretch>
+                      <a:fillRect/>
+                    </a:stretch>
+                  </pic:blipFill>
+                  <pic:spPr>
+                    <a:xfrm>
+                      <a:off x="0" y="0"/>
+                      <a:ext cx="1654810" cy="3836670"/>
+                    </a:xfrm>
+                    <a:prstGeom prst="rect">
+                      <a:avLst/>
+                    </a:prstGeom>
+                  </pic:spPr>
+                </pic:pic>
+              </a:graphicData>
+            </a:graphic>
+            <wp14:sizeRelH relativeFrom="page">
+              <wp14:pctWidth>0</wp14:pctWidth>
+            </wp14:sizeRelH>
+            <wp14:sizeRelV relativeFrom="page">
+              <wp14:pctHeight>0</wp14:pctHeight>
+            </wp14:sizeRelV>
+          </wp:anchor>
+        </w:drawing>
+      </w:r>
+      <w:r>
+        <w:rPr>
+          <w:b/>
+          <w:bCs/>
+          <w:lang w:val="en-US"/>
+        </w:rPr>
+        <w:t>Added placeholder “Back to dashboard” button from Friends tab and changed styling slightly.</w:t>
+      </w:r>
+    </w:p>
+    <w:p>
+      <w:pPr>
+        <w:pStyle w:val="ListParagraph"/>
+        <w:numPr>
+          <w:ilvl w:val="0"/>
+          <w:numId w:val="1"/>
+        </w:numPr>
+        <w:rPr>
+          <w:b/>
+          <w:bCs/>
+          <w:color w:val="EE0000"/>
+          <w:lang w:val="en-US"/>
+        </w:rPr>
+      </w:pPr>
+      <w:r>
+        <w:rPr>
+          <w:b/>
+          <w:bCs/>
+          <w:color w:val="EE0000"/>
+          <w:lang w:val="en-US"/>
+        </w:rPr>
+        <w:t>Should eventually make it so that Dashboard and Friends tabs only show when logged in and disappear when user logs out, will reduce the need for lots of navigation buttons if tabs are at the bottom of the screen.</w:t>
+      </w:r>
+      <w:r>
+        <w:rPr>
+          <w:noProof/>
+        </w:rPr>
+        <w:t xml:space="preserve"> </w:t>
+      </w:r>
+    </w:p>
+    <w:p>
+      <w:pPr>
+        <w:rPr>
+          <w:b/>
+          <w:bCs/>
+          <w:color w:val="EE0000"/>
+          <w:lang w:val="en-US"/>
+        </w:rPr>
+      </w:pPr>
+    </w:p>
+    <w:p>
+      <w:pPr>
+        <w:rPr>
+          <w:b/>
+          <w:bCs/>
+          <w:color w:val="EE0000"/>
+          <w:lang w:val="en-US"/>
+        </w:rPr>
+      </w:pPr>
+    </w:p>
+    <w:p>
+      <w:pPr>
+        <w:rPr>
+          <w:b/>
+          <w:bCs/>
+          <w:color w:val="EE0000"/>
+          <w:lang w:val="en-US"/>
+        </w:rPr>
+      </w:pPr>
+    </w:p>
+    <w:p>
+      <w:pPr>
+        <w:rPr>
+          <w:b/>
+          <w:bCs/>
+          <w:color w:val="EE0000"/>
+          <w:lang w:val="en-US"/>
+        </w:rPr>
+      </w:pPr>
+    </w:p>
+    <w:p>
+      <w:pPr>
+        <w:rPr>
+          <w:b/>
+          <w:bCs/>
+          <w:color w:val="EE0000"/>
+          <w:lang w:val="en-US"/>
+        </w:rPr>
+      </w:pPr>
+    </w:p>
+    <w:p>
+      <w:pPr>
+        <w:rPr>
+          <w:b/>
+          <w:bCs/>
+          <w:color w:val="EE0000"/>
+          <w:lang w:val="en-US"/>
+        </w:rPr>
+      </w:pPr>
+    </w:p>
+    <w:p>
+      <w:pPr>
+        <w:rPr>
+          <w:b/>
+          <w:bCs/>
+          <w:color w:val="EE0000"/>
+          <w:lang w:val="en-US"/>
+        </w:rPr>
+      </w:pPr>
+    </w:p>
+    <w:p>
+      <w:pPr>
+        <w:rPr>
+          <w:b/>
+          <w:bCs/>
+          <w:color w:val="EE0000"/>
+          <w:lang w:val="en-US"/>
+        </w:rPr>
+      </w:pPr>
+    </w:p>
+    <w:p>
+      <w:pPr>
+        <w:rPr>
+          <w:b/>
+          <w:bCs/>
+          <w:color w:val="EE0000"/>
+          <w:lang w:val="en-US"/>
+        </w:rPr>
+      </w:pPr>
+    </w:p>
+    <w:p>
+      <w:pPr>
+        <w:rPr>
+          <w:b/>
+          <w:bCs/>
+          <w:color w:val="EE0000"/>
+          <w:lang w:val="en-US"/>
+        </w:rPr>
+      </w:pPr>
+      <w:r>
+        <w:rPr>
+          <w:b/>
+          <w:bCs/>
+          <w:lang w:val="en-US"/>
+        </w:rPr>
+        <w:t>Fixed “Sent At” time for incoming requests:</w:t>
+      </w:r>
+    </w:p>
+    <w:p>
+      <w:pPr>
+        <w:pStyle w:val="ListParagraph"/>
+        <w:numPr>
+          <w:ilvl w:val="0"/>
+          <w:numId w:val="1"/>
+        </w:numPr>
+        <w:rPr>
+          <w:b/>
+          <w:bCs/>
+          <w:color w:val="EE0000"/>
+          <w:lang w:val="en-US"/>
+        </w:rPr>
+      </w:pPr>
+      <w:r>
+        <w:rPr>
+          <w:b/>
+          <w:bCs/>
+          <w:lang w:val="en-US"/>
+        </w:rPr>
+        <w:drawing>
+          <wp:anchor distT="0" distB="0" distL="114300" distR="114300" simplePos="0" relativeHeight="251692032" behindDoc="0" locked="0" layoutInCell="1" allowOverlap="1" wp14:anchorId="6DC6FC1A" wp14:editId="0CCB3056">
+            <wp:simplePos x="0" y="0"/>
+            <wp:positionH relativeFrom="margin">
+              <wp:posOffset>-521190</wp:posOffset>
+            </wp:positionH>
+            <wp:positionV relativeFrom="paragraph">
+              <wp:posOffset>359401</wp:posOffset>
+            </wp:positionV>
+            <wp:extent cx="6440805" cy="2336165"/>
+            <wp:effectExtent l="0" t="0" r="0" b="6985"/>
+            <wp:wrapSquare wrapText="bothSides"/>
+            <wp:docPr id="1538762072" name="Picture 1" descr="A screen shot of a computer program&#10;&#10;AI-generated content may be incorrect."/>
+            <wp:cNvGraphicFramePr>
+              <a:graphicFrameLocks xmlns:a="http://schemas.openxmlformats.org/drawingml/2006/main" noChangeAspect="1"/>
+            </wp:cNvGraphicFramePr>
+            <a:graphic xmlns:a="http://schemas.openxmlformats.org/drawingml/2006/main">
+              <a:graphicData uri="http://schemas.openxmlformats.org/drawingml/2006/picture">
+                <pic:pic xmlns:pic="http://schemas.openxmlformats.org/drawingml/2006/picture">
+                  <pic:nvPicPr>
+                    <pic:cNvPr id="1538762072" name="Picture 1" descr="A screen shot of a computer program&#10;&#10;AI-generated content may be incorrect."/>
+                    <pic:cNvPicPr/>
+                  </pic:nvPicPr>
+                  <pic:blipFill>
+                    <a:blip r:embed="rId70">
+                      <a:extLst>
+                        <a:ext uri="{28A0092B-C50C-407E-A947-70E740481C1C}">
+                          <a14:useLocalDpi xmlns:a14="http://schemas.microsoft.com/office/drawing/2010/main" val="0"/>
+                        </a:ext>
+                      </a:extLst>
+                    </a:blip>
+                    <a:stretch>
+                      <a:fillRect/>
+                    </a:stretch>
+                  </pic:blipFill>
+                  <pic:spPr>
+                    <a:xfrm>
+                      <a:off x="0" y="0"/>
+                      <a:ext cx="6440805" cy="2336165"/>
+                    </a:xfrm>
+                    <a:prstGeom prst="rect">
+                      <a:avLst/>
+                    </a:prstGeom>
+                  </pic:spPr>
+                </pic:pic>
+              </a:graphicData>
+            </a:graphic>
+            <wp14:sizeRelH relativeFrom="page">
+              <wp14:pctWidth>0</wp14:pctWidth>
+            </wp14:sizeRelH>
+            <wp14:sizeRelV relativeFrom="page">
+              <wp14:pctHeight>0</wp14:pctHeight>
+            </wp14:sizeRelV>
+          </wp:anchor>
+        </w:drawing>
+      </w:r>
+      <w:r>
+        <w:rPr>
+          <w:b/>
+          <w:bCs/>
+          <w:lang w:val="en-US"/>
+        </w:rPr>
+        <w:t xml:space="preserve">(wasn’t </w:t>
+      </w:r>
+      <w:r>
+        <w:rPr>
+          <w:b/>
+          <w:bCs/>
+          <w:lang w:val="en-US"/>
+        </w:rPr>
+        <w:t>converting them to a Date object properly)</w:t>
+      </w:r>
+      <w:r>
+        <w:rPr>
+          <w:b/>
+          <w:bCs/>
+          <w:color w:val="EE0000"/>
+          <w:lang w:val="en-US"/>
+        </w:rPr>
+        <w:br/>
+      </w:r>
+    </w:p>
+    <w:p>
+      <w:pPr>
+        <w:rPr>
+          <w:b/>
+          <w:bCs/>
+          <w:color w:val="EE0000"/>
+          <w:lang w:val="en-US"/>
+        </w:rPr>
+      </w:pPr>
+    </w:p>
+    <w:p>
+      <w:pPr>
+        <w:rPr>
+          <w:b/>
+          <w:bCs/>
+          <w:color w:val="EE0000"/>
+          <w:lang w:val="en-US"/>
+        </w:rPr>
+      </w:pPr>
+    </w:p>
+    <w:p>
+      <w:pPr>
+        <w:rPr>
+          <w:b/>
+          <w:bCs/>
+          <w:color w:val="EE0000"/>
+          <w:lang w:val="en-US"/>
+        </w:rPr>
+      </w:pPr>
+    </w:p>
     <w:sectPr>
       <w:pgSz w:w="11906" w:h="16838"/>
       <w:pgMar w:top="1440" w:right="1440" w:bottom="1440" w:left="1440" w:header="708" w:footer="708" w:gutter="0"/>
@@ -5212,6 +8973,321 @@
 <file path=word/numbering.xml><?xml version="1.0" encoding="utf-8"?>
 <w:numbering xmlns:wpc="http://schemas.microsoft.com/office/word/2010/wordprocessingCanvas" xmlns:cx="http://schemas.microsoft.com/office/drawing/2014/chartex" xmlns:cx1="http://schemas.microsoft.com/office/drawing/2015/9/8/chartex" xmlns:cx2="http://schemas.microsoft.com/office/drawing/2015/10/21/chartex" xmlns:cx3="http://schemas.microsoft.com/office/drawing/2016/5/9/chartex" xmlns:cx4="http://schemas.microsoft.com/office/drawing/2016/5/10/chartex" xmlns:cx5="http://schemas.microsoft.com/office/drawing/2016/5/11/chartex" xmlns:cx6="http://schemas.microsoft.com/office/drawing/2016/5/12/chartex" xmlns:cx7="http://schemas.microsoft.com/office/drawing/2016/5/13/chartex" xmlns:cx8="http://schemas.microsoft.com/office/drawing/2016/5/14/chartex" xmlns:mc="http://schemas.openxmlformats.org/markup-compatibility/2006" xmlns:aink="http://schemas.microsoft.com/office/drawing/2016/ink" xmlns:am3d="http://schemas.microsoft.com/office/drawing/2017/model3d" xmlns:o="urn:schemas-microsoft-com:office:office" xmlns:oel="http://schemas.microsoft.com/office/2019/extlst" xmlns:r="http://schemas.openxmlformats.org/officeDocument/2006/relationships" xmlns:m="http://schemas.openxmlformats.org/officeDocument/2006/math" xmlns:v="urn:schemas-microsoft-com:vml" xmlns:wp14="http://schemas.microsoft.com/office/word/2010/wordprocessingDrawing" xmlns:wp="http://schemas.openxmlformats.org/drawingml/2006/wordprocessingDrawing" xmlns:w10="urn:schemas-microsoft-com:office:word" xmlns:w="http://schemas.openxmlformats.org/wordprocessingml/2006/main" xmlns:w14="http://schemas.microsoft.com/office/word/2010/wordml" xmlns:w15="http://schemas.microsoft.com/office/word/2012/wordml" xmlns:w16cex="http://schemas.microsoft.com/office/word/2018/wordml/cex" xmlns:w16cid="http://schemas.microsoft.com/office/word/2016/wordml/cid" xmlns:w16="http://schemas.microsoft.com/office/word/2018/wordml" xmlns:w16du="http://schemas.microsoft.com/office/word/2023/wordml/word16du" xmlns:w16sdtdh="http://schemas.microsoft.com/office/word/2020/wordml/sdtdatahash" xmlns:w16sdtfl="http://schemas.microsoft.com/office/word/2024/wordml/sdtformatlock" xmlns:w16se="http://schemas.microsoft.com/office/word/2015/wordml/symex" xmlns:wpg="http://schemas.microsoft.com/office/word/2010/wordprocessingGroup" xmlns:wpi="http://schemas.microsoft.com/office/word/2010/wordprocessingInk" xmlns:wne="http://schemas.microsoft.com/office/word/2006/wordml" xmlns:wps="http://schemas.microsoft.com/office/word/2010/wordprocessingShape" mc:Ignorable="w14 w15 w16se w16cid w16 w16cex w16sdtdh w16sdtfl w16du wp14">
   <w:abstractNum w:abstractNumId="0" w15:restartNumberingAfterBreak="0">
+    <w:nsid w:val="1E72380D"/>
+    <w:multiLevelType w:val="hybridMultilevel"/>
+    <w:tmpl w:val="7134468E"/>
+    <w:lvl w:ilvl="0" w:tplc="0809000F">
+      <w:start w:val="1"/>
+      <w:numFmt w:val="decimal"/>
+      <w:lvlText w:val="%1."/>
+      <w:lvlJc w:val="left"/>
+      <w:pPr>
+        <w:ind w:left="720" w:hanging="360"/>
+      </w:pPr>
+      <w:rPr>
+        <w:rFonts w:hint="default"/>
+      </w:rPr>
+    </w:lvl>
+    <w:lvl w:ilvl="1" w:tplc="08090019" w:tentative="1">
+      <w:start w:val="1"/>
+      <w:numFmt w:val="lowerLetter"/>
+      <w:lvlText w:val="%2."/>
+      <w:lvlJc w:val="left"/>
+      <w:pPr>
+        <w:ind w:left="1440" w:hanging="360"/>
+      </w:pPr>
+    </w:lvl>
+    <w:lvl w:ilvl="2" w:tplc="0809001B" w:tentative="1">
+      <w:start w:val="1"/>
+      <w:numFmt w:val="lowerRoman"/>
+      <w:lvlText w:val="%3."/>
+      <w:lvlJc w:val="right"/>
+      <w:pPr>
+        <w:ind w:left="2160" w:hanging="180"/>
+      </w:pPr>
+    </w:lvl>
+    <w:lvl w:ilvl="3" w:tplc="0809000F" w:tentative="1">
+      <w:start w:val="1"/>
+      <w:numFmt w:val="decimal"/>
+      <w:lvlText w:val="%4."/>
+      <w:lvlJc w:val="left"/>
+      <w:pPr>
+        <w:ind w:left="2880" w:hanging="360"/>
+      </w:pPr>
+    </w:lvl>
+    <w:lvl w:ilvl="4" w:tplc="08090019" w:tentative="1">
+      <w:start w:val="1"/>
+      <w:numFmt w:val="lowerLetter"/>
+      <w:lvlText w:val="%5."/>
+      <w:lvlJc w:val="left"/>
+      <w:pPr>
+        <w:ind w:left="3600" w:hanging="360"/>
+      </w:pPr>
+    </w:lvl>
+    <w:lvl w:ilvl="5" w:tplc="0809001B" w:tentative="1">
+      <w:start w:val="1"/>
+      <w:numFmt w:val="lowerRoman"/>
+      <w:lvlText w:val="%6."/>
+      <w:lvlJc w:val="right"/>
+      <w:pPr>
+        <w:ind w:left="4320" w:hanging="180"/>
+      </w:pPr>
+    </w:lvl>
+    <w:lvl w:ilvl="6" w:tplc="0809000F" w:tentative="1">
+      <w:start w:val="1"/>
+      <w:numFmt w:val="decimal"/>
+      <w:lvlText w:val="%7."/>
+      <w:lvlJc w:val="left"/>
+      <w:pPr>
+        <w:ind w:left="5040" w:hanging="360"/>
+      </w:pPr>
+    </w:lvl>
+    <w:lvl w:ilvl="7" w:tplc="08090019" w:tentative="1">
+      <w:start w:val="1"/>
+      <w:numFmt w:val="lowerLetter"/>
+      <w:lvlText w:val="%8."/>
+      <w:lvlJc w:val="left"/>
+      <w:pPr>
+        <w:ind w:left="5760" w:hanging="360"/>
+      </w:pPr>
+    </w:lvl>
+    <w:lvl w:ilvl="8" w:tplc="0809001B" w:tentative="1">
+      <w:start w:val="1"/>
+      <w:numFmt w:val="lowerRoman"/>
+      <w:lvlText w:val="%9."/>
+      <w:lvlJc w:val="right"/>
+      <w:pPr>
+        <w:ind w:left="6480" w:hanging="180"/>
+      </w:pPr>
+    </w:lvl>
+  </w:abstractNum>
+  <w:abstractNum w:abstractNumId="1" w15:restartNumberingAfterBreak="0">
+    <w:nsid w:val="265659D3"/>
+    <w:multiLevelType w:val="hybridMultilevel"/>
+    <w:tmpl w:val="017EBD00"/>
+    <w:lvl w:ilvl="0" w:tplc="FFFFFFFF">
+      <w:start w:val="1"/>
+      <w:numFmt w:val="decimal"/>
+      <w:lvlText w:val="%1."/>
+      <w:lvlJc w:val="left"/>
+      <w:pPr>
+        <w:ind w:left="720" w:hanging="360"/>
+      </w:pPr>
+      <w:rPr>
+        <w:rFonts w:hint="default"/>
+      </w:rPr>
+    </w:lvl>
+    <w:lvl w:ilvl="1" w:tplc="FFFFFFFF" w:tentative="1">
+      <w:start w:val="1"/>
+      <w:numFmt w:val="bullet"/>
+      <w:lvlText w:val="o"/>
+      <w:lvlJc w:val="left"/>
+      <w:pPr>
+        <w:ind w:left="1440" w:hanging="360"/>
+      </w:pPr>
+      <w:rPr>
+        <w:rFonts w:ascii="Courier New" w:hAnsi="Courier New" w:cs="Courier New" w:hint="default"/>
+      </w:rPr>
+    </w:lvl>
+    <w:lvl w:ilvl="2" w:tplc="FFFFFFFF" w:tentative="1">
+      <w:start w:val="1"/>
+      <w:numFmt w:val="bullet"/>
+      <w:lvlText w:val=""/>
+      <w:lvlJc w:val="left"/>
+      <w:pPr>
+        <w:ind w:left="2160" w:hanging="360"/>
+      </w:pPr>
+      <w:rPr>
+        <w:rFonts w:ascii="Wingdings" w:hAnsi="Wingdings" w:hint="default"/>
+      </w:rPr>
+    </w:lvl>
+    <w:lvl w:ilvl="3" w:tplc="FFFFFFFF" w:tentative="1">
+      <w:start w:val="1"/>
+      <w:numFmt w:val="bullet"/>
+      <w:lvlText w:val=""/>
+      <w:lvlJc w:val="left"/>
+      <w:pPr>
+        <w:ind w:left="2880" w:hanging="360"/>
+      </w:pPr>
+      <w:rPr>
+        <w:rFonts w:ascii="Symbol" w:hAnsi="Symbol" w:hint="default"/>
+      </w:rPr>
+    </w:lvl>
+    <w:lvl w:ilvl="4" w:tplc="FFFFFFFF" w:tentative="1">
+      <w:start w:val="1"/>
+      <w:numFmt w:val="bullet"/>
+      <w:lvlText w:val="o"/>
+      <w:lvlJc w:val="left"/>
+      <w:pPr>
+        <w:ind w:left="3600" w:hanging="360"/>
+      </w:pPr>
+      <w:rPr>
+        <w:rFonts w:ascii="Courier New" w:hAnsi="Courier New" w:cs="Courier New" w:hint="default"/>
+      </w:rPr>
+    </w:lvl>
+    <w:lvl w:ilvl="5" w:tplc="FFFFFFFF" w:tentative="1">
+      <w:start w:val="1"/>
+      <w:numFmt w:val="bullet"/>
+      <w:lvlText w:val=""/>
+      <w:lvlJc w:val="left"/>
+      <w:pPr>
+        <w:ind w:left="4320" w:hanging="360"/>
+      </w:pPr>
+      <w:rPr>
+        <w:rFonts w:ascii="Wingdings" w:hAnsi="Wingdings" w:hint="default"/>
+      </w:rPr>
+    </w:lvl>
+    <w:lvl w:ilvl="6" w:tplc="FFFFFFFF" w:tentative="1">
+      <w:start w:val="1"/>
+      <w:numFmt w:val="bullet"/>
+      <w:lvlText w:val=""/>
+      <w:lvlJc w:val="left"/>
+      <w:pPr>
+        <w:ind w:left="5040" w:hanging="360"/>
+      </w:pPr>
+      <w:rPr>
+        <w:rFonts w:ascii="Symbol" w:hAnsi="Symbol" w:hint="default"/>
+      </w:rPr>
+    </w:lvl>
+    <w:lvl w:ilvl="7" w:tplc="FFFFFFFF" w:tentative="1">
+      <w:start w:val="1"/>
+      <w:numFmt w:val="bullet"/>
+      <w:lvlText w:val="o"/>
+      <w:lvlJc w:val="left"/>
+      <w:pPr>
+        <w:ind w:left="5760" w:hanging="360"/>
+      </w:pPr>
+      <w:rPr>
+        <w:rFonts w:ascii="Courier New" w:hAnsi="Courier New" w:cs="Courier New" w:hint="default"/>
+      </w:rPr>
+    </w:lvl>
+    <w:lvl w:ilvl="8" w:tplc="FFFFFFFF" w:tentative="1">
+      <w:start w:val="1"/>
+      <w:numFmt w:val="bullet"/>
+      <w:lvlText w:val=""/>
+      <w:lvlJc w:val="left"/>
+      <w:pPr>
+        <w:ind w:left="6480" w:hanging="360"/>
+      </w:pPr>
+      <w:rPr>
+        <w:rFonts w:ascii="Wingdings" w:hAnsi="Wingdings" w:hint="default"/>
+      </w:rPr>
+    </w:lvl>
+  </w:abstractNum>
+  <w:abstractNum w:abstractNumId="2" w15:restartNumberingAfterBreak="0">
+    <w:nsid w:val="30200716"/>
+    <w:multiLevelType w:val="hybridMultilevel"/>
+    <w:tmpl w:val="017EBD00"/>
+    <w:lvl w:ilvl="0" w:tplc="0809000F">
+      <w:start w:val="1"/>
+      <w:numFmt w:val="decimal"/>
+      <w:lvlText w:val="%1."/>
+      <w:lvlJc w:val="left"/>
+      <w:pPr>
+        <w:ind w:left="720" w:hanging="360"/>
+      </w:pPr>
+      <w:rPr>
+        <w:rFonts w:hint="default"/>
+      </w:rPr>
+    </w:lvl>
+    <w:lvl w:ilvl="1" w:tplc="FFFFFFFF" w:tentative="1">
+      <w:start w:val="1"/>
+      <w:numFmt w:val="bullet"/>
+      <w:lvlText w:val="o"/>
+      <w:lvlJc w:val="left"/>
+      <w:pPr>
+        <w:ind w:left="1440" w:hanging="360"/>
+      </w:pPr>
+      <w:rPr>
+        <w:rFonts w:ascii="Courier New" w:hAnsi="Courier New" w:cs="Courier New" w:hint="default"/>
+      </w:rPr>
+    </w:lvl>
+    <w:lvl w:ilvl="2" w:tplc="FFFFFFFF" w:tentative="1">
+      <w:start w:val="1"/>
+      <w:numFmt w:val="bullet"/>
+      <w:lvlText w:val=""/>
+      <w:lvlJc w:val="left"/>
+      <w:pPr>
+        <w:ind w:left="2160" w:hanging="360"/>
+      </w:pPr>
+      <w:rPr>
+        <w:rFonts w:ascii="Wingdings" w:hAnsi="Wingdings" w:hint="default"/>
+      </w:rPr>
+    </w:lvl>
+    <w:lvl w:ilvl="3" w:tplc="FFFFFFFF" w:tentative="1">
+      <w:start w:val="1"/>
+      <w:numFmt w:val="bullet"/>
+      <w:lvlText w:val=""/>
+      <w:lvlJc w:val="left"/>
+      <w:pPr>
+        <w:ind w:left="2880" w:hanging="360"/>
+      </w:pPr>
+      <w:rPr>
+        <w:rFonts w:ascii="Symbol" w:hAnsi="Symbol" w:hint="default"/>
+      </w:rPr>
+    </w:lvl>
+    <w:lvl w:ilvl="4" w:tplc="FFFFFFFF" w:tentative="1">
+      <w:start w:val="1"/>
+      <w:numFmt w:val="bullet"/>
+      <w:lvlText w:val="o"/>
+      <w:lvlJc w:val="left"/>
+      <w:pPr>
+        <w:ind w:left="3600" w:hanging="360"/>
+      </w:pPr>
+      <w:rPr>
+        <w:rFonts w:ascii="Courier New" w:hAnsi="Courier New" w:cs="Courier New" w:hint="default"/>
+      </w:rPr>
+    </w:lvl>
+    <w:lvl w:ilvl="5" w:tplc="FFFFFFFF" w:tentative="1">
+      <w:start w:val="1"/>
+      <w:numFmt w:val="bullet"/>
+      <w:lvlText w:val=""/>
+      <w:lvlJc w:val="left"/>
+      <w:pPr>
+        <w:ind w:left="4320" w:hanging="360"/>
+      </w:pPr>
+      <w:rPr>
+        <w:rFonts w:ascii="Wingdings" w:hAnsi="Wingdings" w:hint="default"/>
+      </w:rPr>
+    </w:lvl>
+    <w:lvl w:ilvl="6" w:tplc="FFFFFFFF" w:tentative="1">
+      <w:start w:val="1"/>
+      <w:numFmt w:val="bullet"/>
+      <w:lvlText w:val=""/>
+      <w:lvlJc w:val="left"/>
+      <w:pPr>
+        <w:ind w:left="5040" w:hanging="360"/>
+      </w:pPr>
+      <w:rPr>
+        <w:rFonts w:ascii="Symbol" w:hAnsi="Symbol" w:hint="default"/>
+      </w:rPr>
+    </w:lvl>
+    <w:lvl w:ilvl="7" w:tplc="FFFFFFFF" w:tentative="1">
+      <w:start w:val="1"/>
+      <w:numFmt w:val="bullet"/>
+      <w:lvlText w:val="o"/>
+      <w:lvlJc w:val="left"/>
+      <w:pPr>
+        <w:ind w:left="5760" w:hanging="360"/>
+      </w:pPr>
+      <w:rPr>
+        <w:rFonts w:ascii="Courier New" w:hAnsi="Courier New" w:cs="Courier New" w:hint="default"/>
+      </w:rPr>
+    </w:lvl>
+    <w:lvl w:ilvl="8" w:tplc="FFFFFFFF" w:tentative="1">
+      <w:start w:val="1"/>
+      <w:numFmt w:val="bullet"/>
+      <w:lvlText w:val=""/>
+      <w:lvlJc w:val="left"/>
+      <w:pPr>
+        <w:ind w:left="6480" w:hanging="360"/>
+      </w:pPr>
+      <w:rPr>
+        <w:rFonts w:ascii="Wingdings" w:hAnsi="Wingdings" w:hint="default"/>
+      </w:rPr>
+    </w:lvl>
+  </w:abstractNum>
+  <w:abstractNum w:abstractNumId="3" w15:restartNumberingAfterBreak="0">
     <w:nsid w:val="6364308B"/>
     <w:multiLevelType w:val="hybridMultilevel"/>
     <w:tmpl w:val="0E8EB992"/>
@@ -5323,7 +9399,132 @@
       </w:rPr>
     </w:lvl>
   </w:abstractNum>
+  <w:abstractNum w:abstractNumId="4" w15:restartNumberingAfterBreak="0">
+    <w:nsid w:val="6F86462C"/>
+    <w:multiLevelType w:val="hybridMultilevel"/>
+    <w:tmpl w:val="92B2557A"/>
+    <w:lvl w:ilvl="0" w:tplc="08090001">
+      <w:start w:val="1"/>
+      <w:numFmt w:val="bullet"/>
+      <w:lvlText w:val=""/>
+      <w:lvlJc w:val="left"/>
+      <w:pPr>
+        <w:ind w:left="720" w:hanging="360"/>
+      </w:pPr>
+      <w:rPr>
+        <w:rFonts w:ascii="Symbol" w:hAnsi="Symbol" w:hint="default"/>
+      </w:rPr>
+    </w:lvl>
+    <w:lvl w:ilvl="1" w:tplc="08090003" w:tentative="1">
+      <w:start w:val="1"/>
+      <w:numFmt w:val="bullet"/>
+      <w:lvlText w:val="o"/>
+      <w:lvlJc w:val="left"/>
+      <w:pPr>
+        <w:ind w:left="1440" w:hanging="360"/>
+      </w:pPr>
+      <w:rPr>
+        <w:rFonts w:ascii="Courier New" w:hAnsi="Courier New" w:cs="Courier New" w:hint="default"/>
+      </w:rPr>
+    </w:lvl>
+    <w:lvl w:ilvl="2" w:tplc="08090005" w:tentative="1">
+      <w:start w:val="1"/>
+      <w:numFmt w:val="bullet"/>
+      <w:lvlText w:val=""/>
+      <w:lvlJc w:val="left"/>
+      <w:pPr>
+        <w:ind w:left="2160" w:hanging="360"/>
+      </w:pPr>
+      <w:rPr>
+        <w:rFonts w:ascii="Wingdings" w:hAnsi="Wingdings" w:hint="default"/>
+      </w:rPr>
+    </w:lvl>
+    <w:lvl w:ilvl="3" w:tplc="08090001" w:tentative="1">
+      <w:start w:val="1"/>
+      <w:numFmt w:val="bullet"/>
+      <w:lvlText w:val=""/>
+      <w:lvlJc w:val="left"/>
+      <w:pPr>
+        <w:ind w:left="2880" w:hanging="360"/>
+      </w:pPr>
+      <w:rPr>
+        <w:rFonts w:ascii="Symbol" w:hAnsi="Symbol" w:hint="default"/>
+      </w:rPr>
+    </w:lvl>
+    <w:lvl w:ilvl="4" w:tplc="08090003" w:tentative="1">
+      <w:start w:val="1"/>
+      <w:numFmt w:val="bullet"/>
+      <w:lvlText w:val="o"/>
+      <w:lvlJc w:val="left"/>
+      <w:pPr>
+        <w:ind w:left="3600" w:hanging="360"/>
+      </w:pPr>
+      <w:rPr>
+        <w:rFonts w:ascii="Courier New" w:hAnsi="Courier New" w:cs="Courier New" w:hint="default"/>
+      </w:rPr>
+    </w:lvl>
+    <w:lvl w:ilvl="5" w:tplc="08090005" w:tentative="1">
+      <w:start w:val="1"/>
+      <w:numFmt w:val="bullet"/>
+      <w:lvlText w:val=""/>
+      <w:lvlJc w:val="left"/>
+      <w:pPr>
+        <w:ind w:left="4320" w:hanging="360"/>
+      </w:pPr>
+      <w:rPr>
+        <w:rFonts w:ascii="Wingdings" w:hAnsi="Wingdings" w:hint="default"/>
+      </w:rPr>
+    </w:lvl>
+    <w:lvl w:ilvl="6" w:tplc="08090001" w:tentative="1">
+      <w:start w:val="1"/>
+      <w:numFmt w:val="bullet"/>
+      <w:lvlText w:val=""/>
+      <w:lvlJc w:val="left"/>
+      <w:pPr>
+        <w:ind w:left="5040" w:hanging="360"/>
+      </w:pPr>
+      <w:rPr>
+        <w:rFonts w:ascii="Symbol" w:hAnsi="Symbol" w:hint="default"/>
+      </w:rPr>
+    </w:lvl>
+    <w:lvl w:ilvl="7" w:tplc="08090003" w:tentative="1">
+      <w:start w:val="1"/>
+      <w:numFmt w:val="bullet"/>
+      <w:lvlText w:val="o"/>
+      <w:lvlJc w:val="left"/>
+      <w:pPr>
+        <w:ind w:left="5760" w:hanging="360"/>
+      </w:pPr>
+      <w:rPr>
+        <w:rFonts w:ascii="Courier New" w:hAnsi="Courier New" w:cs="Courier New" w:hint="default"/>
+      </w:rPr>
+    </w:lvl>
+    <w:lvl w:ilvl="8" w:tplc="08090005" w:tentative="1">
+      <w:start w:val="1"/>
+      <w:numFmt w:val="bullet"/>
+      <w:lvlText w:val=""/>
+      <w:lvlJc w:val="left"/>
+      <w:pPr>
+        <w:ind w:left="6480" w:hanging="360"/>
+      </w:pPr>
+      <w:rPr>
+        <w:rFonts w:ascii="Wingdings" w:hAnsi="Wingdings" w:hint="default"/>
+      </w:rPr>
+    </w:lvl>
+  </w:abstractNum>
   <w:num w:numId="1" w16cid:durableId="413480618">
+    <w:abstractNumId w:val="3"/>
+  </w:num>
+  <w:num w:numId="2" w16cid:durableId="1588880229">
+    <w:abstractNumId w:val="4"/>
+  </w:num>
+  <w:num w:numId="3" w16cid:durableId="1975938008">
+    <w:abstractNumId w:val="2"/>
+  </w:num>
+  <w:num w:numId="4" w16cid:durableId="1165778892">
+    <w:abstractNumId w:val="1"/>
+  </w:num>
+  <w:num w:numId="5" w16cid:durableId="1584291837">
     <w:abstractNumId w:val="0"/>
   </w:num>
 </w:numbering>
@@ -6321,6 +10522,18 @@
       <w:u w:val="single"/>
     </w:rPr>
   </w:style>
+  <w:style w:type="character" w:styleId="UnresolvedMention">
+    <w:name w:val="Unresolved Mention"/>
+    <w:basedOn w:val="DefaultParagraphFont"/>
+    <w:uiPriority w:val="99"/>
+    <w:semiHidden/>
+    <w:unhideWhenUsed/>
+    <w:rsid w:val="00E13D14"/>
+    <w:rPr>
+      <w:color w:val="605E5C"/>
+      <w:shd w:val="clear" w:color="auto" w:fill="E1DFDD"/>
+    </w:rPr>
+  </w:style>
 </w:styles>
 </file>
 
@@ -6620,16 +10833,15 @@
 </file>
 
 <file path=customXml/item1.xml><?xml version="1.0" encoding="utf-8"?>
-<?mso-contentType ?>
-<FormTemplates xmlns="http://schemas.microsoft.com/sharepoint/v3/contenttype/forms">
-  <Display>DocumentLibraryForm</Display>
-  <Edit>DocumentLibraryForm</Edit>
-  <New>DocumentLibraryForm</New>
-</FormTemplates>
+<b:Sources xmlns:b="http://schemas.openxmlformats.org/officeDocument/2006/bibliography" xmlns="http://schemas.openxmlformats.org/officeDocument/2006/bibliography" SelectedStyle="\APASixthEditionOfficeOnline.xsl" StyleName="APA" Version="6"/>
 </file>
 
 <file path=customXml/item2.xml><?xml version="1.0" encoding="utf-8"?>
-<b:Sources xmlns:b="http://schemas.openxmlformats.org/officeDocument/2006/bibliography" xmlns="http://schemas.openxmlformats.org/officeDocument/2006/bibliography" SelectedStyle="\APASixthEditionOfficeOnline.xsl" StyleName="APA" Version="6"/>
+<p:properties xmlns:p="http://schemas.microsoft.com/office/2006/metadata/properties" xmlns:xsi="http://www.w3.org/2001/XMLSchema-instance" xmlns:pc="http://schemas.microsoft.com/office/infopath/2007/PartnerControls">
+  <documentManagement>
+    <_activity xmlns="c464522a-a754-430f-b544-fd87d4c168c2" xsi:nil="true"/>
+  </documentManagement>
+</p:properties>
 </file>
 
 <file path=customXml/item3.xml><?xml version="1.0" encoding="utf-8"?>
@@ -6807,25 +11019,28 @@
 </file>
 
 <file path=customXml/item4.xml><?xml version="1.0" encoding="utf-8"?>
-<p:properties xmlns:p="http://schemas.microsoft.com/office/2006/metadata/properties" xmlns:xsi="http://www.w3.org/2001/XMLSchema-instance" xmlns:pc="http://schemas.microsoft.com/office/infopath/2007/PartnerControls">
-  <documentManagement>
-    <_activity xmlns="c464522a-a754-430f-b544-fd87d4c168c2" xsi:nil="true"/>
-  </documentManagement>
-</p:properties>
+<?mso-contentType ?>
+<FormTemplates xmlns="http://schemas.microsoft.com/sharepoint/v3/contenttype/forms">
+  <Display>DocumentLibraryForm</Display>
+  <Edit>DocumentLibraryForm</Edit>
+  <New>DocumentLibraryForm</New>
+</FormTemplates>
 </file>
 
 <file path=customXml/itemProps1.xml><?xml version="1.0" encoding="utf-8"?>
-<ds:datastoreItem xmlns:ds="http://schemas.openxmlformats.org/officeDocument/2006/customXml" ds:itemID="{C1AA33A3-61AD-4339-9E8A-C5DBB01DCEDF}">
+<ds:datastoreItem xmlns:ds="http://schemas.openxmlformats.org/officeDocument/2006/customXml" ds:itemID="{238C6C0A-4621-4E84-9BEB-57ADB3D29432}">
   <ds:schemaRefs>
-    <ds:schemaRef ds:uri="http://schemas.microsoft.com/sharepoint/v3/contenttype/forms"/>
+    <ds:schemaRef ds:uri="http://schemas.openxmlformats.org/officeDocument/2006/bibliography"/>
   </ds:schemaRefs>
 </ds:datastoreItem>
 </file>
 
 <file path=customXml/itemProps2.xml><?xml version="1.0" encoding="utf-8"?>
-<ds:datastoreItem xmlns:ds="http://schemas.openxmlformats.org/officeDocument/2006/customXml" ds:itemID="{238C6C0A-4621-4E84-9BEB-57ADB3D29432}">
+<ds:datastoreItem xmlns:ds="http://schemas.openxmlformats.org/officeDocument/2006/customXml" ds:itemID="{F79638DA-D241-4BF3-8AD6-7F74018D56BD}">
   <ds:schemaRefs>
-    <ds:schemaRef ds:uri="http://schemas.openxmlformats.org/officeDocument/2006/bibliography"/>
+    <ds:schemaRef ds:uri="http://schemas.microsoft.com/office/2006/metadata/properties"/>
+    <ds:schemaRef ds:uri="http://schemas.microsoft.com/office/infopath/2007/PartnerControls"/>
+    <ds:schemaRef ds:uri="c464522a-a754-430f-b544-fd87d4c168c2"/>
   </ds:schemaRefs>
 </ds:datastoreItem>
 </file>
@@ -6849,11 +11064,9 @@
 </file>
 
 <file path=customXml/itemProps4.xml><?xml version="1.0" encoding="utf-8"?>
-<ds:datastoreItem xmlns:ds="http://schemas.openxmlformats.org/officeDocument/2006/customXml" ds:itemID="{F79638DA-D241-4BF3-8AD6-7F74018D56BD}">
+<ds:datastoreItem xmlns:ds="http://schemas.openxmlformats.org/officeDocument/2006/customXml" ds:itemID="{C1AA33A3-61AD-4339-9E8A-C5DBB01DCEDF}">
   <ds:schemaRefs>
-    <ds:schemaRef ds:uri="http://schemas.microsoft.com/office/2006/metadata/properties"/>
-    <ds:schemaRef ds:uri="http://schemas.microsoft.com/office/infopath/2007/PartnerControls"/>
-    <ds:schemaRef ds:uri="c464522a-a754-430f-b544-fd87d4c168c2"/>
+    <ds:schemaRef ds:uri="http://schemas.microsoft.com/sharepoint/v3/contenttype/forms"/>
   </ds:schemaRefs>
 </ds:datastoreItem>
 </file>
</xml_diff>

<commit_message>
Gantt Upload + Updated Progress Report
</commit_message>
<xml_diff>
--- a/Documentation/COMP3000 - Progress Report.docx
+++ b/Documentation/COMP3000 - Progress Report.docx
@@ -9,7 +9,7 @@
           <w:lang w:val="en-US"/>
         </w:rPr>
       </w:pPr>
-      <w:bookmarkStart w:id="0" w:name="_Toc214265963"/>
+      <w:bookmarkStart w:id="0" w:name="_Toc214622116"/>
       <w:r>
         <w:rPr>
           <w:lang w:val="en-US"/>
@@ -100,7 +100,7 @@
           <w:r>
             <w:fldChar w:fldCharType="separate"/>
           </w:r>
-          <w:hyperlink w:anchor="_Toc214265963" w:history="1">
+          <w:hyperlink w:anchor="_Toc214622116" w:history="1">
             <w:r>
               <w:rPr>
                 <w:rStyle w:val="Hyperlink"/>
@@ -128,7 +128,7 @@
                 <w:noProof/>
                 <w:webHidden/>
               </w:rPr>
-              <w:instrText xml:space="preserve"> PAGEREF _Toc214265963 \h </w:instrText>
+              <w:instrText xml:space="preserve"> PAGEREF _Toc214622116 \h </w:instrText>
             </w:r>
             <w:r>
               <w:rPr>
@@ -173,7 +173,7 @@
               <w:lang w:eastAsia="en-GB"/>
             </w:rPr>
           </w:pPr>
-          <w:hyperlink w:anchor="_Toc214265964" w:history="1">
+          <w:hyperlink w:anchor="_Toc214622117" w:history="1">
             <w:r>
               <w:rPr>
                 <w:rStyle w:val="Hyperlink"/>
@@ -201,7 +201,7 @@
                 <w:noProof/>
                 <w:webHidden/>
               </w:rPr>
-              <w:instrText xml:space="preserve"> PAGEREF _Toc214265964 \h </w:instrText>
+              <w:instrText xml:space="preserve"> PAGEREF _Toc214622117 \h </w:instrText>
             </w:r>
             <w:r>
               <w:rPr>
@@ -246,7 +246,7 @@
               <w:lang w:eastAsia="en-GB"/>
             </w:rPr>
           </w:pPr>
-          <w:hyperlink w:anchor="_Toc214265965" w:history="1">
+          <w:hyperlink w:anchor="_Toc214622118" w:history="1">
             <w:r>
               <w:rPr>
                 <w:rStyle w:val="Hyperlink"/>
@@ -274,7 +274,7 @@
                 <w:noProof/>
                 <w:webHidden/>
               </w:rPr>
-              <w:instrText xml:space="preserve"> PAGEREF _Toc214265965 \h </w:instrText>
+              <w:instrText xml:space="preserve"> PAGEREF _Toc214622118 \h </w:instrText>
             </w:r>
             <w:r>
               <w:rPr>
@@ -319,7 +319,7 @@
               <w:lang w:eastAsia="en-GB"/>
             </w:rPr>
           </w:pPr>
-          <w:hyperlink w:anchor="_Toc214265966" w:history="1">
+          <w:hyperlink w:anchor="_Toc214622119" w:history="1">
             <w:r>
               <w:rPr>
                 <w:rStyle w:val="Hyperlink"/>
@@ -347,7 +347,7 @@
                 <w:noProof/>
                 <w:webHidden/>
               </w:rPr>
-              <w:instrText xml:space="preserve"> PAGEREF _Toc214265966 \h </w:instrText>
+              <w:instrText xml:space="preserve"> PAGEREF _Toc214622119 \h </w:instrText>
             </w:r>
             <w:r>
               <w:rPr>
@@ -392,7 +392,7 @@
               <w:lang w:eastAsia="en-GB"/>
             </w:rPr>
           </w:pPr>
-          <w:hyperlink w:anchor="_Toc214265967" w:history="1">
+          <w:hyperlink w:anchor="_Toc214622120" w:history="1">
             <w:r>
               <w:rPr>
                 <w:rStyle w:val="Hyperlink"/>
@@ -420,7 +420,7 @@
                 <w:noProof/>
                 <w:webHidden/>
               </w:rPr>
-              <w:instrText xml:space="preserve"> PAGEREF _Toc214265967 \h </w:instrText>
+              <w:instrText xml:space="preserve"> PAGEREF _Toc214622120 \h </w:instrText>
             </w:r>
             <w:r>
               <w:rPr>
@@ -465,7 +465,7 @@
               <w:lang w:eastAsia="en-GB"/>
             </w:rPr>
           </w:pPr>
-          <w:hyperlink w:anchor="_Toc214265968" w:history="1">
+          <w:hyperlink w:anchor="_Toc214622121" w:history="1">
             <w:r>
               <w:rPr>
                 <w:rStyle w:val="Hyperlink"/>
@@ -493,7 +493,7 @@
                 <w:noProof/>
                 <w:webHidden/>
               </w:rPr>
-              <w:instrText xml:space="preserve"> PAGEREF _Toc214265968 \h </w:instrText>
+              <w:instrText xml:space="preserve"> PAGEREF _Toc214622121 \h </w:instrText>
             </w:r>
             <w:r>
               <w:rPr>
@@ -525,6 +525,79 @@
           </w:hyperlink>
         </w:p>
         <w:p>
+          <w:pPr>
+            <w:pStyle w:val="TOC2"/>
+            <w:tabs>
+              <w:tab w:val="right" w:leader="dot" w:pos="9016"/>
+            </w:tabs>
+            <w:rPr>
+              <w:rFonts w:eastAsiaTheme="minorEastAsia"/>
+              <w:noProof/>
+              <w:sz w:val="24"/>
+              <w:szCs w:val="24"/>
+              <w:lang w:eastAsia="en-GB"/>
+            </w:rPr>
+          </w:pPr>
+          <w:hyperlink w:anchor="_Toc214622122" w:history="1">
+            <w:r>
+              <w:rPr>
+                <w:rStyle w:val="Hyperlink"/>
+                <w:noProof/>
+                <w:lang w:val="en-US"/>
+              </w:rPr>
+              <w:t>TO DO:</w:t>
+            </w:r>
+            <w:r>
+              <w:rPr>
+                <w:noProof/>
+                <w:webHidden/>
+              </w:rPr>
+              <w:tab/>
+            </w:r>
+            <w:r>
+              <w:rPr>
+                <w:noProof/>
+                <w:webHidden/>
+              </w:rPr>
+              <w:fldChar w:fldCharType="begin"/>
+            </w:r>
+            <w:r>
+              <w:rPr>
+                <w:noProof/>
+                <w:webHidden/>
+              </w:rPr>
+              <w:instrText xml:space="preserve"> PAGEREF _Toc214622122 \h </w:instrText>
+            </w:r>
+            <w:r>
+              <w:rPr>
+                <w:noProof/>
+                <w:webHidden/>
+              </w:rPr>
+            </w:r>
+            <w:r>
+              <w:rPr>
+                <w:noProof/>
+                <w:webHidden/>
+              </w:rPr>
+              <w:fldChar w:fldCharType="separate"/>
+            </w:r>
+            <w:r>
+              <w:rPr>
+                <w:noProof/>
+                <w:webHidden/>
+              </w:rPr>
+              <w:t>29</w:t>
+            </w:r>
+            <w:r>
+              <w:rPr>
+                <w:noProof/>
+                <w:webHidden/>
+              </w:rPr>
+              <w:fldChar w:fldCharType="end"/>
+            </w:r>
+          </w:hyperlink>
+        </w:p>
+        <w:p>
           <w:r>
             <w:rPr>
               <w:b/>
@@ -575,7 +648,7 @@
           <w:lang w:val="en-US"/>
         </w:rPr>
       </w:pPr>
-      <w:bookmarkStart w:id="1" w:name="_Toc214265964"/>
+      <w:bookmarkStart w:id="1" w:name="_Toc214622117"/>
       <w:r>
         <w:rPr>
           <w:u w:val="single"/>
@@ -593,7 +666,7 @@
           <w:lang w:val="en-US"/>
         </w:rPr>
       </w:pPr>
-      <w:bookmarkStart w:id="2" w:name="_Toc214265965"/>
+      <w:bookmarkStart w:id="2" w:name="_Toc214622118"/>
       <w:r>
         <w:rPr>
           <w:lang w:val="en-US"/>
@@ -741,7 +814,7 @@
           <w:lang w:val="en-US"/>
         </w:rPr>
       </w:pPr>
-      <w:bookmarkStart w:id="3" w:name="_Toc214265966"/>
+      <w:bookmarkStart w:id="3" w:name="_Toc214622119"/>
       <w:r>
         <w:rPr>
           <w:lang w:val="en-US"/>
@@ -1328,21 +1401,7 @@
         <w:rPr>
           <w:lang w:val="en-US"/>
         </w:rPr>
-        <w:t xml:space="preserve">from stock expo </w:t>
-      </w:r>
-      <w:proofErr w:type="spellStart"/>
-      <w:r>
-        <w:rPr>
-          <w:lang w:val="en-US"/>
-        </w:rPr>
-        <w:t>ui</w:t>
-      </w:r>
-      <w:proofErr w:type="spellEnd"/>
-      <w:r>
-        <w:rPr>
-          <w:lang w:val="en-US"/>
-        </w:rPr>
-        <w:t xml:space="preserve"> </w:t>
+        <w:t xml:space="preserve">from stock expo ui </w:t>
       </w:r>
       <w:r>
         <w:rPr>
@@ -1585,35 +1644,7 @@
         <w:rPr>
           <w:lang w:val="en-US"/>
         </w:rPr>
-        <w:t xml:space="preserve">Replaced </w:t>
-      </w:r>
-      <w:proofErr w:type="spellStart"/>
-      <w:r>
-        <w:rPr>
-          <w:lang w:val="en-US"/>
-        </w:rPr>
-        <w:t>HomeScreen</w:t>
-      </w:r>
-      <w:proofErr w:type="spellEnd"/>
-      <w:r>
-        <w:rPr>
-          <w:lang w:val="en-US"/>
-        </w:rPr>
-        <w:t xml:space="preserve"> with </w:t>
-      </w:r>
-      <w:proofErr w:type="spellStart"/>
-      <w:r>
-        <w:rPr>
-          <w:lang w:val="en-US"/>
-        </w:rPr>
-        <w:t>LoginScreen</w:t>
-      </w:r>
-      <w:proofErr w:type="spellEnd"/>
-      <w:r>
-        <w:rPr>
-          <w:lang w:val="en-US"/>
-        </w:rPr>
-        <w:t xml:space="preserve"> with </w:t>
+        <w:t xml:space="preserve">Replaced HomeScreen with LoginScreen with </w:t>
       </w:r>
       <w:r>
         <w:rPr>
@@ -2171,7 +2202,7 @@
           <w:lang w:val="en-US"/>
         </w:rPr>
         <w:drawing>
-          <wp:anchor distT="0" distB="0" distL="114300" distR="114300" simplePos="0" relativeHeight="251677696" behindDoc="0" locked="0" layoutInCell="1" allowOverlap="1" wp14:anchorId="4767C19A" wp14:editId="5DFB8E44">
+          <wp:anchor distT="0" distB="0" distL="114300" distR="114300" simplePos="0" relativeHeight="251677696" behindDoc="0" locked="0" layoutInCell="1" allowOverlap="1" wp14:anchorId="4767C19A" wp14:editId="7A269B47">
             <wp:simplePos x="0" y="0"/>
             <wp:positionH relativeFrom="column">
               <wp:posOffset>-725474</wp:posOffset>
@@ -2234,7 +2265,7 @@
           <w:lang w:val="en-US"/>
         </w:rPr>
       </w:pPr>
-      <w:bookmarkStart w:id="4" w:name="_Toc214265967"/>
+      <w:bookmarkStart w:id="4" w:name="_Toc214622120"/>
       <w:r>
         <w:rPr>
           <w:lang w:val="en-US"/>
@@ -3200,7 +3231,7 @@
           <w:lang w:val="en-US"/>
         </w:rPr>
         <w:drawing>
-          <wp:anchor distT="0" distB="0" distL="114300" distR="114300" simplePos="0" relativeHeight="251664384" behindDoc="1" locked="0" layoutInCell="1" allowOverlap="1" wp14:anchorId="71F3FFD7" wp14:editId="0A75A304">
+          <wp:anchor distT="0" distB="0" distL="114300" distR="114300" simplePos="0" relativeHeight="251664384" behindDoc="1" locked="0" layoutInCell="1" allowOverlap="1" wp14:anchorId="71F3FFD7" wp14:editId="01CEEB54">
             <wp:simplePos x="0" y="0"/>
             <wp:positionH relativeFrom="column">
               <wp:posOffset>-15240</wp:posOffset>
@@ -3396,7 +3427,7 @@
           <w:lang w:val="en-US"/>
         </w:rPr>
         <w:drawing>
-          <wp:anchor distT="0" distB="0" distL="114300" distR="114300" simplePos="0" relativeHeight="251666432" behindDoc="0" locked="0" layoutInCell="1" allowOverlap="1" wp14:anchorId="56452892" wp14:editId="72ED08C0">
+          <wp:anchor distT="0" distB="0" distL="114300" distR="114300" simplePos="0" relativeHeight="251666432" behindDoc="0" locked="0" layoutInCell="1" allowOverlap="1" wp14:anchorId="56452892" wp14:editId="48AF2298">
             <wp:simplePos x="0" y="0"/>
             <wp:positionH relativeFrom="column">
               <wp:posOffset>1748155</wp:posOffset>
@@ -3459,7 +3490,7 @@
           <w:lang w:val="en-US"/>
         </w:rPr>
         <w:drawing>
-          <wp:anchor distT="0" distB="0" distL="114300" distR="114300" simplePos="0" relativeHeight="251665408" behindDoc="0" locked="0" layoutInCell="1" allowOverlap="1" wp14:anchorId="15635525" wp14:editId="26A71568">
+          <wp:anchor distT="0" distB="0" distL="114300" distR="114300" simplePos="0" relativeHeight="251665408" behindDoc="0" locked="0" layoutInCell="1" allowOverlap="1" wp14:anchorId="15635525" wp14:editId="6A332F6C">
             <wp:simplePos x="0" y="0"/>
             <wp:positionH relativeFrom="column">
               <wp:posOffset>0</wp:posOffset>
@@ -4183,25 +4214,7 @@
           <w:lang w:val="en-US"/>
         </w:rPr>
         <w:lastRenderedPageBreak/>
-        <w:t>Adding</w:t>
-      </w:r>
-      <w:r>
-        <w:rPr>
-          <w:b/>
-          <w:bCs/>
-          <w:u w:val="single"/>
-          <w:lang w:val="en-US"/>
-        </w:rPr>
-        <w:t xml:space="preserve"> jQuery and</w:t>
-      </w:r>
-      <w:r>
-        <w:rPr>
-          <w:b/>
-          <w:bCs/>
-          <w:u w:val="single"/>
-          <w:lang w:val="en-US"/>
-        </w:rPr>
-        <w:t xml:space="preserve"> firebase auth</w:t>
+        <w:t>Adding firebase auth</w:t>
       </w:r>
       <w:r>
         <w:rPr>
@@ -5039,7 +5052,7 @@
           <w:lang w:val="en-US"/>
         </w:rPr>
         <w:drawing>
-          <wp:anchor distT="0" distB="0" distL="114300" distR="114300" simplePos="0" relativeHeight="251678720" behindDoc="0" locked="0" layoutInCell="1" allowOverlap="1" wp14:anchorId="5E963EF8" wp14:editId="2A1FF281">
+          <wp:anchor distT="0" distB="0" distL="114300" distR="114300" simplePos="0" relativeHeight="251678720" behindDoc="0" locked="0" layoutInCell="1" allowOverlap="1" wp14:anchorId="5E963EF8" wp14:editId="4AA2FF91">
             <wp:simplePos x="0" y="0"/>
             <wp:positionH relativeFrom="margin">
               <wp:align>center</wp:align>
@@ -5185,7 +5198,7 @@
           <w:lang w:val="en-US"/>
         </w:rPr>
       </w:pPr>
-      <w:bookmarkStart w:id="5" w:name="_Toc214265968"/>
+      <w:bookmarkStart w:id="5" w:name="_Toc214622121"/>
       <w:r>
         <w:rPr>
           <w:lang w:val="en-US"/>
@@ -5253,7 +5266,19 @@
         <w:rPr>
           <w:rStyle w:val="Heading4Char"/>
         </w:rPr>
-        <w:t>Adding friend system</w:t>
+        <w:t>Adding friend</w:t>
+      </w:r>
+      <w:r>
+        <w:rPr>
+          <w:rStyle w:val="Heading4Char"/>
+        </w:rPr>
+        <w:t xml:space="preserve"> request</w:t>
+      </w:r>
+      <w:r>
+        <w:rPr>
+          <w:rStyle w:val="Heading4Char"/>
+        </w:rPr>
+        <w:t xml:space="preserve"> system</w:t>
       </w:r>
       <w:r>
         <w:rPr>
@@ -5285,6 +5310,7 @@
         <w:rPr>
           <w:b/>
           <w:bCs/>
+          <w:noProof/>
           <w:lang w:val="en-US"/>
         </w:rPr>
         <w:drawing>
@@ -5352,6 +5378,7 @@
         <w:rPr>
           <w:b/>
           <w:bCs/>
+          <w:noProof/>
           <w:lang w:val="en-US"/>
         </w:rPr>
         <w:drawing>
@@ -5465,60 +5492,24 @@
           <w:bCs/>
           <w:lang w:val="en-US"/>
         </w:rPr>
-        <w:t xml:space="preserve">- Developed </w:t>
-      </w:r>
-      <w:proofErr w:type="spellStart"/>
-      <w:r>
-        <w:rPr>
-          <w:b/>
-          <w:bCs/>
-          <w:lang w:val="en-US"/>
-        </w:rPr>
-        <w:t>friends.tsx</w:t>
-      </w:r>
-      <w:proofErr w:type="spellEnd"/>
-      <w:r>
-        <w:rPr>
-          <w:b/>
-          <w:bCs/>
-          <w:lang w:val="en-US"/>
-        </w:rPr>
-        <w:t xml:space="preserve"> tab further to show this:</w:t>
-      </w:r>
-    </w:p>
-    <w:p>
-      <w:pPr>
-        <w:rPr>
-          <w:b/>
-          <w:bCs/>
-          <w:lang w:val="en-US"/>
-        </w:rPr>
-      </w:pPr>
-      <w:r>
-        <w:rPr>
-          <w:b/>
-          <w:bCs/>
-          <w:lang w:val="en-US"/>
-        </w:rPr>
-        <w:t xml:space="preserve">Referenced for </w:t>
-      </w:r>
-      <w:proofErr w:type="spellStart"/>
-      <w:r>
-        <w:rPr>
-          <w:b/>
-          <w:bCs/>
-          <w:lang w:val="en-US"/>
-        </w:rPr>
-        <w:t>FlatList</w:t>
-      </w:r>
-      <w:proofErr w:type="spellEnd"/>
-      <w:r>
-        <w:rPr>
-          <w:b/>
-          <w:bCs/>
-          <w:lang w:val="en-US"/>
-        </w:rPr>
-        <w:t xml:space="preserve"> usage: </w:t>
+        <w:t>- Developed friends.tsx tab further to show this:</w:t>
+      </w:r>
+    </w:p>
+    <w:p>
+      <w:pPr>
+        <w:rPr>
+          <w:b/>
+          <w:bCs/>
+          <w:lang w:val="en-US"/>
+        </w:rPr>
+      </w:pPr>
+      <w:r>
+        <w:rPr>
+          <w:b/>
+          <w:bCs/>
+          <w:lang w:val="en-US"/>
+        </w:rPr>
+        <w:t xml:space="preserve">Referenced for FlatList usage: </w:t>
       </w:r>
       <w:hyperlink r:id="rId55" w:history="1">
         <w:r>
@@ -5552,10 +5543,11 @@
         <w:rPr>
           <w:b/>
           <w:bCs/>
+          <w:noProof/>
           <w:lang w:val="en-US"/>
         </w:rPr>
         <w:drawing>
-          <wp:anchor distT="0" distB="0" distL="114300" distR="114300" simplePos="0" relativeHeight="251680768" behindDoc="0" locked="0" layoutInCell="1" allowOverlap="1" wp14:anchorId="1428C8BE" wp14:editId="6416B969">
+          <wp:anchor distT="0" distB="0" distL="114300" distR="114300" simplePos="0" relativeHeight="251680768" behindDoc="0" locked="0" layoutInCell="1" allowOverlap="1" wp14:anchorId="1428C8BE" wp14:editId="42E79DF1">
             <wp:simplePos x="0" y="0"/>
             <wp:positionH relativeFrom="column">
               <wp:posOffset>-70485</wp:posOffset>
@@ -5623,10 +5615,11 @@
         <w:rPr>
           <w:b/>
           <w:bCs/>
+          <w:noProof/>
           <w:lang w:val="en-US"/>
         </w:rPr>
         <w:drawing>
-          <wp:anchor distT="0" distB="0" distL="114300" distR="114300" simplePos="0" relativeHeight="251679744" behindDoc="0" locked="0" layoutInCell="1" allowOverlap="1" wp14:anchorId="4D46F843" wp14:editId="5AB81BFE">
+          <wp:anchor distT="0" distB="0" distL="114300" distR="114300" simplePos="0" relativeHeight="251679744" behindDoc="0" locked="0" layoutInCell="1" allowOverlap="1" wp14:anchorId="4D46F843" wp14:editId="3E905A5E">
             <wp:simplePos x="0" y="0"/>
             <wp:positionH relativeFrom="column">
               <wp:posOffset>-138921</wp:posOffset>
@@ -6211,6 +6204,7 @@
         <w:rPr>
           <w:b/>
           <w:bCs/>
+          <w:noProof/>
           <w:lang w:val="en-US"/>
         </w:rPr>
         <w:drawing>
@@ -6289,11 +6283,12 @@
         <w:rPr>
           <w:b/>
           <w:bCs/>
+          <w:noProof/>
           <w:lang w:val="en-US"/>
         </w:rPr>
         <w:lastRenderedPageBreak/>
         <w:drawing>
-          <wp:anchor distT="0" distB="0" distL="114300" distR="114300" simplePos="0" relativeHeight="251681792" behindDoc="0" locked="0" layoutInCell="1" allowOverlap="1" wp14:anchorId="654FC1FA" wp14:editId="3588C4DC">
+          <wp:anchor distT="0" distB="0" distL="114300" distR="114300" simplePos="0" relativeHeight="251681792" behindDoc="0" locked="0" layoutInCell="1" allowOverlap="1" wp14:anchorId="654FC1FA" wp14:editId="4C784F8B">
             <wp:simplePos x="0" y="0"/>
             <wp:positionH relativeFrom="page">
               <wp:align>right</wp:align>
@@ -6386,25 +6381,7 @@
           <w:bCs/>
           <w:lang w:val="en-US"/>
         </w:rPr>
-        <w:t xml:space="preserve">(fun error when loading Friends Tab, assume </w:t>
-      </w:r>
-      <w:proofErr w:type="spellStart"/>
-      <w:r>
-        <w:rPr>
-          <w:b/>
-          <w:bCs/>
-          <w:lang w:val="en-US"/>
-        </w:rPr>
-        <w:t>its</w:t>
-      </w:r>
-      <w:proofErr w:type="spellEnd"/>
-      <w:r>
-        <w:rPr>
-          <w:b/>
-          <w:bCs/>
-          <w:lang w:val="en-US"/>
-        </w:rPr>
-        <w:t xml:space="preserve"> to do with there not being any requests to display and not having accounted for this in code :/)</w:t>
+        <w:t>(fun error when loading Friends Tab, assume its to do with there not being any requests to display and not having accounted for this in code :/)</w:t>
       </w:r>
       <w:r>
         <w:rPr>
@@ -6436,6 +6413,7 @@
         <w:rPr>
           <w:b/>
           <w:bCs/>
+          <w:noProof/>
           <w:lang w:val="en-US"/>
         </w:rPr>
         <w:drawing>
@@ -7100,25 +7078,7 @@
           <w:bCs/>
           <w:lang w:val="en-US"/>
         </w:rPr>
-        <w:t xml:space="preserve">Using </w:t>
-      </w:r>
-      <w:proofErr w:type="spellStart"/>
-      <w:r>
-        <w:rPr>
-          <w:b/>
-          <w:bCs/>
-          <w:lang w:val="en-US"/>
-        </w:rPr>
-        <w:t>useIsFocused</w:t>
-      </w:r>
-      <w:proofErr w:type="spellEnd"/>
-      <w:r>
-        <w:rPr>
-          <w:b/>
-          <w:bCs/>
-          <w:lang w:val="en-US"/>
-        </w:rPr>
-        <w:t xml:space="preserve"> listener instead, returns “true” whenever the screen comes into view, meaning username updates every time you navigate to dashboard.</w:t>
+        <w:t>Using useIsFocused listener instead, returns “true” whenever the screen comes into view, meaning username updates every time you navigate to dashboard.</w:t>
       </w:r>
       <w:r>
         <w:rPr>
@@ -7163,6 +7123,7 @@
         <w:rPr>
           <w:b/>
           <w:bCs/>
+          <w:noProof/>
           <w:lang w:val="en-US"/>
         </w:rPr>
         <w:drawing>
@@ -7272,43 +7233,7 @@
           <w:bCs/>
           <w:lang w:val="en-US"/>
         </w:rPr>
-        <w:t xml:space="preserve">Removed </w:t>
-      </w:r>
-      <w:proofErr w:type="spellStart"/>
-      <w:r>
-        <w:rPr>
-          <w:b/>
-          <w:bCs/>
-          <w:lang w:val="en-US"/>
-        </w:rPr>
-        <w:t>localSearchParams</w:t>
-      </w:r>
-      <w:proofErr w:type="spellEnd"/>
-      <w:r>
-        <w:rPr>
-          <w:b/>
-          <w:bCs/>
-          <w:lang w:val="en-US"/>
-        </w:rPr>
-        <w:t xml:space="preserve"> and replaced with AsyncStorage and </w:t>
-      </w:r>
-      <w:proofErr w:type="spellStart"/>
-      <w:r>
-        <w:rPr>
-          <w:b/>
-          <w:bCs/>
-          <w:lang w:val="en-US"/>
-        </w:rPr>
-        <w:t>useIsFocused</w:t>
-      </w:r>
-      <w:proofErr w:type="spellEnd"/>
-      <w:r>
-        <w:rPr>
-          <w:b/>
-          <w:bCs/>
-          <w:lang w:val="en-US"/>
-        </w:rPr>
-        <w:t xml:space="preserve"> (same as dashboard.tsx).</w:t>
+        <w:t>Removed localSearchParams and replaced with AsyncStorage and useIsFocused (same as dashboard.tsx).</w:t>
       </w:r>
       <w:r>
         <w:rPr>
@@ -7336,6 +7261,7 @@
         <w:rPr>
           <w:b/>
           <w:bCs/>
+          <w:noProof/>
           <w:lang w:val="en-US"/>
         </w:rPr>
         <w:drawing>
@@ -7858,6 +7784,7 @@
         <w:rPr>
           <w:b/>
           <w:bCs/>
+          <w:noProof/>
           <w:lang w:val="en-US"/>
         </w:rPr>
         <w:drawing>
@@ -8071,6 +7998,7 @@
         <w:rPr>
           <w:b/>
           <w:bCs/>
+          <w:noProof/>
           <w:lang w:val="en-US"/>
         </w:rPr>
         <w:drawing>
@@ -8185,6 +8113,7 @@
         <w:rPr>
           <w:b/>
           <w:bCs/>
+          <w:noProof/>
           <w:color w:val="00B050"/>
           <w:lang w:val="en-US"/>
         </w:rPr>
@@ -8248,6 +8177,7 @@
         <w:rPr>
           <w:b/>
           <w:bCs/>
+          <w:noProof/>
           <w:color w:val="00B050"/>
           <w:lang w:val="en-US"/>
         </w:rPr>
@@ -8382,6 +8312,7 @@
         <w:rPr>
           <w:b/>
           <w:bCs/>
+          <w:noProof/>
           <w:lang w:val="en-US"/>
         </w:rPr>
         <w:drawing>
@@ -8480,6 +8411,7 @@
         <w:rPr>
           <w:b/>
           <w:bCs/>
+          <w:noProof/>
           <w:lang w:val="en-US"/>
         </w:rPr>
         <w:drawing>
@@ -8621,6 +8553,7 @@
         <w:rPr>
           <w:b/>
           <w:bCs/>
+          <w:noProof/>
           <w:color w:val="EE0000"/>
           <w:lang w:val="en-US"/>
         </w:rPr>
@@ -8846,6 +8779,7 @@
         <w:rPr>
           <w:b/>
           <w:bCs/>
+          <w:noProof/>
           <w:lang w:val="en-US"/>
         </w:rPr>
         <w:drawing>
@@ -8959,6 +8893,208 @@
           <w:lang w:val="en-US"/>
         </w:rPr>
       </w:pPr>
+      <w:r>
+        <w:rPr>
+          <w:b/>
+          <w:bCs/>
+          <w:color w:val="EE0000"/>
+          <w:lang w:val="en-US"/>
+        </w:rPr>
+        <w:br/>
+      </w:r>
+      <w:r>
+        <w:rPr>
+          <w:b/>
+          <w:bCs/>
+          <w:color w:val="EE0000"/>
+          <w:lang w:val="en-US"/>
+        </w:rPr>
+        <w:br/>
+      </w:r>
+      <w:r>
+        <w:rPr>
+          <w:b/>
+          <w:bCs/>
+          <w:color w:val="EE0000"/>
+          <w:lang w:val="en-US"/>
+        </w:rPr>
+        <w:br/>
+      </w:r>
+      <w:r>
+        <w:rPr>
+          <w:b/>
+          <w:bCs/>
+          <w:color w:val="EE0000"/>
+          <w:lang w:val="en-US"/>
+        </w:rPr>
+        <w:br/>
+      </w:r>
+      <w:r>
+        <w:rPr>
+          <w:b/>
+          <w:bCs/>
+          <w:color w:val="EE0000"/>
+          <w:lang w:val="en-US"/>
+        </w:rPr>
+        <w:br/>
+      </w:r>
+    </w:p>
+    <w:p>
+      <w:pPr>
+        <w:pStyle w:val="Heading4"/>
+        <w:rPr>
+          <w:lang w:val="en-US"/>
+        </w:rPr>
+      </w:pPr>
+      <w:r>
+        <w:rPr>
+          <w:lang w:val="en-US"/>
+        </w:rPr>
+        <w:lastRenderedPageBreak/>
+        <w:t>Updated Gantt Char</w:t>
+      </w:r>
+      <w:r>
+        <w:rPr>
+          <w:lang w:val="en-US"/>
+        </w:rPr>
+        <w:t>t &amp; GitHub Project Board</w:t>
+      </w:r>
+    </w:p>
+    <w:p>
+      <w:pPr>
+        <w:rPr>
+          <w:lang w:val="en-US"/>
+        </w:rPr>
+      </w:pPr>
+      <w:r>
+        <w:rPr>
+          <w:lang w:val="en-US"/>
+        </w:rPr>
+        <w:drawing>
+          <wp:anchor distT="0" distB="0" distL="114300" distR="114300" simplePos="0" relativeHeight="251693056" behindDoc="0" locked="0" layoutInCell="1" allowOverlap="1" wp14:anchorId="307A97B8" wp14:editId="15DCD3B5">
+            <wp:simplePos x="0" y="0"/>
+            <wp:positionH relativeFrom="column">
+              <wp:posOffset>0</wp:posOffset>
+            </wp:positionH>
+            <wp:positionV relativeFrom="paragraph">
+              <wp:posOffset>0</wp:posOffset>
+            </wp:positionV>
+            <wp:extent cx="5731510" cy="2851785"/>
+            <wp:effectExtent l="0" t="0" r="2540" b="5715"/>
+            <wp:wrapSquare wrapText="bothSides"/>
+            <wp:docPr id="2145294984" name="Picture 1" descr="A graph of a project&#10;&#10;AI-generated content may be incorrect."/>
+            <wp:cNvGraphicFramePr>
+              <a:graphicFrameLocks xmlns:a="http://schemas.openxmlformats.org/drawingml/2006/main" noChangeAspect="1"/>
+            </wp:cNvGraphicFramePr>
+            <a:graphic xmlns:a="http://schemas.openxmlformats.org/drawingml/2006/main">
+              <a:graphicData uri="http://schemas.openxmlformats.org/drawingml/2006/picture">
+                <pic:pic xmlns:pic="http://schemas.openxmlformats.org/drawingml/2006/picture">
+                  <pic:nvPicPr>
+                    <pic:cNvPr id="2145294984" name="Picture 1" descr="A graph of a project&#10;&#10;AI-generated content may be incorrect."/>
+                    <pic:cNvPicPr/>
+                  </pic:nvPicPr>
+                  <pic:blipFill>
+                    <a:blip r:embed="rId71" cstate="print">
+                      <a:extLst>
+                        <a:ext uri="{28A0092B-C50C-407E-A947-70E740481C1C}">
+                          <a14:useLocalDpi xmlns:a14="http://schemas.microsoft.com/office/drawing/2010/main" val="0"/>
+                        </a:ext>
+                      </a:extLst>
+                    </a:blip>
+                    <a:stretch>
+                      <a:fillRect/>
+                    </a:stretch>
+                  </pic:blipFill>
+                  <pic:spPr>
+                    <a:xfrm>
+                      <a:off x="0" y="0"/>
+                      <a:ext cx="5731510" cy="2851785"/>
+                    </a:xfrm>
+                    <a:prstGeom prst="rect">
+                      <a:avLst/>
+                    </a:prstGeom>
+                  </pic:spPr>
+                </pic:pic>
+              </a:graphicData>
+            </a:graphic>
+            <wp14:sizeRelH relativeFrom="page">
+              <wp14:pctWidth>0</wp14:pctWidth>
+            </wp14:sizeRelH>
+            <wp14:sizeRelV relativeFrom="page">
+              <wp14:pctHeight>0</wp14:pctHeight>
+            </wp14:sizeRelV>
+          </wp:anchor>
+        </w:drawing>
+      </w:r>
+      <w:r>
+        <w:rPr>
+          <w:lang w:val="en-US"/>
+        </w:rPr>
+        <w:br/>
+      </w:r>
+    </w:p>
+    <w:p>
+      <w:pPr>
+        <w:pStyle w:val="Heading2"/>
+        <w:rPr>
+          <w:lang w:val="en-US"/>
+        </w:rPr>
+      </w:pPr>
+      <w:bookmarkStart w:id="6" w:name="_Toc214622122"/>
+      <w:r>
+        <w:rPr>
+          <w:lang w:val="en-US"/>
+        </w:rPr>
+        <w:t>TO DO:</w:t>
+      </w:r>
+      <w:bookmarkEnd w:id="6"/>
+    </w:p>
+    <w:p>
+      <w:pPr>
+        <w:rPr>
+          <w:b/>
+          <w:bCs/>
+          <w:color w:val="EE0000"/>
+          <w:lang w:val="en-US"/>
+        </w:rPr>
+      </w:pPr>
+      <w:r>
+        <w:rPr>
+          <w:b/>
+          <w:bCs/>
+          <w:color w:val="EE0000"/>
+          <w:lang w:val="en-US"/>
+        </w:rPr>
+        <w:t>- Shouldn't be able to send yourself a request.</w:t>
+      </w:r>
+    </w:p>
+    <w:p>
+      <w:pPr>
+        <w:rPr>
+          <w:b/>
+          <w:bCs/>
+          <w:color w:val="EE0000"/>
+          <w:lang w:val="en-US"/>
+        </w:rPr>
+      </w:pPr>
+      <w:r>
+        <w:rPr>
+          <w:b/>
+          <w:bCs/>
+          <w:color w:val="EE0000"/>
+          <w:lang w:val="en-US"/>
+        </w:rPr>
+        <w:t>- Shouldn't be able to send multiple friend requests to same user.</w:t>
+      </w:r>
+      <w:r>
+        <w:rPr>
+          <w:b/>
+          <w:bCs/>
+          <w:color w:val="EE0000"/>
+          <w:lang w:val="en-US"/>
+        </w:rPr>
+        <w:br/>
+      </w:r>
     </w:p>
     <w:sectPr>
       <w:pgSz w:w="11906" w:h="16838"/>
@@ -10833,18 +10969,6 @@
 </file>
 
 <file path=customXml/item1.xml><?xml version="1.0" encoding="utf-8"?>
-<b:Sources xmlns:b="http://schemas.openxmlformats.org/officeDocument/2006/bibliography" xmlns="http://schemas.openxmlformats.org/officeDocument/2006/bibliography" SelectedStyle="\APASixthEditionOfficeOnline.xsl" StyleName="APA" Version="6"/>
-</file>
-
-<file path=customXml/item2.xml><?xml version="1.0" encoding="utf-8"?>
-<p:properties xmlns:p="http://schemas.microsoft.com/office/2006/metadata/properties" xmlns:xsi="http://www.w3.org/2001/XMLSchema-instance" xmlns:pc="http://schemas.microsoft.com/office/infopath/2007/PartnerControls">
-  <documentManagement>
-    <_activity xmlns="c464522a-a754-430f-b544-fd87d4c168c2" xsi:nil="true"/>
-  </documentManagement>
-</p:properties>
-</file>
-
-<file path=customXml/item3.xml><?xml version="1.0" encoding="utf-8"?>
 <ct:contentTypeSchema xmlns:ct="http://schemas.microsoft.com/office/2006/metadata/contentType" xmlns:ma="http://schemas.microsoft.com/office/2006/metadata/properties/metaAttributes" ct:_="" ma:_="" ma:contentTypeName="Document" ma:contentTypeID="0x010100FD220758017CC846AA909CC7164ED159" ma:contentTypeVersion="9" ma:contentTypeDescription="Create a new document." ma:contentTypeScope="" ma:versionID="107195f5180327e81a14725ad49c53b2">
   <xsd:schema xmlns:xsd="http://www.w3.org/2001/XMLSchema" xmlns:xs="http://www.w3.org/2001/XMLSchema" xmlns:p="http://schemas.microsoft.com/office/2006/metadata/properties" xmlns:ns3="c464522a-a754-430f-b544-fd87d4c168c2" targetNamespace="http://schemas.microsoft.com/office/2006/metadata/properties" ma:root="true" ma:fieldsID="f73c64e9107e8a5bfbbc1902deeb9531" ns3:_="">
     <xsd:import namespace="c464522a-a754-430f-b544-fd87d4c168c2"/>
@@ -11018,6 +11142,18 @@
 </ct:contentTypeSchema>
 </file>
 
+<file path=customXml/item2.xml><?xml version="1.0" encoding="utf-8"?>
+<b:Sources xmlns:b="http://schemas.openxmlformats.org/officeDocument/2006/bibliography" xmlns="http://schemas.openxmlformats.org/officeDocument/2006/bibliography" SelectedStyle="\APASixthEditionOfficeOnline.xsl" StyleName="APA" Version="6"/>
+</file>
+
+<file path=customXml/item3.xml><?xml version="1.0" encoding="utf-8"?>
+<p:properties xmlns:p="http://schemas.microsoft.com/office/2006/metadata/properties" xmlns:xsi="http://www.w3.org/2001/XMLSchema-instance" xmlns:pc="http://schemas.microsoft.com/office/infopath/2007/PartnerControls">
+  <documentManagement>
+    <_activity xmlns="c464522a-a754-430f-b544-fd87d4c168c2" xsi:nil="true"/>
+  </documentManagement>
+</p:properties>
+</file>
+
 <file path=customXml/item4.xml><?xml version="1.0" encoding="utf-8"?>
 <?mso-contentType ?>
 <FormTemplates xmlns="http://schemas.microsoft.com/sharepoint/v3/contenttype/forms">
@@ -11028,24 +11164,6 @@
 </file>
 
 <file path=customXml/itemProps1.xml><?xml version="1.0" encoding="utf-8"?>
-<ds:datastoreItem xmlns:ds="http://schemas.openxmlformats.org/officeDocument/2006/customXml" ds:itemID="{238C6C0A-4621-4E84-9BEB-57ADB3D29432}">
-  <ds:schemaRefs>
-    <ds:schemaRef ds:uri="http://schemas.openxmlformats.org/officeDocument/2006/bibliography"/>
-  </ds:schemaRefs>
-</ds:datastoreItem>
-</file>
-
-<file path=customXml/itemProps2.xml><?xml version="1.0" encoding="utf-8"?>
-<ds:datastoreItem xmlns:ds="http://schemas.openxmlformats.org/officeDocument/2006/customXml" ds:itemID="{F79638DA-D241-4BF3-8AD6-7F74018D56BD}">
-  <ds:schemaRefs>
-    <ds:schemaRef ds:uri="http://schemas.microsoft.com/office/2006/metadata/properties"/>
-    <ds:schemaRef ds:uri="http://schemas.microsoft.com/office/infopath/2007/PartnerControls"/>
-    <ds:schemaRef ds:uri="c464522a-a754-430f-b544-fd87d4c168c2"/>
-  </ds:schemaRefs>
-</ds:datastoreItem>
-</file>
-
-<file path=customXml/itemProps3.xml><?xml version="1.0" encoding="utf-8"?>
 <ds:datastoreItem xmlns:ds="http://schemas.openxmlformats.org/officeDocument/2006/customXml" ds:itemID="{DF38D78A-FDB7-47F3-B2C0-0D7B5F170E7B}">
   <ds:schemaRefs>
     <ds:schemaRef ds:uri="http://schemas.microsoft.com/office/2006/metadata/contentType"/>
@@ -11063,6 +11181,24 @@
 </ds:datastoreItem>
 </file>
 
+<file path=customXml/itemProps2.xml><?xml version="1.0" encoding="utf-8"?>
+<ds:datastoreItem xmlns:ds="http://schemas.openxmlformats.org/officeDocument/2006/customXml" ds:itemID="{238C6C0A-4621-4E84-9BEB-57ADB3D29432}">
+  <ds:schemaRefs>
+    <ds:schemaRef ds:uri="http://schemas.openxmlformats.org/officeDocument/2006/bibliography"/>
+  </ds:schemaRefs>
+</ds:datastoreItem>
+</file>
+
+<file path=customXml/itemProps3.xml><?xml version="1.0" encoding="utf-8"?>
+<ds:datastoreItem xmlns:ds="http://schemas.openxmlformats.org/officeDocument/2006/customXml" ds:itemID="{F79638DA-D241-4BF3-8AD6-7F74018D56BD}">
+  <ds:schemaRefs>
+    <ds:schemaRef ds:uri="http://schemas.microsoft.com/office/2006/metadata/properties"/>
+    <ds:schemaRef ds:uri="http://schemas.microsoft.com/office/infopath/2007/PartnerControls"/>
+    <ds:schemaRef ds:uri="c464522a-a754-430f-b544-fd87d4c168c2"/>
+  </ds:schemaRefs>
+</ds:datastoreItem>
+</file>
+
 <file path=customXml/itemProps4.xml><?xml version="1.0" encoding="utf-8"?>
 <ds:datastoreItem xmlns:ds="http://schemas.openxmlformats.org/officeDocument/2006/customXml" ds:itemID="{C1AA33A3-61AD-4339-9E8A-C5DBB01DCEDF}">
   <ds:schemaRefs>

</xml_diff>

<commit_message>
Friend Request Edge Cases: - Cannot send yourself a request. - Cannot send someone a pending request twice. - Cannot send someone a request if they have sent you a pending request.
</commit_message>
<xml_diff>
--- a/Documentation/COMP3000 - Progress Report.docx
+++ b/Documentation/COMP3000 - Progress Report.docx
@@ -1401,7 +1401,21 @@
         <w:rPr>
           <w:lang w:val="en-US"/>
         </w:rPr>
-        <w:t xml:space="preserve">from stock expo ui </w:t>
+        <w:t xml:space="preserve">from stock expo </w:t>
+      </w:r>
+      <w:proofErr w:type="spellStart"/>
+      <w:r>
+        <w:rPr>
+          <w:lang w:val="en-US"/>
+        </w:rPr>
+        <w:t>ui</w:t>
+      </w:r>
+      <w:proofErr w:type="spellEnd"/>
+      <w:r>
+        <w:rPr>
+          <w:lang w:val="en-US"/>
+        </w:rPr>
+        <w:t xml:space="preserve"> </w:t>
       </w:r>
       <w:r>
         <w:rPr>
@@ -1644,7 +1658,35 @@
         <w:rPr>
           <w:lang w:val="en-US"/>
         </w:rPr>
-        <w:t xml:space="preserve">Replaced HomeScreen with LoginScreen with </w:t>
+        <w:t xml:space="preserve">Replaced </w:t>
+      </w:r>
+      <w:proofErr w:type="spellStart"/>
+      <w:r>
+        <w:rPr>
+          <w:lang w:val="en-US"/>
+        </w:rPr>
+        <w:t>HomeScreen</w:t>
+      </w:r>
+      <w:proofErr w:type="spellEnd"/>
+      <w:r>
+        <w:rPr>
+          <w:lang w:val="en-US"/>
+        </w:rPr>
+        <w:t xml:space="preserve"> with </w:t>
+      </w:r>
+      <w:proofErr w:type="spellStart"/>
+      <w:r>
+        <w:rPr>
+          <w:lang w:val="en-US"/>
+        </w:rPr>
+        <w:t>LoginScreen</w:t>
+      </w:r>
+      <w:proofErr w:type="spellEnd"/>
+      <w:r>
+        <w:rPr>
+          <w:lang w:val="en-US"/>
+        </w:rPr>
+        <w:t xml:space="preserve"> with </w:t>
       </w:r>
       <w:r>
         <w:rPr>
@@ -2202,7 +2244,7 @@
           <w:lang w:val="en-US"/>
         </w:rPr>
         <w:drawing>
-          <wp:anchor distT="0" distB="0" distL="114300" distR="114300" simplePos="0" relativeHeight="251677696" behindDoc="0" locked="0" layoutInCell="1" allowOverlap="1" wp14:anchorId="4767C19A" wp14:editId="7A269B47">
+          <wp:anchor distT="0" distB="0" distL="114300" distR="114300" simplePos="0" relativeHeight="251677696" behindDoc="0" locked="0" layoutInCell="1" allowOverlap="1" wp14:anchorId="4767C19A" wp14:editId="1B26EAA0">
             <wp:simplePos x="0" y="0"/>
             <wp:positionH relativeFrom="column">
               <wp:posOffset>-725474</wp:posOffset>
@@ -3231,7 +3273,7 @@
           <w:lang w:val="en-US"/>
         </w:rPr>
         <w:drawing>
-          <wp:anchor distT="0" distB="0" distL="114300" distR="114300" simplePos="0" relativeHeight="251664384" behindDoc="1" locked="0" layoutInCell="1" allowOverlap="1" wp14:anchorId="71F3FFD7" wp14:editId="01CEEB54">
+          <wp:anchor distT="0" distB="0" distL="114300" distR="114300" simplePos="0" relativeHeight="251664384" behindDoc="1" locked="0" layoutInCell="1" allowOverlap="1" wp14:anchorId="71F3FFD7" wp14:editId="38151081">
             <wp:simplePos x="0" y="0"/>
             <wp:positionH relativeFrom="column">
               <wp:posOffset>-15240</wp:posOffset>
@@ -3427,7 +3469,7 @@
           <w:lang w:val="en-US"/>
         </w:rPr>
         <w:drawing>
-          <wp:anchor distT="0" distB="0" distL="114300" distR="114300" simplePos="0" relativeHeight="251666432" behindDoc="0" locked="0" layoutInCell="1" allowOverlap="1" wp14:anchorId="56452892" wp14:editId="48AF2298">
+          <wp:anchor distT="0" distB="0" distL="114300" distR="114300" simplePos="0" relativeHeight="251666432" behindDoc="0" locked="0" layoutInCell="1" allowOverlap="1" wp14:anchorId="56452892" wp14:editId="326A6E45">
             <wp:simplePos x="0" y="0"/>
             <wp:positionH relativeFrom="column">
               <wp:posOffset>1748155</wp:posOffset>
@@ -3490,7 +3532,7 @@
           <w:lang w:val="en-US"/>
         </w:rPr>
         <w:drawing>
-          <wp:anchor distT="0" distB="0" distL="114300" distR="114300" simplePos="0" relativeHeight="251665408" behindDoc="0" locked="0" layoutInCell="1" allowOverlap="1" wp14:anchorId="15635525" wp14:editId="6A332F6C">
+          <wp:anchor distT="0" distB="0" distL="114300" distR="114300" simplePos="0" relativeHeight="251665408" behindDoc="0" locked="0" layoutInCell="1" allowOverlap="1" wp14:anchorId="15635525" wp14:editId="2B3F31E8">
             <wp:simplePos x="0" y="0"/>
             <wp:positionH relativeFrom="column">
               <wp:posOffset>0</wp:posOffset>
@@ -5052,7 +5094,7 @@
           <w:lang w:val="en-US"/>
         </w:rPr>
         <w:drawing>
-          <wp:anchor distT="0" distB="0" distL="114300" distR="114300" simplePos="0" relativeHeight="251678720" behindDoc="0" locked="0" layoutInCell="1" allowOverlap="1" wp14:anchorId="5E963EF8" wp14:editId="4AA2FF91">
+          <wp:anchor distT="0" distB="0" distL="114300" distR="114300" simplePos="0" relativeHeight="251678720" behindDoc="0" locked="0" layoutInCell="1" allowOverlap="1" wp14:anchorId="5E963EF8" wp14:editId="7AB9214B">
             <wp:simplePos x="0" y="0"/>
             <wp:positionH relativeFrom="margin">
               <wp:align>center</wp:align>
@@ -5492,24 +5534,60 @@
           <w:bCs/>
           <w:lang w:val="en-US"/>
         </w:rPr>
-        <w:t>- Developed friends.tsx tab further to show this:</w:t>
-      </w:r>
-    </w:p>
-    <w:p>
-      <w:pPr>
-        <w:rPr>
-          <w:b/>
-          <w:bCs/>
-          <w:lang w:val="en-US"/>
-        </w:rPr>
-      </w:pPr>
-      <w:r>
-        <w:rPr>
-          <w:b/>
-          <w:bCs/>
-          <w:lang w:val="en-US"/>
-        </w:rPr>
-        <w:t xml:space="preserve">Referenced for FlatList usage: </w:t>
+        <w:t xml:space="preserve">- Developed </w:t>
+      </w:r>
+      <w:proofErr w:type="spellStart"/>
+      <w:r>
+        <w:rPr>
+          <w:b/>
+          <w:bCs/>
+          <w:lang w:val="en-US"/>
+        </w:rPr>
+        <w:t>friends.tsx</w:t>
+      </w:r>
+      <w:proofErr w:type="spellEnd"/>
+      <w:r>
+        <w:rPr>
+          <w:b/>
+          <w:bCs/>
+          <w:lang w:val="en-US"/>
+        </w:rPr>
+        <w:t xml:space="preserve"> tab further to show this:</w:t>
+      </w:r>
+    </w:p>
+    <w:p>
+      <w:pPr>
+        <w:rPr>
+          <w:b/>
+          <w:bCs/>
+          <w:lang w:val="en-US"/>
+        </w:rPr>
+      </w:pPr>
+      <w:r>
+        <w:rPr>
+          <w:b/>
+          <w:bCs/>
+          <w:lang w:val="en-US"/>
+        </w:rPr>
+        <w:t xml:space="preserve">Referenced for </w:t>
+      </w:r>
+      <w:proofErr w:type="spellStart"/>
+      <w:r>
+        <w:rPr>
+          <w:b/>
+          <w:bCs/>
+          <w:lang w:val="en-US"/>
+        </w:rPr>
+        <w:t>FlatList</w:t>
+      </w:r>
+      <w:proofErr w:type="spellEnd"/>
+      <w:r>
+        <w:rPr>
+          <w:b/>
+          <w:bCs/>
+          <w:lang w:val="en-US"/>
+        </w:rPr>
+        <w:t xml:space="preserve"> usage: </w:t>
       </w:r>
       <w:hyperlink r:id="rId55" w:history="1">
         <w:r>
@@ -5547,7 +5625,7 @@
           <w:lang w:val="en-US"/>
         </w:rPr>
         <w:drawing>
-          <wp:anchor distT="0" distB="0" distL="114300" distR="114300" simplePos="0" relativeHeight="251680768" behindDoc="0" locked="0" layoutInCell="1" allowOverlap="1" wp14:anchorId="1428C8BE" wp14:editId="42E79DF1">
+          <wp:anchor distT="0" distB="0" distL="114300" distR="114300" simplePos="0" relativeHeight="251680768" behindDoc="0" locked="0" layoutInCell="1" allowOverlap="1" wp14:anchorId="1428C8BE" wp14:editId="5693AF4E">
             <wp:simplePos x="0" y="0"/>
             <wp:positionH relativeFrom="column">
               <wp:posOffset>-70485</wp:posOffset>
@@ -5619,7 +5697,7 @@
           <w:lang w:val="en-US"/>
         </w:rPr>
         <w:drawing>
-          <wp:anchor distT="0" distB="0" distL="114300" distR="114300" simplePos="0" relativeHeight="251679744" behindDoc="0" locked="0" layoutInCell="1" allowOverlap="1" wp14:anchorId="4D46F843" wp14:editId="3E905A5E">
+          <wp:anchor distT="0" distB="0" distL="114300" distR="114300" simplePos="0" relativeHeight="251679744" behindDoc="0" locked="0" layoutInCell="1" allowOverlap="1" wp14:anchorId="4D46F843" wp14:editId="17C75EFC">
             <wp:simplePos x="0" y="0"/>
             <wp:positionH relativeFrom="column">
               <wp:posOffset>-138921</wp:posOffset>
@@ -6288,7 +6366,7 @@
         </w:rPr>
         <w:lastRenderedPageBreak/>
         <w:drawing>
-          <wp:anchor distT="0" distB="0" distL="114300" distR="114300" simplePos="0" relativeHeight="251681792" behindDoc="0" locked="0" layoutInCell="1" allowOverlap="1" wp14:anchorId="654FC1FA" wp14:editId="4C784F8B">
+          <wp:anchor distT="0" distB="0" distL="114300" distR="114300" simplePos="0" relativeHeight="251681792" behindDoc="0" locked="0" layoutInCell="1" allowOverlap="1" wp14:anchorId="654FC1FA" wp14:editId="6DC0C80C">
             <wp:simplePos x="0" y="0"/>
             <wp:positionH relativeFrom="page">
               <wp:align>right</wp:align>
@@ -6381,7 +6459,25 @@
           <w:bCs/>
           <w:lang w:val="en-US"/>
         </w:rPr>
-        <w:t>(fun error when loading Friends Tab, assume its to do with there not being any requests to display and not having accounted for this in code :/)</w:t>
+        <w:t xml:space="preserve">(fun error when loading Friends Tab, assume </w:t>
+      </w:r>
+      <w:proofErr w:type="spellStart"/>
+      <w:r>
+        <w:rPr>
+          <w:b/>
+          <w:bCs/>
+          <w:lang w:val="en-US"/>
+        </w:rPr>
+        <w:t>its</w:t>
+      </w:r>
+      <w:proofErr w:type="spellEnd"/>
+      <w:r>
+        <w:rPr>
+          <w:b/>
+          <w:bCs/>
+          <w:lang w:val="en-US"/>
+        </w:rPr>
+        <w:t xml:space="preserve"> to do with there not being any requests to display and not having accounted for this in code :/)</w:t>
       </w:r>
       <w:r>
         <w:rPr>
@@ -7078,7 +7174,25 @@
           <w:bCs/>
           <w:lang w:val="en-US"/>
         </w:rPr>
-        <w:t>Using useIsFocused listener instead, returns “true” whenever the screen comes into view, meaning username updates every time you navigate to dashboard.</w:t>
+        <w:t xml:space="preserve">Using </w:t>
+      </w:r>
+      <w:proofErr w:type="spellStart"/>
+      <w:r>
+        <w:rPr>
+          <w:b/>
+          <w:bCs/>
+          <w:lang w:val="en-US"/>
+        </w:rPr>
+        <w:t>useIsFocused</w:t>
+      </w:r>
+      <w:proofErr w:type="spellEnd"/>
+      <w:r>
+        <w:rPr>
+          <w:b/>
+          <w:bCs/>
+          <w:lang w:val="en-US"/>
+        </w:rPr>
+        <w:t xml:space="preserve"> listener instead, returns “true” whenever the screen comes into view, meaning username updates every time you navigate to dashboard.</w:t>
       </w:r>
       <w:r>
         <w:rPr>
@@ -7233,7 +7347,43 @@
           <w:bCs/>
           <w:lang w:val="en-US"/>
         </w:rPr>
-        <w:t>Removed localSearchParams and replaced with AsyncStorage and useIsFocused (same as dashboard.tsx).</w:t>
+        <w:t xml:space="preserve">Removed </w:t>
+      </w:r>
+      <w:proofErr w:type="spellStart"/>
+      <w:r>
+        <w:rPr>
+          <w:b/>
+          <w:bCs/>
+          <w:lang w:val="en-US"/>
+        </w:rPr>
+        <w:t>localSearchParams</w:t>
+      </w:r>
+      <w:proofErr w:type="spellEnd"/>
+      <w:r>
+        <w:rPr>
+          <w:b/>
+          <w:bCs/>
+          <w:lang w:val="en-US"/>
+        </w:rPr>
+        <w:t xml:space="preserve"> and replaced with AsyncStorage and </w:t>
+      </w:r>
+      <w:proofErr w:type="spellStart"/>
+      <w:r>
+        <w:rPr>
+          <w:b/>
+          <w:bCs/>
+          <w:lang w:val="en-US"/>
+        </w:rPr>
+        <w:t>useIsFocused</w:t>
+      </w:r>
+      <w:proofErr w:type="spellEnd"/>
+      <w:r>
+        <w:rPr>
+          <w:b/>
+          <w:bCs/>
+          <w:lang w:val="en-US"/>
+        </w:rPr>
+        <w:t xml:space="preserve"> (same as dashboard.tsx).</w:t>
       </w:r>
       <w:r>
         <w:rPr>
@@ -8968,19 +9118,20 @@
       </w:pPr>
       <w:r>
         <w:rPr>
+          <w:noProof/>
           <w:lang w:val="en-US"/>
         </w:rPr>
         <w:drawing>
-          <wp:anchor distT="0" distB="0" distL="114300" distR="114300" simplePos="0" relativeHeight="251693056" behindDoc="0" locked="0" layoutInCell="1" allowOverlap="1" wp14:anchorId="307A97B8" wp14:editId="15DCD3B5">
+          <wp:anchor distT="0" distB="0" distL="114300" distR="114300" simplePos="0" relativeHeight="251693056" behindDoc="0" locked="0" layoutInCell="1" allowOverlap="1" wp14:anchorId="307A97B8" wp14:editId="21CC2D8A">
             <wp:simplePos x="0" y="0"/>
-            <wp:positionH relativeFrom="column">
-              <wp:posOffset>0</wp:posOffset>
+            <wp:positionH relativeFrom="page">
+              <wp:posOffset>45250</wp:posOffset>
             </wp:positionH>
             <wp:positionV relativeFrom="paragraph">
-              <wp:posOffset>0</wp:posOffset>
+              <wp:posOffset>176479</wp:posOffset>
             </wp:positionV>
-            <wp:extent cx="5731510" cy="2851785"/>
-            <wp:effectExtent l="0" t="0" r="2540" b="5715"/>
+            <wp:extent cx="7367905" cy="3665220"/>
+            <wp:effectExtent l="0" t="0" r="4445" b="0"/>
             <wp:wrapSquare wrapText="bothSides"/>
             <wp:docPr id="2145294984" name="Picture 1" descr="A graph of a project&#10;&#10;AI-generated content may be incorrect."/>
             <wp:cNvGraphicFramePr>
@@ -9008,7 +9159,7 @@
                   <pic:spPr>
                     <a:xfrm>
                       <a:off x="0" y="0"/>
-                      <a:ext cx="5731510" cy="2851785"/>
+                      <a:ext cx="7367905" cy="3665220"/>
                     </a:xfrm>
                     <a:prstGeom prst="rect">
                       <a:avLst/>
@@ -9026,11 +9177,261 @@
           </wp:anchor>
         </w:drawing>
       </w:r>
-      <w:r>
-        <w:rPr>
-          <w:lang w:val="en-US"/>
-        </w:rPr>
-        <w:br/>
+    </w:p>
+    <w:p>
+      <w:pPr>
+        <w:rPr>
+          <w:lang w:val="en-US"/>
+        </w:rPr>
+      </w:pPr>
+    </w:p>
+    <w:p>
+      <w:pPr>
+        <w:pStyle w:val="Heading4"/>
+        <w:rPr>
+          <w:lang w:val="en-US"/>
+        </w:rPr>
+      </w:pPr>
+      <w:r>
+        <w:rPr>
+          <w:lang w:val="en-US"/>
+        </w:rPr>
+        <w:t>Fixing edge cases!</w:t>
+      </w:r>
+    </w:p>
+    <w:p>
+      <w:pPr>
+        <w:rPr>
+          <w:lang w:val="en-US"/>
+        </w:rPr>
+      </w:pPr>
+    </w:p>
+    <w:p>
+      <w:pPr>
+        <w:rPr>
+          <w:b/>
+          <w:bCs/>
+          <w:lang w:val="en-US"/>
+        </w:rPr>
+      </w:pPr>
+      <w:r>
+        <w:rPr>
+          <w:b/>
+          <w:bCs/>
+          <w:lang w:val="en-US"/>
+        </w:rPr>
+        <w:t>Preventing Users from Sending themselves friend requests:</w:t>
+      </w:r>
+      <w:r>
+        <w:rPr>
+          <w:b/>
+          <w:bCs/>
+          <w:lang w:val="en-US"/>
+        </w:rPr>
+        <w:br/>
+      </w:r>
+      <w:r>
+        <w:rPr>
+          <w:b/>
+          <w:bCs/>
+          <w:lang w:val="en-US"/>
+        </w:rPr>
+        <w:br/>
+      </w:r>
+      <w:r>
+        <w:rPr>
+          <w:b/>
+          <w:bCs/>
+          <w:lang w:val="en-US"/>
+        </w:rPr>
+        <w:drawing>
+          <wp:inline distT="0" distB="0" distL="0" distR="0" wp14:anchorId="48B2BDF1" wp14:editId="2679021E">
+            <wp:extent cx="3768597" cy="752801"/>
+            <wp:effectExtent l="0" t="0" r="3810" b="9525"/>
+            <wp:docPr id="1630975742" name="Picture 1" descr="A computer screen shot of a black background&#10;&#10;AI-generated content may be incorrect."/>
+            <wp:cNvGraphicFramePr>
+              <a:graphicFrameLocks xmlns:a="http://schemas.openxmlformats.org/drawingml/2006/main" noChangeAspect="1"/>
+            </wp:cNvGraphicFramePr>
+            <a:graphic xmlns:a="http://schemas.openxmlformats.org/drawingml/2006/main">
+              <a:graphicData uri="http://schemas.openxmlformats.org/drawingml/2006/picture">
+                <pic:pic xmlns:pic="http://schemas.openxmlformats.org/drawingml/2006/picture">
+                  <pic:nvPicPr>
+                    <pic:cNvPr id="1630975742" name="Picture 1" descr="A computer screen shot of a black background&#10;&#10;AI-generated content may be incorrect."/>
+                    <pic:cNvPicPr/>
+                  </pic:nvPicPr>
+                  <pic:blipFill>
+                    <a:blip r:embed="rId72"/>
+                    <a:stretch>
+                      <a:fillRect/>
+                    </a:stretch>
+                  </pic:blipFill>
+                  <pic:spPr>
+                    <a:xfrm>
+                      <a:off x="0" y="0"/>
+                      <a:ext cx="3797790" cy="758633"/>
+                    </a:xfrm>
+                    <a:prstGeom prst="rect">
+                      <a:avLst/>
+                    </a:prstGeom>
+                  </pic:spPr>
+                </pic:pic>
+              </a:graphicData>
+            </a:graphic>
+          </wp:inline>
+        </w:drawing>
+      </w:r>
+    </w:p>
+    <w:p>
+      <w:pPr>
+        <w:rPr>
+          <w:b/>
+          <w:bCs/>
+          <w:lang w:val="en-US"/>
+        </w:rPr>
+      </w:pPr>
+      <w:r>
+        <w:rPr>
+          <w:b/>
+          <w:bCs/>
+          <w:lang w:val="en-US"/>
+        </w:rPr>
+        <w:t>Stopping Users from sending duplicate requests to same user:</w:t>
+      </w:r>
+      <w:r>
+        <w:rPr>
+          <w:b/>
+          <w:bCs/>
+          <w:lang w:val="en-US"/>
+        </w:rPr>
+        <w:br/>
+      </w:r>
+      <w:r>
+        <w:rPr>
+          <w:b/>
+          <w:bCs/>
+          <w:lang w:val="en-US"/>
+        </w:rPr>
+        <w:drawing>
+          <wp:inline distT="0" distB="0" distL="0" distR="0" wp14:anchorId="70CAC4D9" wp14:editId="56748CE8">
+            <wp:extent cx="5731510" cy="726440"/>
+            <wp:effectExtent l="0" t="0" r="2540" b="0"/>
+            <wp:docPr id="1685875948" name="Picture 1" descr="A black background with a black border&#10;&#10;AI-generated content may be incorrect."/>
+            <wp:cNvGraphicFramePr>
+              <a:graphicFrameLocks xmlns:a="http://schemas.openxmlformats.org/drawingml/2006/main" noChangeAspect="1"/>
+            </wp:cNvGraphicFramePr>
+            <a:graphic xmlns:a="http://schemas.openxmlformats.org/drawingml/2006/main">
+              <a:graphicData uri="http://schemas.openxmlformats.org/drawingml/2006/picture">
+                <pic:pic xmlns:pic="http://schemas.openxmlformats.org/drawingml/2006/picture">
+                  <pic:nvPicPr>
+                    <pic:cNvPr id="1685875948" name="Picture 1" descr="A black background with a black border&#10;&#10;AI-generated content may be incorrect."/>
+                    <pic:cNvPicPr/>
+                  </pic:nvPicPr>
+                  <pic:blipFill>
+                    <a:blip r:embed="rId73"/>
+                    <a:stretch>
+                      <a:fillRect/>
+                    </a:stretch>
+                  </pic:blipFill>
+                  <pic:spPr>
+                    <a:xfrm>
+                      <a:off x="0" y="0"/>
+                      <a:ext cx="5731510" cy="726440"/>
+                    </a:xfrm>
+                    <a:prstGeom prst="rect">
+                      <a:avLst/>
+                    </a:prstGeom>
+                  </pic:spPr>
+                </pic:pic>
+              </a:graphicData>
+            </a:graphic>
+          </wp:inline>
+        </w:drawing>
+      </w:r>
+    </w:p>
+    <w:p>
+      <w:pPr>
+        <w:rPr>
+          <w:b/>
+          <w:bCs/>
+          <w:lang w:val="en-US"/>
+        </w:rPr>
+      </w:pPr>
+      <w:r>
+        <w:rPr>
+          <w:b/>
+          <w:bCs/>
+          <w:lang w:val="en-US"/>
+        </w:rPr>
+        <w:t>Stopping Users from sending requests to a User who has already sent them a pending request:</w:t>
+      </w:r>
+    </w:p>
+    <w:p>
+      <w:pPr>
+        <w:rPr>
+          <w:b/>
+          <w:bCs/>
+          <w:lang w:val="en-US"/>
+        </w:rPr>
+      </w:pPr>
+      <w:r>
+        <w:rPr>
+          <w:b/>
+          <w:bCs/>
+          <w:lang w:val="en-US"/>
+        </w:rPr>
+        <w:drawing>
+          <wp:inline distT="0" distB="0" distL="0" distR="0" wp14:anchorId="1A563B2F" wp14:editId="46107F46">
+            <wp:extent cx="5731510" cy="766445"/>
+            <wp:effectExtent l="0" t="0" r="2540" b="0"/>
+            <wp:docPr id="1380598840" name="Picture 1" descr="A black background with green lights&#10;&#10;AI-generated content may be incorrect."/>
+            <wp:cNvGraphicFramePr>
+              <a:graphicFrameLocks xmlns:a="http://schemas.openxmlformats.org/drawingml/2006/main" noChangeAspect="1"/>
+            </wp:cNvGraphicFramePr>
+            <a:graphic xmlns:a="http://schemas.openxmlformats.org/drawingml/2006/main">
+              <a:graphicData uri="http://schemas.openxmlformats.org/drawingml/2006/picture">
+                <pic:pic xmlns:pic="http://schemas.openxmlformats.org/drawingml/2006/picture">
+                  <pic:nvPicPr>
+                    <pic:cNvPr id="1380598840" name="Picture 1" descr="A black background with green lights&#10;&#10;AI-generated content may be incorrect."/>
+                    <pic:cNvPicPr/>
+                  </pic:nvPicPr>
+                  <pic:blipFill>
+                    <a:blip r:embed="rId74"/>
+                    <a:stretch>
+                      <a:fillRect/>
+                    </a:stretch>
+                  </pic:blipFill>
+                  <pic:spPr>
+                    <a:xfrm>
+                      <a:off x="0" y="0"/>
+                      <a:ext cx="5731510" cy="766445"/>
+                    </a:xfrm>
+                    <a:prstGeom prst="rect">
+                      <a:avLst/>
+                    </a:prstGeom>
+                  </pic:spPr>
+                </pic:pic>
+              </a:graphicData>
+            </a:graphic>
+          </wp:inline>
+        </w:drawing>
+      </w:r>
+    </w:p>
+    <w:p>
+      <w:pPr>
+        <w:rPr>
+          <w:rFonts w:asciiTheme="majorHAnsi" w:eastAsiaTheme="majorEastAsia" w:hAnsiTheme="majorHAnsi" w:cstheme="majorBidi"/>
+          <w:color w:val="0F4761" w:themeColor="accent1" w:themeShade="BF"/>
+          <w:sz w:val="32"/>
+          <w:szCs w:val="32"/>
+          <w:lang w:val="en-US"/>
+        </w:rPr>
+      </w:pPr>
+      <w:bookmarkStart w:id="6" w:name="_Toc214622122"/>
+      <w:r>
+        <w:rPr>
+          <w:lang w:val="en-US"/>
+        </w:rPr>
+        <w:br w:type="page"/>
       </w:r>
     </w:p>
     <w:p>
@@ -9040,11 +9441,11 @@
           <w:lang w:val="en-US"/>
         </w:rPr>
       </w:pPr>
-      <w:bookmarkStart w:id="6" w:name="_Toc214622122"/>
-      <w:r>
-        <w:rPr>
-          <w:lang w:val="en-US"/>
-        </w:rPr>
+      <w:r>
+        <w:rPr>
+          <w:lang w:val="en-US"/>
+        </w:rPr>
+        <w:lastRenderedPageBreak/>
         <w:t>TO DO:</w:t>
       </w:r>
       <w:bookmarkEnd w:id="6"/>
@@ -9058,34 +9459,6 @@
           <w:lang w:val="en-US"/>
         </w:rPr>
       </w:pPr>
-      <w:r>
-        <w:rPr>
-          <w:b/>
-          <w:bCs/>
-          <w:color w:val="EE0000"/>
-          <w:lang w:val="en-US"/>
-        </w:rPr>
-        <w:t>- Shouldn't be able to send yourself a request.</w:t>
-      </w:r>
-    </w:p>
-    <w:p>
-      <w:pPr>
-        <w:rPr>
-          <w:b/>
-          <w:bCs/>
-          <w:color w:val="EE0000"/>
-          <w:lang w:val="en-US"/>
-        </w:rPr>
-      </w:pPr>
-      <w:r>
-        <w:rPr>
-          <w:b/>
-          <w:bCs/>
-          <w:color w:val="EE0000"/>
-          <w:lang w:val="en-US"/>
-        </w:rPr>
-        <w:t>- Shouldn't be able to send multiple friend requests to same user.</w:t>
-      </w:r>
       <w:r>
         <w:rPr>
           <w:b/>
@@ -10969,6 +11342,18 @@
 </file>
 
 <file path=customXml/item1.xml><?xml version="1.0" encoding="utf-8"?>
+<b:Sources xmlns:b="http://schemas.openxmlformats.org/officeDocument/2006/bibliography" xmlns="http://schemas.openxmlformats.org/officeDocument/2006/bibliography" SelectedStyle="\APASixthEditionOfficeOnline.xsl" StyleName="APA" Version="6"/>
+</file>
+
+<file path=customXml/item2.xml><?xml version="1.0" encoding="utf-8"?>
+<p:properties xmlns:p="http://schemas.microsoft.com/office/2006/metadata/properties" xmlns:xsi="http://www.w3.org/2001/XMLSchema-instance" xmlns:pc="http://schemas.microsoft.com/office/infopath/2007/PartnerControls">
+  <documentManagement>
+    <_activity xmlns="c464522a-a754-430f-b544-fd87d4c168c2" xsi:nil="true"/>
+  </documentManagement>
+</p:properties>
+</file>
+
+<file path=customXml/item3.xml><?xml version="1.0" encoding="utf-8"?>
 <ct:contentTypeSchema xmlns:ct="http://schemas.microsoft.com/office/2006/metadata/contentType" xmlns:ma="http://schemas.microsoft.com/office/2006/metadata/properties/metaAttributes" ct:_="" ma:_="" ma:contentTypeName="Document" ma:contentTypeID="0x010100FD220758017CC846AA909CC7164ED159" ma:contentTypeVersion="9" ma:contentTypeDescription="Create a new document." ma:contentTypeScope="" ma:versionID="107195f5180327e81a14725ad49c53b2">
   <xsd:schema xmlns:xsd="http://www.w3.org/2001/XMLSchema" xmlns:xs="http://www.w3.org/2001/XMLSchema" xmlns:p="http://schemas.microsoft.com/office/2006/metadata/properties" xmlns:ns3="c464522a-a754-430f-b544-fd87d4c168c2" targetNamespace="http://schemas.microsoft.com/office/2006/metadata/properties" ma:root="true" ma:fieldsID="f73c64e9107e8a5bfbbc1902deeb9531" ns3:_="">
     <xsd:import namespace="c464522a-a754-430f-b544-fd87d4c168c2"/>
@@ -11142,18 +11527,6 @@
 </ct:contentTypeSchema>
 </file>
 
-<file path=customXml/item2.xml><?xml version="1.0" encoding="utf-8"?>
-<b:Sources xmlns:b="http://schemas.openxmlformats.org/officeDocument/2006/bibliography" xmlns="http://schemas.openxmlformats.org/officeDocument/2006/bibliography" SelectedStyle="\APASixthEditionOfficeOnline.xsl" StyleName="APA" Version="6"/>
-</file>
-
-<file path=customXml/item3.xml><?xml version="1.0" encoding="utf-8"?>
-<p:properties xmlns:p="http://schemas.microsoft.com/office/2006/metadata/properties" xmlns:xsi="http://www.w3.org/2001/XMLSchema-instance" xmlns:pc="http://schemas.microsoft.com/office/infopath/2007/PartnerControls">
-  <documentManagement>
-    <_activity xmlns="c464522a-a754-430f-b544-fd87d4c168c2" xsi:nil="true"/>
-  </documentManagement>
-</p:properties>
-</file>
-
 <file path=customXml/item4.xml><?xml version="1.0" encoding="utf-8"?>
 <?mso-contentType ?>
 <FormTemplates xmlns="http://schemas.microsoft.com/sharepoint/v3/contenttype/forms">
@@ -11164,6 +11537,24 @@
 </file>
 
 <file path=customXml/itemProps1.xml><?xml version="1.0" encoding="utf-8"?>
+<ds:datastoreItem xmlns:ds="http://schemas.openxmlformats.org/officeDocument/2006/customXml" ds:itemID="{238C6C0A-4621-4E84-9BEB-57ADB3D29432}">
+  <ds:schemaRefs>
+    <ds:schemaRef ds:uri="http://schemas.openxmlformats.org/officeDocument/2006/bibliography"/>
+  </ds:schemaRefs>
+</ds:datastoreItem>
+</file>
+
+<file path=customXml/itemProps2.xml><?xml version="1.0" encoding="utf-8"?>
+<ds:datastoreItem xmlns:ds="http://schemas.openxmlformats.org/officeDocument/2006/customXml" ds:itemID="{F79638DA-D241-4BF3-8AD6-7F74018D56BD}">
+  <ds:schemaRefs>
+    <ds:schemaRef ds:uri="http://schemas.microsoft.com/office/2006/metadata/properties"/>
+    <ds:schemaRef ds:uri="http://schemas.microsoft.com/office/infopath/2007/PartnerControls"/>
+    <ds:schemaRef ds:uri="c464522a-a754-430f-b544-fd87d4c168c2"/>
+  </ds:schemaRefs>
+</ds:datastoreItem>
+</file>
+
+<file path=customXml/itemProps3.xml><?xml version="1.0" encoding="utf-8"?>
 <ds:datastoreItem xmlns:ds="http://schemas.openxmlformats.org/officeDocument/2006/customXml" ds:itemID="{DF38D78A-FDB7-47F3-B2C0-0D7B5F170E7B}">
   <ds:schemaRefs>
     <ds:schemaRef ds:uri="http://schemas.microsoft.com/office/2006/metadata/contentType"/>
@@ -11181,24 +11572,6 @@
 </ds:datastoreItem>
 </file>
 
-<file path=customXml/itemProps2.xml><?xml version="1.0" encoding="utf-8"?>
-<ds:datastoreItem xmlns:ds="http://schemas.openxmlformats.org/officeDocument/2006/customXml" ds:itemID="{238C6C0A-4621-4E84-9BEB-57ADB3D29432}">
-  <ds:schemaRefs>
-    <ds:schemaRef ds:uri="http://schemas.openxmlformats.org/officeDocument/2006/bibliography"/>
-  </ds:schemaRefs>
-</ds:datastoreItem>
-</file>
-
-<file path=customXml/itemProps3.xml><?xml version="1.0" encoding="utf-8"?>
-<ds:datastoreItem xmlns:ds="http://schemas.openxmlformats.org/officeDocument/2006/customXml" ds:itemID="{F79638DA-D241-4BF3-8AD6-7F74018D56BD}">
-  <ds:schemaRefs>
-    <ds:schemaRef ds:uri="http://schemas.microsoft.com/office/2006/metadata/properties"/>
-    <ds:schemaRef ds:uri="http://schemas.microsoft.com/office/infopath/2007/PartnerControls"/>
-    <ds:schemaRef ds:uri="c464522a-a754-430f-b544-fd87d4c168c2"/>
-  </ds:schemaRefs>
-</ds:datastoreItem>
-</file>
-
 <file path=customXml/itemProps4.xml><?xml version="1.0" encoding="utf-8"?>
 <ds:datastoreItem xmlns:ds="http://schemas.openxmlformats.org/officeDocument/2006/customXml" ds:itemID="{C1AA33A3-61AD-4339-9E8A-C5DBB01DCEDF}">
   <ds:schemaRefs>

</xml_diff>

<commit_message>
Ability to Deny friend requests: - Deny button added. - When clicked, updates status to denied and refreshes list to exclude denied request.
</commit_message>
<xml_diff>
--- a/Documentation/COMP3000 - Progress Report.docx
+++ b/Documentation/COMP3000 - Progress Report.docx
@@ -1401,21 +1401,7 @@
         <w:rPr>
           <w:lang w:val="en-US"/>
         </w:rPr>
-        <w:t xml:space="preserve">from stock expo </w:t>
-      </w:r>
-      <w:proofErr w:type="spellStart"/>
-      <w:r>
-        <w:rPr>
-          <w:lang w:val="en-US"/>
-        </w:rPr>
-        <w:t>ui</w:t>
-      </w:r>
-      <w:proofErr w:type="spellEnd"/>
-      <w:r>
-        <w:rPr>
-          <w:lang w:val="en-US"/>
-        </w:rPr>
-        <w:t xml:space="preserve"> </w:t>
+        <w:t xml:space="preserve">from stock expo ui </w:t>
       </w:r>
       <w:r>
         <w:rPr>
@@ -1658,35 +1644,7 @@
         <w:rPr>
           <w:lang w:val="en-US"/>
         </w:rPr>
-        <w:t xml:space="preserve">Replaced </w:t>
-      </w:r>
-      <w:proofErr w:type="spellStart"/>
-      <w:r>
-        <w:rPr>
-          <w:lang w:val="en-US"/>
-        </w:rPr>
-        <w:t>HomeScreen</w:t>
-      </w:r>
-      <w:proofErr w:type="spellEnd"/>
-      <w:r>
-        <w:rPr>
-          <w:lang w:val="en-US"/>
-        </w:rPr>
-        <w:t xml:space="preserve"> with </w:t>
-      </w:r>
-      <w:proofErr w:type="spellStart"/>
-      <w:r>
-        <w:rPr>
-          <w:lang w:val="en-US"/>
-        </w:rPr>
-        <w:t>LoginScreen</w:t>
-      </w:r>
-      <w:proofErr w:type="spellEnd"/>
-      <w:r>
-        <w:rPr>
-          <w:lang w:val="en-US"/>
-        </w:rPr>
-        <w:t xml:space="preserve"> with </w:t>
+        <w:t xml:space="preserve">Replaced HomeScreen with LoginScreen with </w:t>
       </w:r>
       <w:r>
         <w:rPr>
@@ -5534,60 +5492,24 @@
           <w:bCs/>
           <w:lang w:val="en-US"/>
         </w:rPr>
-        <w:t xml:space="preserve">- Developed </w:t>
-      </w:r>
-      <w:proofErr w:type="spellStart"/>
-      <w:r>
-        <w:rPr>
-          <w:b/>
-          <w:bCs/>
-          <w:lang w:val="en-US"/>
-        </w:rPr>
-        <w:t>friends.tsx</w:t>
-      </w:r>
-      <w:proofErr w:type="spellEnd"/>
-      <w:r>
-        <w:rPr>
-          <w:b/>
-          <w:bCs/>
-          <w:lang w:val="en-US"/>
-        </w:rPr>
-        <w:t xml:space="preserve"> tab further to show this:</w:t>
-      </w:r>
-    </w:p>
-    <w:p>
-      <w:pPr>
-        <w:rPr>
-          <w:b/>
-          <w:bCs/>
-          <w:lang w:val="en-US"/>
-        </w:rPr>
-      </w:pPr>
-      <w:r>
-        <w:rPr>
-          <w:b/>
-          <w:bCs/>
-          <w:lang w:val="en-US"/>
-        </w:rPr>
-        <w:t xml:space="preserve">Referenced for </w:t>
-      </w:r>
-      <w:proofErr w:type="spellStart"/>
-      <w:r>
-        <w:rPr>
-          <w:b/>
-          <w:bCs/>
-          <w:lang w:val="en-US"/>
-        </w:rPr>
-        <w:t>FlatList</w:t>
-      </w:r>
-      <w:proofErr w:type="spellEnd"/>
-      <w:r>
-        <w:rPr>
-          <w:b/>
-          <w:bCs/>
-          <w:lang w:val="en-US"/>
-        </w:rPr>
-        <w:t xml:space="preserve"> usage: </w:t>
+        <w:t>- Developed friends.tsx tab further to show this:</w:t>
+      </w:r>
+    </w:p>
+    <w:p>
+      <w:pPr>
+        <w:rPr>
+          <w:b/>
+          <w:bCs/>
+          <w:lang w:val="en-US"/>
+        </w:rPr>
+      </w:pPr>
+      <w:r>
+        <w:rPr>
+          <w:b/>
+          <w:bCs/>
+          <w:lang w:val="en-US"/>
+        </w:rPr>
+        <w:t xml:space="preserve">Referenced for FlatList usage: </w:t>
       </w:r>
       <w:hyperlink r:id="rId55" w:history="1">
         <w:r>
@@ -6459,25 +6381,7 @@
           <w:bCs/>
           <w:lang w:val="en-US"/>
         </w:rPr>
-        <w:t xml:space="preserve">(fun error when loading Friends Tab, assume </w:t>
-      </w:r>
-      <w:proofErr w:type="spellStart"/>
-      <w:r>
-        <w:rPr>
-          <w:b/>
-          <w:bCs/>
-          <w:lang w:val="en-US"/>
-        </w:rPr>
-        <w:t>its</w:t>
-      </w:r>
-      <w:proofErr w:type="spellEnd"/>
-      <w:r>
-        <w:rPr>
-          <w:b/>
-          <w:bCs/>
-          <w:lang w:val="en-US"/>
-        </w:rPr>
-        <w:t xml:space="preserve"> to do with there not being any requests to display and not having accounted for this in code :/)</w:t>
+        <w:t>(fun error when loading Friends Tab, assume its to do with there not being any requests to display and not having accounted for this in code :/)</w:t>
       </w:r>
       <w:r>
         <w:rPr>
@@ -7174,25 +7078,7 @@
           <w:bCs/>
           <w:lang w:val="en-US"/>
         </w:rPr>
-        <w:t xml:space="preserve">Using </w:t>
-      </w:r>
-      <w:proofErr w:type="spellStart"/>
-      <w:r>
-        <w:rPr>
-          <w:b/>
-          <w:bCs/>
-          <w:lang w:val="en-US"/>
-        </w:rPr>
-        <w:t>useIsFocused</w:t>
-      </w:r>
-      <w:proofErr w:type="spellEnd"/>
-      <w:r>
-        <w:rPr>
-          <w:b/>
-          <w:bCs/>
-          <w:lang w:val="en-US"/>
-        </w:rPr>
-        <w:t xml:space="preserve"> listener instead, returns “true” whenever the screen comes into view, meaning username updates every time you navigate to dashboard.</w:t>
+        <w:t>Using useIsFocused listener instead, returns “true” whenever the screen comes into view, meaning username updates every time you navigate to dashboard.</w:t>
       </w:r>
       <w:r>
         <w:rPr>
@@ -7347,43 +7233,7 @@
           <w:bCs/>
           <w:lang w:val="en-US"/>
         </w:rPr>
-        <w:t xml:space="preserve">Removed </w:t>
-      </w:r>
-      <w:proofErr w:type="spellStart"/>
-      <w:r>
-        <w:rPr>
-          <w:b/>
-          <w:bCs/>
-          <w:lang w:val="en-US"/>
-        </w:rPr>
-        <w:t>localSearchParams</w:t>
-      </w:r>
-      <w:proofErr w:type="spellEnd"/>
-      <w:r>
-        <w:rPr>
-          <w:b/>
-          <w:bCs/>
-          <w:lang w:val="en-US"/>
-        </w:rPr>
-        <w:t xml:space="preserve"> and replaced with AsyncStorage and </w:t>
-      </w:r>
-      <w:proofErr w:type="spellStart"/>
-      <w:r>
-        <w:rPr>
-          <w:b/>
-          <w:bCs/>
-          <w:lang w:val="en-US"/>
-        </w:rPr>
-        <w:t>useIsFocused</w:t>
-      </w:r>
-      <w:proofErr w:type="spellEnd"/>
-      <w:r>
-        <w:rPr>
-          <w:b/>
-          <w:bCs/>
-          <w:lang w:val="en-US"/>
-        </w:rPr>
-        <w:t xml:space="preserve"> (same as dashboard.tsx).</w:t>
+        <w:t>Removed localSearchParams and replaced with AsyncStorage and useIsFocused (same as dashboard.tsx).</w:t>
       </w:r>
       <w:r>
         <w:rPr>
@@ -9236,14 +9086,6 @@
           <w:bCs/>
           <w:lang w:val="en-US"/>
         </w:rPr>
-        <w:br/>
-      </w:r>
-      <w:r>
-        <w:rPr>
-          <w:b/>
-          <w:bCs/>
-          <w:lang w:val="en-US"/>
-        </w:rPr>
         <w:drawing>
           <wp:inline distT="0" distB="0" distL="0" distR="0" wp14:anchorId="48B2BDF1" wp14:editId="2679021E">
             <wp:extent cx="3768597" cy="752801"/>
@@ -9380,10 +9222,10 @@
           <w:lang w:val="en-US"/>
         </w:rPr>
         <w:drawing>
-          <wp:inline distT="0" distB="0" distL="0" distR="0" wp14:anchorId="1A563B2F" wp14:editId="46107F46">
-            <wp:extent cx="5731510" cy="766445"/>
-            <wp:effectExtent l="0" t="0" r="2540" b="0"/>
-            <wp:docPr id="1380598840" name="Picture 1" descr="A black background with green lights&#10;&#10;AI-generated content may be incorrect."/>
+          <wp:inline distT="0" distB="0" distL="0" distR="0" wp14:anchorId="069CB14C" wp14:editId="09726CAF">
+            <wp:extent cx="5731510" cy="757555"/>
+            <wp:effectExtent l="0" t="0" r="2540" b="4445"/>
+            <wp:docPr id="1651585037" name="Picture 1" descr="A black screen with green and blue text&#10;&#10;AI-generated content may be incorrect."/>
             <wp:cNvGraphicFramePr>
               <a:graphicFrameLocks xmlns:a="http://schemas.openxmlformats.org/drawingml/2006/main" noChangeAspect="1"/>
             </wp:cNvGraphicFramePr>
@@ -9391,7 +9233,7 @@
               <a:graphicData uri="http://schemas.openxmlformats.org/drawingml/2006/picture">
                 <pic:pic xmlns:pic="http://schemas.openxmlformats.org/drawingml/2006/picture">
                   <pic:nvPicPr>
-                    <pic:cNvPr id="1380598840" name="Picture 1" descr="A black background with green lights&#10;&#10;AI-generated content may be incorrect."/>
+                    <pic:cNvPr id="1651585037" name="Picture 1" descr="A black screen with green and blue text&#10;&#10;AI-generated content may be incorrect."/>
                     <pic:cNvPicPr/>
                   </pic:nvPicPr>
                   <pic:blipFill>
@@ -9403,7 +9245,7 @@
                   <pic:spPr>
                     <a:xfrm>
                       <a:off x="0" y="0"/>
-                      <a:ext cx="5731510" cy="766445"/>
+                      <a:ext cx="5731510" cy="757555"/>
                     </a:xfrm>
                     <a:prstGeom prst="rect">
                       <a:avLst/>
@@ -9418,11 +9260,8 @@
     </w:p>
     <w:p>
       <w:pPr>
-        <w:rPr>
-          <w:rFonts w:asciiTheme="majorHAnsi" w:eastAsiaTheme="majorEastAsia" w:hAnsiTheme="majorHAnsi" w:cstheme="majorBidi"/>
-          <w:color w:val="0F4761" w:themeColor="accent1" w:themeShade="BF"/>
-          <w:sz w:val="32"/>
-          <w:szCs w:val="32"/>
+        <w:pStyle w:val="Heading4"/>
+        <w:rPr>
           <w:lang w:val="en-US"/>
         </w:rPr>
       </w:pPr>
@@ -9433,40 +9272,770 @@
         </w:rPr>
         <w:br w:type="page"/>
       </w:r>
-    </w:p>
-    <w:p>
-      <w:pPr>
-        <w:pStyle w:val="Heading2"/>
-        <w:rPr>
-          <w:lang w:val="en-US"/>
-        </w:rPr>
-      </w:pPr>
-      <w:r>
-        <w:rPr>
+      <w:bookmarkEnd w:id="6"/>
+      <w:r>
+        <w:rPr>
+          <w:b/>
+          <w:bCs/>
           <w:lang w:val="en-US"/>
         </w:rPr>
         <w:lastRenderedPageBreak/>
-        <w:t>TO DO:</w:t>
-      </w:r>
-      <w:bookmarkEnd w:id="6"/>
-    </w:p>
-    <w:p>
-      <w:pPr>
-        <w:rPr>
-          <w:b/>
-          <w:bCs/>
-          <w:color w:val="EE0000"/>
-          <w:lang w:val="en-US"/>
-        </w:rPr>
-      </w:pPr>
-      <w:r>
-        <w:rPr>
-          <w:b/>
-          <w:bCs/>
-          <w:color w:val="EE0000"/>
-          <w:lang w:val="en-US"/>
-        </w:rPr>
-        <w:br/>
+        <w:drawing>
+          <wp:anchor distT="0" distB="0" distL="114300" distR="114300" simplePos="0" relativeHeight="251697152" behindDoc="0" locked="0" layoutInCell="1" allowOverlap="1" wp14:anchorId="6143861D" wp14:editId="1C7BB22F">
+            <wp:simplePos x="0" y="0"/>
+            <wp:positionH relativeFrom="margin">
+              <wp:posOffset>4493895</wp:posOffset>
+            </wp:positionH>
+            <wp:positionV relativeFrom="paragraph">
+              <wp:posOffset>489</wp:posOffset>
+            </wp:positionV>
+            <wp:extent cx="1863969" cy="4108856"/>
+            <wp:effectExtent l="0" t="0" r="3175" b="6350"/>
+            <wp:wrapSquare wrapText="bothSides"/>
+            <wp:docPr id="1807220430" name="Picture 1" descr="A screenshot of a phone&#10;&#10;AI-generated content may be incorrect."/>
+            <wp:cNvGraphicFramePr>
+              <a:graphicFrameLocks xmlns:a="http://schemas.openxmlformats.org/drawingml/2006/main" noChangeAspect="1"/>
+            </wp:cNvGraphicFramePr>
+            <a:graphic xmlns:a="http://schemas.openxmlformats.org/drawingml/2006/main">
+              <a:graphicData uri="http://schemas.openxmlformats.org/drawingml/2006/picture">
+                <pic:pic xmlns:pic="http://schemas.openxmlformats.org/drawingml/2006/picture">
+                  <pic:nvPicPr>
+                    <pic:cNvPr id="1807220430" name="Picture 1" descr="A screenshot of a phone&#10;&#10;AI-generated content may be incorrect."/>
+                    <pic:cNvPicPr/>
+                  </pic:nvPicPr>
+                  <pic:blipFill>
+                    <a:blip r:embed="rId75" cstate="print">
+                      <a:extLst>
+                        <a:ext uri="{28A0092B-C50C-407E-A947-70E740481C1C}">
+                          <a14:useLocalDpi xmlns:a14="http://schemas.microsoft.com/office/drawing/2010/main" val="0"/>
+                        </a:ext>
+                      </a:extLst>
+                    </a:blip>
+                    <a:stretch>
+                      <a:fillRect/>
+                    </a:stretch>
+                  </pic:blipFill>
+                  <pic:spPr>
+                    <a:xfrm>
+                      <a:off x="0" y="0"/>
+                      <a:ext cx="1863969" cy="4108856"/>
+                    </a:xfrm>
+                    <a:prstGeom prst="rect">
+                      <a:avLst/>
+                    </a:prstGeom>
+                  </pic:spPr>
+                </pic:pic>
+              </a:graphicData>
+            </a:graphic>
+            <wp14:sizeRelH relativeFrom="page">
+              <wp14:pctWidth>0</wp14:pctWidth>
+            </wp14:sizeRelH>
+            <wp14:sizeRelV relativeFrom="page">
+              <wp14:pctHeight>0</wp14:pctHeight>
+            </wp14:sizeRelV>
+          </wp:anchor>
+        </w:drawing>
+      </w:r>
+      <w:r>
+        <w:rPr>
+          <w:lang w:val="en-US"/>
+        </w:rPr>
+        <w:t>Denying Friend Requests</w:t>
+      </w:r>
+    </w:p>
+    <w:p>
+      <w:pPr>
+        <w:rPr>
+          <w:lang w:val="en-US"/>
+        </w:rPr>
+      </w:pPr>
+    </w:p>
+    <w:p>
+      <w:pPr>
+        <w:pStyle w:val="ListParagraph"/>
+        <w:numPr>
+          <w:ilvl w:val="0"/>
+          <w:numId w:val="6"/>
+        </w:numPr>
+        <w:rPr>
+          <w:b/>
+          <w:bCs/>
+          <w:lang w:val="en-US"/>
+        </w:rPr>
+      </w:pPr>
+      <w:r>
+        <w:drawing>
+          <wp:anchor distT="0" distB="0" distL="114300" distR="114300" simplePos="0" relativeHeight="251694080" behindDoc="0" locked="0" layoutInCell="1" allowOverlap="1" wp14:anchorId="73DCA0E9" wp14:editId="102CA9D3">
+            <wp:simplePos x="0" y="0"/>
+            <wp:positionH relativeFrom="margin">
+              <wp:posOffset>-527538</wp:posOffset>
+            </wp:positionH>
+            <wp:positionV relativeFrom="paragraph">
+              <wp:posOffset>366395</wp:posOffset>
+            </wp:positionV>
+            <wp:extent cx="4917440" cy="1744345"/>
+            <wp:effectExtent l="0" t="0" r="0" b="8255"/>
+            <wp:wrapSquare wrapText="bothSides"/>
+            <wp:docPr id="667564884" name="Picture 1" descr="A computer code on a black background&#10;&#10;AI-generated content may be incorrect."/>
+            <wp:cNvGraphicFramePr>
+              <a:graphicFrameLocks xmlns:a="http://schemas.openxmlformats.org/drawingml/2006/main" noChangeAspect="1"/>
+            </wp:cNvGraphicFramePr>
+            <a:graphic xmlns:a="http://schemas.openxmlformats.org/drawingml/2006/main">
+              <a:graphicData uri="http://schemas.openxmlformats.org/drawingml/2006/picture">
+                <pic:pic xmlns:pic="http://schemas.openxmlformats.org/drawingml/2006/picture">
+                  <pic:nvPicPr>
+                    <pic:cNvPr id="667564884" name="Picture 1" descr="A computer code on a black background&#10;&#10;AI-generated content may be incorrect."/>
+                    <pic:cNvPicPr/>
+                  </pic:nvPicPr>
+                  <pic:blipFill>
+                    <a:blip r:embed="rId76" cstate="print">
+                      <a:extLst>
+                        <a:ext uri="{28A0092B-C50C-407E-A947-70E740481C1C}">
+                          <a14:useLocalDpi xmlns:a14="http://schemas.microsoft.com/office/drawing/2010/main" val="0"/>
+                        </a:ext>
+                      </a:extLst>
+                    </a:blip>
+                    <a:stretch>
+                      <a:fillRect/>
+                    </a:stretch>
+                  </pic:blipFill>
+                  <pic:spPr>
+                    <a:xfrm>
+                      <a:off x="0" y="0"/>
+                      <a:ext cx="4917440" cy="1744345"/>
+                    </a:xfrm>
+                    <a:prstGeom prst="rect">
+                      <a:avLst/>
+                    </a:prstGeom>
+                  </pic:spPr>
+                </pic:pic>
+              </a:graphicData>
+            </a:graphic>
+            <wp14:sizeRelH relativeFrom="page">
+              <wp14:pctWidth>0</wp14:pctWidth>
+            </wp14:sizeRelH>
+            <wp14:sizeRelV relativeFrom="page">
+              <wp14:pctHeight>0</wp14:pctHeight>
+            </wp14:sizeRelV>
+          </wp:anchor>
+        </w:drawing>
+      </w:r>
+      <w:r>
+        <w:rPr>
+          <w:b/>
+          <w:bCs/>
+          <w:lang w:val="en-US"/>
+        </w:rPr>
+        <w:t>Adding Deny button to requests</w:t>
+      </w:r>
+      <w:r>
+        <w:rPr>
+          <w:b/>
+          <w:bCs/>
+          <w:lang w:val="en-US"/>
+        </w:rPr>
+        <w:t xml:space="preserve"> and removing them when clicked.</w:t>
+      </w:r>
+    </w:p>
+    <w:p>
+      <w:pPr>
+        <w:rPr>
+          <w:b/>
+          <w:bCs/>
+          <w:lang w:val="en-US"/>
+        </w:rPr>
+      </w:pPr>
+    </w:p>
+    <w:p>
+      <w:pPr>
+        <w:pStyle w:val="ListParagraph"/>
+        <w:numPr>
+          <w:ilvl w:val="0"/>
+          <w:numId w:val="6"/>
+        </w:numPr>
+        <w:rPr>
+          <w:b/>
+          <w:bCs/>
+          <w:lang w:val="en-US"/>
+        </w:rPr>
+      </w:pPr>
+      <w:r>
+        <w:rPr>
+          <w:b/>
+          <w:bCs/>
+          <w:lang w:val="en-US"/>
+        </w:rPr>
+        <w:t>Created denyFriendRequest function in Firestore.js to update the status of the request to “denied” via the requestId (item.id).</w:t>
+      </w:r>
+    </w:p>
+    <w:p>
+      <w:pPr>
+        <w:rPr>
+          <w:b/>
+          <w:bCs/>
+        </w:rPr>
+      </w:pPr>
+      <w:r>
+        <w:rPr>
+          <w:b/>
+          <w:bCs/>
+        </w:rPr>
+        <w:drawing>
+          <wp:anchor distT="0" distB="0" distL="114300" distR="114300" simplePos="0" relativeHeight="251695104" behindDoc="0" locked="0" layoutInCell="1" allowOverlap="1" wp14:anchorId="064E70E4" wp14:editId="7F7A416B">
+            <wp:simplePos x="0" y="0"/>
+            <wp:positionH relativeFrom="margin">
+              <wp:posOffset>378949</wp:posOffset>
+            </wp:positionH>
+            <wp:positionV relativeFrom="paragraph">
+              <wp:posOffset>8255</wp:posOffset>
+            </wp:positionV>
+            <wp:extent cx="2722880" cy="1989455"/>
+            <wp:effectExtent l="0" t="0" r="1270" b="0"/>
+            <wp:wrapSquare wrapText="bothSides"/>
+            <wp:docPr id="369213396" name="Picture 1" descr="A computer screen shot of a program code&#10;&#10;AI-generated content may be incorrect."/>
+            <wp:cNvGraphicFramePr>
+              <a:graphicFrameLocks xmlns:a="http://schemas.openxmlformats.org/drawingml/2006/main" noChangeAspect="1"/>
+            </wp:cNvGraphicFramePr>
+            <a:graphic xmlns:a="http://schemas.openxmlformats.org/drawingml/2006/main">
+              <a:graphicData uri="http://schemas.openxmlformats.org/drawingml/2006/picture">
+                <pic:pic xmlns:pic="http://schemas.openxmlformats.org/drawingml/2006/picture">
+                  <pic:nvPicPr>
+                    <pic:cNvPr id="369213396" name="Picture 1" descr="A computer screen shot of a program code&#10;&#10;AI-generated content may be incorrect."/>
+                    <pic:cNvPicPr/>
+                  </pic:nvPicPr>
+                  <pic:blipFill>
+                    <a:blip r:embed="rId77" cstate="print">
+                      <a:extLst>
+                        <a:ext uri="{28A0092B-C50C-407E-A947-70E740481C1C}">
+                          <a14:useLocalDpi xmlns:a14="http://schemas.microsoft.com/office/drawing/2010/main" val="0"/>
+                        </a:ext>
+                      </a:extLst>
+                    </a:blip>
+                    <a:stretch>
+                      <a:fillRect/>
+                    </a:stretch>
+                  </pic:blipFill>
+                  <pic:spPr>
+                    <a:xfrm>
+                      <a:off x="0" y="0"/>
+                      <a:ext cx="2722880" cy="1989455"/>
+                    </a:xfrm>
+                    <a:prstGeom prst="rect">
+                      <a:avLst/>
+                    </a:prstGeom>
+                  </pic:spPr>
+                </pic:pic>
+              </a:graphicData>
+            </a:graphic>
+            <wp14:sizeRelH relativeFrom="page">
+              <wp14:pctWidth>0</wp14:pctWidth>
+            </wp14:sizeRelH>
+            <wp14:sizeRelV relativeFrom="page">
+              <wp14:pctHeight>0</wp14:pctHeight>
+            </wp14:sizeRelV>
+          </wp:anchor>
+        </w:drawing>
+      </w:r>
+    </w:p>
+    <w:p>
+      <w:pPr>
+        <w:rPr>
+          <w:b/>
+          <w:bCs/>
+          <w:lang w:val="en-US"/>
+        </w:rPr>
+      </w:pPr>
+      <w:r>
+        <w:rPr>
+          <w:b/>
+          <w:bCs/>
+          <w:lang w:val="en-US"/>
+        </w:rPr>
+        <w:br/>
+      </w:r>
+    </w:p>
+    <w:p>
+      <w:pPr>
+        <w:rPr>
+          <w:b/>
+          <w:bCs/>
+          <w:lang w:val="en-US"/>
+        </w:rPr>
+      </w:pPr>
+    </w:p>
+    <w:p>
+      <w:pPr>
+        <w:rPr>
+          <w:b/>
+          <w:bCs/>
+          <w:lang w:val="en-US"/>
+        </w:rPr>
+      </w:pPr>
+    </w:p>
+    <w:p>
+      <w:pPr>
+        <w:rPr>
+          <w:b/>
+          <w:bCs/>
+          <w:lang w:val="en-US"/>
+        </w:rPr>
+      </w:pPr>
+      <w:r>
+        <w:rPr>
+          <w:lang w:val="en-US"/>
+        </w:rPr>
+        <w:drawing>
+          <wp:anchor distT="0" distB="0" distL="114300" distR="114300" simplePos="0" relativeHeight="251698176" behindDoc="0" locked="0" layoutInCell="1" allowOverlap="1" wp14:anchorId="2BCEECD2" wp14:editId="3F216707">
+            <wp:simplePos x="0" y="0"/>
+            <wp:positionH relativeFrom="page">
+              <wp:posOffset>4893896</wp:posOffset>
+            </wp:positionH>
+            <wp:positionV relativeFrom="paragraph">
+              <wp:posOffset>8255</wp:posOffset>
+            </wp:positionV>
+            <wp:extent cx="2414270" cy="2103120"/>
+            <wp:effectExtent l="0" t="0" r="5080" b="0"/>
+            <wp:wrapSquare wrapText="bothSides"/>
+            <wp:docPr id="695077804" name="Picture 1" descr="A screenshot of a message&#10;&#10;AI-generated content may be incorrect."/>
+            <wp:cNvGraphicFramePr>
+              <a:graphicFrameLocks xmlns:a="http://schemas.openxmlformats.org/drawingml/2006/main" noChangeAspect="1"/>
+            </wp:cNvGraphicFramePr>
+            <a:graphic xmlns:a="http://schemas.openxmlformats.org/drawingml/2006/main">
+              <a:graphicData uri="http://schemas.openxmlformats.org/drawingml/2006/picture">
+                <pic:pic xmlns:pic="http://schemas.openxmlformats.org/drawingml/2006/picture">
+                  <pic:nvPicPr>
+                    <pic:cNvPr id="695077804" name="Picture 1" descr="A screenshot of a message&#10;&#10;AI-generated content may be incorrect."/>
+                    <pic:cNvPicPr/>
+                  </pic:nvPicPr>
+                  <pic:blipFill>
+                    <a:blip r:embed="rId78" cstate="print">
+                      <a:extLst>
+                        <a:ext uri="{28A0092B-C50C-407E-A947-70E740481C1C}">
+                          <a14:useLocalDpi xmlns:a14="http://schemas.microsoft.com/office/drawing/2010/main" val="0"/>
+                        </a:ext>
+                      </a:extLst>
+                    </a:blip>
+                    <a:stretch>
+                      <a:fillRect/>
+                    </a:stretch>
+                  </pic:blipFill>
+                  <pic:spPr>
+                    <a:xfrm>
+                      <a:off x="0" y="0"/>
+                      <a:ext cx="2414270" cy="2103120"/>
+                    </a:xfrm>
+                    <a:prstGeom prst="rect">
+                      <a:avLst/>
+                    </a:prstGeom>
+                  </pic:spPr>
+                </pic:pic>
+              </a:graphicData>
+            </a:graphic>
+            <wp14:sizeRelH relativeFrom="page">
+              <wp14:pctWidth>0</wp14:pctWidth>
+            </wp14:sizeRelH>
+            <wp14:sizeRelV relativeFrom="page">
+              <wp14:pctHeight>0</wp14:pctHeight>
+            </wp14:sizeRelV>
+          </wp:anchor>
+        </w:drawing>
+      </w:r>
+    </w:p>
+    <w:p>
+      <w:pPr>
+        <w:rPr>
+          <w:b/>
+          <w:bCs/>
+          <w:lang w:val="en-US"/>
+        </w:rPr>
+      </w:pPr>
+    </w:p>
+    <w:p>
+      <w:pPr>
+        <w:rPr>
+          <w:b/>
+          <w:bCs/>
+          <w:lang w:val="en-US"/>
+        </w:rPr>
+      </w:pPr>
+    </w:p>
+    <w:p>
+      <w:pPr>
+        <w:rPr>
+          <w:b/>
+          <w:bCs/>
+          <w:lang w:val="en-US"/>
+        </w:rPr>
+      </w:pPr>
+    </w:p>
+    <w:p>
+      <w:pPr>
+        <w:pStyle w:val="ListParagraph"/>
+        <w:numPr>
+          <w:ilvl w:val="0"/>
+          <w:numId w:val="6"/>
+        </w:numPr>
+        <w:rPr>
+          <w:b/>
+          <w:bCs/>
+          <w:lang w:val="en-US"/>
+        </w:rPr>
+      </w:pPr>
+      <w:r>
+        <w:rPr>
+          <w:b/>
+          <w:bCs/>
+          <w:lang w:val="en-US"/>
+        </w:rPr>
+        <w:drawing>
+          <wp:anchor distT="0" distB="0" distL="114300" distR="114300" simplePos="0" relativeHeight="251699200" behindDoc="0" locked="0" layoutInCell="1" allowOverlap="1" wp14:anchorId="603D968C" wp14:editId="23B3ADDB">
+            <wp:simplePos x="0" y="0"/>
+            <wp:positionH relativeFrom="margin">
+              <wp:posOffset>3936316</wp:posOffset>
+            </wp:positionH>
+            <wp:positionV relativeFrom="paragraph">
+              <wp:posOffset>1040667</wp:posOffset>
+            </wp:positionV>
+            <wp:extent cx="2421890" cy="1981835"/>
+            <wp:effectExtent l="0" t="0" r="0" b="0"/>
+            <wp:wrapSquare wrapText="bothSides"/>
+            <wp:docPr id="904463550" name="Picture 1" descr="A screenshot of a message&#10;&#10;AI-generated content may be incorrect."/>
+            <wp:cNvGraphicFramePr>
+              <a:graphicFrameLocks xmlns:a="http://schemas.openxmlformats.org/drawingml/2006/main" noChangeAspect="1"/>
+            </wp:cNvGraphicFramePr>
+            <a:graphic xmlns:a="http://schemas.openxmlformats.org/drawingml/2006/main">
+              <a:graphicData uri="http://schemas.openxmlformats.org/drawingml/2006/picture">
+                <pic:pic xmlns:pic="http://schemas.openxmlformats.org/drawingml/2006/picture">
+                  <pic:nvPicPr>
+                    <pic:cNvPr id="904463550" name="Picture 1" descr="A screenshot of a message&#10;&#10;AI-generated content may be incorrect."/>
+                    <pic:cNvPicPr/>
+                  </pic:nvPicPr>
+                  <pic:blipFill>
+                    <a:blip r:embed="rId79">
+                      <a:extLst>
+                        <a:ext uri="{28A0092B-C50C-407E-A947-70E740481C1C}">
+                          <a14:useLocalDpi xmlns:a14="http://schemas.microsoft.com/office/drawing/2010/main" val="0"/>
+                        </a:ext>
+                      </a:extLst>
+                    </a:blip>
+                    <a:stretch>
+                      <a:fillRect/>
+                    </a:stretch>
+                  </pic:blipFill>
+                  <pic:spPr>
+                    <a:xfrm>
+                      <a:off x="0" y="0"/>
+                      <a:ext cx="2421890" cy="1981835"/>
+                    </a:xfrm>
+                    <a:prstGeom prst="rect">
+                      <a:avLst/>
+                    </a:prstGeom>
+                  </pic:spPr>
+                </pic:pic>
+              </a:graphicData>
+            </a:graphic>
+            <wp14:sizeRelH relativeFrom="page">
+              <wp14:pctWidth>0</wp14:pctWidth>
+            </wp14:sizeRelH>
+            <wp14:sizeRelV relativeFrom="page">
+              <wp14:pctHeight>0</wp14:pctHeight>
+            </wp14:sizeRelV>
+          </wp:anchor>
+        </w:drawing>
+      </w:r>
+      <w:r>
+        <w:rPr>
+          <w:lang w:val="en-US"/>
+        </w:rPr>
+        <w:drawing>
+          <wp:anchor distT="0" distB="0" distL="114300" distR="114300" simplePos="0" relativeHeight="251696128" behindDoc="0" locked="0" layoutInCell="1" allowOverlap="1" wp14:anchorId="15F759CC" wp14:editId="6699F171">
+            <wp:simplePos x="0" y="0"/>
+            <wp:positionH relativeFrom="margin">
+              <wp:align>left</wp:align>
+            </wp:positionH>
+            <wp:positionV relativeFrom="paragraph">
+              <wp:posOffset>889977</wp:posOffset>
+            </wp:positionV>
+            <wp:extent cx="2997200" cy="1487170"/>
+            <wp:effectExtent l="0" t="0" r="0" b="0"/>
+            <wp:wrapSquare wrapText="bothSides"/>
+            <wp:docPr id="1929802834" name="Picture 1" descr="A screen shot of a computer program&#10;&#10;AI-generated content may be incorrect."/>
+            <wp:cNvGraphicFramePr>
+              <a:graphicFrameLocks xmlns:a="http://schemas.openxmlformats.org/drawingml/2006/main" noChangeAspect="1"/>
+            </wp:cNvGraphicFramePr>
+            <a:graphic xmlns:a="http://schemas.openxmlformats.org/drawingml/2006/main">
+              <a:graphicData uri="http://schemas.openxmlformats.org/drawingml/2006/picture">
+                <pic:pic xmlns:pic="http://schemas.openxmlformats.org/drawingml/2006/picture">
+                  <pic:nvPicPr>
+                    <pic:cNvPr id="1929802834" name="Picture 1" descr="A screen shot of a computer program&#10;&#10;AI-generated content may be incorrect."/>
+                    <pic:cNvPicPr/>
+                  </pic:nvPicPr>
+                  <pic:blipFill>
+                    <a:blip r:embed="rId80">
+                      <a:extLst>
+                        <a:ext uri="{28A0092B-C50C-407E-A947-70E740481C1C}">
+                          <a14:useLocalDpi xmlns:a14="http://schemas.microsoft.com/office/drawing/2010/main" val="0"/>
+                        </a:ext>
+                      </a:extLst>
+                    </a:blip>
+                    <a:stretch>
+                      <a:fillRect/>
+                    </a:stretch>
+                  </pic:blipFill>
+                  <pic:spPr>
+                    <a:xfrm>
+                      <a:off x="0" y="0"/>
+                      <a:ext cx="2997200" cy="1487170"/>
+                    </a:xfrm>
+                    <a:prstGeom prst="rect">
+                      <a:avLst/>
+                    </a:prstGeom>
+                  </pic:spPr>
+                </pic:pic>
+              </a:graphicData>
+            </a:graphic>
+            <wp14:sizeRelH relativeFrom="page">
+              <wp14:pctWidth>0</wp14:pctWidth>
+            </wp14:sizeRelH>
+            <wp14:sizeRelV relativeFrom="page">
+              <wp14:pctHeight>0</wp14:pctHeight>
+            </wp14:sizeRelV>
+          </wp:anchor>
+        </w:drawing>
+      </w:r>
+      <w:r>
+        <w:rPr>
+          <w:b/>
+          <w:bCs/>
+          <w:lang w:val="en-US"/>
+        </w:rPr>
+        <w:t>Created denyClicked function in friends.tsx to trigger denyFriendRequest, passing the requestId and updating the requests once the status has been updated (removing it from the list).</w:t>
+      </w:r>
+    </w:p>
+    <w:p>
+      <w:pPr>
+        <w:rPr>
+          <w:b/>
+          <w:bCs/>
+          <w:lang w:val="en-US"/>
+        </w:rPr>
+      </w:pPr>
+    </w:p>
+    <w:p>
+      <w:pPr>
+        <w:rPr>
+          <w:b/>
+          <w:bCs/>
+          <w:lang w:val="en-US"/>
+        </w:rPr>
+      </w:pPr>
+    </w:p>
+    <w:p>
+      <w:pPr>
+        <w:rPr>
+          <w:b/>
+          <w:bCs/>
+          <w:lang w:val="en-US"/>
+        </w:rPr>
+      </w:pPr>
+    </w:p>
+    <w:p>
+      <w:pPr>
+        <w:rPr>
+          <w:b/>
+          <w:bCs/>
+          <w:lang w:val="en-US"/>
+        </w:rPr>
+      </w:pPr>
+    </w:p>
+    <w:p>
+      <w:pPr>
+        <w:rPr>
+          <w:b/>
+          <w:bCs/>
+          <w:lang w:val="en-US"/>
+        </w:rPr>
+      </w:pPr>
+    </w:p>
+    <w:p>
+      <w:pPr>
+        <w:rPr>
+          <w:b/>
+          <w:bCs/>
+          <w:lang w:val="en-US"/>
+        </w:rPr>
+      </w:pPr>
+    </w:p>
+    <w:p>
+      <w:pPr>
+        <w:rPr>
+          <w:b/>
+          <w:bCs/>
+          <w:lang w:val="en-US"/>
+        </w:rPr>
+      </w:pPr>
+    </w:p>
+    <w:p>
+      <w:pPr>
+        <w:rPr>
+          <w:b/>
+          <w:bCs/>
+          <w:lang w:val="en-US"/>
+        </w:rPr>
+      </w:pPr>
+    </w:p>
+    <w:p>
+      <w:pPr>
+        <w:pStyle w:val="Heading4"/>
+        <w:rPr>
+          <w:lang w:val="en-US"/>
+        </w:rPr>
+      </w:pPr>
+      <w:r>
+        <w:rPr>
+          <w:lang w:val="en-US"/>
+        </w:rPr>
+        <w:lastRenderedPageBreak/>
+        <w:t>Accepting Friend Requests</w:t>
+      </w:r>
+    </w:p>
+    <w:p>
+      <w:pPr>
+        <w:rPr>
+          <w:lang w:val="en-US"/>
+        </w:rPr>
+      </w:pPr>
+    </w:p>
+    <w:p>
+      <w:pPr>
+        <w:pStyle w:val="ListParagraph"/>
+        <w:numPr>
+          <w:ilvl w:val="0"/>
+          <w:numId w:val="1"/>
+        </w:numPr>
+        <w:rPr>
+          <w:b/>
+          <w:bCs/>
+          <w:lang w:val="en-US"/>
+        </w:rPr>
+      </w:pPr>
+      <w:r>
+        <w:rPr>
+          <w:b/>
+          <w:bCs/>
+          <w:lang w:val="en-US"/>
+        </w:rPr>
+        <w:t>Have to Create “Friends” list below Incoming Requests.</w:t>
+      </w:r>
+    </w:p>
+    <w:p>
+      <w:pPr>
+        <w:pStyle w:val="ListParagraph"/>
+        <w:numPr>
+          <w:ilvl w:val="0"/>
+          <w:numId w:val="1"/>
+        </w:numPr>
+        <w:rPr>
+          <w:b/>
+          <w:bCs/>
+          <w:lang w:val="en-US"/>
+        </w:rPr>
+      </w:pPr>
+      <w:r>
+        <w:rPr>
+          <w:b/>
+          <w:bCs/>
+          <w:lang w:val="en-US"/>
+        </w:rPr>
+        <w:t>Have to retitle Friend Requests to just Friends.</w:t>
+      </w:r>
+    </w:p>
+    <w:p>
+      <w:pPr>
+        <w:pStyle w:val="ListParagraph"/>
+        <w:numPr>
+          <w:ilvl w:val="0"/>
+          <w:numId w:val="1"/>
+        </w:numPr>
+        <w:rPr>
+          <w:b/>
+          <w:bCs/>
+          <w:lang w:val="en-US"/>
+        </w:rPr>
+      </w:pPr>
+      <w:r>
+        <w:rPr>
+          <w:b/>
+          <w:bCs/>
+          <w:lang w:val="en-US"/>
+        </w:rPr>
+        <w:t>Have to add Accept button.</w:t>
+      </w:r>
+    </w:p>
+    <w:p>
+      <w:pPr>
+        <w:pStyle w:val="ListParagraph"/>
+        <w:numPr>
+          <w:ilvl w:val="0"/>
+          <w:numId w:val="1"/>
+        </w:numPr>
+        <w:rPr>
+          <w:b/>
+          <w:bCs/>
+          <w:lang w:val="en-US"/>
+        </w:rPr>
+      </w:pPr>
+      <w:r>
+        <w:rPr>
+          <w:b/>
+          <w:bCs/>
+          <w:lang w:val="en-US"/>
+        </w:rPr>
+        <w:t xml:space="preserve">Have to update both the request senders and recipients friends list to include the other person. </w:t>
+      </w:r>
+    </w:p>
+    <w:p>
+      <w:pPr>
+        <w:pStyle w:val="ListParagraph"/>
+        <w:numPr>
+          <w:ilvl w:val="0"/>
+          <w:numId w:val="1"/>
+        </w:numPr>
+        <w:rPr>
+          <w:b/>
+          <w:bCs/>
+          <w:lang w:val="en-US"/>
+        </w:rPr>
+      </w:pPr>
+      <w:r>
+        <w:rPr>
+          <w:b/>
+          <w:bCs/>
+          <w:lang w:val="en-US"/>
+        </w:rPr>
+        <w:t>Have to remove the friend request from the friends list.</w:t>
+      </w:r>
+    </w:p>
+    <w:p>
+      <w:pPr>
+        <w:pStyle w:val="ListParagraph"/>
+        <w:numPr>
+          <w:ilvl w:val="0"/>
+          <w:numId w:val="1"/>
+        </w:numPr>
+        <w:rPr>
+          <w:b/>
+          <w:bCs/>
+          <w:lang w:val="en-US"/>
+        </w:rPr>
+      </w:pPr>
+      <w:r>
+        <w:rPr>
+          <w:b/>
+          <w:bCs/>
+          <w:lang w:val="en-US"/>
+        </w:rPr>
+        <w:t>Have to add validation to stop people from sending a request if they are already friends.</w:t>
       </w:r>
     </w:p>
     <w:sectPr>
@@ -9797,6 +10366,95 @@
     </w:lvl>
   </w:abstractNum>
   <w:abstractNum w:abstractNumId="3" w15:restartNumberingAfterBreak="0">
+    <w:nsid w:val="5C4473C7"/>
+    <w:multiLevelType w:val="hybridMultilevel"/>
+    <w:tmpl w:val="1534BA74"/>
+    <w:lvl w:ilvl="0" w:tplc="0809000F">
+      <w:start w:val="1"/>
+      <w:numFmt w:val="decimal"/>
+      <w:lvlText w:val="%1."/>
+      <w:lvlJc w:val="left"/>
+      <w:pPr>
+        <w:ind w:left="720" w:hanging="360"/>
+      </w:pPr>
+      <w:rPr>
+        <w:rFonts w:hint="default"/>
+      </w:rPr>
+    </w:lvl>
+    <w:lvl w:ilvl="1" w:tplc="08090019" w:tentative="1">
+      <w:start w:val="1"/>
+      <w:numFmt w:val="lowerLetter"/>
+      <w:lvlText w:val="%2."/>
+      <w:lvlJc w:val="left"/>
+      <w:pPr>
+        <w:ind w:left="1440" w:hanging="360"/>
+      </w:pPr>
+    </w:lvl>
+    <w:lvl w:ilvl="2" w:tplc="0809001B" w:tentative="1">
+      <w:start w:val="1"/>
+      <w:numFmt w:val="lowerRoman"/>
+      <w:lvlText w:val="%3."/>
+      <w:lvlJc w:val="right"/>
+      <w:pPr>
+        <w:ind w:left="2160" w:hanging="180"/>
+      </w:pPr>
+    </w:lvl>
+    <w:lvl w:ilvl="3" w:tplc="0809000F" w:tentative="1">
+      <w:start w:val="1"/>
+      <w:numFmt w:val="decimal"/>
+      <w:lvlText w:val="%4."/>
+      <w:lvlJc w:val="left"/>
+      <w:pPr>
+        <w:ind w:left="2880" w:hanging="360"/>
+      </w:pPr>
+    </w:lvl>
+    <w:lvl w:ilvl="4" w:tplc="08090019" w:tentative="1">
+      <w:start w:val="1"/>
+      <w:numFmt w:val="lowerLetter"/>
+      <w:lvlText w:val="%5."/>
+      <w:lvlJc w:val="left"/>
+      <w:pPr>
+        <w:ind w:left="3600" w:hanging="360"/>
+      </w:pPr>
+    </w:lvl>
+    <w:lvl w:ilvl="5" w:tplc="0809001B" w:tentative="1">
+      <w:start w:val="1"/>
+      <w:numFmt w:val="lowerRoman"/>
+      <w:lvlText w:val="%6."/>
+      <w:lvlJc w:val="right"/>
+      <w:pPr>
+        <w:ind w:left="4320" w:hanging="180"/>
+      </w:pPr>
+    </w:lvl>
+    <w:lvl w:ilvl="6" w:tplc="0809000F" w:tentative="1">
+      <w:start w:val="1"/>
+      <w:numFmt w:val="decimal"/>
+      <w:lvlText w:val="%7."/>
+      <w:lvlJc w:val="left"/>
+      <w:pPr>
+        <w:ind w:left="5040" w:hanging="360"/>
+      </w:pPr>
+    </w:lvl>
+    <w:lvl w:ilvl="7" w:tplc="08090019" w:tentative="1">
+      <w:start w:val="1"/>
+      <w:numFmt w:val="lowerLetter"/>
+      <w:lvlText w:val="%8."/>
+      <w:lvlJc w:val="left"/>
+      <w:pPr>
+        <w:ind w:left="5760" w:hanging="360"/>
+      </w:pPr>
+    </w:lvl>
+    <w:lvl w:ilvl="8" w:tplc="0809001B" w:tentative="1">
+      <w:start w:val="1"/>
+      <w:numFmt w:val="lowerRoman"/>
+      <w:lvlText w:val="%9."/>
+      <w:lvlJc w:val="right"/>
+      <w:pPr>
+        <w:ind w:left="6480" w:hanging="180"/>
+      </w:pPr>
+    </w:lvl>
+  </w:abstractNum>
+  <w:abstractNum w:abstractNumId="4" w15:restartNumberingAfterBreak="0">
     <w:nsid w:val="6364308B"/>
     <w:multiLevelType w:val="hybridMultilevel"/>
     <w:tmpl w:val="0E8EB992"/>
@@ -9908,7 +10566,7 @@
       </w:rPr>
     </w:lvl>
   </w:abstractNum>
-  <w:abstractNum w:abstractNumId="4" w15:restartNumberingAfterBreak="0">
+  <w:abstractNum w:abstractNumId="5" w15:restartNumberingAfterBreak="0">
     <w:nsid w:val="6F86462C"/>
     <w:multiLevelType w:val="hybridMultilevel"/>
     <w:tmpl w:val="92B2557A"/>
@@ -10022,10 +10680,10 @@
     </w:lvl>
   </w:abstractNum>
   <w:num w:numId="1" w16cid:durableId="413480618">
-    <w:abstractNumId w:val="3"/>
+    <w:abstractNumId w:val="4"/>
   </w:num>
   <w:num w:numId="2" w16cid:durableId="1588880229">
-    <w:abstractNumId w:val="4"/>
+    <w:abstractNumId w:val="5"/>
   </w:num>
   <w:num w:numId="3" w16cid:durableId="1975938008">
     <w:abstractNumId w:val="2"/>
@@ -10035,6 +10693,9 @@
   </w:num>
   <w:num w:numId="5" w16cid:durableId="1584291837">
     <w:abstractNumId w:val="0"/>
+  </w:num>
+  <w:num w:numId="6" w16cid:durableId="2093313818">
+    <w:abstractNumId w:val="3"/>
   </w:num>
 </w:numbering>
 </file>

</xml_diff>

<commit_message>
Ability to Accept friend requests: - Accept button added. - Friends Flatlist added. - When clicked, updates status to accepted and refreshes list to exclude accepted request. - users given friends field.
</commit_message>
<xml_diff>
--- a/Documentation/COMP3000 - Progress Report.docx
+++ b/Documentation/COMP3000 - Progress Report.docx
@@ -9,7 +9,7 @@
           <w:lang w:val="en-US"/>
         </w:rPr>
       </w:pPr>
-      <w:bookmarkStart w:id="0" w:name="_Toc214622116"/>
+      <w:bookmarkStart w:id="0" w:name="_Toc214636776"/>
       <w:r>
         <w:rPr>
           <w:lang w:val="en-US"/>
@@ -100,7 +100,7 @@
           <w:r>
             <w:fldChar w:fldCharType="separate"/>
           </w:r>
-          <w:hyperlink w:anchor="_Toc214622116" w:history="1">
+          <w:hyperlink w:anchor="_Toc214636776" w:history="1">
             <w:r>
               <w:rPr>
                 <w:rStyle w:val="Hyperlink"/>
@@ -128,7 +128,7 @@
                 <w:noProof/>
                 <w:webHidden/>
               </w:rPr>
-              <w:instrText xml:space="preserve"> PAGEREF _Toc214622116 \h </w:instrText>
+              <w:instrText xml:space="preserve"> PAGEREF _Toc214636776 \h </w:instrText>
             </w:r>
             <w:r>
               <w:rPr>
@@ -173,7 +173,7 @@
               <w:lang w:eastAsia="en-GB"/>
             </w:rPr>
           </w:pPr>
-          <w:hyperlink w:anchor="_Toc214622117" w:history="1">
+          <w:hyperlink w:anchor="_Toc214636777" w:history="1">
             <w:r>
               <w:rPr>
                 <w:rStyle w:val="Hyperlink"/>
@@ -201,7 +201,7 @@
                 <w:noProof/>
                 <w:webHidden/>
               </w:rPr>
-              <w:instrText xml:space="preserve"> PAGEREF _Toc214622117 \h </w:instrText>
+              <w:instrText xml:space="preserve"> PAGEREF _Toc214636777 \h </w:instrText>
             </w:r>
             <w:r>
               <w:rPr>
@@ -246,7 +246,7 @@
               <w:lang w:eastAsia="en-GB"/>
             </w:rPr>
           </w:pPr>
-          <w:hyperlink w:anchor="_Toc214622118" w:history="1">
+          <w:hyperlink w:anchor="_Toc214636778" w:history="1">
             <w:r>
               <w:rPr>
                 <w:rStyle w:val="Hyperlink"/>
@@ -274,7 +274,7 @@
                 <w:noProof/>
                 <w:webHidden/>
               </w:rPr>
-              <w:instrText xml:space="preserve"> PAGEREF _Toc214622118 \h </w:instrText>
+              <w:instrText xml:space="preserve"> PAGEREF _Toc214636778 \h </w:instrText>
             </w:r>
             <w:r>
               <w:rPr>
@@ -319,7 +319,7 @@
               <w:lang w:eastAsia="en-GB"/>
             </w:rPr>
           </w:pPr>
-          <w:hyperlink w:anchor="_Toc214622119" w:history="1">
+          <w:hyperlink w:anchor="_Toc214636779" w:history="1">
             <w:r>
               <w:rPr>
                 <w:rStyle w:val="Hyperlink"/>
@@ -347,7 +347,7 @@
                 <w:noProof/>
                 <w:webHidden/>
               </w:rPr>
-              <w:instrText xml:space="preserve"> PAGEREF _Toc214622119 \h </w:instrText>
+              <w:instrText xml:space="preserve"> PAGEREF _Toc214636779 \h </w:instrText>
             </w:r>
             <w:r>
               <w:rPr>
@@ -392,7 +392,7 @@
               <w:lang w:eastAsia="en-GB"/>
             </w:rPr>
           </w:pPr>
-          <w:hyperlink w:anchor="_Toc214622120" w:history="1">
+          <w:hyperlink w:anchor="_Toc214636780" w:history="1">
             <w:r>
               <w:rPr>
                 <w:rStyle w:val="Hyperlink"/>
@@ -420,7 +420,7 @@
                 <w:noProof/>
                 <w:webHidden/>
               </w:rPr>
-              <w:instrText xml:space="preserve"> PAGEREF _Toc214622120 \h </w:instrText>
+              <w:instrText xml:space="preserve"> PAGEREF _Toc214636780 \h </w:instrText>
             </w:r>
             <w:r>
               <w:rPr>
@@ -465,7 +465,7 @@
               <w:lang w:eastAsia="en-GB"/>
             </w:rPr>
           </w:pPr>
-          <w:hyperlink w:anchor="_Toc214622121" w:history="1">
+          <w:hyperlink w:anchor="_Toc214636781" w:history="1">
             <w:r>
               <w:rPr>
                 <w:rStyle w:val="Hyperlink"/>
@@ -493,7 +493,7 @@
                 <w:noProof/>
                 <w:webHidden/>
               </w:rPr>
-              <w:instrText xml:space="preserve"> PAGEREF _Toc214622121 \h </w:instrText>
+              <w:instrText xml:space="preserve"> PAGEREF _Toc214636781 \h </w:instrText>
             </w:r>
             <w:r>
               <w:rPr>
@@ -525,79 +525,6 @@
           </w:hyperlink>
         </w:p>
         <w:p>
-          <w:pPr>
-            <w:pStyle w:val="TOC2"/>
-            <w:tabs>
-              <w:tab w:val="right" w:leader="dot" w:pos="9016"/>
-            </w:tabs>
-            <w:rPr>
-              <w:rFonts w:eastAsiaTheme="minorEastAsia"/>
-              <w:noProof/>
-              <w:sz w:val="24"/>
-              <w:szCs w:val="24"/>
-              <w:lang w:eastAsia="en-GB"/>
-            </w:rPr>
-          </w:pPr>
-          <w:hyperlink w:anchor="_Toc214622122" w:history="1">
-            <w:r>
-              <w:rPr>
-                <w:rStyle w:val="Hyperlink"/>
-                <w:noProof/>
-                <w:lang w:val="en-US"/>
-              </w:rPr>
-              <w:t>TO DO:</w:t>
-            </w:r>
-            <w:r>
-              <w:rPr>
-                <w:noProof/>
-                <w:webHidden/>
-              </w:rPr>
-              <w:tab/>
-            </w:r>
-            <w:r>
-              <w:rPr>
-                <w:noProof/>
-                <w:webHidden/>
-              </w:rPr>
-              <w:fldChar w:fldCharType="begin"/>
-            </w:r>
-            <w:r>
-              <w:rPr>
-                <w:noProof/>
-                <w:webHidden/>
-              </w:rPr>
-              <w:instrText xml:space="preserve"> PAGEREF _Toc214622122 \h </w:instrText>
-            </w:r>
-            <w:r>
-              <w:rPr>
-                <w:noProof/>
-                <w:webHidden/>
-              </w:rPr>
-            </w:r>
-            <w:r>
-              <w:rPr>
-                <w:noProof/>
-                <w:webHidden/>
-              </w:rPr>
-              <w:fldChar w:fldCharType="separate"/>
-            </w:r>
-            <w:r>
-              <w:rPr>
-                <w:noProof/>
-                <w:webHidden/>
-              </w:rPr>
-              <w:t>29</w:t>
-            </w:r>
-            <w:r>
-              <w:rPr>
-                <w:noProof/>
-                <w:webHidden/>
-              </w:rPr>
-              <w:fldChar w:fldCharType="end"/>
-            </w:r>
-          </w:hyperlink>
-        </w:p>
-        <w:p>
           <w:r>
             <w:rPr>
               <w:b/>
@@ -648,7 +575,7 @@
           <w:lang w:val="en-US"/>
         </w:rPr>
       </w:pPr>
-      <w:bookmarkStart w:id="1" w:name="_Toc214622117"/>
+      <w:bookmarkStart w:id="1" w:name="_Toc214636777"/>
       <w:r>
         <w:rPr>
           <w:u w:val="single"/>
@@ -666,7 +593,7 @@
           <w:lang w:val="en-US"/>
         </w:rPr>
       </w:pPr>
-      <w:bookmarkStart w:id="2" w:name="_Toc214622118"/>
+      <w:bookmarkStart w:id="2" w:name="_Toc214636778"/>
       <w:r>
         <w:rPr>
           <w:lang w:val="en-US"/>
@@ -754,7 +681,7 @@
                     <pic:cNvPicPr/>
                   </pic:nvPicPr>
                   <pic:blipFill>
-                    <a:blip r:embed="rId9" cstate="print">
+                    <a:blip r:embed="rId11" cstate="print">
                       <a:extLst>
                         <a:ext uri="{28A0092B-C50C-407E-A947-70E740481C1C}">
                           <a14:useLocalDpi xmlns:a14="http://schemas.microsoft.com/office/drawing/2010/main" val="0"/>
@@ -814,7 +741,7 @@
           <w:lang w:val="en-US"/>
         </w:rPr>
       </w:pPr>
-      <w:bookmarkStart w:id="3" w:name="_Toc214622119"/>
+      <w:bookmarkStart w:id="3" w:name="_Toc214636779"/>
       <w:r>
         <w:rPr>
           <w:lang w:val="en-US"/>
@@ -1006,7 +933,7 @@
                     <pic:cNvPicPr/>
                   </pic:nvPicPr>
                   <pic:blipFill>
-                    <a:blip r:embed="rId10"/>
+                    <a:blip r:embed="rId12"/>
                     <a:stretch>
                       <a:fillRect/>
                     </a:stretch>
@@ -1112,7 +1039,7 @@
                     <pic:cNvPicPr/>
                   </pic:nvPicPr>
                   <pic:blipFill>
-                    <a:blip r:embed="rId11"/>
+                    <a:blip r:embed="rId13"/>
                     <a:stretch>
                       <a:fillRect/>
                     </a:stretch>
@@ -1168,7 +1095,7 @@
                     <pic:cNvPicPr/>
                   </pic:nvPicPr>
                   <pic:blipFill>
-                    <a:blip r:embed="rId12"/>
+                    <a:blip r:embed="rId14"/>
                     <a:stretch>
                       <a:fillRect/>
                     </a:stretch>
@@ -1293,7 +1220,7 @@
                     <pic:cNvPicPr/>
                   </pic:nvPicPr>
                   <pic:blipFill>
-                    <a:blip r:embed="rId13"/>
+                    <a:blip r:embed="rId15"/>
                     <a:stretch>
                       <a:fillRect/>
                     </a:stretch>
@@ -1401,7 +1328,21 @@
         <w:rPr>
           <w:lang w:val="en-US"/>
         </w:rPr>
-        <w:t xml:space="preserve">from stock expo ui </w:t>
+        <w:t xml:space="preserve">from stock expo </w:t>
+      </w:r>
+      <w:proofErr w:type="spellStart"/>
+      <w:r>
+        <w:rPr>
+          <w:lang w:val="en-US"/>
+        </w:rPr>
+        <w:t>ui</w:t>
+      </w:r>
+      <w:proofErr w:type="spellEnd"/>
+      <w:r>
+        <w:rPr>
+          <w:lang w:val="en-US"/>
+        </w:rPr>
+        <w:t xml:space="preserve"> </w:t>
       </w:r>
       <w:r>
         <w:rPr>
@@ -1493,7 +1434,7 @@
                     <pic:cNvPicPr/>
                   </pic:nvPicPr>
                   <pic:blipFill>
-                    <a:blip r:embed="rId14"/>
+                    <a:blip r:embed="rId16"/>
                     <a:stretch>
                       <a:fillRect/>
                     </a:stretch>
@@ -1536,7 +1477,7 @@
                     <pic:cNvPicPr/>
                   </pic:nvPicPr>
                   <pic:blipFill>
-                    <a:blip r:embed="rId15"/>
+                    <a:blip r:embed="rId17"/>
                     <a:stretch>
                       <a:fillRect/>
                     </a:stretch>
@@ -1644,7 +1585,35 @@
         <w:rPr>
           <w:lang w:val="en-US"/>
         </w:rPr>
-        <w:t xml:space="preserve">Replaced HomeScreen with LoginScreen with </w:t>
+        <w:t xml:space="preserve">Replaced </w:t>
+      </w:r>
+      <w:proofErr w:type="spellStart"/>
+      <w:r>
+        <w:rPr>
+          <w:lang w:val="en-US"/>
+        </w:rPr>
+        <w:t>HomeScreen</w:t>
+      </w:r>
+      <w:proofErr w:type="spellEnd"/>
+      <w:r>
+        <w:rPr>
+          <w:lang w:val="en-US"/>
+        </w:rPr>
+        <w:t xml:space="preserve"> with </w:t>
+      </w:r>
+      <w:proofErr w:type="spellStart"/>
+      <w:r>
+        <w:rPr>
+          <w:lang w:val="en-US"/>
+        </w:rPr>
+        <w:t>LoginScreen</w:t>
+      </w:r>
+      <w:proofErr w:type="spellEnd"/>
+      <w:r>
+        <w:rPr>
+          <w:lang w:val="en-US"/>
+        </w:rPr>
+        <w:t xml:space="preserve"> with </w:t>
       </w:r>
       <w:r>
         <w:rPr>
@@ -1693,7 +1662,7 @@
                     <pic:cNvPicPr/>
                   </pic:nvPicPr>
                   <pic:blipFill>
-                    <a:blip r:embed="rId16"/>
+                    <a:blip r:embed="rId18"/>
                     <a:stretch>
                       <a:fillRect/>
                     </a:stretch>
@@ -1734,7 +1703,7 @@
                     <pic:cNvPicPr/>
                   </pic:nvPicPr>
                   <pic:blipFill>
-                    <a:blip r:embed="rId17"/>
+                    <a:blip r:embed="rId19"/>
                     <a:stretch>
                       <a:fillRect/>
                     </a:stretch>
@@ -1833,7 +1802,7 @@
                     <pic:cNvPicPr/>
                   </pic:nvPicPr>
                   <pic:blipFill>
-                    <a:blip r:embed="rId18"/>
+                    <a:blip r:embed="rId20"/>
                     <a:stretch>
                       <a:fillRect/>
                     </a:stretch>
@@ -1988,7 +1957,7 @@
                     <pic:cNvPicPr/>
                   </pic:nvPicPr>
                   <pic:blipFill>
-                    <a:blip r:embed="rId19"/>
+                    <a:blip r:embed="rId21"/>
                     <a:stretch>
                       <a:fillRect/>
                     </a:stretch>
@@ -2030,7 +1999,7 @@
                     <pic:cNvPicPr/>
                   </pic:nvPicPr>
                   <pic:blipFill>
-                    <a:blip r:embed="rId20"/>
+                    <a:blip r:embed="rId22"/>
                     <a:stretch>
                       <a:fillRect/>
                     </a:stretch>
@@ -2147,7 +2116,7 @@
                     <pic:cNvPicPr/>
                   </pic:nvPicPr>
                   <pic:blipFill>
-                    <a:blip r:embed="rId21"/>
+                    <a:blip r:embed="rId23"/>
                     <a:stretch>
                       <a:fillRect/>
                     </a:stretch>
@@ -2202,7 +2171,7 @@
           <w:lang w:val="en-US"/>
         </w:rPr>
         <w:drawing>
-          <wp:anchor distT="0" distB="0" distL="114300" distR="114300" simplePos="0" relativeHeight="251677696" behindDoc="0" locked="0" layoutInCell="1" allowOverlap="1" wp14:anchorId="4767C19A" wp14:editId="1B26EAA0">
+          <wp:anchor distT="0" distB="0" distL="114300" distR="114300" simplePos="0" relativeHeight="251677696" behindDoc="0" locked="0" layoutInCell="1" allowOverlap="1" wp14:anchorId="4767C19A" wp14:editId="62C2B64A">
             <wp:simplePos x="0" y="0"/>
             <wp:positionH relativeFrom="column">
               <wp:posOffset>-725474</wp:posOffset>
@@ -2225,7 +2194,7 @@
                     <pic:cNvPicPr/>
                   </pic:nvPicPr>
                   <pic:blipFill>
-                    <a:blip r:embed="rId22" cstate="print">
+                    <a:blip r:embed="rId24" cstate="print">
                       <a:extLst>
                         <a:ext uri="{28A0092B-C50C-407E-A947-70E740481C1C}">
                           <a14:useLocalDpi xmlns:a14="http://schemas.microsoft.com/office/drawing/2010/main" val="0"/>
@@ -2265,7 +2234,7 @@
           <w:lang w:val="en-US"/>
         </w:rPr>
       </w:pPr>
-      <w:bookmarkStart w:id="4" w:name="_Toc214622120"/>
+      <w:bookmarkStart w:id="4" w:name="_Toc214636780"/>
       <w:r>
         <w:rPr>
           <w:lang w:val="en-US"/>
@@ -2362,7 +2331,7 @@
                     <pic:cNvPicPr/>
                   </pic:nvPicPr>
                   <pic:blipFill>
-                    <a:blip r:embed="rId23"/>
+                    <a:blip r:embed="rId25"/>
                     <a:stretch>
                       <a:fillRect/>
                     </a:stretch>
@@ -2405,7 +2374,7 @@
                     <pic:cNvPicPr/>
                   </pic:nvPicPr>
                   <pic:blipFill>
-                    <a:blip r:embed="rId24"/>
+                    <a:blip r:embed="rId26"/>
                     <a:stretch>
                       <a:fillRect/>
                     </a:stretch>
@@ -2510,7 +2479,7 @@
                     <pic:cNvPicPr/>
                   </pic:nvPicPr>
                   <pic:blipFill>
-                    <a:blip r:embed="rId25"/>
+                    <a:blip r:embed="rId27"/>
                     <a:stretch>
                       <a:fillRect/>
                     </a:stretch>
@@ -2628,7 +2597,7 @@
                     <pic:cNvPicPr/>
                   </pic:nvPicPr>
                   <pic:blipFill>
-                    <a:blip r:embed="rId26"/>
+                    <a:blip r:embed="rId28"/>
                     <a:stretch>
                       <a:fillRect/>
                     </a:stretch>
@@ -2697,7 +2666,7 @@
                     <pic:cNvPicPr/>
                   </pic:nvPicPr>
                   <pic:blipFill>
-                    <a:blip r:embed="rId27"/>
+                    <a:blip r:embed="rId29"/>
                     <a:stretch>
                       <a:fillRect/>
                     </a:stretch>
@@ -2794,7 +2763,7 @@
                     <pic:cNvPicPr/>
                   </pic:nvPicPr>
                   <pic:blipFill>
-                    <a:blip r:embed="rId28"/>
+                    <a:blip r:embed="rId30"/>
                     <a:stretch>
                       <a:fillRect/>
                     </a:stretch>
@@ -2865,7 +2834,7 @@
                     <pic:cNvPicPr/>
                   </pic:nvPicPr>
                   <pic:blipFill>
-                    <a:blip r:embed="rId29">
+                    <a:blip r:embed="rId31">
                       <a:extLst>
                         <a:ext uri="{28A0092B-C50C-407E-A947-70E740481C1C}">
                           <a14:useLocalDpi xmlns:a14="http://schemas.microsoft.com/office/drawing/2010/main" val="0"/>
@@ -2929,7 +2898,7 @@
                     <pic:cNvPicPr/>
                   </pic:nvPicPr>
                   <pic:blipFill>
-                    <a:blip r:embed="rId30">
+                    <a:blip r:embed="rId32">
                       <a:extLst>
                         <a:ext uri="{28A0092B-C50C-407E-A947-70E740481C1C}">
                           <a14:useLocalDpi xmlns:a14="http://schemas.microsoft.com/office/drawing/2010/main" val="0"/>
@@ -3028,7 +2997,7 @@
                     <pic:cNvPicPr/>
                   </pic:nvPicPr>
                   <pic:blipFill>
-                    <a:blip r:embed="rId31">
+                    <a:blip r:embed="rId33">
                       <a:extLst>
                         <a:ext uri="{28A0092B-C50C-407E-A947-70E740481C1C}">
                           <a14:useLocalDpi xmlns:a14="http://schemas.microsoft.com/office/drawing/2010/main" val="0"/>
@@ -3091,7 +3060,7 @@
                     <pic:cNvPicPr/>
                   </pic:nvPicPr>
                   <pic:blipFill>
-                    <a:blip r:embed="rId32" cstate="print">
+                    <a:blip r:embed="rId34" cstate="print">
                       <a:extLst>
                         <a:ext uri="{28A0092B-C50C-407E-A947-70E740481C1C}">
                           <a14:useLocalDpi xmlns:a14="http://schemas.microsoft.com/office/drawing/2010/main" val="0"/>
@@ -3191,7 +3160,7 @@
                     <pic:cNvPicPr/>
                   </pic:nvPicPr>
                   <pic:blipFill>
-                    <a:blip r:embed="rId33">
+                    <a:blip r:embed="rId35">
                       <a:extLst>
                         <a:ext uri="{28A0092B-C50C-407E-A947-70E740481C1C}">
                           <a14:useLocalDpi xmlns:a14="http://schemas.microsoft.com/office/drawing/2010/main" val="0"/>
@@ -3231,7 +3200,7 @@
           <w:lang w:val="en-US"/>
         </w:rPr>
         <w:drawing>
-          <wp:anchor distT="0" distB="0" distL="114300" distR="114300" simplePos="0" relativeHeight="251664384" behindDoc="1" locked="0" layoutInCell="1" allowOverlap="1" wp14:anchorId="71F3FFD7" wp14:editId="38151081">
+          <wp:anchor distT="0" distB="0" distL="114300" distR="114300" simplePos="0" relativeHeight="251664384" behindDoc="1" locked="0" layoutInCell="1" allowOverlap="1" wp14:anchorId="71F3FFD7" wp14:editId="3F20A765">
             <wp:simplePos x="0" y="0"/>
             <wp:positionH relativeFrom="column">
               <wp:posOffset>-15240</wp:posOffset>
@@ -3262,7 +3231,7 @@
                     <pic:cNvPicPr/>
                   </pic:nvPicPr>
                   <pic:blipFill>
-                    <a:blip r:embed="rId34" cstate="print">
+                    <a:blip r:embed="rId36" cstate="print">
                       <a:extLst>
                         <a:ext uri="{28A0092B-C50C-407E-A947-70E740481C1C}">
                           <a14:useLocalDpi xmlns:a14="http://schemas.microsoft.com/office/drawing/2010/main" val="0"/>
@@ -3427,7 +3396,7 @@
           <w:lang w:val="en-US"/>
         </w:rPr>
         <w:drawing>
-          <wp:anchor distT="0" distB="0" distL="114300" distR="114300" simplePos="0" relativeHeight="251666432" behindDoc="0" locked="0" layoutInCell="1" allowOverlap="1" wp14:anchorId="56452892" wp14:editId="326A6E45">
+          <wp:anchor distT="0" distB="0" distL="114300" distR="114300" simplePos="0" relativeHeight="251666432" behindDoc="0" locked="0" layoutInCell="1" allowOverlap="1" wp14:anchorId="56452892" wp14:editId="5B574C8D">
             <wp:simplePos x="0" y="0"/>
             <wp:positionH relativeFrom="column">
               <wp:posOffset>1748155</wp:posOffset>
@@ -3450,7 +3419,7 @@
                     <pic:cNvPicPr/>
                   </pic:nvPicPr>
                   <pic:blipFill>
-                    <a:blip r:embed="rId35" cstate="print">
+                    <a:blip r:embed="rId37" cstate="print">
                       <a:extLst>
                         <a:ext uri="{28A0092B-C50C-407E-A947-70E740481C1C}">
                           <a14:useLocalDpi xmlns:a14="http://schemas.microsoft.com/office/drawing/2010/main" val="0"/>
@@ -3490,7 +3459,7 @@
           <w:lang w:val="en-US"/>
         </w:rPr>
         <w:drawing>
-          <wp:anchor distT="0" distB="0" distL="114300" distR="114300" simplePos="0" relativeHeight="251665408" behindDoc="0" locked="0" layoutInCell="1" allowOverlap="1" wp14:anchorId="15635525" wp14:editId="2B3F31E8">
+          <wp:anchor distT="0" distB="0" distL="114300" distR="114300" simplePos="0" relativeHeight="251665408" behindDoc="0" locked="0" layoutInCell="1" allowOverlap="1" wp14:anchorId="15635525" wp14:editId="0ACFA771">
             <wp:simplePos x="0" y="0"/>
             <wp:positionH relativeFrom="column">
               <wp:posOffset>0</wp:posOffset>
@@ -3513,7 +3482,7 @@
                     <pic:cNvPicPr/>
                   </pic:nvPicPr>
                   <pic:blipFill>
-                    <a:blip r:embed="rId36" cstate="print">
+                    <a:blip r:embed="rId38" cstate="print">
                       <a:extLst>
                         <a:ext uri="{28A0092B-C50C-407E-A947-70E740481C1C}">
                           <a14:useLocalDpi xmlns:a14="http://schemas.microsoft.com/office/drawing/2010/main" val="0"/>
@@ -3655,7 +3624,7 @@
                     <pic:cNvPicPr/>
                   </pic:nvPicPr>
                   <pic:blipFill>
-                    <a:blip r:embed="rId37"/>
+                    <a:blip r:embed="rId39"/>
                     <a:stretch>
                       <a:fillRect/>
                     </a:stretch>
@@ -3722,7 +3691,7 @@
                     <pic:cNvPicPr/>
                   </pic:nvPicPr>
                   <pic:blipFill>
-                    <a:blip r:embed="rId38"/>
+                    <a:blip r:embed="rId40"/>
                     <a:stretch>
                       <a:fillRect/>
                     </a:stretch>
@@ -3941,7 +3910,7 @@
                     <pic:cNvPicPr/>
                   </pic:nvPicPr>
                   <pic:blipFill>
-                    <a:blip r:embed="rId39">
+                    <a:blip r:embed="rId41">
                       <a:extLst>
                         <a:ext uri="{28A0092B-C50C-407E-A947-70E740481C1C}">
                           <a14:useLocalDpi xmlns:a14="http://schemas.microsoft.com/office/drawing/2010/main" val="0"/>
@@ -4003,7 +3972,7 @@
                     <pic:cNvPicPr/>
                   </pic:nvPicPr>
                   <pic:blipFill>
-                    <a:blip r:embed="rId40">
+                    <a:blip r:embed="rId42">
                       <a:extLst>
                         <a:ext uri="{28A0092B-C50C-407E-A947-70E740481C1C}">
                           <a14:useLocalDpi xmlns:a14="http://schemas.microsoft.com/office/drawing/2010/main" val="0"/>
@@ -4097,7 +4066,7 @@
                     <pic:cNvPicPr/>
                   </pic:nvPicPr>
                   <pic:blipFill>
-                    <a:blip r:embed="rId41" cstate="print">
+                    <a:blip r:embed="rId43" cstate="print">
                       <a:extLst>
                         <a:ext uri="{28A0092B-C50C-407E-A947-70E740481C1C}">
                           <a14:useLocalDpi xmlns:a14="http://schemas.microsoft.com/office/drawing/2010/main" val="0"/>
@@ -4158,7 +4127,7 @@
                     <pic:cNvPicPr/>
                   </pic:nvPicPr>
                   <pic:blipFill>
-                    <a:blip r:embed="rId42">
+                    <a:blip r:embed="rId44">
                       <a:extLst>
                         <a:ext uri="{28A0092B-C50C-407E-A947-70E740481C1C}">
                           <a14:useLocalDpi xmlns:a14="http://schemas.microsoft.com/office/drawing/2010/main" val="0"/>
@@ -4334,7 +4303,7 @@
                     <pic:cNvPicPr/>
                   </pic:nvPicPr>
                   <pic:blipFill>
-                    <a:blip r:embed="rId43"/>
+                    <a:blip r:embed="rId45"/>
                     <a:stretch>
                       <a:fillRect/>
                     </a:stretch>
@@ -4489,7 +4458,7 @@
                     <pic:cNvPicPr/>
                   </pic:nvPicPr>
                   <pic:blipFill>
-                    <a:blip r:embed="rId44">
+                    <a:blip r:embed="rId46">
                       <a:extLst>
                         <a:ext uri="{28A0092B-C50C-407E-A947-70E740481C1C}">
                           <a14:useLocalDpi xmlns:a14="http://schemas.microsoft.com/office/drawing/2010/main" val="0"/>
@@ -4550,7 +4519,7 @@
                     <pic:cNvPicPr/>
                   </pic:nvPicPr>
                   <pic:blipFill>
-                    <a:blip r:embed="rId45">
+                    <a:blip r:embed="rId47">
                       <a:extLst>
                         <a:ext uri="{28A0092B-C50C-407E-A947-70E740481C1C}">
                           <a14:useLocalDpi xmlns:a14="http://schemas.microsoft.com/office/drawing/2010/main" val="0"/>
@@ -4689,7 +4658,7 @@
                     <pic:cNvPicPr/>
                   </pic:nvPicPr>
                   <pic:blipFill>
-                    <a:blip r:embed="rId46">
+                    <a:blip r:embed="rId48">
                       <a:extLst>
                         <a:ext uri="{28A0092B-C50C-407E-A947-70E740481C1C}">
                           <a14:useLocalDpi xmlns:a14="http://schemas.microsoft.com/office/drawing/2010/main" val="0"/>
@@ -4752,7 +4721,7 @@
                     <pic:cNvPicPr/>
                   </pic:nvPicPr>
                   <pic:blipFill>
-                    <a:blip r:embed="rId47">
+                    <a:blip r:embed="rId49">
                       <a:extLst>
                         <a:ext uri="{28A0092B-C50C-407E-A947-70E740481C1C}">
                           <a14:useLocalDpi xmlns:a14="http://schemas.microsoft.com/office/drawing/2010/main" val="0"/>
@@ -4815,7 +4784,7 @@
                     <pic:cNvPicPr/>
                   </pic:nvPicPr>
                   <pic:blipFill>
-                    <a:blip r:embed="rId48">
+                    <a:blip r:embed="rId50">
                       <a:extLst>
                         <a:ext uri="{28A0092B-C50C-407E-A947-70E740481C1C}">
                           <a14:useLocalDpi xmlns:a14="http://schemas.microsoft.com/office/drawing/2010/main" val="0"/>
@@ -4969,7 +4938,7 @@
                     <pic:cNvPicPr/>
                   </pic:nvPicPr>
                   <pic:blipFill>
-                    <a:blip r:embed="rId49"/>
+                    <a:blip r:embed="rId51"/>
                     <a:stretch>
                       <a:fillRect/>
                     </a:stretch>
@@ -5010,7 +4979,7 @@
                     <pic:cNvPicPr/>
                   </pic:nvPicPr>
                   <pic:blipFill>
-                    <a:blip r:embed="rId50"/>
+                    <a:blip r:embed="rId52"/>
                     <a:stretch>
                       <a:fillRect/>
                     </a:stretch>
@@ -5052,7 +5021,7 @@
           <w:lang w:val="en-US"/>
         </w:rPr>
         <w:drawing>
-          <wp:anchor distT="0" distB="0" distL="114300" distR="114300" simplePos="0" relativeHeight="251678720" behindDoc="0" locked="0" layoutInCell="1" allowOverlap="1" wp14:anchorId="5E963EF8" wp14:editId="7AB9214B">
+          <wp:anchor distT="0" distB="0" distL="114300" distR="114300" simplePos="0" relativeHeight="251678720" behindDoc="0" locked="0" layoutInCell="1" allowOverlap="1" wp14:anchorId="5E963EF8" wp14:editId="1F1F320C">
             <wp:simplePos x="0" y="0"/>
             <wp:positionH relativeFrom="margin">
               <wp:align>center</wp:align>
@@ -5075,7 +5044,7 @@
                     <pic:cNvPicPr/>
                   </pic:nvPicPr>
                   <pic:blipFill>
-                    <a:blip r:embed="rId51" cstate="print">
+                    <a:blip r:embed="rId53" cstate="print">
                       <a:extLst>
                         <a:ext uri="{28A0092B-C50C-407E-A947-70E740481C1C}">
                           <a14:useLocalDpi xmlns:a14="http://schemas.microsoft.com/office/drawing/2010/main" val="0"/>
@@ -5198,7 +5167,7 @@
           <w:lang w:val="en-US"/>
         </w:rPr>
       </w:pPr>
-      <w:bookmarkStart w:id="5" w:name="_Toc214622121"/>
+      <w:bookmarkStart w:id="5" w:name="_Toc214636781"/>
       <w:r>
         <w:rPr>
           <w:lang w:val="en-US"/>
@@ -5235,7 +5204,7 @@
         </w:rPr>
         <w:br/>
       </w:r>
-      <w:hyperlink r:id="rId52" w:history="1">
+      <w:hyperlink r:id="rId54" w:history="1">
         <w:r>
           <w:rPr>
             <w:rStyle w:val="Hyperlink"/>
@@ -5329,7 +5298,7 @@
                     <pic:cNvPicPr/>
                   </pic:nvPicPr>
                   <pic:blipFill>
-                    <a:blip r:embed="rId53"/>
+                    <a:blip r:embed="rId55"/>
                     <a:stretch>
                       <a:fillRect/>
                     </a:stretch>
@@ -5397,7 +5366,7 @@
                     <pic:cNvPicPr/>
                   </pic:nvPicPr>
                   <pic:blipFill>
-                    <a:blip r:embed="rId54"/>
+                    <a:blip r:embed="rId56"/>
                     <a:stretch>
                       <a:fillRect/>
                     </a:stretch>
@@ -5509,9 +5478,27 @@
           <w:bCs/>
           <w:lang w:val="en-US"/>
         </w:rPr>
-        <w:t xml:space="preserve">Referenced for FlatList usage: </w:t>
-      </w:r>
-      <w:hyperlink r:id="rId55" w:history="1">
+        <w:t xml:space="preserve">Referenced for </w:t>
+      </w:r>
+      <w:proofErr w:type="spellStart"/>
+      <w:r>
+        <w:rPr>
+          <w:b/>
+          <w:bCs/>
+          <w:lang w:val="en-US"/>
+        </w:rPr>
+        <w:t>FlatList</w:t>
+      </w:r>
+      <w:proofErr w:type="spellEnd"/>
+      <w:r>
+        <w:rPr>
+          <w:b/>
+          <w:bCs/>
+          <w:lang w:val="en-US"/>
+        </w:rPr>
+        <w:t xml:space="preserve"> usage: </w:t>
+      </w:r>
+      <w:hyperlink r:id="rId57" w:history="1">
         <w:r>
           <w:rPr>
             <w:rStyle w:val="Hyperlink"/>
@@ -5547,7 +5534,7 @@
           <w:lang w:val="en-US"/>
         </w:rPr>
         <w:drawing>
-          <wp:anchor distT="0" distB="0" distL="114300" distR="114300" simplePos="0" relativeHeight="251680768" behindDoc="0" locked="0" layoutInCell="1" allowOverlap="1" wp14:anchorId="1428C8BE" wp14:editId="5693AF4E">
+          <wp:anchor distT="0" distB="0" distL="114300" distR="114300" simplePos="0" relativeHeight="251680768" behindDoc="0" locked="0" layoutInCell="1" allowOverlap="1" wp14:anchorId="1428C8BE" wp14:editId="3104C5A6">
             <wp:simplePos x="0" y="0"/>
             <wp:positionH relativeFrom="column">
               <wp:posOffset>-70485</wp:posOffset>
@@ -5570,7 +5557,7 @@
                     <pic:cNvPicPr/>
                   </pic:nvPicPr>
                   <pic:blipFill>
-                    <a:blip r:embed="rId56" cstate="print">
+                    <a:blip r:embed="rId58" cstate="print">
                       <a:extLst>
                         <a:ext uri="{28A0092B-C50C-407E-A947-70E740481C1C}">
                           <a14:useLocalDpi xmlns:a14="http://schemas.microsoft.com/office/drawing/2010/main" val="0"/>
@@ -5619,7 +5606,7 @@
           <w:lang w:val="en-US"/>
         </w:rPr>
         <w:drawing>
-          <wp:anchor distT="0" distB="0" distL="114300" distR="114300" simplePos="0" relativeHeight="251679744" behindDoc="0" locked="0" layoutInCell="1" allowOverlap="1" wp14:anchorId="4D46F843" wp14:editId="17C75EFC">
+          <wp:anchor distT="0" distB="0" distL="114300" distR="114300" simplePos="0" relativeHeight="251679744" behindDoc="0" locked="0" layoutInCell="1" allowOverlap="1" wp14:anchorId="4D46F843" wp14:editId="5FBEAD21">
             <wp:simplePos x="0" y="0"/>
             <wp:positionH relativeFrom="column">
               <wp:posOffset>-138921</wp:posOffset>
@@ -5642,7 +5629,7 @@
                     <pic:cNvPicPr/>
                   </pic:nvPicPr>
                   <pic:blipFill>
-                    <a:blip r:embed="rId57" cstate="print">
+                    <a:blip r:embed="rId59" cstate="print">
                       <a:extLst>
                         <a:ext uri="{28A0092B-C50C-407E-A947-70E740481C1C}">
                           <a14:useLocalDpi xmlns:a14="http://schemas.microsoft.com/office/drawing/2010/main" val="0"/>
@@ -6223,7 +6210,7 @@
                     <pic:cNvPicPr/>
                   </pic:nvPicPr>
                   <pic:blipFill>
-                    <a:blip r:embed="rId58"/>
+                    <a:blip r:embed="rId60"/>
                     <a:stretch>
                       <a:fillRect/>
                     </a:stretch>
@@ -6288,7 +6275,7 @@
         </w:rPr>
         <w:lastRenderedPageBreak/>
         <w:drawing>
-          <wp:anchor distT="0" distB="0" distL="114300" distR="114300" simplePos="0" relativeHeight="251681792" behindDoc="0" locked="0" layoutInCell="1" allowOverlap="1" wp14:anchorId="654FC1FA" wp14:editId="6DC0C80C">
+          <wp:anchor distT="0" distB="0" distL="114300" distR="114300" simplePos="0" relativeHeight="251681792" behindDoc="0" locked="0" layoutInCell="1" allowOverlap="1" wp14:anchorId="654FC1FA" wp14:editId="163DE674">
             <wp:simplePos x="0" y="0"/>
             <wp:positionH relativeFrom="page">
               <wp:align>right</wp:align>
@@ -6311,7 +6298,7 @@
                     <pic:cNvPicPr/>
                   </pic:nvPicPr>
                   <pic:blipFill>
-                    <a:blip r:embed="rId59" cstate="print">
+                    <a:blip r:embed="rId61" cstate="print">
                       <a:extLst>
                         <a:ext uri="{28A0092B-C50C-407E-A947-70E740481C1C}">
                           <a14:useLocalDpi xmlns:a14="http://schemas.microsoft.com/office/drawing/2010/main" val="0"/>
@@ -6381,7 +6368,25 @@
           <w:bCs/>
           <w:lang w:val="en-US"/>
         </w:rPr>
-        <w:t>(fun error when loading Friends Tab, assume its to do with there not being any requests to display and not having accounted for this in code :/)</w:t>
+        <w:t xml:space="preserve">(fun error when loading Friends Tab, assume </w:t>
+      </w:r>
+      <w:proofErr w:type="spellStart"/>
+      <w:r>
+        <w:rPr>
+          <w:b/>
+          <w:bCs/>
+          <w:lang w:val="en-US"/>
+        </w:rPr>
+        <w:t>its</w:t>
+      </w:r>
+      <w:proofErr w:type="spellEnd"/>
+      <w:r>
+        <w:rPr>
+          <w:b/>
+          <w:bCs/>
+          <w:lang w:val="en-US"/>
+        </w:rPr>
+        <w:t xml:space="preserve"> to do with there not being any requests to display and not having accounted for this in code :/)</w:t>
       </w:r>
       <w:r>
         <w:rPr>
@@ -6440,7 +6445,7 @@
                     <pic:cNvPicPr/>
                   </pic:nvPicPr>
                   <pic:blipFill>
-                    <a:blip r:embed="rId60">
+                    <a:blip r:embed="rId62">
                       <a:extLst>
                         <a:ext uri="{28A0092B-C50C-407E-A947-70E740481C1C}">
                           <a14:useLocalDpi xmlns:a14="http://schemas.microsoft.com/office/drawing/2010/main" val="0"/>
@@ -7078,7 +7083,25 @@
           <w:bCs/>
           <w:lang w:val="en-US"/>
         </w:rPr>
-        <w:t>Using useIsFocused listener instead, returns “true” whenever the screen comes into view, meaning username updates every time you navigate to dashboard.</w:t>
+        <w:t xml:space="preserve">Using </w:t>
+      </w:r>
+      <w:proofErr w:type="spellStart"/>
+      <w:r>
+        <w:rPr>
+          <w:b/>
+          <w:bCs/>
+          <w:lang w:val="en-US"/>
+        </w:rPr>
+        <w:t>useIsFocused</w:t>
+      </w:r>
+      <w:proofErr w:type="spellEnd"/>
+      <w:r>
+        <w:rPr>
+          <w:b/>
+          <w:bCs/>
+          <w:lang w:val="en-US"/>
+        </w:rPr>
+        <w:t xml:space="preserve"> listener instead, returns “true” whenever the screen comes into view, meaning username updates every time you navigate to dashboard.</w:t>
       </w:r>
       <w:r>
         <w:rPr>
@@ -7142,7 +7165,7 @@
                     <pic:cNvPicPr/>
                   </pic:nvPicPr>
                   <pic:blipFill>
-                    <a:blip r:embed="rId61"/>
+                    <a:blip r:embed="rId63"/>
                     <a:stretch>
                       <a:fillRect/>
                     </a:stretch>
@@ -7233,7 +7256,43 @@
           <w:bCs/>
           <w:lang w:val="en-US"/>
         </w:rPr>
-        <w:t>Removed localSearchParams and replaced with AsyncStorage and useIsFocused (same as dashboard.tsx).</w:t>
+        <w:t xml:space="preserve">Removed </w:t>
+      </w:r>
+      <w:proofErr w:type="spellStart"/>
+      <w:r>
+        <w:rPr>
+          <w:b/>
+          <w:bCs/>
+          <w:lang w:val="en-US"/>
+        </w:rPr>
+        <w:t>localSearchParams</w:t>
+      </w:r>
+      <w:proofErr w:type="spellEnd"/>
+      <w:r>
+        <w:rPr>
+          <w:b/>
+          <w:bCs/>
+          <w:lang w:val="en-US"/>
+        </w:rPr>
+        <w:t xml:space="preserve"> and replaced with AsyncStorage and </w:t>
+      </w:r>
+      <w:proofErr w:type="spellStart"/>
+      <w:r>
+        <w:rPr>
+          <w:b/>
+          <w:bCs/>
+          <w:lang w:val="en-US"/>
+        </w:rPr>
+        <w:t>useIsFocused</w:t>
+      </w:r>
+      <w:proofErr w:type="spellEnd"/>
+      <w:r>
+        <w:rPr>
+          <w:b/>
+          <w:bCs/>
+          <w:lang w:val="en-US"/>
+        </w:rPr>
+        <w:t xml:space="preserve"> (same as dashboard.tsx).</w:t>
       </w:r>
       <w:r>
         <w:rPr>
@@ -7288,7 +7347,7 @@
                     <pic:cNvPicPr/>
                   </pic:nvPicPr>
                   <pic:blipFill>
-                    <a:blip r:embed="rId62">
+                    <a:blip r:embed="rId64">
                       <a:extLst>
                         <a:ext uri="{28A0092B-C50C-407E-A947-70E740481C1C}">
                           <a14:useLocalDpi xmlns:a14="http://schemas.microsoft.com/office/drawing/2010/main" val="0"/>
@@ -7811,7 +7870,7 @@
                     <pic:cNvPicPr/>
                   </pic:nvPicPr>
                   <pic:blipFill>
-                    <a:blip r:embed="rId63">
+                    <a:blip r:embed="rId65">
                       <a:extLst>
                         <a:ext uri="{28A0092B-C50C-407E-A947-70E740481C1C}">
                           <a14:useLocalDpi xmlns:a14="http://schemas.microsoft.com/office/drawing/2010/main" val="0"/>
@@ -8025,7 +8084,7 @@
                     <pic:cNvPicPr/>
                   </pic:nvPicPr>
                   <pic:blipFill>
-                    <a:blip r:embed="rId64" cstate="print">
+                    <a:blip r:embed="rId66" cstate="print">
                       <a:extLst>
                         <a:ext uri="{28A0092B-C50C-407E-A947-70E740481C1C}">
                           <a14:useLocalDpi xmlns:a14="http://schemas.microsoft.com/office/drawing/2010/main" val="0"/>
@@ -8141,7 +8200,7 @@
                     <pic:cNvPicPr/>
                   </pic:nvPicPr>
                   <pic:blipFill>
-                    <a:blip r:embed="rId65">
+                    <a:blip r:embed="rId67">
                       <a:extLst>
                         <a:ext uri="{28A0092B-C50C-407E-A947-70E740481C1C}">
                           <a14:useLocalDpi xmlns:a14="http://schemas.microsoft.com/office/drawing/2010/main" val="0"/>
@@ -8205,7 +8264,7 @@
                     <pic:cNvPicPr/>
                   </pic:nvPicPr>
                   <pic:blipFill>
-                    <a:blip r:embed="rId66" cstate="print">
+                    <a:blip r:embed="rId68" cstate="print">
                       <a:extLst>
                         <a:ext uri="{28A0092B-C50C-407E-A947-70E740481C1C}">
                           <a14:useLocalDpi xmlns:a14="http://schemas.microsoft.com/office/drawing/2010/main" val="0"/>
@@ -8339,7 +8398,7 @@
                     <pic:cNvPicPr/>
                   </pic:nvPicPr>
                   <pic:blipFill>
-                    <a:blip r:embed="rId67">
+                    <a:blip r:embed="rId69">
                       <a:extLst>
                         <a:ext uri="{28A0092B-C50C-407E-A947-70E740481C1C}">
                           <a14:useLocalDpi xmlns:a14="http://schemas.microsoft.com/office/drawing/2010/main" val="0"/>
@@ -8438,7 +8497,7 @@
                     <pic:cNvPicPr/>
                   </pic:nvPicPr>
                   <pic:blipFill>
-                    <a:blip r:embed="rId68">
+                    <a:blip r:embed="rId70">
                       <a:extLst>
                         <a:ext uri="{28A0092B-C50C-407E-A947-70E740481C1C}">
                           <a14:useLocalDpi xmlns:a14="http://schemas.microsoft.com/office/drawing/2010/main" val="0"/>
@@ -8582,7 +8641,7 @@
                     <pic:cNvPicPr/>
                   </pic:nvPicPr>
                   <pic:blipFill>
-                    <a:blip r:embed="rId69" cstate="print">
+                    <a:blip r:embed="rId71" cstate="print">
                       <a:extLst>
                         <a:ext uri="{28A0092B-C50C-407E-A947-70E740481C1C}">
                           <a14:useLocalDpi xmlns:a14="http://schemas.microsoft.com/office/drawing/2010/main" val="0"/>
@@ -8806,7 +8865,7 @@
                     <pic:cNvPicPr/>
                   </pic:nvPicPr>
                   <pic:blipFill>
-                    <a:blip r:embed="rId70">
+                    <a:blip r:embed="rId72">
                       <a:extLst>
                         <a:ext uri="{28A0092B-C50C-407E-A947-70E740481C1C}">
                           <a14:useLocalDpi xmlns:a14="http://schemas.microsoft.com/office/drawing/2010/main" val="0"/>
@@ -8972,7 +9031,7 @@
           <w:lang w:val="en-US"/>
         </w:rPr>
         <w:drawing>
-          <wp:anchor distT="0" distB="0" distL="114300" distR="114300" simplePos="0" relativeHeight="251693056" behindDoc="0" locked="0" layoutInCell="1" allowOverlap="1" wp14:anchorId="307A97B8" wp14:editId="21CC2D8A">
+          <wp:anchor distT="0" distB="0" distL="114300" distR="114300" simplePos="0" relativeHeight="251693056" behindDoc="0" locked="0" layoutInCell="1" allowOverlap="1" wp14:anchorId="307A97B8" wp14:editId="5199D99B">
             <wp:simplePos x="0" y="0"/>
             <wp:positionH relativeFrom="page">
               <wp:posOffset>45250</wp:posOffset>
@@ -8995,7 +9054,7 @@
                     <pic:cNvPicPr/>
                   </pic:nvPicPr>
                   <pic:blipFill>
-                    <a:blip r:embed="rId71" cstate="print">
+                    <a:blip r:embed="rId73" cstate="print">
                       <a:extLst>
                         <a:ext uri="{28A0092B-C50C-407E-A947-70E740481C1C}">
                           <a14:useLocalDpi xmlns:a14="http://schemas.microsoft.com/office/drawing/2010/main" val="0"/>
@@ -9084,6 +9143,7 @@
         <w:rPr>
           <w:b/>
           <w:bCs/>
+          <w:noProof/>
           <w:lang w:val="en-US"/>
         </w:rPr>
         <w:drawing>
@@ -9102,7 +9162,7 @@
                     <pic:cNvPicPr/>
                   </pic:nvPicPr>
                   <pic:blipFill>
-                    <a:blip r:embed="rId72"/>
+                    <a:blip r:embed="rId74"/>
                     <a:stretch>
                       <a:fillRect/>
                     </a:stretch>
@@ -9151,6 +9211,7 @@
         <w:rPr>
           <w:b/>
           <w:bCs/>
+          <w:noProof/>
           <w:lang w:val="en-US"/>
         </w:rPr>
         <w:drawing>
@@ -9169,7 +9230,7 @@
                     <pic:cNvPicPr/>
                   </pic:nvPicPr>
                   <pic:blipFill>
-                    <a:blip r:embed="rId73"/>
+                    <a:blip r:embed="rId75"/>
                     <a:stretch>
                       <a:fillRect/>
                     </a:stretch>
@@ -9219,6 +9280,7 @@
         <w:rPr>
           <w:b/>
           <w:bCs/>
+          <w:noProof/>
           <w:lang w:val="en-US"/>
         </w:rPr>
         <w:drawing>
@@ -9237,7 +9299,7 @@
                     <pic:cNvPicPr/>
                   </pic:nvPicPr>
                   <pic:blipFill>
-                    <a:blip r:embed="rId74"/>
+                    <a:blip r:embed="rId76"/>
                     <a:stretch>
                       <a:fillRect/>
                     </a:stretch>
@@ -9265,18 +9327,17 @@
           <w:lang w:val="en-US"/>
         </w:rPr>
       </w:pPr>
-      <w:bookmarkStart w:id="6" w:name="_Toc214622122"/>
       <w:r>
         <w:rPr>
           <w:lang w:val="en-US"/>
         </w:rPr>
         <w:br w:type="page"/>
       </w:r>
-      <w:bookmarkEnd w:id="6"/>
-      <w:r>
-        <w:rPr>
-          <w:b/>
-          <w:bCs/>
+      <w:r>
+        <w:rPr>
+          <w:b/>
+          <w:bCs/>
+          <w:noProof/>
           <w:lang w:val="en-US"/>
         </w:rPr>
         <w:lastRenderedPageBreak/>
@@ -9304,7 +9365,7 @@
                     <pic:cNvPicPr/>
                   </pic:nvPicPr>
                   <pic:blipFill>
-                    <a:blip r:embed="rId75" cstate="print">
+                    <a:blip r:embed="rId77" cstate="print">
                       <a:extLst>
                         <a:ext uri="{28A0092B-C50C-407E-A947-70E740481C1C}">
                           <a14:useLocalDpi xmlns:a14="http://schemas.microsoft.com/office/drawing/2010/main" val="0"/>
@@ -9364,8 +9425,11 @@
         </w:rPr>
       </w:pPr>
       <w:r>
+        <w:rPr>
+          <w:noProof/>
+        </w:rPr>
         <w:drawing>
-          <wp:anchor distT="0" distB="0" distL="114300" distR="114300" simplePos="0" relativeHeight="251694080" behindDoc="0" locked="0" layoutInCell="1" allowOverlap="1" wp14:anchorId="73DCA0E9" wp14:editId="102CA9D3">
+          <wp:anchor distT="0" distB="0" distL="114300" distR="114300" simplePos="0" relativeHeight="251694080" behindDoc="0" locked="0" layoutInCell="1" allowOverlap="1" wp14:anchorId="73DCA0E9" wp14:editId="4BF6AEB9">
             <wp:simplePos x="0" y="0"/>
             <wp:positionH relativeFrom="margin">
               <wp:posOffset>-527538</wp:posOffset>
@@ -9388,7 +9452,7 @@
                     <pic:cNvPicPr/>
                   </pic:nvPicPr>
                   <pic:blipFill>
-                    <a:blip r:embed="rId76" cstate="print">
+                    <a:blip r:embed="rId78" cstate="print">
                       <a:extLst>
                         <a:ext uri="{28A0092B-C50C-407E-A947-70E740481C1C}">
                           <a14:useLocalDpi xmlns:a14="http://schemas.microsoft.com/office/drawing/2010/main" val="0"/>
@@ -9465,23 +9529,60 @@
           <w:bCs/>
           <w:lang w:val="en-US"/>
         </w:rPr>
-        <w:t>Created denyFriendRequest function in Firestore.js to update the status of the request to “denied” via the requestId (item.id).</w:t>
-      </w:r>
-    </w:p>
-    <w:p>
-      <w:pPr>
-        <w:rPr>
-          <w:b/>
-          <w:bCs/>
-        </w:rPr>
-      </w:pPr>
-      <w:r>
-        <w:rPr>
-          <w:b/>
-          <w:bCs/>
+        <w:t xml:space="preserve">Created </w:t>
+      </w:r>
+      <w:proofErr w:type="spellStart"/>
+      <w:r>
+        <w:rPr>
+          <w:b/>
+          <w:bCs/>
+          <w:lang w:val="en-US"/>
+        </w:rPr>
+        <w:t>denyFriendRequest</w:t>
+      </w:r>
+      <w:proofErr w:type="spellEnd"/>
+      <w:r>
+        <w:rPr>
+          <w:b/>
+          <w:bCs/>
+          <w:lang w:val="en-US"/>
+        </w:rPr>
+        <w:t xml:space="preserve"> function in Firestore.js to update the status of the request to “denied” via the </w:t>
+      </w:r>
+      <w:proofErr w:type="spellStart"/>
+      <w:r>
+        <w:rPr>
+          <w:b/>
+          <w:bCs/>
+          <w:lang w:val="en-US"/>
+        </w:rPr>
+        <w:t>requestId</w:t>
+      </w:r>
+      <w:proofErr w:type="spellEnd"/>
+      <w:r>
+        <w:rPr>
+          <w:b/>
+          <w:bCs/>
+          <w:lang w:val="en-US"/>
+        </w:rPr>
+        <w:t xml:space="preserve"> (item.id).</w:t>
+      </w:r>
+    </w:p>
+    <w:p>
+      <w:pPr>
+        <w:rPr>
+          <w:b/>
+          <w:bCs/>
+        </w:rPr>
+      </w:pPr>
+      <w:r>
+        <w:rPr>
+          <w:b/>
+          <w:bCs/>
+          <w:noProof/>
         </w:rPr>
         <w:drawing>
-          <wp:anchor distT="0" distB="0" distL="114300" distR="114300" simplePos="0" relativeHeight="251695104" behindDoc="0" locked="0" layoutInCell="1" allowOverlap="1" wp14:anchorId="064E70E4" wp14:editId="7F7A416B">
+          <wp:anchor distT="0" distB="0" distL="114300" distR="114300" simplePos="0" relativeHeight="251695104" behindDoc="0" locked="0" layoutInCell="1" allowOverlap="1" wp14:anchorId="064E70E4" wp14:editId="61426A58">
             <wp:simplePos x="0" y="0"/>
             <wp:positionH relativeFrom="margin">
               <wp:posOffset>378949</wp:posOffset>
@@ -9504,7 +9605,7 @@
                     <pic:cNvPicPr/>
                   </pic:nvPicPr>
                   <pic:blipFill>
-                    <a:blip r:embed="rId77" cstate="print">
+                    <a:blip r:embed="rId79" cstate="print">
                       <a:extLst>
                         <a:ext uri="{28A0092B-C50C-407E-A947-70E740481C1C}">
                           <a14:useLocalDpi xmlns:a14="http://schemas.microsoft.com/office/drawing/2010/main" val="0"/>
@@ -9582,6 +9683,7 @@
       </w:pPr>
       <w:r>
         <w:rPr>
+          <w:noProof/>
           <w:lang w:val="en-US"/>
         </w:rPr>
         <w:drawing>
@@ -9608,7 +9710,7 @@
                     <pic:cNvPicPr/>
                   </pic:nvPicPr>
                   <pic:blipFill>
-                    <a:blip r:embed="rId78" cstate="print">
+                    <a:blip r:embed="rId80" cstate="print">
                       <a:extLst>
                         <a:ext uri="{28A0092B-C50C-407E-A947-70E740481C1C}">
                           <a14:useLocalDpi xmlns:a14="http://schemas.microsoft.com/office/drawing/2010/main" val="0"/>
@@ -9685,6 +9787,7 @@
         <w:rPr>
           <w:b/>
           <w:bCs/>
+          <w:noProof/>
           <w:lang w:val="en-US"/>
         </w:rPr>
         <w:drawing>
@@ -9711,7 +9814,7 @@
                     <pic:cNvPicPr/>
                   </pic:nvPicPr>
                   <pic:blipFill>
-                    <a:blip r:embed="rId79">
+                    <a:blip r:embed="rId81">
                       <a:extLst>
                         <a:ext uri="{28A0092B-C50C-407E-A947-70E740481C1C}">
                           <a14:useLocalDpi xmlns:a14="http://schemas.microsoft.com/office/drawing/2010/main" val="0"/>
@@ -9745,6 +9848,7 @@
       </w:r>
       <w:r>
         <w:rPr>
+          <w:noProof/>
           <w:lang w:val="en-US"/>
         </w:rPr>
         <w:drawing>
@@ -9771,7 +9875,7 @@
                     <pic:cNvPicPr/>
                   </pic:nvPicPr>
                   <pic:blipFill>
-                    <a:blip r:embed="rId80">
+                    <a:blip r:embed="rId82">
                       <a:extLst>
                         <a:ext uri="{28A0092B-C50C-407E-A947-70E740481C1C}">
                           <a14:useLocalDpi xmlns:a14="http://schemas.microsoft.com/office/drawing/2010/main" val="0"/>
@@ -9809,7 +9913,61 @@
           <w:bCs/>
           <w:lang w:val="en-US"/>
         </w:rPr>
-        <w:t>Created denyClicked function in friends.tsx to trigger denyFriendRequest, passing the requestId and updating the requests once the status has been updated (removing it from the list).</w:t>
+        <w:t xml:space="preserve">Created </w:t>
+      </w:r>
+      <w:proofErr w:type="spellStart"/>
+      <w:r>
+        <w:rPr>
+          <w:b/>
+          <w:bCs/>
+          <w:lang w:val="en-US"/>
+        </w:rPr>
+        <w:t>denyClicked</w:t>
+      </w:r>
+      <w:proofErr w:type="spellEnd"/>
+      <w:r>
+        <w:rPr>
+          <w:b/>
+          <w:bCs/>
+          <w:lang w:val="en-US"/>
+        </w:rPr>
+        <w:t xml:space="preserve"> function in friends.tsx to trigger </w:t>
+      </w:r>
+      <w:proofErr w:type="spellStart"/>
+      <w:r>
+        <w:rPr>
+          <w:b/>
+          <w:bCs/>
+          <w:lang w:val="en-US"/>
+        </w:rPr>
+        <w:t>denyFriendRequest</w:t>
+      </w:r>
+      <w:proofErr w:type="spellEnd"/>
+      <w:r>
+        <w:rPr>
+          <w:b/>
+          <w:bCs/>
+          <w:lang w:val="en-US"/>
+        </w:rPr>
+        <w:t xml:space="preserve">, passing the </w:t>
+      </w:r>
+      <w:proofErr w:type="spellStart"/>
+      <w:r>
+        <w:rPr>
+          <w:b/>
+          <w:bCs/>
+          <w:lang w:val="en-US"/>
+        </w:rPr>
+        <w:t>requestId</w:t>
+      </w:r>
+      <w:proofErr w:type="spellEnd"/>
+      <w:r>
+        <w:rPr>
+          <w:b/>
+          <w:bCs/>
+          <w:lang w:val="en-US"/>
+        </w:rPr>
+        <w:t xml:space="preserve"> and updating the requests once the status has been updated (removing it from the list).</w:t>
       </w:r>
     </w:p>
     <w:p>
@@ -10036,6 +10194,1797 @@
           <w:lang w:val="en-US"/>
         </w:rPr>
         <w:t>Have to add validation to stop people from sending a request if they are already friends.</w:t>
+      </w:r>
+    </w:p>
+    <w:p>
+      <w:pPr>
+        <w:pStyle w:val="ListParagraph"/>
+        <w:numPr>
+          <w:ilvl w:val="0"/>
+          <w:numId w:val="1"/>
+        </w:numPr>
+        <w:rPr>
+          <w:b/>
+          <w:bCs/>
+          <w:lang w:val="en-US"/>
+        </w:rPr>
+      </w:pPr>
+      <w:r>
+        <w:rPr>
+          <w:b/>
+          <w:bCs/>
+          <w:lang w:val="en-US"/>
+        </w:rPr>
+        <w:t>ABILITY TO REMOVE FRIEND</w:t>
+      </w:r>
+    </w:p>
+    <w:p>
+      <w:pPr>
+        <w:pStyle w:val="ListParagraph"/>
+        <w:numPr>
+          <w:ilvl w:val="0"/>
+          <w:numId w:val="1"/>
+        </w:numPr>
+        <w:rPr>
+          <w:b/>
+          <w:bCs/>
+          <w:lang w:val="en-US"/>
+        </w:rPr>
+      </w:pPr>
+      <w:r>
+        <w:rPr>
+          <w:b/>
+          <w:bCs/>
+          <w:color w:val="EE0000"/>
+          <w:lang w:val="en-US"/>
+        </w:rPr>
+        <w:t xml:space="preserve">TO CHECK: Can a user send a request to someone who denied their previous request? </w:t>
+      </w:r>
+    </w:p>
+    <w:p>
+      <w:pPr>
+        <w:ind w:left="360"/>
+        <w:rPr>
+          <w:b/>
+          <w:bCs/>
+          <w:lang w:val="en-US"/>
+        </w:rPr>
+      </w:pPr>
+    </w:p>
+    <w:p>
+      <w:pPr>
+        <w:pStyle w:val="ListParagraph"/>
+        <w:numPr>
+          <w:ilvl w:val="0"/>
+          <w:numId w:val="7"/>
+        </w:numPr>
+        <w:rPr>
+          <w:b/>
+          <w:bCs/>
+          <w:lang w:val="en-US"/>
+        </w:rPr>
+      </w:pPr>
+      <w:r>
+        <w:rPr>
+          <w:b/>
+          <w:bCs/>
+          <w:lang w:val="en-US"/>
+        </w:rPr>
+        <w:t>Created acceptFriendRequest function in Firestore.js to add users to each other’s “friends” list on database when request accepted. Also updates the request status to accepted.</w:t>
+      </w:r>
+    </w:p>
+    <w:p>
+      <w:pPr>
+        <w:ind w:left="360"/>
+        <w:rPr>
+          <w:b/>
+          <w:bCs/>
+          <w:lang w:val="en-US"/>
+        </w:rPr>
+      </w:pPr>
+      <w:r>
+        <w:rPr>
+          <w:b/>
+          <w:bCs/>
+          <w:lang w:val="en-US"/>
+        </w:rPr>
+        <w:drawing>
+          <wp:anchor distT="0" distB="0" distL="114300" distR="114300" simplePos="0" relativeHeight="251700224" behindDoc="0" locked="0" layoutInCell="1" allowOverlap="1" wp14:anchorId="42D8D228" wp14:editId="4994C2A9">
+            <wp:simplePos x="0" y="0"/>
+            <wp:positionH relativeFrom="column">
+              <wp:posOffset>184597</wp:posOffset>
+            </wp:positionH>
+            <wp:positionV relativeFrom="paragraph">
+              <wp:posOffset>5858</wp:posOffset>
+            </wp:positionV>
+            <wp:extent cx="3364230" cy="5027295"/>
+            <wp:effectExtent l="0" t="0" r="7620" b="1905"/>
+            <wp:wrapSquare wrapText="bothSides"/>
+            <wp:docPr id="484873715" name="Picture 1" descr="A screen shot of a computer program&#10;&#10;AI-generated content may be incorrect."/>
+            <wp:cNvGraphicFramePr>
+              <a:graphicFrameLocks xmlns:a="http://schemas.openxmlformats.org/drawingml/2006/main" noChangeAspect="1"/>
+            </wp:cNvGraphicFramePr>
+            <a:graphic xmlns:a="http://schemas.openxmlformats.org/drawingml/2006/main">
+              <a:graphicData uri="http://schemas.openxmlformats.org/drawingml/2006/picture">
+                <pic:pic xmlns:pic="http://schemas.openxmlformats.org/drawingml/2006/picture">
+                  <pic:nvPicPr>
+                    <pic:cNvPr id="484873715" name="Picture 1" descr="A screen shot of a computer program&#10;&#10;AI-generated content may be incorrect."/>
+                    <pic:cNvPicPr/>
+                  </pic:nvPicPr>
+                  <pic:blipFill>
+                    <a:blip r:embed="rId83">
+                      <a:extLst>
+                        <a:ext uri="{28A0092B-C50C-407E-A947-70E740481C1C}">
+                          <a14:useLocalDpi xmlns:a14="http://schemas.microsoft.com/office/drawing/2010/main" val="0"/>
+                        </a:ext>
+                      </a:extLst>
+                    </a:blip>
+                    <a:stretch>
+                      <a:fillRect/>
+                    </a:stretch>
+                  </pic:blipFill>
+                  <pic:spPr>
+                    <a:xfrm>
+                      <a:off x="0" y="0"/>
+                      <a:ext cx="3364230" cy="5027295"/>
+                    </a:xfrm>
+                    <a:prstGeom prst="rect">
+                      <a:avLst/>
+                    </a:prstGeom>
+                  </pic:spPr>
+                </pic:pic>
+              </a:graphicData>
+            </a:graphic>
+            <wp14:sizeRelH relativeFrom="page">
+              <wp14:pctWidth>0</wp14:pctWidth>
+            </wp14:sizeRelH>
+            <wp14:sizeRelV relativeFrom="page">
+              <wp14:pctHeight>0</wp14:pctHeight>
+            </wp14:sizeRelV>
+          </wp:anchor>
+        </w:drawing>
+      </w:r>
+    </w:p>
+    <w:p>
+      <w:pPr>
+        <w:ind w:left="360"/>
+        <w:rPr>
+          <w:b/>
+          <w:bCs/>
+          <w:lang w:val="en-US"/>
+        </w:rPr>
+      </w:pPr>
+    </w:p>
+    <w:p>
+      <w:pPr>
+        <w:ind w:left="360"/>
+        <w:rPr>
+          <w:b/>
+          <w:bCs/>
+          <w:lang w:val="en-US"/>
+        </w:rPr>
+      </w:pPr>
+    </w:p>
+    <w:p>
+      <w:pPr>
+        <w:ind w:left="360"/>
+        <w:rPr>
+          <w:b/>
+          <w:bCs/>
+          <w:lang w:val="en-US"/>
+        </w:rPr>
+      </w:pPr>
+    </w:p>
+    <w:p>
+      <w:pPr>
+        <w:ind w:left="360"/>
+        <w:rPr>
+          <w:b/>
+          <w:bCs/>
+          <w:lang w:val="en-US"/>
+        </w:rPr>
+      </w:pPr>
+    </w:p>
+    <w:p>
+      <w:pPr>
+        <w:ind w:left="360"/>
+        <w:rPr>
+          <w:b/>
+          <w:bCs/>
+          <w:lang w:val="en-US"/>
+        </w:rPr>
+      </w:pPr>
+    </w:p>
+    <w:p>
+      <w:pPr>
+        <w:ind w:left="360"/>
+        <w:rPr>
+          <w:b/>
+          <w:bCs/>
+          <w:lang w:val="en-US"/>
+        </w:rPr>
+      </w:pPr>
+    </w:p>
+    <w:p>
+      <w:pPr>
+        <w:ind w:left="360"/>
+        <w:rPr>
+          <w:b/>
+          <w:bCs/>
+          <w:lang w:val="en-US"/>
+        </w:rPr>
+      </w:pPr>
+    </w:p>
+    <w:p>
+      <w:pPr>
+        <w:ind w:left="360"/>
+        <w:rPr>
+          <w:b/>
+          <w:bCs/>
+          <w:lang w:val="en-US"/>
+        </w:rPr>
+      </w:pPr>
+    </w:p>
+    <w:p>
+      <w:pPr>
+        <w:ind w:left="360"/>
+        <w:rPr>
+          <w:b/>
+          <w:bCs/>
+          <w:lang w:val="en-US"/>
+        </w:rPr>
+      </w:pPr>
+    </w:p>
+    <w:p>
+      <w:pPr>
+        <w:ind w:left="360"/>
+        <w:rPr>
+          <w:b/>
+          <w:bCs/>
+          <w:lang w:val="en-US"/>
+        </w:rPr>
+      </w:pPr>
+    </w:p>
+    <w:p>
+      <w:pPr>
+        <w:ind w:left="360"/>
+        <w:rPr>
+          <w:b/>
+          <w:bCs/>
+          <w:lang w:val="en-US"/>
+        </w:rPr>
+      </w:pPr>
+    </w:p>
+    <w:p>
+      <w:pPr>
+        <w:ind w:left="360"/>
+        <w:rPr>
+          <w:b/>
+          <w:bCs/>
+          <w:lang w:val="en-US"/>
+        </w:rPr>
+      </w:pPr>
+    </w:p>
+    <w:p>
+      <w:pPr>
+        <w:ind w:left="360"/>
+        <w:rPr>
+          <w:b/>
+          <w:bCs/>
+          <w:lang w:val="en-US"/>
+        </w:rPr>
+      </w:pPr>
+    </w:p>
+    <w:p>
+      <w:pPr>
+        <w:ind w:left="360"/>
+        <w:rPr>
+          <w:b/>
+          <w:bCs/>
+          <w:lang w:val="en-US"/>
+        </w:rPr>
+      </w:pPr>
+    </w:p>
+    <w:p>
+      <w:pPr>
+        <w:ind w:left="360"/>
+        <w:rPr>
+          <w:b/>
+          <w:bCs/>
+          <w:lang w:val="en-US"/>
+        </w:rPr>
+      </w:pPr>
+    </w:p>
+    <w:p>
+      <w:pPr>
+        <w:ind w:left="360"/>
+        <w:rPr>
+          <w:b/>
+          <w:bCs/>
+          <w:lang w:val="en-US"/>
+        </w:rPr>
+      </w:pPr>
+    </w:p>
+    <w:p>
+      <w:pPr>
+        <w:ind w:left="360"/>
+        <w:rPr>
+          <w:b/>
+          <w:bCs/>
+          <w:lang w:val="en-US"/>
+        </w:rPr>
+      </w:pPr>
+    </w:p>
+    <w:p>
+      <w:pPr>
+        <w:rPr>
+          <w:b/>
+          <w:bCs/>
+          <w:lang w:val="en-US"/>
+        </w:rPr>
+      </w:pPr>
+    </w:p>
+    <w:p>
+      <w:pPr>
+        <w:pStyle w:val="ListParagraph"/>
+        <w:numPr>
+          <w:ilvl w:val="0"/>
+          <w:numId w:val="7"/>
+        </w:numPr>
+        <w:rPr>
+          <w:b/>
+          <w:bCs/>
+          <w:lang w:val="en-US"/>
+        </w:rPr>
+      </w:pPr>
+      <w:r>
+        <w:rPr>
+          <w:b/>
+          <w:bCs/>
+          <w:lang w:val="en-US"/>
+        </w:rPr>
+        <w:t xml:space="preserve">Created accept button and placeholder </w:t>
+      </w:r>
+      <w:proofErr w:type="spellStart"/>
+      <w:r>
+        <w:rPr>
+          <w:b/>
+          <w:bCs/>
+          <w:lang w:val="en-US"/>
+        </w:rPr>
+        <w:t>Flatlist</w:t>
+      </w:r>
+      <w:proofErr w:type="spellEnd"/>
+      <w:r>
+        <w:rPr>
+          <w:b/>
+          <w:bCs/>
+          <w:lang w:val="en-US"/>
+        </w:rPr>
+        <w:t xml:space="preserve"> for displaying friends.</w:t>
+      </w:r>
+      <w:r>
+        <w:rPr>
+          <w:b/>
+          <w:bCs/>
+          <w:lang w:val="en-US"/>
+        </w:rPr>
+        <w:br/>
+      </w:r>
+      <w:r>
+        <w:rPr>
+          <w:b/>
+          <w:bCs/>
+          <w:lang w:val="en-US"/>
+        </w:rPr>
+        <w:drawing>
+          <wp:inline distT="0" distB="0" distL="0" distR="0" wp14:anchorId="7CAA9152" wp14:editId="277A96CD">
+            <wp:extent cx="3055047" cy="2019662"/>
+            <wp:effectExtent l="0" t="0" r="0" b="0"/>
+            <wp:docPr id="203930232" name="Picture 1" descr="A screen shot of a computer screen&#10;&#10;AI-generated content may be incorrect."/>
+            <wp:cNvGraphicFramePr>
+              <a:graphicFrameLocks xmlns:a="http://schemas.openxmlformats.org/drawingml/2006/main" noChangeAspect="1"/>
+            </wp:cNvGraphicFramePr>
+            <a:graphic xmlns:a="http://schemas.openxmlformats.org/drawingml/2006/main">
+              <a:graphicData uri="http://schemas.openxmlformats.org/drawingml/2006/picture">
+                <pic:pic xmlns:pic="http://schemas.openxmlformats.org/drawingml/2006/picture">
+                  <pic:nvPicPr>
+                    <pic:cNvPr id="203930232" name="Picture 1" descr="A screen shot of a computer screen&#10;&#10;AI-generated content may be incorrect."/>
+                    <pic:cNvPicPr/>
+                  </pic:nvPicPr>
+                  <pic:blipFill>
+                    <a:blip r:embed="rId84"/>
+                    <a:stretch>
+                      <a:fillRect/>
+                    </a:stretch>
+                  </pic:blipFill>
+                  <pic:spPr>
+                    <a:xfrm>
+                      <a:off x="0" y="0"/>
+                      <a:ext cx="3065674" cy="2026687"/>
+                    </a:xfrm>
+                    <a:prstGeom prst="rect">
+                      <a:avLst/>
+                    </a:prstGeom>
+                  </pic:spPr>
+                </pic:pic>
+              </a:graphicData>
+            </a:graphic>
+          </wp:inline>
+        </w:drawing>
+      </w:r>
+    </w:p>
+    <w:p>
+      <w:pPr>
+        <w:rPr>
+          <w:b/>
+          <w:bCs/>
+          <w:lang w:val="en-US"/>
+        </w:rPr>
+      </w:pPr>
+    </w:p>
+    <w:p>
+      <w:pPr>
+        <w:pStyle w:val="ListParagraph"/>
+        <w:numPr>
+          <w:ilvl w:val="0"/>
+          <w:numId w:val="7"/>
+        </w:numPr>
+        <w:rPr>
+          <w:b/>
+          <w:bCs/>
+          <w:lang w:val="en-US"/>
+        </w:rPr>
+      </w:pPr>
+      <w:r>
+        <w:rPr>
+          <w:b/>
+          <w:bCs/>
+          <w:lang w:val="en-US"/>
+        </w:rPr>
+        <w:t xml:space="preserve">Created </w:t>
+      </w:r>
+      <w:proofErr w:type="spellStart"/>
+      <w:r>
+        <w:rPr>
+          <w:b/>
+          <w:bCs/>
+          <w:lang w:val="en-US"/>
+        </w:rPr>
+        <w:t>acceptClicked</w:t>
+      </w:r>
+      <w:proofErr w:type="spellEnd"/>
+      <w:r>
+        <w:rPr>
+          <w:b/>
+          <w:bCs/>
+          <w:lang w:val="en-US"/>
+        </w:rPr>
+        <w:t>() function to friends.tsx to trigger acceptFriendRequest and to re load the friends list and requests.</w:t>
+      </w:r>
+      <w:r>
+        <w:rPr>
+          <w:b/>
+          <w:bCs/>
+          <w:lang w:val="en-US"/>
+        </w:rPr>
+        <w:t xml:space="preserve"> (</w:t>
+      </w:r>
+      <w:proofErr w:type="spellStart"/>
+      <w:r>
+        <w:rPr>
+          <w:b/>
+          <w:bCs/>
+          <w:lang w:val="en-US"/>
+        </w:rPr>
+        <w:t>loadFriends</w:t>
+      </w:r>
+      <w:proofErr w:type="spellEnd"/>
+      <w:r>
+        <w:rPr>
+          <w:b/>
+          <w:bCs/>
+          <w:lang w:val="en-US"/>
+        </w:rPr>
+        <w:t>()) as placeholder for now, still have to make.</w:t>
+      </w:r>
+    </w:p>
+    <w:p>
+      <w:pPr>
+        <w:pStyle w:val="ListParagraph"/>
+        <w:rPr>
+          <w:b/>
+          <w:bCs/>
+          <w:lang w:val="en-US"/>
+        </w:rPr>
+      </w:pPr>
+      <w:r>
+        <w:rPr>
+          <w:b/>
+          <w:bCs/>
+          <w:lang w:val="en-US"/>
+        </w:rPr>
+        <w:drawing>
+          <wp:anchor distT="0" distB="0" distL="114300" distR="114300" simplePos="0" relativeHeight="251701248" behindDoc="0" locked="0" layoutInCell="1" allowOverlap="1" wp14:anchorId="31640FE1" wp14:editId="113620D2">
+            <wp:simplePos x="0" y="0"/>
+            <wp:positionH relativeFrom="column">
+              <wp:posOffset>459740</wp:posOffset>
+            </wp:positionH>
+            <wp:positionV relativeFrom="paragraph">
+              <wp:posOffset>-1270</wp:posOffset>
+            </wp:positionV>
+            <wp:extent cx="3662680" cy="1712595"/>
+            <wp:effectExtent l="0" t="0" r="0" b="1905"/>
+            <wp:wrapSquare wrapText="bothSides"/>
+            <wp:docPr id="98355729" name="Picture 1" descr="A screen shot of a computer program&#10;&#10;AI-generated content may be incorrect."/>
+            <wp:cNvGraphicFramePr>
+              <a:graphicFrameLocks xmlns:a="http://schemas.openxmlformats.org/drawingml/2006/main" noChangeAspect="1"/>
+            </wp:cNvGraphicFramePr>
+            <a:graphic xmlns:a="http://schemas.openxmlformats.org/drawingml/2006/main">
+              <a:graphicData uri="http://schemas.openxmlformats.org/drawingml/2006/picture">
+                <pic:pic xmlns:pic="http://schemas.openxmlformats.org/drawingml/2006/picture">
+                  <pic:nvPicPr>
+                    <pic:cNvPr id="98355729" name="Picture 1" descr="A screen shot of a computer program&#10;&#10;AI-generated content may be incorrect."/>
+                    <pic:cNvPicPr/>
+                  </pic:nvPicPr>
+                  <pic:blipFill>
+                    <a:blip r:embed="rId85">
+                      <a:extLst>
+                        <a:ext uri="{28A0092B-C50C-407E-A947-70E740481C1C}">
+                          <a14:useLocalDpi xmlns:a14="http://schemas.microsoft.com/office/drawing/2010/main" val="0"/>
+                        </a:ext>
+                      </a:extLst>
+                    </a:blip>
+                    <a:stretch>
+                      <a:fillRect/>
+                    </a:stretch>
+                  </pic:blipFill>
+                  <pic:spPr>
+                    <a:xfrm>
+                      <a:off x="0" y="0"/>
+                      <a:ext cx="3662680" cy="1712595"/>
+                    </a:xfrm>
+                    <a:prstGeom prst="rect">
+                      <a:avLst/>
+                    </a:prstGeom>
+                  </pic:spPr>
+                </pic:pic>
+              </a:graphicData>
+            </a:graphic>
+            <wp14:sizeRelH relativeFrom="page">
+              <wp14:pctWidth>0</wp14:pctWidth>
+            </wp14:sizeRelH>
+            <wp14:sizeRelV relativeFrom="page">
+              <wp14:pctHeight>0</wp14:pctHeight>
+            </wp14:sizeRelV>
+          </wp:anchor>
+        </w:drawing>
+      </w:r>
+    </w:p>
+    <w:p>
+      <w:pPr>
+        <w:pStyle w:val="ListParagraph"/>
+        <w:rPr>
+          <w:b/>
+          <w:bCs/>
+          <w:lang w:val="en-US"/>
+        </w:rPr>
+      </w:pPr>
+    </w:p>
+    <w:p>
+      <w:pPr>
+        <w:pStyle w:val="ListParagraph"/>
+        <w:rPr>
+          <w:b/>
+          <w:bCs/>
+          <w:lang w:val="en-US"/>
+        </w:rPr>
+      </w:pPr>
+    </w:p>
+    <w:p>
+      <w:pPr>
+        <w:pStyle w:val="ListParagraph"/>
+        <w:rPr>
+          <w:b/>
+          <w:bCs/>
+          <w:lang w:val="en-US"/>
+        </w:rPr>
+      </w:pPr>
+    </w:p>
+    <w:p>
+      <w:pPr>
+        <w:pStyle w:val="ListParagraph"/>
+        <w:rPr>
+          <w:b/>
+          <w:bCs/>
+          <w:lang w:val="en-US"/>
+        </w:rPr>
+      </w:pPr>
+    </w:p>
+    <w:p>
+      <w:pPr>
+        <w:pStyle w:val="ListParagraph"/>
+        <w:rPr>
+          <w:b/>
+          <w:bCs/>
+          <w:lang w:val="en-US"/>
+        </w:rPr>
+      </w:pPr>
+    </w:p>
+    <w:p>
+      <w:pPr>
+        <w:pStyle w:val="ListParagraph"/>
+        <w:rPr>
+          <w:b/>
+          <w:bCs/>
+          <w:lang w:val="en-US"/>
+        </w:rPr>
+      </w:pPr>
+    </w:p>
+    <w:p>
+      <w:pPr>
+        <w:pStyle w:val="ListParagraph"/>
+        <w:rPr>
+          <w:b/>
+          <w:bCs/>
+          <w:lang w:val="en-US"/>
+        </w:rPr>
+      </w:pPr>
+    </w:p>
+    <w:p>
+      <w:pPr>
+        <w:rPr>
+          <w:b/>
+          <w:bCs/>
+          <w:lang w:val="en-US"/>
+        </w:rPr>
+      </w:pPr>
+    </w:p>
+    <w:p>
+      <w:pPr>
+        <w:pStyle w:val="ListParagraph"/>
+        <w:rPr>
+          <w:b/>
+          <w:bCs/>
+          <w:lang w:val="en-US"/>
+        </w:rPr>
+      </w:pPr>
+    </w:p>
+    <w:p>
+      <w:pPr>
+        <w:pStyle w:val="ListParagraph"/>
+        <w:numPr>
+          <w:ilvl w:val="0"/>
+          <w:numId w:val="7"/>
+        </w:numPr>
+        <w:rPr>
+          <w:b/>
+          <w:bCs/>
+          <w:lang w:val="en-US"/>
+        </w:rPr>
+      </w:pPr>
+      <w:r>
+        <w:rPr>
+          <w:b/>
+          <w:bCs/>
+          <w:lang w:val="en-US"/>
+        </w:rPr>
+        <w:t xml:space="preserve">Added </w:t>
+      </w:r>
+      <w:proofErr w:type="spellStart"/>
+      <w:r>
+        <w:rPr>
+          <w:b/>
+          <w:bCs/>
+          <w:lang w:val="en-US"/>
+        </w:rPr>
+        <w:t>loadFriends</w:t>
+      </w:r>
+      <w:proofErr w:type="spellEnd"/>
+      <w:r>
+        <w:rPr>
+          <w:b/>
+          <w:bCs/>
+          <w:lang w:val="en-US"/>
+        </w:rPr>
+        <w:t>() function.</w:t>
+      </w:r>
+    </w:p>
+    <w:p>
+      <w:pPr>
+        <w:pStyle w:val="ListParagraph"/>
+        <w:rPr>
+          <w:b/>
+          <w:bCs/>
+          <w:lang w:val="en-US"/>
+        </w:rPr>
+      </w:pPr>
+      <w:r>
+        <w:rPr>
+          <w:b/>
+          <w:bCs/>
+          <w:lang w:val="en-US"/>
+        </w:rPr>
+        <w:drawing>
+          <wp:anchor distT="0" distB="0" distL="114300" distR="114300" simplePos="0" relativeHeight="251706368" behindDoc="0" locked="0" layoutInCell="1" allowOverlap="1" wp14:anchorId="034DFFF9" wp14:editId="3DFDED79">
+            <wp:simplePos x="0" y="0"/>
+            <wp:positionH relativeFrom="column">
+              <wp:posOffset>459740</wp:posOffset>
+            </wp:positionH>
+            <wp:positionV relativeFrom="paragraph">
+              <wp:posOffset>181610</wp:posOffset>
+            </wp:positionV>
+            <wp:extent cx="3018155" cy="1447800"/>
+            <wp:effectExtent l="0" t="0" r="0" b="0"/>
+            <wp:wrapSquare wrapText="bothSides"/>
+            <wp:docPr id="964865064" name="Picture 1" descr="A computer screen shot of a program code&#10;&#10;AI-generated content may be incorrect."/>
+            <wp:cNvGraphicFramePr>
+              <a:graphicFrameLocks xmlns:a="http://schemas.openxmlformats.org/drawingml/2006/main" noChangeAspect="1"/>
+            </wp:cNvGraphicFramePr>
+            <a:graphic xmlns:a="http://schemas.openxmlformats.org/drawingml/2006/main">
+              <a:graphicData uri="http://schemas.openxmlformats.org/drawingml/2006/picture">
+                <pic:pic xmlns:pic="http://schemas.openxmlformats.org/drawingml/2006/picture">
+                  <pic:nvPicPr>
+                    <pic:cNvPr id="964865064" name="Picture 1" descr="A computer screen shot of a program code&#10;&#10;AI-generated content may be incorrect."/>
+                    <pic:cNvPicPr/>
+                  </pic:nvPicPr>
+                  <pic:blipFill>
+                    <a:blip r:embed="rId86">
+                      <a:extLst>
+                        <a:ext uri="{28A0092B-C50C-407E-A947-70E740481C1C}">
+                          <a14:useLocalDpi xmlns:a14="http://schemas.microsoft.com/office/drawing/2010/main" val="0"/>
+                        </a:ext>
+                      </a:extLst>
+                    </a:blip>
+                    <a:stretch>
+                      <a:fillRect/>
+                    </a:stretch>
+                  </pic:blipFill>
+                  <pic:spPr>
+                    <a:xfrm>
+                      <a:off x="0" y="0"/>
+                      <a:ext cx="3018155" cy="1447800"/>
+                    </a:xfrm>
+                    <a:prstGeom prst="rect">
+                      <a:avLst/>
+                    </a:prstGeom>
+                  </pic:spPr>
+                </pic:pic>
+              </a:graphicData>
+            </a:graphic>
+            <wp14:sizeRelH relativeFrom="page">
+              <wp14:pctWidth>0</wp14:pctWidth>
+            </wp14:sizeRelH>
+            <wp14:sizeRelV relativeFrom="page">
+              <wp14:pctHeight>0</wp14:pctHeight>
+            </wp14:sizeRelV>
+          </wp:anchor>
+        </w:drawing>
+      </w:r>
+    </w:p>
+    <w:p>
+      <w:pPr>
+        <w:pStyle w:val="ListParagraph"/>
+        <w:rPr>
+          <w:b/>
+          <w:bCs/>
+          <w:lang w:val="en-US"/>
+        </w:rPr>
+      </w:pPr>
+    </w:p>
+    <w:p>
+      <w:pPr>
+        <w:pStyle w:val="ListParagraph"/>
+        <w:rPr>
+          <w:b/>
+          <w:bCs/>
+          <w:lang w:val="en-US"/>
+        </w:rPr>
+      </w:pPr>
+    </w:p>
+    <w:p>
+      <w:pPr>
+        <w:pStyle w:val="ListParagraph"/>
+        <w:rPr>
+          <w:b/>
+          <w:bCs/>
+          <w:lang w:val="en-US"/>
+        </w:rPr>
+      </w:pPr>
+    </w:p>
+    <w:p>
+      <w:pPr>
+        <w:pStyle w:val="ListParagraph"/>
+        <w:rPr>
+          <w:b/>
+          <w:bCs/>
+          <w:lang w:val="en-US"/>
+        </w:rPr>
+      </w:pPr>
+    </w:p>
+    <w:p>
+      <w:pPr>
+        <w:pStyle w:val="ListParagraph"/>
+        <w:rPr>
+          <w:b/>
+          <w:bCs/>
+          <w:lang w:val="en-US"/>
+        </w:rPr>
+      </w:pPr>
+    </w:p>
+    <w:p>
+      <w:pPr>
+        <w:pStyle w:val="ListParagraph"/>
+        <w:rPr>
+          <w:b/>
+          <w:bCs/>
+          <w:lang w:val="en-US"/>
+        </w:rPr>
+      </w:pPr>
+    </w:p>
+    <w:p>
+      <w:pPr>
+        <w:rPr>
+          <w:b/>
+          <w:bCs/>
+          <w:lang w:val="en-US"/>
+        </w:rPr>
+      </w:pPr>
+    </w:p>
+    <w:p>
+      <w:pPr>
+        <w:pStyle w:val="ListParagraph"/>
+        <w:numPr>
+          <w:ilvl w:val="0"/>
+          <w:numId w:val="7"/>
+        </w:numPr>
+        <w:rPr>
+          <w:b/>
+          <w:bCs/>
+          <w:lang w:val="en-US"/>
+        </w:rPr>
+      </w:pPr>
+      <w:r>
+        <w:rPr>
+          <w:b/>
+          <w:bCs/>
+          <w:lang w:val="en-US"/>
+        </w:rPr>
+        <w:t xml:space="preserve">Updated empty friends </w:t>
+      </w:r>
+      <w:proofErr w:type="spellStart"/>
+      <w:r>
+        <w:rPr>
+          <w:b/>
+          <w:bCs/>
+          <w:lang w:val="en-US"/>
+        </w:rPr>
+        <w:t>flatlist</w:t>
+      </w:r>
+      <w:proofErr w:type="spellEnd"/>
+      <w:r>
+        <w:rPr>
+          <w:b/>
+          <w:bCs/>
+          <w:lang w:val="en-US"/>
+        </w:rPr>
+        <w:t>.</w:t>
+      </w:r>
+    </w:p>
+    <w:p>
+      <w:pPr>
+        <w:pStyle w:val="ListParagraph"/>
+        <w:rPr>
+          <w:b/>
+          <w:bCs/>
+          <w:lang w:val="en-US"/>
+        </w:rPr>
+      </w:pPr>
+      <w:r>
+        <w:rPr>
+          <w:b/>
+          <w:bCs/>
+          <w:lang w:val="en-US"/>
+        </w:rPr>
+        <w:drawing>
+          <wp:anchor distT="0" distB="0" distL="114300" distR="114300" simplePos="0" relativeHeight="251703296" behindDoc="0" locked="0" layoutInCell="1" allowOverlap="1" wp14:anchorId="764059C8" wp14:editId="7FE4B1C1">
+            <wp:simplePos x="0" y="0"/>
+            <wp:positionH relativeFrom="column">
+              <wp:posOffset>263412</wp:posOffset>
+            </wp:positionH>
+            <wp:positionV relativeFrom="paragraph">
+              <wp:posOffset>64110</wp:posOffset>
+            </wp:positionV>
+            <wp:extent cx="2917825" cy="1204595"/>
+            <wp:effectExtent l="0" t="0" r="0" b="0"/>
+            <wp:wrapSquare wrapText="bothSides"/>
+            <wp:docPr id="1162324497" name="Picture 1" descr="A computer screen with text and images&#10;&#10;AI-generated content may be incorrect."/>
+            <wp:cNvGraphicFramePr>
+              <a:graphicFrameLocks xmlns:a="http://schemas.openxmlformats.org/drawingml/2006/main" noChangeAspect="1"/>
+            </wp:cNvGraphicFramePr>
+            <a:graphic xmlns:a="http://schemas.openxmlformats.org/drawingml/2006/main">
+              <a:graphicData uri="http://schemas.openxmlformats.org/drawingml/2006/picture">
+                <pic:pic xmlns:pic="http://schemas.openxmlformats.org/drawingml/2006/picture">
+                  <pic:nvPicPr>
+                    <pic:cNvPr id="1162324497" name="Picture 1" descr="A computer screen with text and images&#10;&#10;AI-generated content may be incorrect."/>
+                    <pic:cNvPicPr/>
+                  </pic:nvPicPr>
+                  <pic:blipFill>
+                    <a:blip r:embed="rId87">
+                      <a:extLst>
+                        <a:ext uri="{28A0092B-C50C-407E-A947-70E740481C1C}">
+                          <a14:useLocalDpi xmlns:a14="http://schemas.microsoft.com/office/drawing/2010/main" val="0"/>
+                        </a:ext>
+                      </a:extLst>
+                    </a:blip>
+                    <a:stretch>
+                      <a:fillRect/>
+                    </a:stretch>
+                  </pic:blipFill>
+                  <pic:spPr>
+                    <a:xfrm>
+                      <a:off x="0" y="0"/>
+                      <a:ext cx="2917825" cy="1204595"/>
+                    </a:xfrm>
+                    <a:prstGeom prst="rect">
+                      <a:avLst/>
+                    </a:prstGeom>
+                  </pic:spPr>
+                </pic:pic>
+              </a:graphicData>
+            </a:graphic>
+            <wp14:sizeRelH relativeFrom="page">
+              <wp14:pctWidth>0</wp14:pctWidth>
+            </wp14:sizeRelH>
+            <wp14:sizeRelV relativeFrom="page">
+              <wp14:pctHeight>0</wp14:pctHeight>
+            </wp14:sizeRelV>
+          </wp:anchor>
+        </w:drawing>
+      </w:r>
+      <w:r>
+        <w:rPr>
+          <w:b/>
+          <w:bCs/>
+          <w:lang w:val="en-US"/>
+        </w:rPr>
+        <w:br/>
+      </w:r>
+      <w:r>
+        <w:rPr>
+          <w:b/>
+          <w:bCs/>
+          <w:lang w:val="en-US"/>
+        </w:rPr>
+        <w:br/>
+      </w:r>
+      <w:r>
+        <w:rPr>
+          <w:b/>
+          <w:bCs/>
+          <w:lang w:val="en-US"/>
+        </w:rPr>
+        <w:br/>
+      </w:r>
+      <w:r>
+        <w:rPr>
+          <w:b/>
+          <w:bCs/>
+          <w:lang w:val="en-US"/>
+        </w:rPr>
+        <w:br/>
+      </w:r>
+      <w:r>
+        <w:rPr>
+          <w:b/>
+          <w:bCs/>
+          <w:lang w:val="en-US"/>
+        </w:rPr>
+        <w:br/>
+      </w:r>
+    </w:p>
+    <w:p>
+      <w:pPr>
+        <w:pStyle w:val="ListParagraph"/>
+        <w:numPr>
+          <w:ilvl w:val="0"/>
+          <w:numId w:val="7"/>
+        </w:numPr>
+        <w:rPr>
+          <w:b/>
+          <w:bCs/>
+          <w:lang w:val="en-US"/>
+        </w:rPr>
+      </w:pPr>
+      <w:r>
+        <w:rPr>
+          <w:b/>
+          <w:bCs/>
+          <w:lang w:val="en-US"/>
+        </w:rPr>
+        <w:br w:type="page"/>
+      </w:r>
+      <w:r>
+        <w:rPr>
+          <w:b/>
+          <w:bCs/>
+          <w:lang w:val="en-US"/>
+        </w:rPr>
+        <w:lastRenderedPageBreak/>
+        <w:t>Testing</w:t>
+      </w:r>
+    </w:p>
+    <w:p>
+      <w:pPr>
+        <w:pStyle w:val="ListParagraph"/>
+        <w:rPr>
+          <w:b/>
+          <w:bCs/>
+          <w:lang w:val="en-US"/>
+        </w:rPr>
+      </w:pPr>
+    </w:p>
+    <w:p>
+      <w:pPr>
+        <w:pStyle w:val="ListParagraph"/>
+        <w:rPr>
+          <w:b/>
+          <w:bCs/>
+          <w:lang w:val="en-US"/>
+        </w:rPr>
+      </w:pPr>
+      <w:r>
+        <w:rPr>
+          <w:b/>
+          <w:bCs/>
+          <w:lang w:val="en-US"/>
+        </w:rPr>
+        <w:drawing>
+          <wp:anchor distT="0" distB="0" distL="114300" distR="114300" simplePos="0" relativeHeight="251705344" behindDoc="0" locked="0" layoutInCell="1" allowOverlap="1" wp14:anchorId="0F88246C" wp14:editId="0710687E">
+            <wp:simplePos x="0" y="0"/>
+            <wp:positionH relativeFrom="column">
+              <wp:posOffset>459740</wp:posOffset>
+            </wp:positionH>
+            <wp:positionV relativeFrom="paragraph">
+              <wp:posOffset>1163955</wp:posOffset>
+            </wp:positionV>
+            <wp:extent cx="3926840" cy="1306830"/>
+            <wp:effectExtent l="0" t="0" r="0" b="7620"/>
+            <wp:wrapSquare wrapText="bothSides"/>
+            <wp:docPr id="1767213742" name="Picture 1" descr="A screen shot of a computer code&#10;&#10;AI-generated content may be incorrect."/>
+            <wp:cNvGraphicFramePr>
+              <a:graphicFrameLocks xmlns:a="http://schemas.openxmlformats.org/drawingml/2006/main" noChangeAspect="1"/>
+            </wp:cNvGraphicFramePr>
+            <a:graphic xmlns:a="http://schemas.openxmlformats.org/drawingml/2006/main">
+              <a:graphicData uri="http://schemas.openxmlformats.org/drawingml/2006/picture">
+                <pic:pic xmlns:pic="http://schemas.openxmlformats.org/drawingml/2006/picture">
+                  <pic:nvPicPr>
+                    <pic:cNvPr id="1767213742" name="Picture 1" descr="A screen shot of a computer code&#10;&#10;AI-generated content may be incorrect."/>
+                    <pic:cNvPicPr/>
+                  </pic:nvPicPr>
+                  <pic:blipFill>
+                    <a:blip r:embed="rId88" cstate="print">
+                      <a:extLst>
+                        <a:ext uri="{28A0092B-C50C-407E-A947-70E740481C1C}">
+                          <a14:useLocalDpi xmlns:a14="http://schemas.microsoft.com/office/drawing/2010/main" val="0"/>
+                        </a:ext>
+                      </a:extLst>
+                    </a:blip>
+                    <a:stretch>
+                      <a:fillRect/>
+                    </a:stretch>
+                  </pic:blipFill>
+                  <pic:spPr>
+                    <a:xfrm>
+                      <a:off x="0" y="0"/>
+                      <a:ext cx="3926840" cy="1306830"/>
+                    </a:xfrm>
+                    <a:prstGeom prst="rect">
+                      <a:avLst/>
+                    </a:prstGeom>
+                  </pic:spPr>
+                </pic:pic>
+              </a:graphicData>
+            </a:graphic>
+            <wp14:sizeRelH relativeFrom="page">
+              <wp14:pctWidth>0</wp14:pctWidth>
+            </wp14:sizeRelH>
+            <wp14:sizeRelV relativeFrom="page">
+              <wp14:pctHeight>0</wp14:pctHeight>
+            </wp14:sizeRelV>
+          </wp:anchor>
+        </w:drawing>
+      </w:r>
+      <w:r>
+        <w:rPr>
+          <w:lang w:val="en-US"/>
+        </w:rPr>
+        <w:drawing>
+          <wp:anchor distT="0" distB="0" distL="114300" distR="114300" simplePos="0" relativeHeight="251704320" behindDoc="0" locked="0" layoutInCell="1" allowOverlap="1" wp14:anchorId="1EC17D82" wp14:editId="76BC044F">
+            <wp:simplePos x="0" y="0"/>
+            <wp:positionH relativeFrom="column">
+              <wp:posOffset>459740</wp:posOffset>
+            </wp:positionH>
+            <wp:positionV relativeFrom="paragraph">
+              <wp:posOffset>196622</wp:posOffset>
+            </wp:positionV>
+            <wp:extent cx="5731510" cy="412750"/>
+            <wp:effectExtent l="0" t="0" r="2540" b="6350"/>
+            <wp:wrapSquare wrapText="bothSides"/>
+            <wp:docPr id="1714332244" name="Picture 1"/>
+            <wp:cNvGraphicFramePr>
+              <a:graphicFrameLocks xmlns:a="http://schemas.openxmlformats.org/drawingml/2006/main" noChangeAspect="1"/>
+            </wp:cNvGraphicFramePr>
+            <a:graphic xmlns:a="http://schemas.openxmlformats.org/drawingml/2006/main">
+              <a:graphicData uri="http://schemas.openxmlformats.org/drawingml/2006/picture">
+                <pic:pic xmlns:pic="http://schemas.openxmlformats.org/drawingml/2006/picture">
+                  <pic:nvPicPr>
+                    <pic:cNvPr id="1714332244" name=""/>
+                    <pic:cNvPicPr/>
+                  </pic:nvPicPr>
+                  <pic:blipFill>
+                    <a:blip r:embed="rId89">
+                      <a:extLst>
+                        <a:ext uri="{28A0092B-C50C-407E-A947-70E740481C1C}">
+                          <a14:useLocalDpi xmlns:a14="http://schemas.microsoft.com/office/drawing/2010/main" val="0"/>
+                        </a:ext>
+                      </a:extLst>
+                    </a:blip>
+                    <a:stretch>
+                      <a:fillRect/>
+                    </a:stretch>
+                  </pic:blipFill>
+                  <pic:spPr>
+                    <a:xfrm>
+                      <a:off x="0" y="0"/>
+                      <a:ext cx="5731510" cy="412750"/>
+                    </a:xfrm>
+                    <a:prstGeom prst="rect">
+                      <a:avLst/>
+                    </a:prstGeom>
+                  </pic:spPr>
+                </pic:pic>
+              </a:graphicData>
+            </a:graphic>
+            <wp14:sizeRelH relativeFrom="page">
+              <wp14:pctWidth>0</wp14:pctWidth>
+            </wp14:sizeRelH>
+            <wp14:sizeRelV relativeFrom="page">
+              <wp14:pctHeight>0</wp14:pctHeight>
+            </wp14:sizeRelV>
+          </wp:anchor>
+        </w:drawing>
+      </w:r>
+      <w:r>
+        <w:rPr>
+          <w:b/>
+          <w:bCs/>
+          <w:color w:val="EE0000"/>
+          <w:lang w:val="en-US"/>
+        </w:rPr>
+        <w:t>On clicking Friends tab:</w:t>
+      </w:r>
+      <w:r>
+        <w:rPr>
+          <w:b/>
+          <w:bCs/>
+          <w:lang w:val="en-US"/>
+        </w:rPr>
+        <w:br/>
+      </w:r>
+      <w:r>
+        <w:rPr>
+          <w:b/>
+          <w:bCs/>
+          <w:lang w:val="en-US"/>
+        </w:rPr>
+        <w:br/>
+      </w:r>
+      <w:r>
+        <w:rPr>
+          <w:b/>
+          <w:bCs/>
+          <w:color w:val="4EA72E" w:themeColor="accent6"/>
+          <w:lang w:val="en-US"/>
+        </w:rPr>
+        <w:t>Solution:</w:t>
+      </w:r>
+      <w:r>
+        <w:rPr>
+          <w:b/>
+          <w:bCs/>
+          <w:lang w:val="en-US"/>
+        </w:rPr>
+        <w:br/>
+        <w:t>- forgot to import “collection, query, db, where or getDocs” in friends.tsx…</w:t>
+      </w:r>
+    </w:p>
+    <w:p>
+      <w:pPr>
+        <w:pStyle w:val="ListParagraph"/>
+        <w:rPr>
+          <w:b/>
+          <w:bCs/>
+          <w:lang w:val="en-US"/>
+        </w:rPr>
+      </w:pPr>
+      <w:r>
+        <w:rPr>
+          <w:b/>
+          <w:bCs/>
+          <w:lang w:val="en-US"/>
+        </w:rPr>
+        <w:br/>
+      </w:r>
+      <w:r>
+        <w:rPr>
+          <w:b/>
+          <w:bCs/>
+          <w:lang w:val="en-US"/>
+        </w:rPr>
+        <w:br/>
+      </w:r>
+      <w:r>
+        <w:rPr>
+          <w:b/>
+          <w:bCs/>
+          <w:lang w:val="en-US"/>
+        </w:rPr>
+        <w:br/>
+      </w:r>
+    </w:p>
+    <w:p>
+      <w:pPr>
+        <w:rPr>
+          <w:b/>
+          <w:bCs/>
+          <w:lang w:val="en-US"/>
+        </w:rPr>
+      </w:pPr>
+      <w:r>
+        <w:rPr>
+          <w:b/>
+          <w:bCs/>
+          <w:lang w:val="en-US"/>
+        </w:rPr>
+        <w:tab/>
+      </w:r>
+    </w:p>
+    <w:p>
+      <w:pPr>
+        <w:rPr>
+          <w:b/>
+          <w:bCs/>
+          <w:lang w:val="en-US"/>
+        </w:rPr>
+      </w:pPr>
+    </w:p>
+    <w:p>
+      <w:pPr>
+        <w:rPr>
+          <w:b/>
+          <w:bCs/>
+          <w:lang w:val="en-US"/>
+        </w:rPr>
+      </w:pPr>
+    </w:p>
+    <w:p>
+      <w:pPr>
+        <w:rPr>
+          <w:b/>
+          <w:bCs/>
+          <w:lang w:val="en-US"/>
+        </w:rPr>
+      </w:pPr>
+      <w:r>
+        <w:rPr>
+          <w:b/>
+          <w:bCs/>
+          <w:lang w:val="en-US"/>
+        </w:rPr>
+        <w:drawing>
+          <wp:anchor distT="0" distB="0" distL="114300" distR="114300" simplePos="0" relativeHeight="251707392" behindDoc="0" locked="0" layoutInCell="1" allowOverlap="1" wp14:anchorId="2484F31B" wp14:editId="5FDB0BF3">
+            <wp:simplePos x="0" y="0"/>
+            <wp:positionH relativeFrom="column">
+              <wp:posOffset>2985641</wp:posOffset>
+            </wp:positionH>
+            <wp:positionV relativeFrom="paragraph">
+              <wp:posOffset>151728</wp:posOffset>
+            </wp:positionV>
+            <wp:extent cx="1953895" cy="903605"/>
+            <wp:effectExtent l="0" t="0" r="8255" b="0"/>
+            <wp:wrapSquare wrapText="bothSides"/>
+            <wp:docPr id="784385060" name="Picture 1" descr="A screenshot of a computer&#10;&#10;AI-generated content may be incorrect."/>
+            <wp:cNvGraphicFramePr>
+              <a:graphicFrameLocks xmlns:a="http://schemas.openxmlformats.org/drawingml/2006/main" noChangeAspect="1"/>
+            </wp:cNvGraphicFramePr>
+            <a:graphic xmlns:a="http://schemas.openxmlformats.org/drawingml/2006/main">
+              <a:graphicData uri="http://schemas.openxmlformats.org/drawingml/2006/picture">
+                <pic:pic xmlns:pic="http://schemas.openxmlformats.org/drawingml/2006/picture">
+                  <pic:nvPicPr>
+                    <pic:cNvPr id="784385060" name="Picture 1" descr="A screenshot of a computer&#10;&#10;AI-generated content may be incorrect."/>
+                    <pic:cNvPicPr/>
+                  </pic:nvPicPr>
+                  <pic:blipFill>
+                    <a:blip r:embed="rId90">
+                      <a:extLst>
+                        <a:ext uri="{28A0092B-C50C-407E-A947-70E740481C1C}">
+                          <a14:useLocalDpi xmlns:a14="http://schemas.microsoft.com/office/drawing/2010/main" val="0"/>
+                        </a:ext>
+                      </a:extLst>
+                    </a:blip>
+                    <a:stretch>
+                      <a:fillRect/>
+                    </a:stretch>
+                  </pic:blipFill>
+                  <pic:spPr>
+                    <a:xfrm>
+                      <a:off x="0" y="0"/>
+                      <a:ext cx="1953895" cy="903605"/>
+                    </a:xfrm>
+                    <a:prstGeom prst="rect">
+                      <a:avLst/>
+                    </a:prstGeom>
+                  </pic:spPr>
+                </pic:pic>
+              </a:graphicData>
+            </a:graphic>
+            <wp14:sizeRelH relativeFrom="page">
+              <wp14:pctWidth>0</wp14:pctWidth>
+            </wp14:sizeRelH>
+            <wp14:sizeRelV relativeFrom="page">
+              <wp14:pctHeight>0</wp14:pctHeight>
+            </wp14:sizeRelV>
+          </wp:anchor>
+        </w:drawing>
+      </w:r>
+      <w:r>
+        <w:rPr>
+          <w:b/>
+          <w:bCs/>
+          <w:lang w:val="en-US"/>
+        </w:rPr>
+        <w:t>Back to testing:</w:t>
+      </w:r>
+    </w:p>
+    <w:p>
+      <w:pPr>
+        <w:pStyle w:val="ListParagraph"/>
+        <w:numPr>
+          <w:ilvl w:val="0"/>
+          <w:numId w:val="8"/>
+        </w:numPr>
+        <w:rPr>
+          <w:b/>
+          <w:bCs/>
+          <w:lang w:val="en-US"/>
+        </w:rPr>
+      </w:pPr>
+      <w:r>
+        <w:rPr>
+          <w:b/>
+          <w:bCs/>
+          <w:lang w:val="en-US"/>
+        </w:rPr>
+        <w:t>Logged in as UserA.</w:t>
+      </w:r>
+    </w:p>
+    <w:p>
+      <w:pPr>
+        <w:pStyle w:val="ListParagraph"/>
+        <w:numPr>
+          <w:ilvl w:val="0"/>
+          <w:numId w:val="8"/>
+        </w:numPr>
+        <w:rPr>
+          <w:b/>
+          <w:bCs/>
+          <w:lang w:val="en-US"/>
+        </w:rPr>
+      </w:pPr>
+      <w:r>
+        <w:rPr>
+          <w:b/>
+          <w:bCs/>
+          <w:lang w:val="en-US"/>
+        </w:rPr>
+        <w:t>Sent Friend Request to UserB.</w:t>
+      </w:r>
+    </w:p>
+    <w:p>
+      <w:pPr>
+        <w:pStyle w:val="ListParagraph"/>
+        <w:numPr>
+          <w:ilvl w:val="0"/>
+          <w:numId w:val="8"/>
+        </w:numPr>
+        <w:rPr>
+          <w:b/>
+          <w:bCs/>
+          <w:lang w:val="en-US"/>
+        </w:rPr>
+      </w:pPr>
+      <w:r>
+        <w:rPr>
+          <w:b/>
+          <w:bCs/>
+          <w:lang w:val="en-US"/>
+        </w:rPr>
+        <w:t>Logged in as UserB.</w:t>
+      </w:r>
+    </w:p>
+    <w:p>
+      <w:pPr>
+        <w:pStyle w:val="ListParagraph"/>
+        <w:numPr>
+          <w:ilvl w:val="0"/>
+          <w:numId w:val="8"/>
+        </w:numPr>
+        <w:rPr>
+          <w:b/>
+          <w:bCs/>
+          <w:lang w:val="en-US"/>
+        </w:rPr>
+      </w:pPr>
+      <w:r>
+        <w:rPr>
+          <w:b/>
+          <w:bCs/>
+          <w:lang w:val="en-US"/>
+        </w:rPr>
+        <w:t>Accepted Request.</w:t>
+      </w:r>
+    </w:p>
+    <w:p>
+      <w:pPr>
+        <w:pStyle w:val="ListParagraph"/>
+        <w:numPr>
+          <w:ilvl w:val="0"/>
+          <w:numId w:val="8"/>
+        </w:numPr>
+        <w:rPr>
+          <w:b/>
+          <w:bCs/>
+          <w:lang w:val="en-US"/>
+        </w:rPr>
+      </w:pPr>
+      <w:r>
+        <w:rPr>
+          <w:b/>
+          <w:bCs/>
+          <w:lang w:val="en-US"/>
+        </w:rPr>
+        <w:t>Logged in as User A.</w:t>
+      </w:r>
+    </w:p>
+    <w:p>
+      <w:pPr>
+        <w:pStyle w:val="ListParagraph"/>
+        <w:numPr>
+          <w:ilvl w:val="0"/>
+          <w:numId w:val="8"/>
+        </w:numPr>
+        <w:rPr>
+          <w:b/>
+          <w:bCs/>
+          <w:lang w:val="en-US"/>
+        </w:rPr>
+      </w:pPr>
+      <w:r>
+        <w:rPr>
+          <w:noProof/>
+        </w:rPr>
+        <w:drawing>
+          <wp:anchor distT="0" distB="0" distL="114300" distR="114300" simplePos="0" relativeHeight="251712512" behindDoc="0" locked="0" layoutInCell="1" allowOverlap="1" wp14:anchorId="3DAE41D9" wp14:editId="50575E0F">
+            <wp:simplePos x="0" y="0"/>
+            <wp:positionH relativeFrom="column">
+              <wp:posOffset>4112106</wp:posOffset>
+            </wp:positionH>
+            <wp:positionV relativeFrom="paragraph">
+              <wp:posOffset>3014521</wp:posOffset>
+            </wp:positionV>
+            <wp:extent cx="2235200" cy="1139825"/>
+            <wp:effectExtent l="0" t="0" r="0" b="3175"/>
+            <wp:wrapSquare wrapText="bothSides"/>
+            <wp:docPr id="2125198627" name="Picture 1" descr="A screenshot of a computer&#10;&#10;AI-generated content may be incorrect."/>
+            <wp:cNvGraphicFramePr>
+              <a:graphicFrameLocks xmlns:a="http://schemas.openxmlformats.org/drawingml/2006/main" noChangeAspect="1"/>
+            </wp:cNvGraphicFramePr>
+            <a:graphic xmlns:a="http://schemas.openxmlformats.org/drawingml/2006/main">
+              <a:graphicData uri="http://schemas.openxmlformats.org/drawingml/2006/picture">
+                <pic:pic xmlns:pic="http://schemas.openxmlformats.org/drawingml/2006/picture">
+                  <pic:nvPicPr>
+                    <pic:cNvPr id="2125198627" name="Picture 1" descr="A screenshot of a computer&#10;&#10;AI-generated content may be incorrect."/>
+                    <pic:cNvPicPr/>
+                  </pic:nvPicPr>
+                  <pic:blipFill>
+                    <a:blip r:embed="rId91">
+                      <a:extLst>
+                        <a:ext uri="{28A0092B-C50C-407E-A947-70E740481C1C}">
+                          <a14:useLocalDpi xmlns:a14="http://schemas.microsoft.com/office/drawing/2010/main" val="0"/>
+                        </a:ext>
+                      </a:extLst>
+                    </a:blip>
+                    <a:stretch>
+                      <a:fillRect/>
+                    </a:stretch>
+                  </pic:blipFill>
+                  <pic:spPr>
+                    <a:xfrm>
+                      <a:off x="0" y="0"/>
+                      <a:ext cx="2235200" cy="1139825"/>
+                    </a:xfrm>
+                    <a:prstGeom prst="rect">
+                      <a:avLst/>
+                    </a:prstGeom>
+                  </pic:spPr>
+                </pic:pic>
+              </a:graphicData>
+            </a:graphic>
+            <wp14:sizeRelH relativeFrom="page">
+              <wp14:pctWidth>0</wp14:pctWidth>
+            </wp14:sizeRelH>
+            <wp14:sizeRelV relativeFrom="page">
+              <wp14:pctHeight>0</wp14:pctHeight>
+            </wp14:sizeRelV>
+          </wp:anchor>
+        </w:drawing>
+      </w:r>
+      <w:r>
+        <w:rPr>
+          <w:noProof/>
+        </w:rPr>
+        <w:drawing>
+          <wp:anchor distT="0" distB="0" distL="114300" distR="114300" simplePos="0" relativeHeight="251711488" behindDoc="0" locked="0" layoutInCell="1" allowOverlap="1" wp14:anchorId="6BA3C224" wp14:editId="448CC171">
+            <wp:simplePos x="0" y="0"/>
+            <wp:positionH relativeFrom="column">
+              <wp:posOffset>1288926</wp:posOffset>
+            </wp:positionH>
+            <wp:positionV relativeFrom="paragraph">
+              <wp:posOffset>3352165</wp:posOffset>
+            </wp:positionV>
+            <wp:extent cx="2198370" cy="1071880"/>
+            <wp:effectExtent l="0" t="0" r="0" b="0"/>
+            <wp:wrapSquare wrapText="bothSides"/>
+            <wp:docPr id="85686999" name="Picture 1" descr="A screenshot of a computer&#10;&#10;AI-generated content may be incorrect."/>
+            <wp:cNvGraphicFramePr>
+              <a:graphicFrameLocks xmlns:a="http://schemas.openxmlformats.org/drawingml/2006/main" noChangeAspect="1"/>
+            </wp:cNvGraphicFramePr>
+            <a:graphic xmlns:a="http://schemas.openxmlformats.org/drawingml/2006/main">
+              <a:graphicData uri="http://schemas.openxmlformats.org/drawingml/2006/picture">
+                <pic:pic xmlns:pic="http://schemas.openxmlformats.org/drawingml/2006/picture">
+                  <pic:nvPicPr>
+                    <pic:cNvPr id="85686999" name="Picture 1" descr="A screenshot of a computer&#10;&#10;AI-generated content may be incorrect."/>
+                    <pic:cNvPicPr/>
+                  </pic:nvPicPr>
+                  <pic:blipFill>
+                    <a:blip r:embed="rId92">
+                      <a:extLst>
+                        <a:ext uri="{28A0092B-C50C-407E-A947-70E740481C1C}">
+                          <a14:useLocalDpi xmlns:a14="http://schemas.microsoft.com/office/drawing/2010/main" val="0"/>
+                        </a:ext>
+                      </a:extLst>
+                    </a:blip>
+                    <a:stretch>
+                      <a:fillRect/>
+                    </a:stretch>
+                  </pic:blipFill>
+                  <pic:spPr>
+                    <a:xfrm>
+                      <a:off x="0" y="0"/>
+                      <a:ext cx="2198370" cy="1071880"/>
+                    </a:xfrm>
+                    <a:prstGeom prst="rect">
+                      <a:avLst/>
+                    </a:prstGeom>
+                  </pic:spPr>
+                </pic:pic>
+              </a:graphicData>
+            </a:graphic>
+            <wp14:sizeRelH relativeFrom="page">
+              <wp14:pctWidth>0</wp14:pctWidth>
+            </wp14:sizeRelH>
+            <wp14:sizeRelV relativeFrom="page">
+              <wp14:pctHeight>0</wp14:pctHeight>
+            </wp14:sizeRelV>
+          </wp:anchor>
+        </w:drawing>
+      </w:r>
+      <w:r>
+        <w:rPr>
+          <w:b/>
+          <w:bCs/>
+          <w:lang w:val="en-US"/>
+        </w:rPr>
+        <w:drawing>
+          <wp:anchor distT="0" distB="0" distL="114300" distR="114300" simplePos="0" relativeHeight="251710464" behindDoc="0" locked="0" layoutInCell="1" allowOverlap="1" wp14:anchorId="59B9E8D2" wp14:editId="43B80E7B">
+            <wp:simplePos x="0" y="0"/>
+            <wp:positionH relativeFrom="column">
+              <wp:posOffset>3287164</wp:posOffset>
+            </wp:positionH>
+            <wp:positionV relativeFrom="paragraph">
+              <wp:posOffset>361436</wp:posOffset>
+            </wp:positionV>
+            <wp:extent cx="1569720" cy="3467735"/>
+            <wp:effectExtent l="0" t="0" r="0" b="0"/>
+            <wp:wrapSquare wrapText="bothSides"/>
+            <wp:docPr id="208597746" name="Picture 1" descr="A screenshot of a phone&#10;&#10;AI-generated content may be incorrect."/>
+            <wp:cNvGraphicFramePr>
+              <a:graphicFrameLocks xmlns:a="http://schemas.openxmlformats.org/drawingml/2006/main" noChangeAspect="1"/>
+            </wp:cNvGraphicFramePr>
+            <a:graphic xmlns:a="http://schemas.openxmlformats.org/drawingml/2006/main">
+              <a:graphicData uri="http://schemas.openxmlformats.org/drawingml/2006/picture">
+                <pic:pic xmlns:pic="http://schemas.openxmlformats.org/drawingml/2006/picture">
+                  <pic:nvPicPr>
+                    <pic:cNvPr id="208597746" name="Picture 1" descr="A screenshot of a phone&#10;&#10;AI-generated content may be incorrect."/>
+                    <pic:cNvPicPr/>
+                  </pic:nvPicPr>
+                  <pic:blipFill>
+                    <a:blip r:embed="rId93" cstate="print">
+                      <a:extLst>
+                        <a:ext uri="{28A0092B-C50C-407E-A947-70E740481C1C}">
+                          <a14:useLocalDpi xmlns:a14="http://schemas.microsoft.com/office/drawing/2010/main" val="0"/>
+                        </a:ext>
+                      </a:extLst>
+                    </a:blip>
+                    <a:stretch>
+                      <a:fillRect/>
+                    </a:stretch>
+                  </pic:blipFill>
+                  <pic:spPr>
+                    <a:xfrm>
+                      <a:off x="0" y="0"/>
+                      <a:ext cx="1569720" cy="3467735"/>
+                    </a:xfrm>
+                    <a:prstGeom prst="rect">
+                      <a:avLst/>
+                    </a:prstGeom>
+                  </pic:spPr>
+                </pic:pic>
+              </a:graphicData>
+            </a:graphic>
+            <wp14:sizeRelH relativeFrom="page">
+              <wp14:pctWidth>0</wp14:pctWidth>
+            </wp14:sizeRelH>
+            <wp14:sizeRelV relativeFrom="page">
+              <wp14:pctHeight>0</wp14:pctHeight>
+            </wp14:sizeRelV>
+          </wp:anchor>
+        </w:drawing>
+      </w:r>
+      <w:r>
+        <w:rPr>
+          <w:lang w:val="en-US"/>
+        </w:rPr>
+        <w:drawing>
+          <wp:anchor distT="0" distB="0" distL="114300" distR="114300" simplePos="0" relativeHeight="251709440" behindDoc="0" locked="0" layoutInCell="1" allowOverlap="1" wp14:anchorId="6BECBD67" wp14:editId="6614B6DC">
+            <wp:simplePos x="0" y="0"/>
+            <wp:positionH relativeFrom="column">
+              <wp:posOffset>1668644</wp:posOffset>
+            </wp:positionH>
+            <wp:positionV relativeFrom="paragraph">
+              <wp:posOffset>355255</wp:posOffset>
+            </wp:positionV>
+            <wp:extent cx="1516380" cy="3488055"/>
+            <wp:effectExtent l="0" t="0" r="7620" b="0"/>
+            <wp:wrapSquare wrapText="bothSides"/>
+            <wp:docPr id="1114648563" name="Picture 1" descr="A screenshot of a phone&#10;&#10;AI-generated content may be incorrect."/>
+            <wp:cNvGraphicFramePr>
+              <a:graphicFrameLocks xmlns:a="http://schemas.openxmlformats.org/drawingml/2006/main" noChangeAspect="1"/>
+            </wp:cNvGraphicFramePr>
+            <a:graphic xmlns:a="http://schemas.openxmlformats.org/drawingml/2006/main">
+              <a:graphicData uri="http://schemas.openxmlformats.org/drawingml/2006/picture">
+                <pic:pic xmlns:pic="http://schemas.openxmlformats.org/drawingml/2006/picture">
+                  <pic:nvPicPr>
+                    <pic:cNvPr id="1114648563" name="Picture 1" descr="A screenshot of a phone&#10;&#10;AI-generated content may be incorrect."/>
+                    <pic:cNvPicPr/>
+                  </pic:nvPicPr>
+                  <pic:blipFill>
+                    <a:blip r:embed="rId94" cstate="print">
+                      <a:extLst>
+                        <a:ext uri="{28A0092B-C50C-407E-A947-70E740481C1C}">
+                          <a14:useLocalDpi xmlns:a14="http://schemas.microsoft.com/office/drawing/2010/main" val="0"/>
+                        </a:ext>
+                      </a:extLst>
+                    </a:blip>
+                    <a:stretch>
+                      <a:fillRect/>
+                    </a:stretch>
+                  </pic:blipFill>
+                  <pic:spPr>
+                    <a:xfrm>
+                      <a:off x="0" y="0"/>
+                      <a:ext cx="1516380" cy="3488055"/>
+                    </a:xfrm>
+                    <a:prstGeom prst="rect">
+                      <a:avLst/>
+                    </a:prstGeom>
+                  </pic:spPr>
+                </pic:pic>
+              </a:graphicData>
+            </a:graphic>
+            <wp14:sizeRelH relativeFrom="page">
+              <wp14:pctWidth>0</wp14:pctWidth>
+            </wp14:sizeRelH>
+            <wp14:sizeRelV relativeFrom="page">
+              <wp14:pctHeight>0</wp14:pctHeight>
+            </wp14:sizeRelV>
+          </wp:anchor>
+        </w:drawing>
+      </w:r>
+      <w:r>
+        <w:rPr>
+          <w:lang w:val="en-US"/>
+        </w:rPr>
+        <w:drawing>
+          <wp:anchor distT="0" distB="0" distL="114300" distR="114300" simplePos="0" relativeHeight="251708416" behindDoc="0" locked="0" layoutInCell="1" allowOverlap="1" wp14:anchorId="43984F97" wp14:editId="42C04B47">
+            <wp:simplePos x="0" y="0"/>
+            <wp:positionH relativeFrom="margin">
+              <wp:posOffset>109033</wp:posOffset>
+            </wp:positionH>
+            <wp:positionV relativeFrom="paragraph">
+              <wp:posOffset>376489</wp:posOffset>
+            </wp:positionV>
+            <wp:extent cx="1511300" cy="3343275"/>
+            <wp:effectExtent l="0" t="0" r="0" b="9525"/>
+            <wp:wrapSquare wrapText="bothSides"/>
+            <wp:docPr id="1849672929" name="Picture 1" descr="A screenshot of a phone&#10;&#10;AI-generated content may be incorrect."/>
+            <wp:cNvGraphicFramePr>
+              <a:graphicFrameLocks xmlns:a="http://schemas.openxmlformats.org/drawingml/2006/main" noChangeAspect="1"/>
+            </wp:cNvGraphicFramePr>
+            <a:graphic xmlns:a="http://schemas.openxmlformats.org/drawingml/2006/main">
+              <a:graphicData uri="http://schemas.openxmlformats.org/drawingml/2006/picture">
+                <pic:pic xmlns:pic="http://schemas.openxmlformats.org/drawingml/2006/picture">
+                  <pic:nvPicPr>
+                    <pic:cNvPr id="1849672929" name="Picture 1" descr="A screenshot of a phone&#10;&#10;AI-generated content may be incorrect."/>
+                    <pic:cNvPicPr/>
+                  </pic:nvPicPr>
+                  <pic:blipFill>
+                    <a:blip r:embed="rId95" cstate="print">
+                      <a:extLst>
+                        <a:ext uri="{28A0092B-C50C-407E-A947-70E740481C1C}">
+                          <a14:useLocalDpi xmlns:a14="http://schemas.microsoft.com/office/drawing/2010/main" val="0"/>
+                        </a:ext>
+                      </a:extLst>
+                    </a:blip>
+                    <a:stretch>
+                      <a:fillRect/>
+                    </a:stretch>
+                  </pic:blipFill>
+                  <pic:spPr>
+                    <a:xfrm>
+                      <a:off x="0" y="0"/>
+                      <a:ext cx="1511300" cy="3343275"/>
+                    </a:xfrm>
+                    <a:prstGeom prst="rect">
+                      <a:avLst/>
+                    </a:prstGeom>
+                  </pic:spPr>
+                </pic:pic>
+              </a:graphicData>
+            </a:graphic>
+            <wp14:sizeRelH relativeFrom="page">
+              <wp14:pctWidth>0</wp14:pctWidth>
+            </wp14:sizeRelH>
+            <wp14:sizeRelV relativeFrom="page">
+              <wp14:pctHeight>0</wp14:pctHeight>
+            </wp14:sizeRelV>
+          </wp:anchor>
+        </w:drawing>
+      </w:r>
+      <w:r>
+        <w:rPr>
+          <w:b/>
+          <w:bCs/>
+          <w:lang w:val="en-US"/>
+        </w:rPr>
+        <w:t>Checked to see if UserB was also on UserA’s friends list.</w:t>
+      </w:r>
+      <w:r>
+        <w:rPr>
+          <w:noProof/>
+        </w:rPr>
+        <w:t xml:space="preserve"> </w:t>
       </w:r>
     </w:p>
     <w:sectPr>
@@ -10046,6 +11995,56 @@
     </w:sectPr>
   </w:body>
 </w:document>
+</file>
+
+<file path=word/endnotes.xml><?xml version="1.0" encoding="utf-8"?>
+<w:endnotes xmlns:wpc="http://schemas.microsoft.com/office/word/2010/wordprocessingCanvas" xmlns:cx="http://schemas.microsoft.com/office/drawing/2014/chartex" xmlns:cx1="http://schemas.microsoft.com/office/drawing/2015/9/8/chartex" xmlns:cx2="http://schemas.microsoft.com/office/drawing/2015/10/21/chartex" xmlns:cx3="http://schemas.microsoft.com/office/drawing/2016/5/9/chartex" xmlns:cx4="http://schemas.microsoft.com/office/drawing/2016/5/10/chartex" xmlns:cx5="http://schemas.microsoft.com/office/drawing/2016/5/11/chartex" xmlns:cx6="http://schemas.microsoft.com/office/drawing/2016/5/12/chartex" xmlns:cx7="http://schemas.microsoft.com/office/drawing/2016/5/13/chartex" xmlns:cx8="http://schemas.microsoft.com/office/drawing/2016/5/14/chartex" xmlns:mc="http://schemas.openxmlformats.org/markup-compatibility/2006" xmlns:aink="http://schemas.microsoft.com/office/drawing/2016/ink" xmlns:am3d="http://schemas.microsoft.com/office/drawing/2017/model3d" xmlns:o="urn:schemas-microsoft-com:office:office" xmlns:oel="http://schemas.microsoft.com/office/2019/extlst" xmlns:r="http://schemas.openxmlformats.org/officeDocument/2006/relationships" xmlns:m="http://schemas.openxmlformats.org/officeDocument/2006/math" xmlns:v="urn:schemas-microsoft-com:vml" xmlns:wp14="http://schemas.microsoft.com/office/word/2010/wordprocessingDrawing" xmlns:wp="http://schemas.openxmlformats.org/drawingml/2006/wordprocessingDrawing" xmlns:w10="urn:schemas-microsoft-com:office:word" xmlns:w="http://schemas.openxmlformats.org/wordprocessingml/2006/main" xmlns:w14="http://schemas.microsoft.com/office/word/2010/wordml" xmlns:w15="http://schemas.microsoft.com/office/word/2012/wordml" xmlns:w16cex="http://schemas.microsoft.com/office/word/2018/wordml/cex" xmlns:w16cid="http://schemas.microsoft.com/office/word/2016/wordml/cid" xmlns:w16="http://schemas.microsoft.com/office/word/2018/wordml" xmlns:w16du="http://schemas.microsoft.com/office/word/2023/wordml/word16du" xmlns:w16sdtdh="http://schemas.microsoft.com/office/word/2020/wordml/sdtdatahash" xmlns:w16sdtfl="http://schemas.microsoft.com/office/word/2024/wordml/sdtformatlock" xmlns:w16se="http://schemas.microsoft.com/office/word/2015/wordml/symex" xmlns:wpg="http://schemas.microsoft.com/office/word/2010/wordprocessingGroup" xmlns:wpi="http://schemas.microsoft.com/office/word/2010/wordprocessingInk" xmlns:wne="http://schemas.microsoft.com/office/word/2006/wordml" xmlns:wps="http://schemas.microsoft.com/office/word/2010/wordprocessingShape" mc:Ignorable="w14 w15 w16se w16cid w16 w16cex w16sdtdh w16sdtfl w16du wp14">
+  <w:endnote w:type="separator" w:id="-1">
+    <w:p>
+      <w:pPr>
+        <w:spacing w:after="0" w:line="240" w:lineRule="auto"/>
+      </w:pPr>
+      <w:r>
+        <w:separator/>
+      </w:r>
+    </w:p>
+  </w:endnote>
+  <w:endnote w:type="continuationSeparator" w:id="0">
+    <w:p>
+      <w:pPr>
+        <w:spacing w:after="0" w:line="240" w:lineRule="auto"/>
+      </w:pPr>
+      <w:r>
+        <w:continuationSeparator/>
+      </w:r>
+    </w:p>
+  </w:endnote>
+</w:endnotes>
+</file>
+
+<file path=word/footnotes.xml><?xml version="1.0" encoding="utf-8"?>
+<w:footnotes xmlns:wpc="http://schemas.microsoft.com/office/word/2010/wordprocessingCanvas" xmlns:cx="http://schemas.microsoft.com/office/drawing/2014/chartex" xmlns:cx1="http://schemas.microsoft.com/office/drawing/2015/9/8/chartex" xmlns:cx2="http://schemas.microsoft.com/office/drawing/2015/10/21/chartex" xmlns:cx3="http://schemas.microsoft.com/office/drawing/2016/5/9/chartex" xmlns:cx4="http://schemas.microsoft.com/office/drawing/2016/5/10/chartex" xmlns:cx5="http://schemas.microsoft.com/office/drawing/2016/5/11/chartex" xmlns:cx6="http://schemas.microsoft.com/office/drawing/2016/5/12/chartex" xmlns:cx7="http://schemas.microsoft.com/office/drawing/2016/5/13/chartex" xmlns:cx8="http://schemas.microsoft.com/office/drawing/2016/5/14/chartex" xmlns:mc="http://schemas.openxmlformats.org/markup-compatibility/2006" xmlns:aink="http://schemas.microsoft.com/office/drawing/2016/ink" xmlns:am3d="http://schemas.microsoft.com/office/drawing/2017/model3d" xmlns:o="urn:schemas-microsoft-com:office:office" xmlns:oel="http://schemas.microsoft.com/office/2019/extlst" xmlns:r="http://schemas.openxmlformats.org/officeDocument/2006/relationships" xmlns:m="http://schemas.openxmlformats.org/officeDocument/2006/math" xmlns:v="urn:schemas-microsoft-com:vml" xmlns:wp14="http://schemas.microsoft.com/office/word/2010/wordprocessingDrawing" xmlns:wp="http://schemas.openxmlformats.org/drawingml/2006/wordprocessingDrawing" xmlns:w10="urn:schemas-microsoft-com:office:word" xmlns:w="http://schemas.openxmlformats.org/wordprocessingml/2006/main" xmlns:w14="http://schemas.microsoft.com/office/word/2010/wordml" xmlns:w15="http://schemas.microsoft.com/office/word/2012/wordml" xmlns:w16cex="http://schemas.microsoft.com/office/word/2018/wordml/cex" xmlns:w16cid="http://schemas.microsoft.com/office/word/2016/wordml/cid" xmlns:w16="http://schemas.microsoft.com/office/word/2018/wordml" xmlns:w16du="http://schemas.microsoft.com/office/word/2023/wordml/word16du" xmlns:w16sdtdh="http://schemas.microsoft.com/office/word/2020/wordml/sdtdatahash" xmlns:w16sdtfl="http://schemas.microsoft.com/office/word/2024/wordml/sdtformatlock" xmlns:w16se="http://schemas.microsoft.com/office/word/2015/wordml/symex" xmlns:wpg="http://schemas.microsoft.com/office/word/2010/wordprocessingGroup" xmlns:wpi="http://schemas.microsoft.com/office/word/2010/wordprocessingInk" xmlns:wne="http://schemas.microsoft.com/office/word/2006/wordml" xmlns:wps="http://schemas.microsoft.com/office/word/2010/wordprocessingShape" mc:Ignorable="w14 w15 w16se w16cid w16 w16cex w16sdtdh w16sdtfl w16du wp14">
+  <w:footnote w:type="separator" w:id="-1">
+    <w:p>
+      <w:pPr>
+        <w:spacing w:after="0" w:line="240" w:lineRule="auto"/>
+      </w:pPr>
+      <w:r>
+        <w:separator/>
+      </w:r>
+    </w:p>
+  </w:footnote>
+  <w:footnote w:type="continuationSeparator" w:id="0">
+    <w:p>
+      <w:pPr>
+        <w:spacing w:after="0" w:line="240" w:lineRule="auto"/>
+      </w:pPr>
+      <w:r>
+        <w:continuationSeparator/>
+      </w:r>
+    </w:p>
+  </w:footnote>
+</w:footnotes>
 </file>
 
 <file path=word/numbering.xml><?xml version="1.0" encoding="utf-8"?>
@@ -10140,6 +12139,95 @@
     </w:lvl>
   </w:abstractNum>
   <w:abstractNum w:abstractNumId="1" w15:restartNumberingAfterBreak="0">
+    <w:nsid w:val="1FF94DE2"/>
+    <w:multiLevelType w:val="hybridMultilevel"/>
+    <w:tmpl w:val="F66C1280"/>
+    <w:lvl w:ilvl="0" w:tplc="0809000F">
+      <w:start w:val="1"/>
+      <w:numFmt w:val="decimal"/>
+      <w:lvlText w:val="%1."/>
+      <w:lvlJc w:val="left"/>
+      <w:pPr>
+        <w:ind w:left="720" w:hanging="360"/>
+      </w:pPr>
+      <w:rPr>
+        <w:rFonts w:hint="default"/>
+      </w:rPr>
+    </w:lvl>
+    <w:lvl w:ilvl="1" w:tplc="08090019" w:tentative="1">
+      <w:start w:val="1"/>
+      <w:numFmt w:val="lowerLetter"/>
+      <w:lvlText w:val="%2."/>
+      <w:lvlJc w:val="left"/>
+      <w:pPr>
+        <w:ind w:left="1440" w:hanging="360"/>
+      </w:pPr>
+    </w:lvl>
+    <w:lvl w:ilvl="2" w:tplc="0809001B" w:tentative="1">
+      <w:start w:val="1"/>
+      <w:numFmt w:val="lowerRoman"/>
+      <w:lvlText w:val="%3."/>
+      <w:lvlJc w:val="right"/>
+      <w:pPr>
+        <w:ind w:left="2160" w:hanging="180"/>
+      </w:pPr>
+    </w:lvl>
+    <w:lvl w:ilvl="3" w:tplc="0809000F" w:tentative="1">
+      <w:start w:val="1"/>
+      <w:numFmt w:val="decimal"/>
+      <w:lvlText w:val="%4."/>
+      <w:lvlJc w:val="left"/>
+      <w:pPr>
+        <w:ind w:left="2880" w:hanging="360"/>
+      </w:pPr>
+    </w:lvl>
+    <w:lvl w:ilvl="4" w:tplc="08090019" w:tentative="1">
+      <w:start w:val="1"/>
+      <w:numFmt w:val="lowerLetter"/>
+      <w:lvlText w:val="%5."/>
+      <w:lvlJc w:val="left"/>
+      <w:pPr>
+        <w:ind w:left="3600" w:hanging="360"/>
+      </w:pPr>
+    </w:lvl>
+    <w:lvl w:ilvl="5" w:tplc="0809001B" w:tentative="1">
+      <w:start w:val="1"/>
+      <w:numFmt w:val="lowerRoman"/>
+      <w:lvlText w:val="%6."/>
+      <w:lvlJc w:val="right"/>
+      <w:pPr>
+        <w:ind w:left="4320" w:hanging="180"/>
+      </w:pPr>
+    </w:lvl>
+    <w:lvl w:ilvl="6" w:tplc="0809000F" w:tentative="1">
+      <w:start w:val="1"/>
+      <w:numFmt w:val="decimal"/>
+      <w:lvlText w:val="%7."/>
+      <w:lvlJc w:val="left"/>
+      <w:pPr>
+        <w:ind w:left="5040" w:hanging="360"/>
+      </w:pPr>
+    </w:lvl>
+    <w:lvl w:ilvl="7" w:tplc="08090019" w:tentative="1">
+      <w:start w:val="1"/>
+      <w:numFmt w:val="lowerLetter"/>
+      <w:lvlText w:val="%8."/>
+      <w:lvlJc w:val="left"/>
+      <w:pPr>
+        <w:ind w:left="5760" w:hanging="360"/>
+      </w:pPr>
+    </w:lvl>
+    <w:lvl w:ilvl="8" w:tplc="0809001B" w:tentative="1">
+      <w:start w:val="1"/>
+      <w:numFmt w:val="lowerRoman"/>
+      <w:lvlText w:val="%9."/>
+      <w:lvlJc w:val="right"/>
+      <w:pPr>
+        <w:ind w:left="6480" w:hanging="180"/>
+      </w:pPr>
+    </w:lvl>
+  </w:abstractNum>
+  <w:abstractNum w:abstractNumId="2" w15:restartNumberingAfterBreak="0">
     <w:nsid w:val="265659D3"/>
     <w:multiLevelType w:val="hybridMultilevel"/>
     <w:tmpl w:val="017EBD00"/>
@@ -10252,7 +12340,7 @@
       </w:rPr>
     </w:lvl>
   </w:abstractNum>
-  <w:abstractNum w:abstractNumId="2" w15:restartNumberingAfterBreak="0">
+  <w:abstractNum w:abstractNumId="3" w15:restartNumberingAfterBreak="0">
     <w:nsid w:val="30200716"/>
     <w:multiLevelType w:val="hybridMultilevel"/>
     <w:tmpl w:val="017EBD00"/>
@@ -10365,7 +12453,7 @@
       </w:rPr>
     </w:lvl>
   </w:abstractNum>
-  <w:abstractNum w:abstractNumId="3" w15:restartNumberingAfterBreak="0">
+  <w:abstractNum w:abstractNumId="4" w15:restartNumberingAfterBreak="0">
     <w:nsid w:val="5C4473C7"/>
     <w:multiLevelType w:val="hybridMultilevel"/>
     <w:tmpl w:val="1534BA74"/>
@@ -10454,7 +12542,7 @@
       </w:pPr>
     </w:lvl>
   </w:abstractNum>
-  <w:abstractNum w:abstractNumId="4" w15:restartNumberingAfterBreak="0">
+  <w:abstractNum w:abstractNumId="5" w15:restartNumberingAfterBreak="0">
     <w:nsid w:val="6364308B"/>
     <w:multiLevelType w:val="hybridMultilevel"/>
     <w:tmpl w:val="0E8EB992"/>
@@ -10469,7 +12557,7 @@
         <w:rFonts w:ascii="Aptos" w:eastAsiaTheme="minorHAnsi" w:hAnsi="Aptos" w:cstheme="minorBidi" w:hint="default"/>
       </w:rPr>
     </w:lvl>
-    <w:lvl w:ilvl="1" w:tplc="08090003" w:tentative="1">
+    <w:lvl w:ilvl="1" w:tplc="08090003">
       <w:start w:val="1"/>
       <w:numFmt w:val="bullet"/>
       <w:lvlText w:val="o"/>
@@ -10566,7 +12654,96 @@
       </w:rPr>
     </w:lvl>
   </w:abstractNum>
-  <w:abstractNum w:abstractNumId="5" w15:restartNumberingAfterBreak="0">
+  <w:abstractNum w:abstractNumId="6" w15:restartNumberingAfterBreak="0">
+    <w:nsid w:val="6A1D37BB"/>
+    <w:multiLevelType w:val="hybridMultilevel"/>
+    <w:tmpl w:val="327E6034"/>
+    <w:lvl w:ilvl="0" w:tplc="5680C8AE">
+      <w:start w:val="1"/>
+      <w:numFmt w:val="decimal"/>
+      <w:lvlText w:val="%1."/>
+      <w:lvlJc w:val="left"/>
+      <w:pPr>
+        <w:ind w:left="1080" w:hanging="360"/>
+      </w:pPr>
+      <w:rPr>
+        <w:rFonts w:hint="default"/>
+      </w:rPr>
+    </w:lvl>
+    <w:lvl w:ilvl="1" w:tplc="08090019" w:tentative="1">
+      <w:start w:val="1"/>
+      <w:numFmt w:val="lowerLetter"/>
+      <w:lvlText w:val="%2."/>
+      <w:lvlJc w:val="left"/>
+      <w:pPr>
+        <w:ind w:left="1800" w:hanging="360"/>
+      </w:pPr>
+    </w:lvl>
+    <w:lvl w:ilvl="2" w:tplc="0809001B" w:tentative="1">
+      <w:start w:val="1"/>
+      <w:numFmt w:val="lowerRoman"/>
+      <w:lvlText w:val="%3."/>
+      <w:lvlJc w:val="right"/>
+      <w:pPr>
+        <w:ind w:left="2520" w:hanging="180"/>
+      </w:pPr>
+    </w:lvl>
+    <w:lvl w:ilvl="3" w:tplc="0809000F" w:tentative="1">
+      <w:start w:val="1"/>
+      <w:numFmt w:val="decimal"/>
+      <w:lvlText w:val="%4."/>
+      <w:lvlJc w:val="left"/>
+      <w:pPr>
+        <w:ind w:left="3240" w:hanging="360"/>
+      </w:pPr>
+    </w:lvl>
+    <w:lvl w:ilvl="4" w:tplc="08090019" w:tentative="1">
+      <w:start w:val="1"/>
+      <w:numFmt w:val="lowerLetter"/>
+      <w:lvlText w:val="%5."/>
+      <w:lvlJc w:val="left"/>
+      <w:pPr>
+        <w:ind w:left="3960" w:hanging="360"/>
+      </w:pPr>
+    </w:lvl>
+    <w:lvl w:ilvl="5" w:tplc="0809001B" w:tentative="1">
+      <w:start w:val="1"/>
+      <w:numFmt w:val="lowerRoman"/>
+      <w:lvlText w:val="%6."/>
+      <w:lvlJc w:val="right"/>
+      <w:pPr>
+        <w:ind w:left="4680" w:hanging="180"/>
+      </w:pPr>
+    </w:lvl>
+    <w:lvl w:ilvl="6" w:tplc="0809000F" w:tentative="1">
+      <w:start w:val="1"/>
+      <w:numFmt w:val="decimal"/>
+      <w:lvlText w:val="%7."/>
+      <w:lvlJc w:val="left"/>
+      <w:pPr>
+        <w:ind w:left="5400" w:hanging="360"/>
+      </w:pPr>
+    </w:lvl>
+    <w:lvl w:ilvl="7" w:tplc="08090019" w:tentative="1">
+      <w:start w:val="1"/>
+      <w:numFmt w:val="lowerLetter"/>
+      <w:lvlText w:val="%8."/>
+      <w:lvlJc w:val="left"/>
+      <w:pPr>
+        <w:ind w:left="6120" w:hanging="360"/>
+      </w:pPr>
+    </w:lvl>
+    <w:lvl w:ilvl="8" w:tplc="0809001B" w:tentative="1">
+      <w:start w:val="1"/>
+      <w:numFmt w:val="lowerRoman"/>
+      <w:lvlText w:val="%9."/>
+      <w:lvlJc w:val="right"/>
+      <w:pPr>
+        <w:ind w:left="6840" w:hanging="180"/>
+      </w:pPr>
+    </w:lvl>
+  </w:abstractNum>
+  <w:abstractNum w:abstractNumId="7" w15:restartNumberingAfterBreak="0">
     <w:nsid w:val="6F86462C"/>
     <w:multiLevelType w:val="hybridMultilevel"/>
     <w:tmpl w:val="92B2557A"/>
@@ -10680,22 +12857,28 @@
     </w:lvl>
   </w:abstractNum>
   <w:num w:numId="1" w16cid:durableId="413480618">
-    <w:abstractNumId w:val="4"/>
+    <w:abstractNumId w:val="5"/>
   </w:num>
   <w:num w:numId="2" w16cid:durableId="1588880229">
-    <w:abstractNumId w:val="5"/>
+    <w:abstractNumId w:val="7"/>
   </w:num>
   <w:num w:numId="3" w16cid:durableId="1975938008">
-    <w:abstractNumId w:val="2"/>
+    <w:abstractNumId w:val="3"/>
   </w:num>
   <w:num w:numId="4" w16cid:durableId="1165778892">
-    <w:abstractNumId w:val="1"/>
+    <w:abstractNumId w:val="2"/>
   </w:num>
   <w:num w:numId="5" w16cid:durableId="1584291837">
     <w:abstractNumId w:val="0"/>
   </w:num>
   <w:num w:numId="6" w16cid:durableId="2093313818">
-    <w:abstractNumId w:val="3"/>
+    <w:abstractNumId w:val="4"/>
+  </w:num>
+  <w:num w:numId="7" w16cid:durableId="1525248063">
+    <w:abstractNumId w:val="1"/>
+  </w:num>
+  <w:num w:numId="8" w16cid:durableId="691149786">
+    <w:abstractNumId w:val="6"/>
   </w:num>
 </w:numbering>
 </file>
@@ -11704,6 +13887,50 @@
       <w:shd w:val="clear" w:color="auto" w:fill="E1DFDD"/>
     </w:rPr>
   </w:style>
+  <w:style w:type="paragraph" w:styleId="Header">
+    <w:name w:val="header"/>
+    <w:basedOn w:val="Normal"/>
+    <w:link w:val="HeaderChar"/>
+    <w:uiPriority w:val="99"/>
+    <w:unhideWhenUsed/>
+    <w:rsid w:val="00A045A5"/>
+    <w:pPr>
+      <w:tabs>
+        <w:tab w:val="center" w:pos="4513"/>
+        <w:tab w:val="right" w:pos="9026"/>
+      </w:tabs>
+      <w:spacing w:after="0" w:line="240" w:lineRule="auto"/>
+    </w:pPr>
+  </w:style>
+  <w:style w:type="character" w:customStyle="1" w:styleId="HeaderChar">
+    <w:name w:val="Header Char"/>
+    <w:basedOn w:val="DefaultParagraphFont"/>
+    <w:link w:val="Header"/>
+    <w:uiPriority w:val="99"/>
+    <w:rsid w:val="00A045A5"/>
+  </w:style>
+  <w:style w:type="paragraph" w:styleId="Footer">
+    <w:name w:val="footer"/>
+    <w:basedOn w:val="Normal"/>
+    <w:link w:val="FooterChar"/>
+    <w:uiPriority w:val="99"/>
+    <w:unhideWhenUsed/>
+    <w:rsid w:val="00A045A5"/>
+    <w:pPr>
+      <w:tabs>
+        <w:tab w:val="center" w:pos="4513"/>
+        <w:tab w:val="right" w:pos="9026"/>
+      </w:tabs>
+      <w:spacing w:after="0" w:line="240" w:lineRule="auto"/>
+    </w:pPr>
+  </w:style>
+  <w:style w:type="character" w:customStyle="1" w:styleId="FooterChar">
+    <w:name w:val="Footer Char"/>
+    <w:basedOn w:val="DefaultParagraphFont"/>
+    <w:link w:val="Footer"/>
+    <w:uiPriority w:val="99"/>
+    <w:rsid w:val="00A045A5"/>
+  </w:style>
 </w:styles>
 </file>
 
@@ -12003,18 +14230,15 @@
 </file>
 
 <file path=customXml/item1.xml><?xml version="1.0" encoding="utf-8"?>
-<b:Sources xmlns:b="http://schemas.openxmlformats.org/officeDocument/2006/bibliography" xmlns="http://schemas.openxmlformats.org/officeDocument/2006/bibliography" SelectedStyle="\APASixthEditionOfficeOnline.xsl" StyleName="APA" Version="6"/>
+<?mso-contentType ?>
+<FormTemplates xmlns="http://schemas.microsoft.com/sharepoint/v3/contenttype/forms">
+  <Display>DocumentLibraryForm</Display>
+  <Edit>DocumentLibraryForm</Edit>
+  <New>DocumentLibraryForm</New>
+</FormTemplates>
 </file>
 
 <file path=customXml/item2.xml><?xml version="1.0" encoding="utf-8"?>
-<p:properties xmlns:p="http://schemas.microsoft.com/office/2006/metadata/properties" xmlns:xsi="http://www.w3.org/2001/XMLSchema-instance" xmlns:pc="http://schemas.microsoft.com/office/infopath/2007/PartnerControls">
-  <documentManagement>
-    <_activity xmlns="c464522a-a754-430f-b544-fd87d4c168c2" xsi:nil="true"/>
-  </documentManagement>
-</p:properties>
-</file>
-
-<file path=customXml/item3.xml><?xml version="1.0" encoding="utf-8"?>
 <ct:contentTypeSchema xmlns:ct="http://schemas.microsoft.com/office/2006/metadata/contentType" xmlns:ma="http://schemas.microsoft.com/office/2006/metadata/properties/metaAttributes" ct:_="" ma:_="" ma:contentTypeName="Document" ma:contentTypeID="0x010100FD220758017CC846AA909CC7164ED159" ma:contentTypeVersion="9" ma:contentTypeDescription="Create a new document." ma:contentTypeScope="" ma:versionID="107195f5180327e81a14725ad49c53b2">
   <xsd:schema xmlns:xsd="http://www.w3.org/2001/XMLSchema" xmlns:xs="http://www.w3.org/2001/XMLSchema" xmlns:p="http://schemas.microsoft.com/office/2006/metadata/properties" xmlns:ns3="c464522a-a754-430f-b544-fd87d4c168c2" targetNamespace="http://schemas.microsoft.com/office/2006/metadata/properties" ma:root="true" ma:fieldsID="f73c64e9107e8a5bfbbc1902deeb9531" ns3:_="">
     <xsd:import namespace="c464522a-a754-430f-b544-fd87d4c168c2"/>
@@ -12188,34 +14412,27 @@
 </ct:contentTypeSchema>
 </file>
 
+<file path=customXml/item3.xml><?xml version="1.0" encoding="utf-8"?>
+<p:properties xmlns:p="http://schemas.microsoft.com/office/2006/metadata/properties" xmlns:xsi="http://www.w3.org/2001/XMLSchema-instance" xmlns:pc="http://schemas.microsoft.com/office/infopath/2007/PartnerControls">
+  <documentManagement>
+    <_activity xmlns="c464522a-a754-430f-b544-fd87d4c168c2" xsi:nil="true"/>
+  </documentManagement>
+</p:properties>
+</file>
+
 <file path=customXml/item4.xml><?xml version="1.0" encoding="utf-8"?>
-<?mso-contentType ?>
-<FormTemplates xmlns="http://schemas.microsoft.com/sharepoint/v3/contenttype/forms">
-  <Display>DocumentLibraryForm</Display>
-  <Edit>DocumentLibraryForm</Edit>
-  <New>DocumentLibraryForm</New>
-</FormTemplates>
+<b:Sources xmlns:b="http://schemas.openxmlformats.org/officeDocument/2006/bibliography" xmlns="http://schemas.openxmlformats.org/officeDocument/2006/bibliography" SelectedStyle="\APASixthEditionOfficeOnline.xsl" StyleName="APA" Version="6"/>
 </file>
 
 <file path=customXml/itemProps1.xml><?xml version="1.0" encoding="utf-8"?>
-<ds:datastoreItem xmlns:ds="http://schemas.openxmlformats.org/officeDocument/2006/customXml" ds:itemID="{238C6C0A-4621-4E84-9BEB-57ADB3D29432}">
+<ds:datastoreItem xmlns:ds="http://schemas.openxmlformats.org/officeDocument/2006/customXml" ds:itemID="{C1AA33A3-61AD-4339-9E8A-C5DBB01DCEDF}">
   <ds:schemaRefs>
-    <ds:schemaRef ds:uri="http://schemas.openxmlformats.org/officeDocument/2006/bibliography"/>
+    <ds:schemaRef ds:uri="http://schemas.microsoft.com/sharepoint/v3/contenttype/forms"/>
   </ds:schemaRefs>
 </ds:datastoreItem>
 </file>
 
 <file path=customXml/itemProps2.xml><?xml version="1.0" encoding="utf-8"?>
-<ds:datastoreItem xmlns:ds="http://schemas.openxmlformats.org/officeDocument/2006/customXml" ds:itemID="{F79638DA-D241-4BF3-8AD6-7F74018D56BD}">
-  <ds:schemaRefs>
-    <ds:schemaRef ds:uri="http://schemas.microsoft.com/office/2006/metadata/properties"/>
-    <ds:schemaRef ds:uri="http://schemas.microsoft.com/office/infopath/2007/PartnerControls"/>
-    <ds:schemaRef ds:uri="c464522a-a754-430f-b544-fd87d4c168c2"/>
-  </ds:schemaRefs>
-</ds:datastoreItem>
-</file>
-
-<file path=customXml/itemProps3.xml><?xml version="1.0" encoding="utf-8"?>
 <ds:datastoreItem xmlns:ds="http://schemas.openxmlformats.org/officeDocument/2006/customXml" ds:itemID="{DF38D78A-FDB7-47F3-B2C0-0D7B5F170E7B}">
   <ds:schemaRefs>
     <ds:schemaRef ds:uri="http://schemas.microsoft.com/office/2006/metadata/contentType"/>
@@ -12233,10 +14450,20 @@
 </ds:datastoreItem>
 </file>
 
+<file path=customXml/itemProps3.xml><?xml version="1.0" encoding="utf-8"?>
+<ds:datastoreItem xmlns:ds="http://schemas.openxmlformats.org/officeDocument/2006/customXml" ds:itemID="{F79638DA-D241-4BF3-8AD6-7F74018D56BD}">
+  <ds:schemaRefs>
+    <ds:schemaRef ds:uri="http://schemas.microsoft.com/office/2006/metadata/properties"/>
+    <ds:schemaRef ds:uri="http://schemas.microsoft.com/office/infopath/2007/PartnerControls"/>
+    <ds:schemaRef ds:uri="c464522a-a754-430f-b544-fd87d4c168c2"/>
+  </ds:schemaRefs>
+</ds:datastoreItem>
+</file>
+
 <file path=customXml/itemProps4.xml><?xml version="1.0" encoding="utf-8"?>
-<ds:datastoreItem xmlns:ds="http://schemas.openxmlformats.org/officeDocument/2006/customXml" ds:itemID="{C1AA33A3-61AD-4339-9E8A-C5DBB01DCEDF}">
+<ds:datastoreItem xmlns:ds="http://schemas.openxmlformats.org/officeDocument/2006/customXml" ds:itemID="{238C6C0A-4621-4E84-9BEB-57ADB3D29432}">
   <ds:schemaRefs>
-    <ds:schemaRef ds:uri="http://schemas.microsoft.com/sharepoint/v3/contenttype/forms"/>
+    <ds:schemaRef ds:uri="http://schemas.openxmlformats.org/officeDocument/2006/bibliography"/>
   </ds:schemaRefs>
 </ds:datastoreItem>
 </file>
</xml_diff>

<commit_message>
Can't send friend request to a friend.
</commit_message>
<xml_diff>
--- a/Documentation/COMP3000 - Progress Report.docx
+++ b/Documentation/COMP3000 - Progress Report.docx
@@ -11665,9 +11665,7 @@
           <w:numId w:val="8"/>
         </w:numPr>
         <w:rPr>
-          <w:b/>
-          <w:bCs/>
-          <w:lang w:val="en-US"/>
+          <w:noProof/>
         </w:rPr>
       </w:pPr>
       <w:r>
@@ -11987,6 +11985,210 @@
         <w:t xml:space="preserve"> </w:t>
       </w:r>
     </w:p>
+    <w:p>
+      <w:pPr>
+        <w:rPr>
+          <w:noProof/>
+        </w:rPr>
+      </w:pPr>
+      <w:r>
+        <w:rPr>
+          <w:noProof/>
+        </w:rPr>
+        <w:br w:type="page"/>
+      </w:r>
+    </w:p>
+    <w:p>
+      <w:pPr>
+        <w:rPr>
+          <w:b/>
+          <w:bCs/>
+          <w:lang w:val="en-US"/>
+        </w:rPr>
+      </w:pPr>
+      <w:r>
+        <w:rPr>
+          <w:b/>
+          <w:bCs/>
+          <w:lang w:val="en-US"/>
+        </w:rPr>
+        <w:lastRenderedPageBreak/>
+        <w:drawing>
+          <wp:anchor distT="0" distB="0" distL="114300" distR="114300" simplePos="0" relativeHeight="251714560" behindDoc="0" locked="0" layoutInCell="1" allowOverlap="1" wp14:anchorId="2B6058F9" wp14:editId="3AD4D5FE">
+            <wp:simplePos x="0" y="0"/>
+            <wp:positionH relativeFrom="margin">
+              <wp:posOffset>3837099</wp:posOffset>
+            </wp:positionH>
+            <wp:positionV relativeFrom="paragraph">
+              <wp:posOffset>419</wp:posOffset>
+            </wp:positionV>
+            <wp:extent cx="1469390" cy="3387725"/>
+            <wp:effectExtent l="0" t="0" r="0" b="3175"/>
+            <wp:wrapSquare wrapText="bothSides"/>
+            <wp:docPr id="335799769" name="Picture 1" descr="A screenshot of a social media account&#10;&#10;AI-generated content may be incorrect."/>
+            <wp:cNvGraphicFramePr>
+              <a:graphicFrameLocks xmlns:a="http://schemas.openxmlformats.org/drawingml/2006/main" noChangeAspect="1"/>
+            </wp:cNvGraphicFramePr>
+            <a:graphic xmlns:a="http://schemas.openxmlformats.org/drawingml/2006/main">
+              <a:graphicData uri="http://schemas.openxmlformats.org/drawingml/2006/picture">
+                <pic:pic xmlns:pic="http://schemas.openxmlformats.org/drawingml/2006/picture">
+                  <pic:nvPicPr>
+                    <pic:cNvPr id="335799769" name="Picture 1" descr="A screenshot of a social media account&#10;&#10;AI-generated content may be incorrect."/>
+                    <pic:cNvPicPr/>
+                  </pic:nvPicPr>
+                  <pic:blipFill>
+                    <a:blip r:embed="rId96" cstate="print">
+                      <a:extLst>
+                        <a:ext uri="{28A0092B-C50C-407E-A947-70E740481C1C}">
+                          <a14:useLocalDpi xmlns:a14="http://schemas.microsoft.com/office/drawing/2010/main" val="0"/>
+                        </a:ext>
+                      </a:extLst>
+                    </a:blip>
+                    <a:stretch>
+                      <a:fillRect/>
+                    </a:stretch>
+                  </pic:blipFill>
+                  <pic:spPr>
+                    <a:xfrm>
+                      <a:off x="0" y="0"/>
+                      <a:ext cx="1469390" cy="3387725"/>
+                    </a:xfrm>
+                    <a:prstGeom prst="rect">
+                      <a:avLst/>
+                    </a:prstGeom>
+                  </pic:spPr>
+                </pic:pic>
+              </a:graphicData>
+            </a:graphic>
+            <wp14:sizeRelH relativeFrom="page">
+              <wp14:pctWidth>0</wp14:pctWidth>
+            </wp14:sizeRelH>
+            <wp14:sizeRelV relativeFrom="page">
+              <wp14:pctHeight>0</wp14:pctHeight>
+            </wp14:sizeRelV>
+          </wp:anchor>
+        </w:drawing>
+      </w:r>
+      <w:r>
+        <w:rPr>
+          <w:b/>
+          <w:bCs/>
+          <w:lang w:val="en-US"/>
+        </w:rPr>
+        <w:t>Shouldn’t be able to send friend requests to someone you are already friends with:</w:t>
+      </w:r>
+    </w:p>
+    <w:p>
+      <w:pPr>
+        <w:pStyle w:val="ListParagraph"/>
+        <w:numPr>
+          <w:ilvl w:val="0"/>
+          <w:numId w:val="9"/>
+        </w:numPr>
+        <w:rPr>
+          <w:b/>
+          <w:bCs/>
+          <w:lang w:val="en-US"/>
+        </w:rPr>
+      </w:pPr>
+      <w:r>
+        <w:rPr>
+          <w:b/>
+          <w:bCs/>
+          <w:lang w:val="en-US"/>
+        </w:rPr>
+        <w:t>Edited sendFriendRequest in Firestore.js to add an already friends check:</w:t>
+      </w:r>
+    </w:p>
+    <w:p>
+      <w:pPr>
+        <w:rPr>
+          <w:b/>
+          <w:bCs/>
+          <w:lang w:val="en-US"/>
+        </w:rPr>
+      </w:pPr>
+      <w:r>
+        <w:rPr>
+          <w:b/>
+          <w:bCs/>
+          <w:lang w:val="en-US"/>
+        </w:rPr>
+        <w:drawing>
+          <wp:anchor distT="0" distB="0" distL="114300" distR="114300" simplePos="0" relativeHeight="251713536" behindDoc="0" locked="0" layoutInCell="1" allowOverlap="1" wp14:anchorId="4B416188" wp14:editId="381F3AB3">
+            <wp:simplePos x="0" y="0"/>
+            <wp:positionH relativeFrom="margin">
+              <wp:posOffset>-702978</wp:posOffset>
+            </wp:positionH>
+            <wp:positionV relativeFrom="paragraph">
+              <wp:posOffset>99156</wp:posOffset>
+            </wp:positionV>
+            <wp:extent cx="4318000" cy="1453515"/>
+            <wp:effectExtent l="0" t="0" r="6350" b="0"/>
+            <wp:wrapSquare wrapText="bothSides"/>
+            <wp:docPr id="1241346896" name="Picture 1" descr="A computer screen shot of a program code&#10;&#10;AI-generated content may be incorrect."/>
+            <wp:cNvGraphicFramePr>
+              <a:graphicFrameLocks xmlns:a="http://schemas.openxmlformats.org/drawingml/2006/main" noChangeAspect="1"/>
+            </wp:cNvGraphicFramePr>
+            <a:graphic xmlns:a="http://schemas.openxmlformats.org/drawingml/2006/main">
+              <a:graphicData uri="http://schemas.openxmlformats.org/drawingml/2006/picture">
+                <pic:pic xmlns:pic="http://schemas.openxmlformats.org/drawingml/2006/picture">
+                  <pic:nvPicPr>
+                    <pic:cNvPr id="1241346896" name="Picture 1" descr="A computer screen shot of a program code&#10;&#10;AI-generated content may be incorrect."/>
+                    <pic:cNvPicPr/>
+                  </pic:nvPicPr>
+                  <pic:blipFill>
+                    <a:blip r:embed="rId97">
+                      <a:extLst>
+                        <a:ext uri="{28A0092B-C50C-407E-A947-70E740481C1C}">
+                          <a14:useLocalDpi xmlns:a14="http://schemas.microsoft.com/office/drawing/2010/main" val="0"/>
+                        </a:ext>
+                      </a:extLst>
+                    </a:blip>
+                    <a:stretch>
+                      <a:fillRect/>
+                    </a:stretch>
+                  </pic:blipFill>
+                  <pic:spPr>
+                    <a:xfrm>
+                      <a:off x="0" y="0"/>
+                      <a:ext cx="4318000" cy="1453515"/>
+                    </a:xfrm>
+                    <a:prstGeom prst="rect">
+                      <a:avLst/>
+                    </a:prstGeom>
+                  </pic:spPr>
+                </pic:pic>
+              </a:graphicData>
+            </a:graphic>
+            <wp14:sizeRelH relativeFrom="page">
+              <wp14:pctWidth>0</wp14:pctWidth>
+            </wp14:sizeRelH>
+            <wp14:sizeRelV relativeFrom="page">
+              <wp14:pctHeight>0</wp14:pctHeight>
+            </wp14:sizeRelV>
+          </wp:anchor>
+        </w:drawing>
+      </w:r>
+    </w:p>
+    <w:p>
+      <w:pPr>
+        <w:rPr>
+          <w:b/>
+          <w:bCs/>
+          <w:lang w:val="en-US"/>
+        </w:rPr>
+      </w:pPr>
+    </w:p>
+    <w:p>
+      <w:pPr>
+        <w:rPr>
+          <w:b/>
+          <w:bCs/>
+          <w:lang w:val="en-US"/>
+        </w:rPr>
+      </w:pPr>
+    </w:p>
     <w:sectPr>
       <w:pgSz w:w="11906" w:h="16838"/>
       <w:pgMar w:top="1440" w:right="1440" w:bottom="1440" w:left="1440" w:header="708" w:footer="708" w:gutter="0"/>
@@ -12454,9 +12656,9 @@
     </w:lvl>
   </w:abstractNum>
   <w:abstractNum w:abstractNumId="4" w15:restartNumberingAfterBreak="0">
-    <w:nsid w:val="5C4473C7"/>
+    <w:nsid w:val="51737CD0"/>
     <w:multiLevelType w:val="hybridMultilevel"/>
-    <w:tmpl w:val="1534BA74"/>
+    <w:tmpl w:val="8BD60F1E"/>
     <w:lvl w:ilvl="0" w:tplc="0809000F">
       <w:start w:val="1"/>
       <w:numFmt w:val="decimal"/>
@@ -12543,6 +12745,95 @@
     </w:lvl>
   </w:abstractNum>
   <w:abstractNum w:abstractNumId="5" w15:restartNumberingAfterBreak="0">
+    <w:nsid w:val="5C4473C7"/>
+    <w:multiLevelType w:val="hybridMultilevel"/>
+    <w:tmpl w:val="1534BA74"/>
+    <w:lvl w:ilvl="0" w:tplc="0809000F">
+      <w:start w:val="1"/>
+      <w:numFmt w:val="decimal"/>
+      <w:lvlText w:val="%1."/>
+      <w:lvlJc w:val="left"/>
+      <w:pPr>
+        <w:ind w:left="720" w:hanging="360"/>
+      </w:pPr>
+      <w:rPr>
+        <w:rFonts w:hint="default"/>
+      </w:rPr>
+    </w:lvl>
+    <w:lvl w:ilvl="1" w:tplc="08090019" w:tentative="1">
+      <w:start w:val="1"/>
+      <w:numFmt w:val="lowerLetter"/>
+      <w:lvlText w:val="%2."/>
+      <w:lvlJc w:val="left"/>
+      <w:pPr>
+        <w:ind w:left="1440" w:hanging="360"/>
+      </w:pPr>
+    </w:lvl>
+    <w:lvl w:ilvl="2" w:tplc="0809001B" w:tentative="1">
+      <w:start w:val="1"/>
+      <w:numFmt w:val="lowerRoman"/>
+      <w:lvlText w:val="%3."/>
+      <w:lvlJc w:val="right"/>
+      <w:pPr>
+        <w:ind w:left="2160" w:hanging="180"/>
+      </w:pPr>
+    </w:lvl>
+    <w:lvl w:ilvl="3" w:tplc="0809000F" w:tentative="1">
+      <w:start w:val="1"/>
+      <w:numFmt w:val="decimal"/>
+      <w:lvlText w:val="%4."/>
+      <w:lvlJc w:val="left"/>
+      <w:pPr>
+        <w:ind w:left="2880" w:hanging="360"/>
+      </w:pPr>
+    </w:lvl>
+    <w:lvl w:ilvl="4" w:tplc="08090019" w:tentative="1">
+      <w:start w:val="1"/>
+      <w:numFmt w:val="lowerLetter"/>
+      <w:lvlText w:val="%5."/>
+      <w:lvlJc w:val="left"/>
+      <w:pPr>
+        <w:ind w:left="3600" w:hanging="360"/>
+      </w:pPr>
+    </w:lvl>
+    <w:lvl w:ilvl="5" w:tplc="0809001B" w:tentative="1">
+      <w:start w:val="1"/>
+      <w:numFmt w:val="lowerRoman"/>
+      <w:lvlText w:val="%6."/>
+      <w:lvlJc w:val="right"/>
+      <w:pPr>
+        <w:ind w:left="4320" w:hanging="180"/>
+      </w:pPr>
+    </w:lvl>
+    <w:lvl w:ilvl="6" w:tplc="0809000F" w:tentative="1">
+      <w:start w:val="1"/>
+      <w:numFmt w:val="decimal"/>
+      <w:lvlText w:val="%7."/>
+      <w:lvlJc w:val="left"/>
+      <w:pPr>
+        <w:ind w:left="5040" w:hanging="360"/>
+      </w:pPr>
+    </w:lvl>
+    <w:lvl w:ilvl="7" w:tplc="08090019" w:tentative="1">
+      <w:start w:val="1"/>
+      <w:numFmt w:val="lowerLetter"/>
+      <w:lvlText w:val="%8."/>
+      <w:lvlJc w:val="left"/>
+      <w:pPr>
+        <w:ind w:left="5760" w:hanging="360"/>
+      </w:pPr>
+    </w:lvl>
+    <w:lvl w:ilvl="8" w:tplc="0809001B" w:tentative="1">
+      <w:start w:val="1"/>
+      <w:numFmt w:val="lowerRoman"/>
+      <w:lvlText w:val="%9."/>
+      <w:lvlJc w:val="right"/>
+      <w:pPr>
+        <w:ind w:left="6480" w:hanging="180"/>
+      </w:pPr>
+    </w:lvl>
+  </w:abstractNum>
+  <w:abstractNum w:abstractNumId="6" w15:restartNumberingAfterBreak="0">
     <w:nsid w:val="6364308B"/>
     <w:multiLevelType w:val="hybridMultilevel"/>
     <w:tmpl w:val="0E8EB992"/>
@@ -12654,7 +12945,7 @@
       </w:rPr>
     </w:lvl>
   </w:abstractNum>
-  <w:abstractNum w:abstractNumId="6" w15:restartNumberingAfterBreak="0">
+  <w:abstractNum w:abstractNumId="7" w15:restartNumberingAfterBreak="0">
     <w:nsid w:val="6A1D37BB"/>
     <w:multiLevelType w:val="hybridMultilevel"/>
     <w:tmpl w:val="327E6034"/>
@@ -12743,7 +13034,7 @@
       </w:pPr>
     </w:lvl>
   </w:abstractNum>
-  <w:abstractNum w:abstractNumId="7" w15:restartNumberingAfterBreak="0">
+  <w:abstractNum w:abstractNumId="8" w15:restartNumberingAfterBreak="0">
     <w:nsid w:val="6F86462C"/>
     <w:multiLevelType w:val="hybridMultilevel"/>
     <w:tmpl w:val="92B2557A"/>
@@ -12857,10 +13148,10 @@
     </w:lvl>
   </w:abstractNum>
   <w:num w:numId="1" w16cid:durableId="413480618">
-    <w:abstractNumId w:val="5"/>
+    <w:abstractNumId w:val="6"/>
   </w:num>
   <w:num w:numId="2" w16cid:durableId="1588880229">
-    <w:abstractNumId w:val="7"/>
+    <w:abstractNumId w:val="8"/>
   </w:num>
   <w:num w:numId="3" w16cid:durableId="1975938008">
     <w:abstractNumId w:val="3"/>
@@ -12872,13 +13163,16 @@
     <w:abstractNumId w:val="0"/>
   </w:num>
   <w:num w:numId="6" w16cid:durableId="2093313818">
-    <w:abstractNumId w:val="4"/>
+    <w:abstractNumId w:val="5"/>
   </w:num>
   <w:num w:numId="7" w16cid:durableId="1525248063">
     <w:abstractNumId w:val="1"/>
   </w:num>
   <w:num w:numId="8" w16cid:durableId="691149786">
-    <w:abstractNumId w:val="6"/>
+    <w:abstractNumId w:val="7"/>
+  </w:num>
+  <w:num w:numId="9" w16cid:durableId="1602757048">
+    <w:abstractNumId w:val="4"/>
   </w:num>
 </w:numbering>
 </file>

</xml_diff>